<commit_message>
Update CRM PRD and Decisions Log with Section 4 decisions
CRM PRD v0.2:
- Platform selected: EspoCRM (self-hosted on AWS)
- HubSpot and Attio documented as evaluated alternatives
- Full volunteer role model (mentor, co-mentor, SME)
- Mentoring lifecycle workflow documented
- Communication strategy: all through CRM
- Inactivity tracking and follow-up requirements
- SME request workflow
- NPS tracking requirements
- Scheduling decision deferred to Section 5

Decisions Log v0.2:
- Added D-009 through D-015
- Updated pending decisions tracker
</commit_message>
<xml_diff>
--- a/PRDs/CBM-Decisions-Log.docx
+++ b/PRDs/CBM-Decisions-Log.docx
@@ -46,7 +46,7 @@
           <w:sz w:val="22"/>
           <w:szCs w:val="22"/>
         </w:rPr>
-        <w:t xml:space="preserve">Version 0.1  |  Living Document  |  2025</w:t>
+        <w:t xml:space="preserve">Version 0.2  |  Living Document  |  2025</w:t>
       </w:r>
     </w:p>
     <w:p>
@@ -78,14 +78,6 @@
       </w:pPr>
       <w:r>
         <w:t xml:space="preserve">This is a living document that records every significant technology decision made by Cleveland Business Mentors. For each decision it captures: the options considered, the rationale for the choice made, and any conditions under which the decision should be revisited.</w:t>
-      </w:r>
-    </w:p>
-    <w:p>
-      <w:pPr>
-        <w:spacing w:after="120"/>
-      </w:pPr>
-      <w:r>
-        <w:t xml:space="preserve">This log exists to preserve institutional memory, support onboarding of future administrators, and ensure accountability and transparency in technology stewardship.</w:t>
       </w:r>
     </w:p>
     <w:p>
@@ -200,10 +192,10 @@
         </w:tblBorders>
       </w:tblPr>
       <w:tblGrid>
-        <w:gridCol w:w="1800"/>
-        <w:gridCol w:w="2200"/>
+        <w:gridCol w:w="800"/>
+        <w:gridCol w:w="1600"/>
         <w:gridCol w:w="2000"/>
-        <w:gridCol w:w="3360"/>
+        <w:gridCol w:w="4960"/>
       </w:tblGrid>
       <w:tr>
         <w:trPr>
@@ -211,7 +203,7 @@
         </w:trPr>
         <w:tc>
           <w:tcPr>
-            <w:tcW w:type="dxa" w:w="1800"/>
+            <w:tcW w:type="dxa" w:w="800"/>
             <w:tcBorders>
               <w:top w:val="single" w:color="CCCCCC" w:sz="1"/>
               <w:left w:val="single" w:color="CCCCCC" w:sz="1"/>
@@ -242,7 +234,7 @@
         </w:tc>
         <w:tc>
           <w:tcPr>
-            <w:tcW w:type="dxa" w:w="2200"/>
+            <w:tcW w:type="dxa" w:w="1600"/>
             <w:tcBorders>
               <w:top w:val="single" w:color="CCCCCC" w:sz="1"/>
               <w:left w:val="single" w:color="CCCCCC" w:sz="1"/>
@@ -267,7 +259,7 @@
                 <w:sz w:val="20"/>
                 <w:szCs w:val="20"/>
               </w:rPr>
-              <w:t xml:space="preserve">Decision</w:t>
+              <w:t xml:space="preserve">Domain</w:t>
             </w:r>
           </w:p>
         </w:tc>
@@ -304,7 +296,7 @@
         </w:tc>
         <w:tc>
           <w:tcPr>
-            <w:tcW w:type="dxa" w:w="3360"/>
+            <w:tcW w:type="dxa" w:w="4960"/>
             <w:tcBorders>
               <w:top w:val="single" w:color="CCCCCC" w:sz="1"/>
               <w:left w:val="single" w:color="CCCCCC" w:sz="1"/>
@@ -329,7 +321,7 @@
                 <w:sz w:val="20"/>
                 <w:szCs w:val="20"/>
               </w:rPr>
-              <w:t xml:space="preserve">Rationale / Notes</w:t>
+              <w:t xml:space="preserve">Decision &amp; Rationale</w:t>
             </w:r>
           </w:p>
         </w:tc>
@@ -337,7 +329,7 @@
       <w:tr>
         <w:tc>
           <w:tcPr>
-            <w:tcW w:type="dxa" w:w="1800"/>
+            <w:tcW w:type="dxa" w:w="800"/>
             <w:tcBorders>
               <w:top w:val="single" w:color="CCCCCC" w:sz="1"/>
               <w:left w:val="single" w:color="CCCCCC" w:sz="1"/>
@@ -365,30 +357,29 @@
         </w:tc>
         <w:tc>
           <w:tcPr>
-            <w:tcW w:type="dxa" w:w="2200"/>
-            <w:tcBorders>
-              <w:top w:val="single" w:color="CCCCCC" w:sz="1"/>
-              <w:left w:val="single" w:color="CCCCCC" w:sz="1"/>
-              <w:bottom w:val="single" w:color="CCCCCC" w:sz="1"/>
-              <w:right w:val="single" w:color="CCCCCC" w:sz="1"/>
-            </w:tcBorders>
-            <w:shd w:fill="FFFFFF" w:val="clear"/>
-            <w:tcMar>
-              <w:top w:type="dxa" w:w="80"/>
-              <w:left w:type="dxa" w:w="120"/>
-              <w:bottom w:type="dxa" w:w="80"/>
-              <w:right w:type="dxa" w:w="120"/>
-            </w:tcMar>
-          </w:tcPr>
-          <w:p>
-            <w:r>
-              <w:rPr>
-                <w:rFonts w:ascii="Arial" w:cs="Arial" w:eastAsia="Arial" w:hAnsi="Arial"/>
-                <w:sz w:val="20"/>
-                <w:szCs w:val="20"/>
-              </w:rPr>
-              <w:t xml:space="preserve">Hosting Platform
-(PROVISIONAL)</w:t>
+            <w:tcW w:type="dxa" w:w="1600"/>
+            <w:tcBorders>
+              <w:top w:val="single" w:color="CCCCCC" w:sz="1"/>
+              <w:left w:val="single" w:color="CCCCCC" w:sz="1"/>
+              <w:bottom w:val="single" w:color="CCCCCC" w:sz="1"/>
+              <w:right w:val="single" w:color="CCCCCC" w:sz="1"/>
+            </w:tcBorders>
+            <w:shd w:fill="FFFFFF" w:val="clear"/>
+            <w:tcMar>
+              <w:top w:type="dxa" w:w="80"/>
+              <w:left w:type="dxa" w:w="120"/>
+              <w:bottom w:type="dxa" w:w="80"/>
+              <w:right w:type="dxa" w:w="120"/>
+            </w:tcMar>
+          </w:tcPr>
+          <w:p>
+            <w:r>
+              <w:rPr>
+                <w:rFonts w:ascii="Arial" w:cs="Arial" w:eastAsia="Arial" w:hAnsi="Arial"/>
+                <w:sz w:val="20"/>
+                <w:szCs w:val="20"/>
+              </w:rPr>
+              <w:t xml:space="preserve">Hosting Platform</w:t>
             </w:r>
           </w:p>
         </w:tc>
@@ -416,35 +407,35 @@
                 <w:sz w:val="20"/>
                 <w:szCs w:val="20"/>
               </w:rPr>
-              <w:t xml:space="preserve">AWS, Google Cloud, Azure, DigitalOcean, self-hosted VPS</w:t>
-            </w:r>
-          </w:p>
-        </w:tc>
-        <w:tc>
-          <w:tcPr>
-            <w:tcW w:type="dxa" w:w="3360"/>
-            <w:tcBorders>
-              <w:top w:val="single" w:color="CCCCCC" w:sz="1"/>
-              <w:left w:val="single" w:color="CCCCCC" w:sz="1"/>
-              <w:bottom w:val="single" w:color="CCCCCC" w:sz="1"/>
-              <w:right w:val="single" w:color="CCCCCC" w:sz="1"/>
-            </w:tcBorders>
-            <w:shd w:fill="FFFFFF" w:val="clear"/>
-            <w:tcMar>
-              <w:top w:type="dxa" w:w="80"/>
-              <w:left w:type="dxa" w:w="120"/>
-              <w:bottom w:type="dxa" w:w="80"/>
-              <w:right w:type="dxa" w:w="120"/>
-            </w:tcMar>
-          </w:tcPr>
-          <w:p>
-            <w:r>
-              <w:rPr>
-                <w:rFonts w:ascii="Arial" w:cs="Arial" w:eastAsia="Arial" w:hAnsi="Arial"/>
-                <w:sz w:val="20"/>
-                <w:szCs w:val="20"/>
-              </w:rPr>
-              <w:t xml:space="preserve">AWS chosen for unified ecosystem (domain, hosting, CI/CD, CDN under one platform and billing). Tech admin comfortable with AWS. Cost manageable at CBM scale. Revisit if costs exceed budget threshold.</w:t>
+              <w:t xml:space="preserve">AWS, GCP, Azure, DigitalOcean, self-hosted VPS</w:t>
+            </w:r>
+          </w:p>
+        </w:tc>
+        <w:tc>
+          <w:tcPr>
+            <w:tcW w:type="dxa" w:w="4960"/>
+            <w:tcBorders>
+              <w:top w:val="single" w:color="CCCCCC" w:sz="1"/>
+              <w:left w:val="single" w:color="CCCCCC" w:sz="1"/>
+              <w:bottom w:val="single" w:color="CCCCCC" w:sz="1"/>
+              <w:right w:val="single" w:color="CCCCCC" w:sz="1"/>
+            </w:tcBorders>
+            <w:shd w:fill="FFFFFF" w:val="clear"/>
+            <w:tcMar>
+              <w:top w:type="dxa" w:w="80"/>
+              <w:left w:type="dxa" w:w="120"/>
+              <w:bottom w:type="dxa" w:w="80"/>
+              <w:right w:type="dxa" w:w="120"/>
+            </w:tcMar>
+          </w:tcPr>
+          <w:p>
+            <w:r>
+              <w:rPr>
+                <w:rFonts w:ascii="Arial" w:cs="Arial" w:eastAsia="Arial" w:hAnsi="Arial"/>
+                <w:sz w:val="20"/>
+                <w:szCs w:val="20"/>
+              </w:rPr>
+              <w:t xml:space="preserve">AWS SELECTED. Unified ecosystem (domain, hosting, CI/CD, CDN). Tech admin AWS-comfortable. Cost manageable at CBM scale. Revisit if costs exceed budget.</w:t>
             </w:r>
           </w:p>
         </w:tc>
@@ -452,7 +443,7 @@
       <w:tr>
         <w:tc>
           <w:tcPr>
-            <w:tcW w:type="dxa" w:w="1800"/>
+            <w:tcW w:type="dxa" w:w="800"/>
             <w:tcBorders>
               <w:top w:val="single" w:color="CCCCCC" w:sz="1"/>
               <w:left w:val="single" w:color="CCCCCC" w:sz="1"/>
@@ -480,7 +471,7 @@
         </w:tc>
         <w:tc>
           <w:tcPr>
-            <w:tcW w:type="dxa" w:w="2200"/>
+            <w:tcW w:type="dxa" w:w="1600"/>
             <w:tcBorders>
               <w:top w:val="single" w:color="CCCCCC" w:sz="1"/>
               <w:left w:val="single" w:color="CCCCCC" w:sz="1"/>
@@ -536,29 +527,29 @@
         </w:tc>
         <w:tc>
           <w:tcPr>
-            <w:tcW w:type="dxa" w:w="3360"/>
-            <w:tcBorders>
-              <w:top w:val="single" w:color="CCCCCC" w:sz="1"/>
-              <w:left w:val="single" w:color="CCCCCC" w:sz="1"/>
-              <w:bottom w:val="single" w:color="CCCCCC" w:sz="1"/>
-              <w:right w:val="single" w:color="CCCCCC" w:sz="1"/>
-            </w:tcBorders>
-            <w:shd w:fill="F2F2F2" w:val="clear"/>
-            <w:tcMar>
-              <w:top w:type="dxa" w:w="80"/>
-              <w:left w:type="dxa" w:w="120"/>
-              <w:bottom w:type="dxa" w:w="80"/>
-              <w:right w:type="dxa" w:w="120"/>
-            </w:tcMar>
-          </w:tcPr>
-          <w:p>
-            <w:r>
-              <w:rPr>
-                <w:rFonts w:ascii="Arial" w:cs="Arial" w:eastAsia="Arial" w:hAnsi="Arial"/>
-                <w:sz w:val="20"/>
-                <w:szCs w:val="20"/>
-              </w:rPr>
-              <w:t xml:space="preserve">AWS Route 53 chosen to stay within the AWS ecosystem. Unified access management via IAM. Integrated billing. Slightly higher cost than alternatives but justified by simplicity.</w:t>
+            <w:tcW w:type="dxa" w:w="4960"/>
+            <w:tcBorders>
+              <w:top w:val="single" w:color="CCCCCC" w:sz="1"/>
+              <w:left w:val="single" w:color="CCCCCC" w:sz="1"/>
+              <w:bottom w:val="single" w:color="CCCCCC" w:sz="1"/>
+              <w:right w:val="single" w:color="CCCCCC" w:sz="1"/>
+            </w:tcBorders>
+            <w:shd w:fill="F2F2F2" w:val="clear"/>
+            <w:tcMar>
+              <w:top w:type="dxa" w:w="80"/>
+              <w:left w:type="dxa" w:w="120"/>
+              <w:bottom w:type="dxa" w:w="80"/>
+              <w:right w:type="dxa" w:w="120"/>
+            </w:tcMar>
+          </w:tcPr>
+          <w:p>
+            <w:r>
+              <w:rPr>
+                <w:rFonts w:ascii="Arial" w:cs="Arial" w:eastAsia="Arial" w:hAnsi="Arial"/>
+                <w:sz w:val="20"/>
+                <w:szCs w:val="20"/>
+              </w:rPr>
+              <w:t xml:space="preserve">AWS Route 53 SELECTED. Stays within AWS ecosystem. Unified IAM access management. Integrated billing.</w:t>
             </w:r>
           </w:p>
         </w:tc>
@@ -566,7 +557,7 @@
       <w:tr>
         <w:tc>
           <w:tcPr>
-            <w:tcW w:type="dxa" w:w="1800"/>
+            <w:tcW w:type="dxa" w:w="800"/>
             <w:tcBorders>
               <w:top w:val="single" w:color="CCCCCC" w:sz="1"/>
               <w:left w:val="single" w:color="CCCCCC" w:sz="1"/>
@@ -594,30 +585,29 @@
         </w:tc>
         <w:tc>
           <w:tcPr>
-            <w:tcW w:type="dxa" w:w="2200"/>
-            <w:tcBorders>
-              <w:top w:val="single" w:color="CCCCCC" w:sz="1"/>
-              <w:left w:val="single" w:color="CCCCCC" w:sz="1"/>
-              <w:bottom w:val="single" w:color="CCCCCC" w:sz="1"/>
-              <w:right w:val="single" w:color="CCCCCC" w:sz="1"/>
-            </w:tcBorders>
-            <w:shd w:fill="FFFFFF" w:val="clear"/>
-            <w:tcMar>
-              <w:top w:type="dxa" w:w="80"/>
-              <w:left w:type="dxa" w:w="120"/>
-              <w:bottom w:type="dxa" w:w="80"/>
-              <w:right w:type="dxa" w:w="120"/>
-            </w:tcMar>
-          </w:tcPr>
-          <w:p>
-            <w:r>
-              <w:rPr>
-                <w:rFonts w:ascii="Arial" w:cs="Arial" w:eastAsia="Arial" w:hAnsi="Arial"/>
-                <w:sz w:val="20"/>
-                <w:szCs w:val="20"/>
-              </w:rPr>
-              <w:t xml:space="preserve">Email Platform
-(PROVISIONAL)</w:t>
+            <w:tcW w:type="dxa" w:w="1600"/>
+            <w:tcBorders>
+              <w:top w:val="single" w:color="CCCCCC" w:sz="1"/>
+              <w:left w:val="single" w:color="CCCCCC" w:sz="1"/>
+              <w:bottom w:val="single" w:color="CCCCCC" w:sz="1"/>
+              <w:right w:val="single" w:color="CCCCCC" w:sz="1"/>
+            </w:tcBorders>
+            <w:shd w:fill="FFFFFF" w:val="clear"/>
+            <w:tcMar>
+              <w:top w:type="dxa" w:w="80"/>
+              <w:left w:type="dxa" w:w="120"/>
+              <w:bottom w:type="dxa" w:w="80"/>
+              <w:right w:type="dxa" w:w="120"/>
+            </w:tcMar>
+          </w:tcPr>
+          <w:p>
+            <w:r>
+              <w:rPr>
+                <w:rFonts w:ascii="Arial" w:cs="Arial" w:eastAsia="Arial" w:hAnsi="Arial"/>
+                <w:sz w:val="20"/>
+                <w:szCs w:val="20"/>
+              </w:rPr>
+              <w:t xml:space="preserve">Email Platform (PROVISIONAL)</w:t>
             </w:r>
           </w:p>
         </w:tc>
@@ -645,35 +635,35 @@
                 <w:sz w:val="20"/>
                 <w:szCs w:val="20"/>
               </w:rPr>
-              <w:t xml:space="preserve">Google Workspace for Nonprofits, Proton Business, self-hosted (Mailcow/iRedMail)</w:t>
-            </w:r>
-          </w:p>
-        </w:tc>
-        <w:tc>
-          <w:tcPr>
-            <w:tcW w:type="dxa" w:w="3360"/>
-            <w:tcBorders>
-              <w:top w:val="single" w:color="CCCCCC" w:sz="1"/>
-              <w:left w:val="single" w:color="CCCCCC" w:sz="1"/>
-              <w:bottom w:val="single" w:color="CCCCCC" w:sz="1"/>
-              <w:right w:val="single" w:color="CCCCCC" w:sz="1"/>
-            </w:tcBorders>
-            <w:shd w:fill="FFFFFF" w:val="clear"/>
-            <w:tcMar>
-              <w:top w:type="dxa" w:w="80"/>
-              <w:left w:type="dxa" w:w="120"/>
-              <w:bottom w:type="dxa" w:w="80"/>
-              <w:right w:type="dxa" w:w="120"/>
-            </w:tcMar>
-          </w:tcPr>
-          <w:p>
-            <w:r>
-              <w:rPr>
-                <w:rFonts w:ascii="Arial" w:cs="Arial" w:eastAsia="Arial" w:hAnsi="Arial"/>
-                <w:sz w:val="20"/>
-                <w:szCs w:val="20"/>
-              </w:rPr>
-              <w:t xml:space="preserve">Google Workspace for Nonprofits chosen as provisional solution — free for 501(c)(3), familiar to most volunteers including seniors, includes Drive/Docs/Calendar. PROVISIONAL: May migrate to Proton or similar if CRM centralizes all client/mentor communication, reducing dependency on email platform.</w:t>
+              <w:t xml:space="preserve">Google Workspace for Nonprofits, Proton Business, self-hosted Mailcow/iRedMail</w:t>
+            </w:r>
+          </w:p>
+        </w:tc>
+        <w:tc>
+          <w:tcPr>
+            <w:tcW w:type="dxa" w:w="4960"/>
+            <w:tcBorders>
+              <w:top w:val="single" w:color="CCCCCC" w:sz="1"/>
+              <w:left w:val="single" w:color="CCCCCC" w:sz="1"/>
+              <w:bottom w:val="single" w:color="CCCCCC" w:sz="1"/>
+              <w:right w:val="single" w:color="CCCCCC" w:sz="1"/>
+            </w:tcBorders>
+            <w:shd w:fill="FFFFFF" w:val="clear"/>
+            <w:tcMar>
+              <w:top w:type="dxa" w:w="80"/>
+              <w:left w:type="dxa" w:w="120"/>
+              <w:bottom w:type="dxa" w:w="80"/>
+              <w:right w:type="dxa" w:w="120"/>
+            </w:tcMar>
+          </w:tcPr>
+          <w:p>
+            <w:r>
+              <w:rPr>
+                <w:rFonts w:ascii="Arial" w:cs="Arial" w:eastAsia="Arial" w:hAnsi="Arial"/>
+                <w:sz w:val="20"/>
+                <w:szCs w:val="20"/>
+              </w:rPr>
+              <w:t xml:space="preserve">Google Workspace for Nonprofits SELECTED (provisional). Free for 501(c)(3), familiar UI, includes Drive/Docs/Calendar. PROVISIONAL: May migrate to Proton if CRM centralizes all client/mentor communication, reducing email platform dependency.</w:t>
             </w:r>
           </w:p>
         </w:tc>
@@ -681,7 +671,7 @@
       <w:tr>
         <w:tc>
           <w:tcPr>
-            <w:tcW w:type="dxa" w:w="1800"/>
+            <w:tcW w:type="dxa" w:w="800"/>
             <w:tcBorders>
               <w:top w:val="single" w:color="CCCCCC" w:sz="1"/>
               <w:left w:val="single" w:color="CCCCCC" w:sz="1"/>
@@ -709,7 +699,7 @@
         </w:tc>
         <w:tc>
           <w:tcPr>
-            <w:tcW w:type="dxa" w:w="2200"/>
+            <w:tcW w:type="dxa" w:w="1600"/>
             <w:tcBorders>
               <w:top w:val="single" w:color="CCCCCC" w:sz="1"/>
               <w:left w:val="single" w:color="CCCCCC" w:sz="1"/>
@@ -759,35 +749,35 @@
                 <w:sz w:val="20"/>
                 <w:szCs w:val="20"/>
               </w:rPr>
-              <w:t xml:space="preserve">WordPress (self-hosted), Drupal, Static HTML/CSS/JS</w:t>
-            </w:r>
-          </w:p>
-        </w:tc>
-        <w:tc>
-          <w:tcPr>
-            <w:tcW w:type="dxa" w:w="3360"/>
-            <w:tcBorders>
-              <w:top w:val="single" w:color="CCCCCC" w:sz="1"/>
-              <w:left w:val="single" w:color="CCCCCC" w:sz="1"/>
-              <w:bottom w:val="single" w:color="CCCCCC" w:sz="1"/>
-              <w:right w:val="single" w:color="CCCCCC" w:sz="1"/>
-            </w:tcBorders>
-            <w:shd w:fill="F2F2F2" w:val="clear"/>
-            <w:tcMar>
-              <w:top w:type="dxa" w:w="80"/>
-              <w:left w:type="dxa" w:w="120"/>
-              <w:bottom w:type="dxa" w:w="80"/>
-              <w:right w:type="dxa" w:w="120"/>
-            </w:tcMar>
-          </w:tcPr>
-          <w:p>
-            <w:r>
-              <w:rPr>
-                <w:rFonts w:ascii="Arial" w:cs="Arial" w:eastAsia="Arial" w:hAnsi="Arial"/>
-                <w:sz w:val="20"/>
-                <w:szCs w:val="20"/>
-              </w:rPr>
-              <w:t xml:space="preserve">Static HTML/CSS/JavaScript chosen. Built with Claude Code assistance. Advantages: no CMS overhead to patch, extremely fast, cheap to host on S3, full control, no plugin conflicts. Aligns with developer capability of tech admin.</w:t>
+              <w:t xml:space="preserve">WordPress, Drupal, Static HTML/CSS/JS</w:t>
+            </w:r>
+          </w:p>
+        </w:tc>
+        <w:tc>
+          <w:tcPr>
+            <w:tcW w:type="dxa" w:w="4960"/>
+            <w:tcBorders>
+              <w:top w:val="single" w:color="CCCCCC" w:sz="1"/>
+              <w:left w:val="single" w:color="CCCCCC" w:sz="1"/>
+              <w:bottom w:val="single" w:color="CCCCCC" w:sz="1"/>
+              <w:right w:val="single" w:color="CCCCCC" w:sz="1"/>
+            </w:tcBorders>
+            <w:shd w:fill="F2F2F2" w:val="clear"/>
+            <w:tcMar>
+              <w:top w:type="dxa" w:w="80"/>
+              <w:left w:type="dxa" w:w="120"/>
+              <w:bottom w:type="dxa" w:w="80"/>
+              <w:right w:type="dxa" w:w="120"/>
+            </w:tcMar>
+          </w:tcPr>
+          <w:p>
+            <w:r>
+              <w:rPr>
+                <w:rFonts w:ascii="Arial" w:cs="Arial" w:eastAsia="Arial" w:hAnsi="Arial"/>
+                <w:sz w:val="20"/>
+                <w:szCs w:val="20"/>
+              </w:rPr>
+              <w:t xml:space="preserve">Static HTML/CSS/JS SELECTED. Built with Claude Code. No CMS overhead, fast, cheap on S3, full control. Aligns with tech admin capability.</w:t>
             </w:r>
           </w:p>
         </w:tc>
@@ -795,7 +785,7 @@
       <w:tr>
         <w:tc>
           <w:tcPr>
-            <w:tcW w:type="dxa" w:w="1800"/>
+            <w:tcW w:type="dxa" w:w="800"/>
             <w:tcBorders>
               <w:top w:val="single" w:color="CCCCCC" w:sz="1"/>
               <w:left w:val="single" w:color="CCCCCC" w:sz="1"/>
@@ -823,29 +813,29 @@
         </w:tc>
         <w:tc>
           <w:tcPr>
-            <w:tcW w:type="dxa" w:w="2200"/>
-            <w:tcBorders>
-              <w:top w:val="single" w:color="CCCCCC" w:sz="1"/>
-              <w:left w:val="single" w:color="CCCCCC" w:sz="1"/>
-              <w:bottom w:val="single" w:color="CCCCCC" w:sz="1"/>
-              <w:right w:val="single" w:color="CCCCCC" w:sz="1"/>
-            </w:tcBorders>
-            <w:shd w:fill="FFFFFF" w:val="clear"/>
-            <w:tcMar>
-              <w:top w:type="dxa" w:w="80"/>
-              <w:left w:type="dxa" w:w="120"/>
-              <w:bottom w:type="dxa" w:w="80"/>
-              <w:right w:type="dxa" w:w="120"/>
-            </w:tcMar>
-          </w:tcPr>
-          <w:p>
-            <w:r>
-              <w:rPr>
-                <w:rFonts w:ascii="Arial" w:cs="Arial" w:eastAsia="Arial" w:hAnsi="Arial"/>
-                <w:sz w:val="20"/>
-                <w:szCs w:val="20"/>
-              </w:rPr>
-              <w:t xml:space="preserve">Website Hosting Architecture</w:t>
+            <w:tcW w:type="dxa" w:w="1600"/>
+            <w:tcBorders>
+              <w:top w:val="single" w:color="CCCCCC" w:sz="1"/>
+              <w:left w:val="single" w:color="CCCCCC" w:sz="1"/>
+              <w:bottom w:val="single" w:color="CCCCCC" w:sz="1"/>
+              <w:right w:val="single" w:color="CCCCCC" w:sz="1"/>
+            </w:tcBorders>
+            <w:shd w:fill="FFFFFF" w:val="clear"/>
+            <w:tcMar>
+              <w:top w:type="dxa" w:w="80"/>
+              <w:left w:type="dxa" w:w="120"/>
+              <w:bottom w:type="dxa" w:w="80"/>
+              <w:right w:type="dxa" w:w="120"/>
+            </w:tcMar>
+          </w:tcPr>
+          <w:p>
+            <w:r>
+              <w:rPr>
+                <w:rFonts w:ascii="Arial" w:cs="Arial" w:eastAsia="Arial" w:hAnsi="Arial"/>
+                <w:sz w:val="20"/>
+                <w:szCs w:val="20"/>
+              </w:rPr>
+              <w:t xml:space="preserve">Website Hosting</w:t>
             </w:r>
           </w:p>
         </w:tc>
@@ -879,29 +869,29 @@
         </w:tc>
         <w:tc>
           <w:tcPr>
-            <w:tcW w:type="dxa" w:w="3360"/>
-            <w:tcBorders>
-              <w:top w:val="single" w:color="CCCCCC" w:sz="1"/>
-              <w:left w:val="single" w:color="CCCCCC" w:sz="1"/>
-              <w:bottom w:val="single" w:color="CCCCCC" w:sz="1"/>
-              <w:right w:val="single" w:color="CCCCCC" w:sz="1"/>
-            </w:tcBorders>
-            <w:shd w:fill="FFFFFF" w:val="clear"/>
-            <w:tcMar>
-              <w:top w:type="dxa" w:w="80"/>
-              <w:left w:type="dxa" w:w="120"/>
-              <w:bottom w:type="dxa" w:w="80"/>
-              <w:right w:type="dxa" w:w="120"/>
-            </w:tcMar>
-          </w:tcPr>
-          <w:p>
-            <w:r>
-              <w:rPr>
-                <w:rFonts w:ascii="Arial" w:cs="Arial" w:eastAsia="Arial" w:hAnsi="Arial"/>
-                <w:sz w:val="20"/>
-                <w:szCs w:val="20"/>
-              </w:rPr>
-              <w:t xml:space="preserve">AWS S3 + CloudFront chosen. Natural fit with AWS ecosystem. Negligible cost at CBM scale. CloudFront provides CDN and SSL. Consistent with overall AWS platform decision.</w:t>
+            <w:tcW w:type="dxa" w:w="4960"/>
+            <w:tcBorders>
+              <w:top w:val="single" w:color="CCCCCC" w:sz="1"/>
+              <w:left w:val="single" w:color="CCCCCC" w:sz="1"/>
+              <w:bottom w:val="single" w:color="CCCCCC" w:sz="1"/>
+              <w:right w:val="single" w:color="CCCCCC" w:sz="1"/>
+            </w:tcBorders>
+            <w:shd w:fill="FFFFFF" w:val="clear"/>
+            <w:tcMar>
+              <w:top w:type="dxa" w:w="80"/>
+              <w:left w:type="dxa" w:w="120"/>
+              <w:bottom w:type="dxa" w:w="80"/>
+              <w:right w:type="dxa" w:w="120"/>
+            </w:tcMar>
+          </w:tcPr>
+          <w:p>
+            <w:r>
+              <w:rPr>
+                <w:rFonts w:ascii="Arial" w:cs="Arial" w:eastAsia="Arial" w:hAnsi="Arial"/>
+                <w:sz w:val="20"/>
+                <w:szCs w:val="20"/>
+              </w:rPr>
+              <w:t xml:space="preserve">AWS S3 + CloudFront SELECTED. Natural AWS ecosystem fit. Negligible cost. CloudFront provides CDN and SSL.</w:t>
             </w:r>
           </w:p>
         </w:tc>
@@ -909,7 +899,7 @@
       <w:tr>
         <w:tc>
           <w:tcPr>
-            <w:tcW w:type="dxa" w:w="1800"/>
+            <w:tcW w:type="dxa" w:w="800"/>
             <w:tcBorders>
               <w:top w:val="single" w:color="CCCCCC" w:sz="1"/>
               <w:left w:val="single" w:color="CCCCCC" w:sz="1"/>
@@ -937,7 +927,7 @@
         </w:tc>
         <w:tc>
           <w:tcPr>
-            <w:tcW w:type="dxa" w:w="2200"/>
+            <w:tcW w:type="dxa" w:w="1600"/>
             <w:tcBorders>
               <w:top w:val="single" w:color="CCCCCC" w:sz="1"/>
               <w:left w:val="single" w:color="CCCCCC" w:sz="1"/>
@@ -987,35 +977,35 @@
                 <w:sz w:val="20"/>
                 <w:szCs w:val="20"/>
               </w:rPr>
-              <w:t xml:space="preserve">AWS CodePipeline + CodeCommit, GitHub Actions + GitHub, GitLab CI</w:t>
-            </w:r>
-          </w:p>
-        </w:tc>
-        <w:tc>
-          <w:tcPr>
-            <w:tcW w:type="dxa" w:w="3360"/>
-            <w:tcBorders>
-              <w:top w:val="single" w:color="CCCCCC" w:sz="1"/>
-              <w:left w:val="single" w:color="CCCCCC" w:sz="1"/>
-              <w:bottom w:val="single" w:color="CCCCCC" w:sz="1"/>
-              <w:right w:val="single" w:color="CCCCCC" w:sz="1"/>
-            </w:tcBorders>
-            <w:shd w:fill="F2F2F2" w:val="clear"/>
-            <w:tcMar>
-              <w:top w:type="dxa" w:w="80"/>
-              <w:left w:type="dxa" w:w="120"/>
-              <w:bottom w:type="dxa" w:w="80"/>
-              <w:right w:type="dxa" w:w="120"/>
-            </w:tcMar>
-          </w:tcPr>
-          <w:p>
-            <w:r>
-              <w:rPr>
-                <w:rFonts w:ascii="Arial" w:cs="Arial" w:eastAsia="Arial" w:hAnsi="Arial"/>
-                <w:sz w:val="20"/>
-                <w:szCs w:val="20"/>
-              </w:rPr>
-              <w:t xml:space="preserve">AWS CodePipeline + AWS CodeCommit chosen to stay within single AWS ecosystem. Unified IAM access control. Integrated billing. Allows future contributors to submit changes via pull requests reviewed by tech admin.</w:t>
+              <w:t xml:space="preserve">AWS CodePipeline + CodeCommit, GitHub Actions, GitLab CI</w:t>
+            </w:r>
+          </w:p>
+        </w:tc>
+        <w:tc>
+          <w:tcPr>
+            <w:tcW w:type="dxa" w:w="4960"/>
+            <w:tcBorders>
+              <w:top w:val="single" w:color="CCCCCC" w:sz="1"/>
+              <w:left w:val="single" w:color="CCCCCC" w:sz="1"/>
+              <w:bottom w:val="single" w:color="CCCCCC" w:sz="1"/>
+              <w:right w:val="single" w:color="CCCCCC" w:sz="1"/>
+            </w:tcBorders>
+            <w:shd w:fill="F2F2F2" w:val="clear"/>
+            <w:tcMar>
+              <w:top w:type="dxa" w:w="80"/>
+              <w:left w:type="dxa" w:w="120"/>
+              <w:bottom w:type="dxa" w:w="80"/>
+              <w:right w:type="dxa" w:w="120"/>
+            </w:tcMar>
+          </w:tcPr>
+          <w:p>
+            <w:r>
+              <w:rPr>
+                <w:rFonts w:ascii="Arial" w:cs="Arial" w:eastAsia="Arial" w:hAnsi="Arial"/>
+                <w:sz w:val="20"/>
+                <w:szCs w:val="20"/>
+              </w:rPr>
+              <w:t xml:space="preserve">AWS CodePipeline + CodeCommit SELECTED. Single AWS ecosystem. Unified IAM. Future contributors submit changes via pull requests reviewed by tech admin.</w:t>
             </w:r>
           </w:p>
         </w:tc>
@@ -1023,7 +1013,7 @@
       <w:tr>
         <w:tc>
           <w:tcPr>
-            <w:tcW w:type="dxa" w:w="1800"/>
+            <w:tcW w:type="dxa" w:w="800"/>
             <w:tcBorders>
               <w:top w:val="single" w:color="CCCCCC" w:sz="1"/>
               <w:left w:val="single" w:color="CCCCCC" w:sz="1"/>
@@ -1051,7 +1041,7 @@
         </w:tc>
         <w:tc>
           <w:tcPr>
-            <w:tcW w:type="dxa" w:w="2200"/>
+            <w:tcW w:type="dxa" w:w="1600"/>
             <w:tcBorders>
               <w:top w:val="single" w:color="CCCCCC" w:sz="1"/>
               <w:left w:val="single" w:color="CCCCCC" w:sz="1"/>
@@ -1101,35 +1091,35 @@
                 <w:sz w:val="20"/>
                 <w:szCs w:val="20"/>
               </w:rPr>
-              <w:t xml:space="preserve">Embedded third-party form tools, CRM-native forms, custom API</w:t>
-            </w:r>
-          </w:p>
-        </w:tc>
-        <w:tc>
-          <w:tcPr>
-            <w:tcW w:type="dxa" w:w="3360"/>
-            <w:tcBorders>
-              <w:top w:val="single" w:color="CCCCCC" w:sz="1"/>
-              <w:left w:val="single" w:color="CCCCCC" w:sz="1"/>
-              <w:bottom w:val="single" w:color="CCCCCC" w:sz="1"/>
-              <w:right w:val="single" w:color="CCCCCC" w:sz="1"/>
-            </w:tcBorders>
-            <w:shd w:fill="FFFFFF" w:val="clear"/>
-            <w:tcMar>
-              <w:top w:type="dxa" w:w="80"/>
-              <w:left w:type="dxa" w:w="120"/>
-              <w:bottom w:type="dxa" w:w="80"/>
-              <w:right w:type="dxa" w:w="120"/>
-            </w:tcMar>
-          </w:tcPr>
-          <w:p>
-            <w:r>
-              <w:rPr>
-                <w:rFonts w:ascii="Arial" w:cs="Arial" w:eastAsia="Arial" w:hAnsi="Arial"/>
-                <w:sz w:val="20"/>
-                <w:szCs w:val="20"/>
-              </w:rPr>
-              <w:t xml:space="preserve">CRM-native forms chosen. Form submissions go directly into CRM with no middleware. Client intake, volunteer signup, and workshop registration become CRM records automatically. Eliminates data leakage across disconnected systems. CRM selection must support this requirement.</w:t>
+              <w:t xml:space="preserve">Third-party form tools, CRM-native forms, custom API</w:t>
+            </w:r>
+          </w:p>
+        </w:tc>
+        <w:tc>
+          <w:tcPr>
+            <w:tcW w:type="dxa" w:w="4960"/>
+            <w:tcBorders>
+              <w:top w:val="single" w:color="CCCCCC" w:sz="1"/>
+              <w:left w:val="single" w:color="CCCCCC" w:sz="1"/>
+              <w:bottom w:val="single" w:color="CCCCCC" w:sz="1"/>
+              <w:right w:val="single" w:color="CCCCCC" w:sz="1"/>
+            </w:tcBorders>
+            <w:shd w:fill="FFFFFF" w:val="clear"/>
+            <w:tcMar>
+              <w:top w:type="dxa" w:w="80"/>
+              <w:left w:type="dxa" w:w="120"/>
+              <w:bottom w:type="dxa" w:w="80"/>
+              <w:right w:type="dxa" w:w="120"/>
+            </w:tcMar>
+          </w:tcPr>
+          <w:p>
+            <w:r>
+              <w:rPr>
+                <w:rFonts w:ascii="Arial" w:cs="Arial" w:eastAsia="Arial" w:hAnsi="Arial"/>
+                <w:sz w:val="20"/>
+                <w:szCs w:val="20"/>
+              </w:rPr>
+              <w:t xml:space="preserve">CRM-native forms SELECTED. Submissions go directly into CRM. No middleware. All intake, volunteer signup, and event registration become CRM records automatically.</w:t>
             </w:r>
           </w:p>
         </w:tc>
@@ -1137,7 +1127,7 @@
       <w:tr>
         <w:tc>
           <w:tcPr>
-            <w:tcW w:type="dxa" w:w="1800"/>
+            <w:tcW w:type="dxa" w:w="800"/>
             <w:tcBorders>
               <w:top w:val="single" w:color="CCCCCC" w:sz="1"/>
               <w:left w:val="single" w:color="CCCCCC" w:sz="1"/>
@@ -1165,7 +1155,7 @@
         </w:tc>
         <w:tc>
           <w:tcPr>
-            <w:tcW w:type="dxa" w:w="2200"/>
+            <w:tcW w:type="dxa" w:w="1600"/>
             <w:tcBorders>
               <w:top w:val="single" w:color="CCCCCC" w:sz="1"/>
               <w:left w:val="single" w:color="CCCCCC" w:sz="1"/>
@@ -1221,29 +1211,827 @@
         </w:tc>
         <w:tc>
           <w:tcPr>
-            <w:tcW w:type="dxa" w:w="3360"/>
-            <w:tcBorders>
-              <w:top w:val="single" w:color="CCCCCC" w:sz="1"/>
-              <w:left w:val="single" w:color="CCCCCC" w:sz="1"/>
-              <w:bottom w:val="single" w:color="CCCCCC" w:sz="1"/>
-              <w:right w:val="single" w:color="CCCCCC" w:sz="1"/>
-            </w:tcBorders>
-            <w:shd w:fill="F2F2F2" w:val="clear"/>
-            <w:tcMar>
-              <w:top w:type="dxa" w:w="80"/>
-              <w:left w:type="dxa" w:w="120"/>
-              <w:bottom w:type="dxa" w:w="80"/>
-              <w:right w:type="dxa" w:w="120"/>
-            </w:tcMar>
-          </w:tcPr>
-          <w:p>
-            <w:r>
-              <w:rPr>
-                <w:rFonts w:ascii="Arial" w:cs="Arial" w:eastAsia="Arial" w:hAnsi="Arial"/>
-                <w:sz w:val="20"/>
-                <w:szCs w:val="20"/>
-              </w:rPr>
-              <w:t xml:space="preserve">GitHub chosen for technology planning documents (PRDs, Decisions Log). GitHub renders documents accessibly for board members without AWS credentials. AWS CodeCommit reserved for website source code. Public repository for transparency.</w:t>
+            <w:tcW w:type="dxa" w:w="4960"/>
+            <w:tcBorders>
+              <w:top w:val="single" w:color="CCCCCC" w:sz="1"/>
+              <w:left w:val="single" w:color="CCCCCC" w:sz="1"/>
+              <w:bottom w:val="single" w:color="CCCCCC" w:sz="1"/>
+              <w:right w:val="single" w:color="CCCCCC" w:sz="1"/>
+            </w:tcBorders>
+            <w:shd w:fill="F2F2F2" w:val="clear"/>
+            <w:tcMar>
+              <w:top w:type="dxa" w:w="80"/>
+              <w:left w:type="dxa" w:w="120"/>
+              <w:bottom w:type="dxa" w:w="80"/>
+              <w:right w:type="dxa" w:w="120"/>
+            </w:tcMar>
+          </w:tcPr>
+          <w:p>
+            <w:r>
+              <w:rPr>
+                <w:rFonts w:ascii="Arial" w:cs="Arial" w:eastAsia="Arial" w:hAnsi="Arial"/>
+                <w:sz w:val="20"/>
+                <w:szCs w:val="20"/>
+              </w:rPr>
+              <w:t xml:space="preserve">GitHub SELECTED for planning documents (PRDs, Decisions Log). Accessible to board without AWS credentials. AWS CodeCommit reserved for website source code.</w:t>
+            </w:r>
+          </w:p>
+        </w:tc>
+      </w:tr>
+      <w:tr>
+        <w:tc>
+          <w:tcPr>
+            <w:tcW w:type="dxa" w:w="800"/>
+            <w:tcBorders>
+              <w:top w:val="single" w:color="CCCCCC" w:sz="1"/>
+              <w:left w:val="single" w:color="CCCCCC" w:sz="1"/>
+              <w:bottom w:val="single" w:color="CCCCCC" w:sz="1"/>
+              <w:right w:val="single" w:color="CCCCCC" w:sz="1"/>
+            </w:tcBorders>
+            <w:shd w:fill="FFFFFF" w:val="clear"/>
+            <w:tcMar>
+              <w:top w:type="dxa" w:w="80"/>
+              <w:left w:type="dxa" w:w="120"/>
+              <w:bottom w:type="dxa" w:w="80"/>
+              <w:right w:type="dxa" w:w="120"/>
+            </w:tcMar>
+          </w:tcPr>
+          <w:p>
+            <w:r>
+              <w:rPr>
+                <w:rFonts w:ascii="Arial" w:cs="Arial" w:eastAsia="Arial" w:hAnsi="Arial"/>
+                <w:sz w:val="20"/>
+                <w:szCs w:val="20"/>
+              </w:rPr>
+              <w:t xml:space="preserve">D-009</w:t>
+            </w:r>
+          </w:p>
+        </w:tc>
+        <w:tc>
+          <w:tcPr>
+            <w:tcW w:type="dxa" w:w="1600"/>
+            <w:tcBorders>
+              <w:top w:val="single" w:color="CCCCCC" w:sz="1"/>
+              <w:left w:val="single" w:color="CCCCCC" w:sz="1"/>
+              <w:bottom w:val="single" w:color="CCCCCC" w:sz="1"/>
+              <w:right w:val="single" w:color="CCCCCC" w:sz="1"/>
+            </w:tcBorders>
+            <w:shd w:fill="FFFFFF" w:val="clear"/>
+            <w:tcMar>
+              <w:top w:type="dxa" w:w="80"/>
+              <w:left w:type="dxa" w:w="120"/>
+              <w:bottom w:type="dxa" w:w="80"/>
+              <w:right w:type="dxa" w:w="120"/>
+            </w:tcMar>
+          </w:tcPr>
+          <w:p>
+            <w:r>
+              <w:rPr>
+                <w:rFonts w:ascii="Arial" w:cs="Arial" w:eastAsia="Arial" w:hAnsi="Arial"/>
+                <w:sz w:val="20"/>
+                <w:szCs w:val="20"/>
+              </w:rPr>
+              <w:t xml:space="preserve">CRM Platform</w:t>
+            </w:r>
+          </w:p>
+        </w:tc>
+        <w:tc>
+          <w:tcPr>
+            <w:tcW w:type="dxa" w:w="2000"/>
+            <w:tcBorders>
+              <w:top w:val="single" w:color="CCCCCC" w:sz="1"/>
+              <w:left w:val="single" w:color="CCCCCC" w:sz="1"/>
+              <w:bottom w:val="single" w:color="CCCCCC" w:sz="1"/>
+              <w:right w:val="single" w:color="CCCCCC" w:sz="1"/>
+            </w:tcBorders>
+            <w:shd w:fill="FFFFFF" w:val="clear"/>
+            <w:tcMar>
+              <w:top w:type="dxa" w:w="80"/>
+              <w:left w:type="dxa" w:w="120"/>
+              <w:bottom w:type="dxa" w:w="80"/>
+              <w:right w:type="dxa" w:w="120"/>
+            </w:tcMar>
+          </w:tcPr>
+          <w:p>
+            <w:r>
+              <w:rPr>
+                <w:rFonts w:ascii="Arial" w:cs="Arial" w:eastAsia="Arial" w:hAnsi="Arial"/>
+                <w:sz w:val="20"/>
+                <w:szCs w:val="20"/>
+              </w:rPr>
+              <w:t xml:space="preserve">EspoCRM, HubSpot, Attio, CiviCRM</w:t>
+            </w:r>
+          </w:p>
+        </w:tc>
+        <w:tc>
+          <w:tcPr>
+            <w:tcW w:type="dxa" w:w="4960"/>
+            <w:tcBorders>
+              <w:top w:val="single" w:color="CCCCCC" w:sz="1"/>
+              <w:left w:val="single" w:color="CCCCCC" w:sz="1"/>
+              <w:bottom w:val="single" w:color="CCCCCC" w:sz="1"/>
+              <w:right w:val="single" w:color="CCCCCC" w:sz="1"/>
+            </w:tcBorders>
+            <w:shd w:fill="FFFFFF" w:val="clear"/>
+            <w:tcMar>
+              <w:top w:type="dxa" w:w="80"/>
+              <w:left w:type="dxa" w:w="120"/>
+              <w:bottom w:type="dxa" w:w="80"/>
+              <w:right w:type="dxa" w:w="120"/>
+            </w:tcMar>
+          </w:tcPr>
+          <w:p>
+            <w:r>
+              <w:rPr>
+                <w:rFonts w:ascii="Arial" w:cs="Arial" w:eastAsia="Arial" w:hAnsi="Arial"/>
+                <w:sz w:val="20"/>
+                <w:szCs w:val="20"/>
+              </w:rPr>
+              <w:t xml:space="preserve">EspoCRM SELECTED. FOSS, self-hosted on AWS, fully customizable data model, native email threading with inbound reply capture, workflow automation, REST API, no per-seat costs, modern senior-accessible UI. HubSpot evaluated but not selected (cost, not FOSS, not self-hosted, minimal volunteer familiarity). Attio retained as future fallback.</w:t>
+            </w:r>
+          </w:p>
+        </w:tc>
+      </w:tr>
+      <w:tr>
+        <w:tc>
+          <w:tcPr>
+            <w:tcW w:type="dxa" w:w="800"/>
+            <w:tcBorders>
+              <w:top w:val="single" w:color="CCCCCC" w:sz="1"/>
+              <w:left w:val="single" w:color="CCCCCC" w:sz="1"/>
+              <w:bottom w:val="single" w:color="CCCCCC" w:sz="1"/>
+              <w:right w:val="single" w:color="CCCCCC" w:sz="1"/>
+            </w:tcBorders>
+            <w:shd w:fill="F2F2F2" w:val="clear"/>
+            <w:tcMar>
+              <w:top w:type="dxa" w:w="80"/>
+              <w:left w:type="dxa" w:w="120"/>
+              <w:bottom w:type="dxa" w:w="80"/>
+              <w:right w:type="dxa" w:w="120"/>
+            </w:tcMar>
+          </w:tcPr>
+          <w:p>
+            <w:r>
+              <w:rPr>
+                <w:rFonts w:ascii="Arial" w:cs="Arial" w:eastAsia="Arial" w:hAnsi="Arial"/>
+                <w:sz w:val="20"/>
+                <w:szCs w:val="20"/>
+              </w:rPr>
+              <w:t xml:space="preserve">D-010</w:t>
+            </w:r>
+          </w:p>
+        </w:tc>
+        <w:tc>
+          <w:tcPr>
+            <w:tcW w:type="dxa" w:w="1600"/>
+            <w:tcBorders>
+              <w:top w:val="single" w:color="CCCCCC" w:sz="1"/>
+              <w:left w:val="single" w:color="CCCCCC" w:sz="1"/>
+              <w:bottom w:val="single" w:color="CCCCCC" w:sz="1"/>
+              <w:right w:val="single" w:color="CCCCCC" w:sz="1"/>
+            </w:tcBorders>
+            <w:shd w:fill="F2F2F2" w:val="clear"/>
+            <w:tcMar>
+              <w:top w:type="dxa" w:w="80"/>
+              <w:left w:type="dxa" w:w="120"/>
+              <w:bottom w:type="dxa" w:w="80"/>
+              <w:right w:type="dxa" w:w="120"/>
+            </w:tcMar>
+          </w:tcPr>
+          <w:p>
+            <w:r>
+              <w:rPr>
+                <w:rFonts w:ascii="Arial" w:cs="Arial" w:eastAsia="Arial" w:hAnsi="Arial"/>
+                <w:sz w:val="20"/>
+                <w:szCs w:val="20"/>
+              </w:rPr>
+              <w:t xml:space="preserve">CRM Communication Strategy</w:t>
+            </w:r>
+          </w:p>
+        </w:tc>
+        <w:tc>
+          <w:tcPr>
+            <w:tcW w:type="dxa" w:w="2000"/>
+            <w:tcBorders>
+              <w:top w:val="single" w:color="CCCCCC" w:sz="1"/>
+              <w:left w:val="single" w:color="CCCCCC" w:sz="1"/>
+              <w:bottom w:val="single" w:color="CCCCCC" w:sz="1"/>
+              <w:right w:val="single" w:color="CCCCCC" w:sz="1"/>
+            </w:tcBorders>
+            <w:shd w:fill="F2F2F2" w:val="clear"/>
+            <w:tcMar>
+              <w:top w:type="dxa" w:w="80"/>
+              <w:left w:type="dxa" w:w="120"/>
+              <w:bottom w:type="dxa" w:w="80"/>
+              <w:right w:type="dxa" w:w="120"/>
+            </w:tcMar>
+          </w:tcPr>
+          <w:p>
+            <w:r>
+              <w:rPr>
+                <w:rFonts w:ascii="Arial" w:cs="Arial" w:eastAsia="Arial" w:hAnsi="Arial"/>
+                <w:sz w:val="20"/>
+                <w:szCs w:val="20"/>
+              </w:rPr>
+              <w:t xml:space="preserve">Personal email, organizational email, CRM-native</w:t>
+            </w:r>
+          </w:p>
+        </w:tc>
+        <w:tc>
+          <w:tcPr>
+            <w:tcW w:type="dxa" w:w="4960"/>
+            <w:tcBorders>
+              <w:top w:val="single" w:color="CCCCCC" w:sz="1"/>
+              <w:left w:val="single" w:color="CCCCCC" w:sz="1"/>
+              <w:bottom w:val="single" w:color="CCCCCC" w:sz="1"/>
+              <w:right w:val="single" w:color="CCCCCC" w:sz="1"/>
+            </w:tcBorders>
+            <w:shd w:fill="F2F2F2" w:val="clear"/>
+            <w:tcMar>
+              <w:top w:type="dxa" w:w="80"/>
+              <w:left w:type="dxa" w:w="120"/>
+              <w:bottom w:type="dxa" w:w="80"/>
+              <w:right w:type="dxa" w:w="120"/>
+            </w:tcMar>
+          </w:tcPr>
+          <w:p>
+            <w:r>
+              <w:rPr>
+                <w:rFonts w:ascii="Arial" w:cs="Arial" w:eastAsia="Arial" w:hAnsi="Arial"/>
+                <w:sz w:val="20"/>
+                <w:szCs w:val="20"/>
+              </w:rPr>
+              <w:t xml:space="preserve">All mentor-client communication through CRM SELECTED. Enables inactivity tracking, maintains confidentiality, provides full audit trail. Clients interact via email reply or form link — no CRM login required.</w:t>
+            </w:r>
+          </w:p>
+        </w:tc>
+      </w:tr>
+      <w:tr>
+        <w:tc>
+          <w:tcPr>
+            <w:tcW w:type="dxa" w:w="800"/>
+            <w:tcBorders>
+              <w:top w:val="single" w:color="CCCCCC" w:sz="1"/>
+              <w:left w:val="single" w:color="CCCCCC" w:sz="1"/>
+              <w:bottom w:val="single" w:color="CCCCCC" w:sz="1"/>
+              <w:right w:val="single" w:color="CCCCCC" w:sz="1"/>
+            </w:tcBorders>
+            <w:shd w:fill="FFFFFF" w:val="clear"/>
+            <w:tcMar>
+              <w:top w:type="dxa" w:w="80"/>
+              <w:left w:type="dxa" w:w="120"/>
+              <w:bottom w:type="dxa" w:w="80"/>
+              <w:right w:type="dxa" w:w="120"/>
+            </w:tcMar>
+          </w:tcPr>
+          <w:p>
+            <w:r>
+              <w:rPr>
+                <w:rFonts w:ascii="Arial" w:cs="Arial" w:eastAsia="Arial" w:hAnsi="Arial"/>
+                <w:sz w:val="20"/>
+                <w:szCs w:val="20"/>
+              </w:rPr>
+              <w:t xml:space="preserve">D-011</w:t>
+            </w:r>
+          </w:p>
+        </w:tc>
+        <w:tc>
+          <w:tcPr>
+            <w:tcW w:type="dxa" w:w="1600"/>
+            <w:tcBorders>
+              <w:top w:val="single" w:color="CCCCCC" w:sz="1"/>
+              <w:left w:val="single" w:color="CCCCCC" w:sz="1"/>
+              <w:bottom w:val="single" w:color="CCCCCC" w:sz="1"/>
+              <w:right w:val="single" w:color="CCCCCC" w:sz="1"/>
+            </w:tcBorders>
+            <w:shd w:fill="FFFFFF" w:val="clear"/>
+            <w:tcMar>
+              <w:top w:type="dxa" w:w="80"/>
+              <w:left w:type="dxa" w:w="120"/>
+              <w:bottom w:type="dxa" w:w="80"/>
+              <w:right w:type="dxa" w:w="120"/>
+            </w:tcMar>
+          </w:tcPr>
+          <w:p>
+            <w:r>
+              <w:rPr>
+                <w:rFonts w:ascii="Arial" w:cs="Arial" w:eastAsia="Arial" w:hAnsi="Arial"/>
+                <w:sz w:val="20"/>
+                <w:szCs w:val="20"/>
+              </w:rPr>
+              <w:t xml:space="preserve">Volunteer Role Model</w:t>
+            </w:r>
+          </w:p>
+        </w:tc>
+        <w:tc>
+          <w:tcPr>
+            <w:tcW w:type="dxa" w:w="2000"/>
+            <w:tcBorders>
+              <w:top w:val="single" w:color="CCCCCC" w:sz="1"/>
+              <w:left w:val="single" w:color="CCCCCC" w:sz="1"/>
+              <w:bottom w:val="single" w:color="CCCCCC" w:sz="1"/>
+              <w:right w:val="single" w:color="CCCCCC" w:sz="1"/>
+            </w:tcBorders>
+            <w:shd w:fill="FFFFFF" w:val="clear"/>
+            <w:tcMar>
+              <w:top w:type="dxa" w:w="80"/>
+              <w:left w:type="dxa" w:w="120"/>
+              <w:bottom w:type="dxa" w:w="80"/>
+              <w:right w:type="dxa" w:w="120"/>
+            </w:tcMar>
+          </w:tcPr>
+          <w:p>
+            <w:r>
+              <w:rPr>
+                <w:rFonts w:ascii="Arial" w:cs="Arial" w:eastAsia="Arial" w:hAnsi="Arial"/>
+                <w:sz w:val="20"/>
+                <w:szCs w:val="20"/>
+              </w:rPr>
+              <w:t xml:space="preserve">Single role per volunteer, multiple profiles, single profile multi-role</w:t>
+            </w:r>
+          </w:p>
+        </w:tc>
+        <w:tc>
+          <w:tcPr>
+            <w:tcW w:type="dxa" w:w="4960"/>
+            <w:tcBorders>
+              <w:top w:val="single" w:color="CCCCCC" w:sz="1"/>
+              <w:left w:val="single" w:color="CCCCCC" w:sz="1"/>
+              <w:bottom w:val="single" w:color="CCCCCC" w:sz="1"/>
+              <w:right w:val="single" w:color="CCCCCC" w:sz="1"/>
+            </w:tcBorders>
+            <w:shd w:fill="FFFFFF" w:val="clear"/>
+            <w:tcMar>
+              <w:top w:type="dxa" w:w="80"/>
+              <w:left w:type="dxa" w:w="120"/>
+              <w:bottom w:type="dxa" w:w="80"/>
+              <w:right w:type="dxa" w:w="120"/>
+            </w:tcMar>
+          </w:tcPr>
+          <w:p>
+            <w:r>
+              <w:rPr>
+                <w:rFonts w:ascii="Arial" w:cs="Arial" w:eastAsia="Arial" w:hAnsi="Arial"/>
+                <w:sz w:val="20"/>
+                <w:szCs w:val="20"/>
+              </w:rPr>
+              <w:t xml:space="preserve">Single profile with additive roles SELECTED. One profile per volunteer. Roles (mentor, co-mentor, SME) are additive. Capacity settings per role. SME availability managed separately from mentor capacity.</w:t>
+            </w:r>
+          </w:p>
+        </w:tc>
+      </w:tr>
+      <w:tr>
+        <w:tc>
+          <w:tcPr>
+            <w:tcW w:type="dxa" w:w="800"/>
+            <w:tcBorders>
+              <w:top w:val="single" w:color="CCCCCC" w:sz="1"/>
+              <w:left w:val="single" w:color="CCCCCC" w:sz="1"/>
+              <w:bottom w:val="single" w:color="CCCCCC" w:sz="1"/>
+              <w:right w:val="single" w:color="CCCCCC" w:sz="1"/>
+            </w:tcBorders>
+            <w:shd w:fill="F2F2F2" w:val="clear"/>
+            <w:tcMar>
+              <w:top w:type="dxa" w:w="80"/>
+              <w:left w:type="dxa" w:w="120"/>
+              <w:bottom w:type="dxa" w:w="80"/>
+              <w:right w:type="dxa" w:w="120"/>
+            </w:tcMar>
+          </w:tcPr>
+          <w:p>
+            <w:r>
+              <w:rPr>
+                <w:rFonts w:ascii="Arial" w:cs="Arial" w:eastAsia="Arial" w:hAnsi="Arial"/>
+                <w:sz w:val="20"/>
+                <w:szCs w:val="20"/>
+              </w:rPr>
+              <w:t xml:space="preserve">D-012</w:t>
+            </w:r>
+          </w:p>
+        </w:tc>
+        <w:tc>
+          <w:tcPr>
+            <w:tcW w:type="dxa" w:w="1600"/>
+            <w:tcBorders>
+              <w:top w:val="single" w:color="CCCCCC" w:sz="1"/>
+              <w:left w:val="single" w:color="CCCCCC" w:sz="1"/>
+              <w:bottom w:val="single" w:color="CCCCCC" w:sz="1"/>
+              <w:right w:val="single" w:color="CCCCCC" w:sz="1"/>
+            </w:tcBorders>
+            <w:shd w:fill="F2F2F2" w:val="clear"/>
+            <w:tcMar>
+              <w:top w:type="dxa" w:w="80"/>
+              <w:left w:type="dxa" w:w="120"/>
+              <w:bottom w:type="dxa" w:w="80"/>
+              <w:right w:type="dxa" w:w="120"/>
+            </w:tcMar>
+          </w:tcPr>
+          <w:p>
+            <w:r>
+              <w:rPr>
+                <w:rFonts w:ascii="Arial" w:cs="Arial" w:eastAsia="Arial" w:hAnsi="Arial"/>
+                <w:sz w:val="20"/>
+                <w:szCs w:val="20"/>
+              </w:rPr>
+              <w:t xml:space="preserve">Mentor Matching (Phase 1)</w:t>
+            </w:r>
+          </w:p>
+        </w:tc>
+        <w:tc>
+          <w:tcPr>
+            <w:tcW w:type="dxa" w:w="2000"/>
+            <w:tcBorders>
+              <w:top w:val="single" w:color="CCCCCC" w:sz="1"/>
+              <w:left w:val="single" w:color="CCCCCC" w:sz="1"/>
+              <w:bottom w:val="single" w:color="CCCCCC" w:sz="1"/>
+              <w:right w:val="single" w:color="CCCCCC" w:sz="1"/>
+            </w:tcBorders>
+            <w:shd w:fill="F2F2F2" w:val="clear"/>
+            <w:tcMar>
+              <w:top w:type="dxa" w:w="80"/>
+              <w:left w:type="dxa" w:w="120"/>
+              <w:bottom w:type="dxa" w:w="80"/>
+              <w:right w:type="dxa" w:w="120"/>
+            </w:tcMar>
+          </w:tcPr>
+          <w:p>
+            <w:r>
+              <w:rPr>
+                <w:rFonts w:ascii="Arial" w:cs="Arial" w:eastAsia="Arial" w:hAnsi="Arial"/>
+                <w:sz w:val="20"/>
+                <w:szCs w:val="20"/>
+              </w:rPr>
+              <w:t xml:space="preserve">Fully automated, fully manual, admin-assisted manual</w:t>
+            </w:r>
+          </w:p>
+        </w:tc>
+        <w:tc>
+          <w:tcPr>
+            <w:tcW w:type="dxa" w:w="4960"/>
+            <w:tcBorders>
+              <w:top w:val="single" w:color="CCCCCC" w:sz="1"/>
+              <w:left w:val="single" w:color="CCCCCC" w:sz="1"/>
+              <w:bottom w:val="single" w:color="CCCCCC" w:sz="1"/>
+              <w:right w:val="single" w:color="CCCCCC" w:sz="1"/>
+            </w:tcBorders>
+            <w:shd w:fill="F2F2F2" w:val="clear"/>
+            <w:tcMar>
+              <w:top w:type="dxa" w:w="80"/>
+              <w:left w:type="dxa" w:w="120"/>
+              <w:bottom w:type="dxa" w:w="80"/>
+              <w:right w:type="dxa" w:w="120"/>
+            </w:tcMar>
+          </w:tcPr>
+          <w:p>
+            <w:r>
+              <w:rPr>
+                <w:rFonts w:ascii="Arial" w:cs="Arial" w:eastAsia="Arial" w:hAnsi="Arial"/>
+                <w:sz w:val="20"/>
+                <w:szCs w:val="20"/>
+              </w:rPr>
+              <w:t xml:space="preserve">Admin-assisted manual matching SELECTED for Phase 1. Admin reviews intake, browses filtered mentor pool, makes assignment. Automated suggestion system planned for Phase 2 — data model designed to support it from day one.</w:t>
+            </w:r>
+          </w:p>
+        </w:tc>
+      </w:tr>
+      <w:tr>
+        <w:tc>
+          <w:tcPr>
+            <w:tcW w:type="dxa" w:w="800"/>
+            <w:tcBorders>
+              <w:top w:val="single" w:color="CCCCCC" w:sz="1"/>
+              <w:left w:val="single" w:color="CCCCCC" w:sz="1"/>
+              <w:bottom w:val="single" w:color="CCCCCC" w:sz="1"/>
+              <w:right w:val="single" w:color="CCCCCC" w:sz="1"/>
+            </w:tcBorders>
+            <w:shd w:fill="FFFFFF" w:val="clear"/>
+            <w:tcMar>
+              <w:top w:type="dxa" w:w="80"/>
+              <w:left w:type="dxa" w:w="120"/>
+              <w:bottom w:type="dxa" w:w="80"/>
+              <w:right w:type="dxa" w:w="120"/>
+            </w:tcMar>
+          </w:tcPr>
+          <w:p>
+            <w:r>
+              <w:rPr>
+                <w:rFonts w:ascii="Arial" w:cs="Arial" w:eastAsia="Arial" w:hAnsi="Arial"/>
+                <w:sz w:val="20"/>
+                <w:szCs w:val="20"/>
+              </w:rPr>
+              <w:t xml:space="preserve">D-013</w:t>
+            </w:r>
+          </w:p>
+        </w:tc>
+        <w:tc>
+          <w:tcPr>
+            <w:tcW w:type="dxa" w:w="1600"/>
+            <w:tcBorders>
+              <w:top w:val="single" w:color="CCCCCC" w:sz="1"/>
+              <w:left w:val="single" w:color="CCCCCC" w:sz="1"/>
+              <w:bottom w:val="single" w:color="CCCCCC" w:sz="1"/>
+              <w:right w:val="single" w:color="CCCCCC" w:sz="1"/>
+            </w:tcBorders>
+            <w:shd w:fill="FFFFFF" w:val="clear"/>
+            <w:tcMar>
+              <w:top w:type="dxa" w:w="80"/>
+              <w:left w:type="dxa" w:w="120"/>
+              <w:bottom w:type="dxa" w:w="80"/>
+              <w:right w:type="dxa" w:w="120"/>
+            </w:tcMar>
+          </w:tcPr>
+          <w:p>
+            <w:r>
+              <w:rPr>
+                <w:rFonts w:ascii="Arial" w:cs="Arial" w:eastAsia="Arial" w:hAnsi="Arial"/>
+                <w:sz w:val="20"/>
+                <w:szCs w:val="20"/>
+              </w:rPr>
+              <w:t xml:space="preserve">SME Workflow</w:t>
+            </w:r>
+          </w:p>
+        </w:tc>
+        <w:tc>
+          <w:tcPr>
+            <w:tcW w:type="dxa" w:w="2000"/>
+            <w:tcBorders>
+              <w:top w:val="single" w:color="CCCCCC" w:sz="1"/>
+              <w:left w:val="single" w:color="CCCCCC" w:sz="1"/>
+              <w:bottom w:val="single" w:color="CCCCCC" w:sz="1"/>
+              <w:right w:val="single" w:color="CCCCCC" w:sz="1"/>
+            </w:tcBorders>
+            <w:shd w:fill="FFFFFF" w:val="clear"/>
+            <w:tcMar>
+              <w:top w:type="dxa" w:w="80"/>
+              <w:left w:type="dxa" w:w="120"/>
+              <w:bottom w:type="dxa" w:w="80"/>
+              <w:right w:type="dxa" w:w="120"/>
+            </w:tcMar>
+          </w:tcPr>
+          <w:p>
+            <w:r>
+              <w:rPr>
+                <w:rFonts w:ascii="Arial" w:cs="Arial" w:eastAsia="Arial" w:hAnsi="Arial"/>
+                <w:sz w:val="20"/>
+                <w:szCs w:val="20"/>
+              </w:rPr>
+              <w:t xml:space="preserve">Admin-managed, mentor-initiated, client-initiated</w:t>
+            </w:r>
+          </w:p>
+        </w:tc>
+        <w:tc>
+          <w:tcPr>
+            <w:tcW w:type="dxa" w:w="4960"/>
+            <w:tcBorders>
+              <w:top w:val="single" w:color="CCCCCC" w:sz="1"/>
+              <w:left w:val="single" w:color="CCCCCC" w:sz="1"/>
+              <w:bottom w:val="single" w:color="CCCCCC" w:sz="1"/>
+              <w:right w:val="single" w:color="CCCCCC" w:sz="1"/>
+            </w:tcBorders>
+            <w:shd w:fill="FFFFFF" w:val="clear"/>
+            <w:tcMar>
+              <w:top w:type="dxa" w:w="80"/>
+              <w:left w:type="dxa" w:w="120"/>
+              <w:bottom w:type="dxa" w:w="80"/>
+              <w:right w:type="dxa" w:w="120"/>
+            </w:tcMar>
+          </w:tcPr>
+          <w:p>
+            <w:r>
+              <w:rPr>
+                <w:rFonts w:ascii="Arial" w:cs="Arial" w:eastAsia="Arial" w:hAnsi="Arial"/>
+                <w:sz w:val="20"/>
+                <w:szCs w:val="20"/>
+              </w:rPr>
+              <w:t xml:space="preserve">Mentor-initiated request workflow SELECTED. Primary mentor identifies SME need, browses pool, submits request. SME accepts or declines. Admin has visibility but is not the bottleneck.</w:t>
+            </w:r>
+          </w:p>
+        </w:tc>
+      </w:tr>
+      <w:tr>
+        <w:tc>
+          <w:tcPr>
+            <w:tcW w:type="dxa" w:w="800"/>
+            <w:tcBorders>
+              <w:top w:val="single" w:color="CCCCCC" w:sz="1"/>
+              <w:left w:val="single" w:color="CCCCCC" w:sz="1"/>
+              <w:bottom w:val="single" w:color="CCCCCC" w:sz="1"/>
+              <w:right w:val="single" w:color="CCCCCC" w:sz="1"/>
+            </w:tcBorders>
+            <w:shd w:fill="F2F2F2" w:val="clear"/>
+            <w:tcMar>
+              <w:top w:type="dxa" w:w="80"/>
+              <w:left w:type="dxa" w:w="120"/>
+              <w:bottom w:type="dxa" w:w="80"/>
+              <w:right w:type="dxa" w:w="120"/>
+            </w:tcMar>
+          </w:tcPr>
+          <w:p>
+            <w:r>
+              <w:rPr>
+                <w:rFonts w:ascii="Arial" w:cs="Arial" w:eastAsia="Arial" w:hAnsi="Arial"/>
+                <w:sz w:val="20"/>
+                <w:szCs w:val="20"/>
+              </w:rPr>
+              <w:t xml:space="preserve">D-014</w:t>
+            </w:r>
+          </w:p>
+        </w:tc>
+        <w:tc>
+          <w:tcPr>
+            <w:tcW w:type="dxa" w:w="1600"/>
+            <w:tcBorders>
+              <w:top w:val="single" w:color="CCCCCC" w:sz="1"/>
+              <w:left w:val="single" w:color="CCCCCC" w:sz="1"/>
+              <w:bottom w:val="single" w:color="CCCCCC" w:sz="1"/>
+              <w:right w:val="single" w:color="CCCCCC" w:sz="1"/>
+            </w:tcBorders>
+            <w:shd w:fill="F2F2F2" w:val="clear"/>
+            <w:tcMar>
+              <w:top w:type="dxa" w:w="80"/>
+              <w:left w:type="dxa" w:w="120"/>
+              <w:bottom w:type="dxa" w:w="80"/>
+              <w:right w:type="dxa" w:w="120"/>
+            </w:tcMar>
+          </w:tcPr>
+          <w:p>
+            <w:r>
+              <w:rPr>
+                <w:rFonts w:ascii="Arial" w:cs="Arial" w:eastAsia="Arial" w:hAnsi="Arial"/>
+                <w:sz w:val="20"/>
+                <w:szCs w:val="20"/>
+              </w:rPr>
+              <w:t xml:space="preserve">NPS Tracking</w:t>
+            </w:r>
+          </w:p>
+        </w:tc>
+        <w:tc>
+          <w:tcPr>
+            <w:tcW w:type="dxa" w:w="2000"/>
+            <w:tcBorders>
+              <w:top w:val="single" w:color="CCCCCC" w:sz="1"/>
+              <w:left w:val="single" w:color="CCCCCC" w:sz="1"/>
+              <w:bottom w:val="single" w:color="CCCCCC" w:sz="1"/>
+              <w:right w:val="single" w:color="CCCCCC" w:sz="1"/>
+            </w:tcBorders>
+            <w:shd w:fill="F2F2F2" w:val="clear"/>
+            <w:tcMar>
+              <w:top w:type="dxa" w:w="80"/>
+              <w:left w:type="dxa" w:w="120"/>
+              <w:bottom w:type="dxa" w:w="80"/>
+              <w:right w:type="dxa" w:w="120"/>
+            </w:tcMar>
+          </w:tcPr>
+          <w:p>
+            <w:r>
+              <w:rPr>
+                <w:rFonts w:ascii="Arial" w:cs="Arial" w:eastAsia="Arial" w:hAnsi="Arial"/>
+                <w:sz w:val="20"/>
+                <w:szCs w:val="20"/>
+              </w:rPr>
+              <w:t xml:space="preserve">Manual surveys, CRM-native, integrated survey tool</w:t>
+            </w:r>
+          </w:p>
+        </w:tc>
+        <w:tc>
+          <w:tcPr>
+            <w:tcW w:type="dxa" w:w="4960"/>
+            <w:tcBorders>
+              <w:top w:val="single" w:color="CCCCCC" w:sz="1"/>
+              <w:left w:val="single" w:color="CCCCCC" w:sz="1"/>
+              <w:bottom w:val="single" w:color="CCCCCC" w:sz="1"/>
+              <w:right w:val="single" w:color="CCCCCC" w:sz="1"/>
+            </w:tcBorders>
+            <w:shd w:fill="F2F2F2" w:val="clear"/>
+            <w:tcMar>
+              <w:top w:type="dxa" w:w="80"/>
+              <w:left w:type="dxa" w:w="120"/>
+              <w:bottom w:type="dxa" w:w="80"/>
+              <w:right w:type="dxa" w:w="120"/>
+            </w:tcMar>
+          </w:tcPr>
+          <w:p>
+            <w:r>
+              <w:rPr>
+                <w:rFonts w:ascii="Arial" w:cs="Arial" w:eastAsia="Arial" w:hAnsi="Arial"/>
+                <w:sz w:val="20"/>
+                <w:szCs w:val="20"/>
+              </w:rPr>
+              <w:t xml:space="preserve">CRM-triggered NPS SELECTED. Automated trigger at engagement close. Email link to form — no client login required. Score recorded in CRM. Integrate external tool (e.g., LimeSurvey) if CRM-native capability insufficient.</w:t>
+            </w:r>
+          </w:p>
+        </w:tc>
+      </w:tr>
+      <w:tr>
+        <w:tc>
+          <w:tcPr>
+            <w:tcW w:type="dxa" w:w="800"/>
+            <w:tcBorders>
+              <w:top w:val="single" w:color="CCCCCC" w:sz="1"/>
+              <w:left w:val="single" w:color="CCCCCC" w:sz="1"/>
+              <w:bottom w:val="single" w:color="CCCCCC" w:sz="1"/>
+              <w:right w:val="single" w:color="CCCCCC" w:sz="1"/>
+            </w:tcBorders>
+            <w:shd w:fill="FFFFFF" w:val="clear"/>
+            <w:tcMar>
+              <w:top w:type="dxa" w:w="80"/>
+              <w:left w:type="dxa" w:w="120"/>
+              <w:bottom w:type="dxa" w:w="80"/>
+              <w:right w:type="dxa" w:w="120"/>
+            </w:tcMar>
+          </w:tcPr>
+          <w:p>
+            <w:r>
+              <w:rPr>
+                <w:rFonts w:ascii="Arial" w:cs="Arial" w:eastAsia="Arial" w:hAnsi="Arial"/>
+                <w:sz w:val="20"/>
+                <w:szCs w:val="20"/>
+              </w:rPr>
+              <w:t xml:space="preserve">D-015</w:t>
+            </w:r>
+          </w:p>
+        </w:tc>
+        <w:tc>
+          <w:tcPr>
+            <w:tcW w:type="dxa" w:w="1600"/>
+            <w:tcBorders>
+              <w:top w:val="single" w:color="CCCCCC" w:sz="1"/>
+              <w:left w:val="single" w:color="CCCCCC" w:sz="1"/>
+              <w:bottom w:val="single" w:color="CCCCCC" w:sz="1"/>
+              <w:right w:val="single" w:color="CCCCCC" w:sz="1"/>
+            </w:tcBorders>
+            <w:shd w:fill="FFFFFF" w:val="clear"/>
+            <w:tcMar>
+              <w:top w:type="dxa" w:w="80"/>
+              <w:left w:type="dxa" w:w="120"/>
+              <w:bottom w:type="dxa" w:w="80"/>
+              <w:right w:type="dxa" w:w="120"/>
+            </w:tcMar>
+          </w:tcPr>
+          <w:p>
+            <w:r>
+              <w:rPr>
+                <w:rFonts w:ascii="Arial" w:cs="Arial" w:eastAsia="Arial" w:hAnsi="Arial"/>
+                <w:sz w:val="20"/>
+                <w:szCs w:val="20"/>
+              </w:rPr>
+              <w:t xml:space="preserve">Scheduling (DEFERRED)</w:t>
+            </w:r>
+          </w:p>
+        </w:tc>
+        <w:tc>
+          <w:tcPr>
+            <w:tcW w:type="dxa" w:w="2000"/>
+            <w:tcBorders>
+              <w:top w:val="single" w:color="CCCCCC" w:sz="1"/>
+              <w:left w:val="single" w:color="CCCCCC" w:sz="1"/>
+              <w:bottom w:val="single" w:color="CCCCCC" w:sz="1"/>
+              <w:right w:val="single" w:color="CCCCCC" w:sz="1"/>
+            </w:tcBorders>
+            <w:shd w:fill="FFFFFF" w:val="clear"/>
+            <w:tcMar>
+              <w:top w:type="dxa" w:w="80"/>
+              <w:left w:type="dxa" w:w="120"/>
+              <w:bottom w:type="dxa" w:w="80"/>
+              <w:right w:type="dxa" w:w="120"/>
+            </w:tcMar>
+          </w:tcPr>
+          <w:p>
+            <w:r>
+              <w:rPr>
+                <w:rFonts w:ascii="Arial" w:cs="Arial" w:eastAsia="Arial" w:hAnsi="Arial"/>
+                <w:sz w:val="20"/>
+                <w:szCs w:val="20"/>
+              </w:rPr>
+              <w:t xml:space="preserve">CRM-native calendar, dedicated tool (Cal.com), admin-managed</w:t>
+            </w:r>
+          </w:p>
+        </w:tc>
+        <w:tc>
+          <w:tcPr>
+            <w:tcW w:type="dxa" w:w="4960"/>
+            <w:tcBorders>
+              <w:top w:val="single" w:color="CCCCCC" w:sz="1"/>
+              <w:left w:val="single" w:color="CCCCCC" w:sz="1"/>
+              <w:bottom w:val="single" w:color="CCCCCC" w:sz="1"/>
+              <w:right w:val="single" w:color="CCCCCC" w:sz="1"/>
+            </w:tcBorders>
+            <w:shd w:fill="FFFFFF" w:val="clear"/>
+            <w:tcMar>
+              <w:top w:type="dxa" w:w="80"/>
+              <w:left w:type="dxa" w:w="120"/>
+              <w:bottom w:type="dxa" w:w="80"/>
+              <w:right w:type="dxa" w:w="120"/>
+            </w:tcMar>
+          </w:tcPr>
+          <w:p>
+            <w:r>
+              <w:rPr>
+                <w:rFonts w:ascii="Arial" w:cs="Arial" w:eastAsia="Arial" w:hAnsi="Arial"/>
+                <w:sz w:val="20"/>
+                <w:szCs w:val="20"/>
+              </w:rPr>
+              <w:t xml:space="preserve">DEFERRED to Section 5 — Scheduling conversation. Key question: client self-scheduling vs. admin/mentor-controlled booking.</w:t>
             </w:r>
           </w:p>
         </w:tc>
@@ -1267,7 +2055,7 @@
         <w:spacing w:after="120"/>
       </w:pPr>
       <w:r>
-        <w:t xml:space="preserve">The following decisions are still under evaluation and will be added to the log once finalized:</w:t>
+        <w:t xml:space="preserve">The following decisions are still under evaluation:</w:t>
       </w:r>
     </w:p>
     <w:p>
@@ -1383,7 +2171,7 @@
                 <w:sz w:val="20"/>
                 <w:szCs w:val="20"/>
               </w:rPr>
-              <w:t xml:space="preserve">CRM Platform Selection</w:t>
+              <w:t xml:space="preserve">Scheduling Tool</w:t>
             </w:r>
           </w:p>
         </w:tc>
@@ -1411,7 +2199,7 @@
                 <w:sz w:val="20"/>
                 <w:szCs w:val="20"/>
               </w:rPr>
-              <w:t xml:space="preserve">Under evaluation — Section PRD in development</w:t>
+              <w:t xml:space="preserve">Deferred — Section 5 conversation pending</w:t>
             </w:r>
           </w:p>
         </w:tc>
@@ -1441,7 +2229,7 @@
                 <w:sz w:val="20"/>
                 <w:szCs w:val="20"/>
               </w:rPr>
-              <w:t xml:space="preserve">Scheduling Tool</w:t>
+              <w:t xml:space="preserve">Online Learning Platform</w:t>
             </w:r>
           </w:p>
         </w:tc>
@@ -1469,7 +2257,7 @@
                 <w:sz w:val="20"/>
                 <w:szCs w:val="20"/>
               </w:rPr>
-              <w:t xml:space="preserve">Pending — may be CRM-native or separate tool</w:t>
+              <w:t xml:space="preserve">Pending — Section 8 conversation pending</w:t>
             </w:r>
           </w:p>
         </w:tc>
@@ -1499,7 +2287,7 @@
                 <w:sz w:val="20"/>
                 <w:szCs w:val="20"/>
               </w:rPr>
-              <w:t xml:space="preserve">Online Learning Platform</w:t>
+              <w:t xml:space="preserve">Volunteer Coordination Tools</w:t>
             </w:r>
           </w:p>
         </w:tc>
@@ -1527,7 +2315,7 @@
                 <w:sz w:val="20"/>
                 <w:szCs w:val="20"/>
               </w:rPr>
-              <w:t xml:space="preserve">Under evaluation — Section PRD in development</w:t>
+              <w:t xml:space="preserve">Largely resolved by EspoCRM selection — confirm in section conversation</w:t>
             </w:r>
           </w:p>
         </w:tc>
@@ -1557,7 +2345,7 @@
                 <w:sz w:val="20"/>
                 <w:szCs w:val="20"/>
               </w:rPr>
-              <w:t xml:space="preserve">Volunteer Coordination Tools</w:t>
+              <w:t xml:space="preserve">Donor Management</w:t>
             </w:r>
           </w:p>
         </w:tc>
@@ -1585,7 +2373,7 @@
                 <w:sz w:val="20"/>
                 <w:szCs w:val="20"/>
               </w:rPr>
-              <w:t xml:space="preserve">Pending CRM decision</w:t>
+              <w:t xml:space="preserve">Evaluate EspoCRM native capability first</w:t>
             </w:r>
           </w:p>
         </w:tc>
@@ -1615,7 +2403,7 @@
                 <w:sz w:val="20"/>
                 <w:szCs w:val="20"/>
               </w:rPr>
-              <w:t xml:space="preserve">Donor Management Platform</w:t>
+              <w:t xml:space="preserve">Document &amp; Resource Sharing</w:t>
             </w:r>
           </w:p>
         </w:tc>
@@ -1643,7 +2431,7 @@
                 <w:sz w:val="20"/>
                 <w:szCs w:val="20"/>
               </w:rPr>
-              <w:t xml:space="preserve">Pending — evaluate CRM capability first</w:t>
+              <w:t xml:space="preserve">Pending — evaluate Google Drive vs FOSS alternatives</w:t>
             </w:r>
           </w:p>
         </w:tc>
@@ -1673,7 +2461,7 @@
                 <w:sz w:val="20"/>
                 <w:szCs w:val="20"/>
               </w:rPr>
-              <w:t xml:space="preserve">Document &amp; Resource Sharing</w:t>
+              <w:t xml:space="preserve">Reporting &amp; Analytics</w:t>
             </w:r>
           </w:p>
         </w:tc>
@@ -1701,7 +2489,7 @@
                 <w:sz w:val="20"/>
                 <w:szCs w:val="20"/>
               </w:rPr>
-              <w:t xml:space="preserve">Pending — evaluate Google Drive vs FOSS alternatives</w:t>
+              <w:t xml:space="preserve">Largely resolved by EspoCRM selection — confirm dashboards adequate</w:t>
             </w:r>
           </w:p>
         </w:tc>
@@ -1731,7 +2519,7 @@
                 <w:sz w:val="20"/>
                 <w:szCs w:val="20"/>
               </w:rPr>
-              <w:t xml:space="preserve">Reporting &amp; Analytics</w:t>
+              <w:t xml:space="preserve">Email Platform (Final)</w:t>
             </w:r>
           </w:p>
         </w:tc>
@@ -1759,7 +2547,7 @@
                 <w:sz w:val="20"/>
                 <w:szCs w:val="20"/>
               </w:rPr>
-              <w:t xml:space="preserve">Pending CRM and data architecture decisions</w:t>
+              <w:t xml:space="preserve">Provisional — pending CRM communication capability assessment</w:t>
             </w:r>
           </w:p>
         </w:tc>
@@ -1789,7 +2577,7 @@
                 <w:sz w:val="20"/>
                 <w:szCs w:val="20"/>
               </w:rPr>
-              <w:t xml:space="preserve">Email Platform (Final)</w:t>
+              <w:t xml:space="preserve">Video/Virtual Meeting Integration</w:t>
             </w:r>
           </w:p>
         </w:tc>
@@ -1817,7 +2605,123 @@
                 <w:sz w:val="20"/>
                 <w:szCs w:val="20"/>
               </w:rPr>
-              <w:t xml:space="preserve">Provisional — pending CRM communication capability assessment</w:t>
+              <w:t xml:space="preserve">Open — how are virtual sessions initiated and logged?</w:t>
+            </w:r>
+          </w:p>
+        </w:tc>
+      </w:tr>
+      <w:tr>
+        <w:tc>
+          <w:tcPr>
+            <w:tcW w:type="dxa" w:w="3500"/>
+            <w:tcBorders>
+              <w:top w:val="single" w:color="CCCCCC" w:sz="1"/>
+              <w:left w:val="single" w:color="CCCCCC" w:sz="1"/>
+              <w:bottom w:val="single" w:color="CCCCCC" w:sz="1"/>
+              <w:right w:val="single" w:color="CCCCCC" w:sz="1"/>
+            </w:tcBorders>
+            <w:shd w:fill="FFFFFF" w:val="clear"/>
+            <w:tcMar>
+              <w:top w:type="dxa" w:w="80"/>
+              <w:left w:type="dxa" w:w="120"/>
+              <w:bottom w:type="dxa" w:w="80"/>
+              <w:right w:type="dxa" w:w="120"/>
+            </w:tcMar>
+          </w:tcPr>
+          <w:p>
+            <w:r>
+              <w:rPr>
+                <w:rFonts w:ascii="Arial" w:cs="Arial" w:eastAsia="Arial" w:hAnsi="Arial"/>
+                <w:sz w:val="20"/>
+                <w:szCs w:val="20"/>
+              </w:rPr>
+              <w:t xml:space="preserve">Dues Payment Processing</w:t>
+            </w:r>
+          </w:p>
+        </w:tc>
+        <w:tc>
+          <w:tcPr>
+            <w:tcW w:type="dxa" w:w="5860"/>
+            <w:tcBorders>
+              <w:top w:val="single" w:color="CCCCCC" w:sz="1"/>
+              <w:left w:val="single" w:color="CCCCCC" w:sz="1"/>
+              <w:bottom w:val="single" w:color="CCCCCC" w:sz="1"/>
+              <w:right w:val="single" w:color="CCCCCC" w:sz="1"/>
+            </w:tcBorders>
+            <w:shd w:fill="FFFFFF" w:val="clear"/>
+            <w:tcMar>
+              <w:top w:type="dxa" w:w="80"/>
+              <w:left w:type="dxa" w:w="120"/>
+              <w:bottom w:type="dxa" w:w="80"/>
+              <w:right w:type="dxa" w:w="120"/>
+            </w:tcMar>
+          </w:tcPr>
+          <w:p>
+            <w:r>
+              <w:rPr>
+                <w:rFonts w:ascii="Arial" w:cs="Arial" w:eastAsia="Arial" w:hAnsi="Arial"/>
+                <w:sz w:val="20"/>
+                <w:szCs w:val="20"/>
+              </w:rPr>
+              <w:t xml:space="preserve">Open — PCI-compliant payment integration needed</w:t>
+            </w:r>
+          </w:p>
+        </w:tc>
+      </w:tr>
+      <w:tr>
+        <w:tc>
+          <w:tcPr>
+            <w:tcW w:type="dxa" w:w="3500"/>
+            <w:tcBorders>
+              <w:top w:val="single" w:color="CCCCCC" w:sz="1"/>
+              <w:left w:val="single" w:color="CCCCCC" w:sz="1"/>
+              <w:bottom w:val="single" w:color="CCCCCC" w:sz="1"/>
+              <w:right w:val="single" w:color="CCCCCC" w:sz="1"/>
+            </w:tcBorders>
+            <w:shd w:fill="F2F2F2" w:val="clear"/>
+            <w:tcMar>
+              <w:top w:type="dxa" w:w="80"/>
+              <w:left w:type="dxa" w:w="120"/>
+              <w:bottom w:type="dxa" w:w="80"/>
+              <w:right w:type="dxa" w:w="120"/>
+            </w:tcMar>
+          </w:tcPr>
+          <w:p>
+            <w:r>
+              <w:rPr>
+                <w:rFonts w:ascii="Arial" w:cs="Arial" w:eastAsia="Arial" w:hAnsi="Arial"/>
+                <w:sz w:val="20"/>
+                <w:szCs w:val="20"/>
+              </w:rPr>
+              <w:t xml:space="preserve">Backup &amp; Recovery Strategy</w:t>
+            </w:r>
+          </w:p>
+        </w:tc>
+        <w:tc>
+          <w:tcPr>
+            <w:tcW w:type="dxa" w:w="5860"/>
+            <w:tcBorders>
+              <w:top w:val="single" w:color="CCCCCC" w:sz="1"/>
+              <w:left w:val="single" w:color="CCCCCC" w:sz="1"/>
+              <w:bottom w:val="single" w:color="CCCCCC" w:sz="1"/>
+              <w:right w:val="single" w:color="CCCCCC" w:sz="1"/>
+            </w:tcBorders>
+            <w:shd w:fill="F2F2F2" w:val="clear"/>
+            <w:tcMar>
+              <w:top w:type="dxa" w:w="80"/>
+              <w:left w:type="dxa" w:w="120"/>
+              <w:bottom w:type="dxa" w:w="80"/>
+              <w:right w:type="dxa" w:w="120"/>
+            </w:tcMar>
+          </w:tcPr>
+          <w:p>
+            <w:r>
+              <w:rPr>
+                <w:rFonts w:ascii="Arial" w:cs="Arial" w:eastAsia="Arial" w:hAnsi="Arial"/>
+                <w:sz w:val="20"/>
+                <w:szCs w:val="20"/>
+              </w:rPr>
+              <w:t xml:space="preserve">Open — self-hosted EspoCRM on AWS</w:t>
             </w:r>
           </w:p>
         </w:tc>
@@ -1904,15 +2808,6 @@
         <w:szCs w:val="16"/>
       </w:rPr>
       <w:t xml:space="preserve">	Page </w:t>
-    </w:r>
-    <w:r>
-      <w:rPr>
-        <w:rFonts w:ascii="Arial" w:cs="Arial" w:eastAsia="Arial" w:hAnsi="Arial"/>
-        <w:color w:val="595959"/>
-        <w:sz w:val="16"/>
-        <w:szCs w:val="16"/>
-      </w:rPr>
-      <w:t xml:space="preserve"/>
     </w:r>
   </w:p>
 </w:ftr>

</xml_diff>

<commit_message>
Update CRM PRD v0.3 and Decisions Log v0.3 with scheduling and video decisions
CRM PRD v0.3:
- Added Section 7: Scheduling (EspoCRM native + Cal.com hybrid)
- Added Section 8: Video platform split (Google Meet / Jitsi Meet)
- Updated mentoring lifecycle with scheduling and video steps
- Added functional requirements for scheduling and video
- Updated open questions

Decisions Log v0.3:
- Added D-015: Session Scheduling (hybrid EspoCRM + Cal.com)
- Added D-016: Client-Facing Video (Google Meet)
- Added D-017: Internal Meeting Video (Jitsi Meet self-hosted)
- Updated pending decisions tracker
</commit_message>
<xml_diff>
--- a/PRDs/CBM-Decisions-Log.docx
+++ b/PRDs/CBM-Decisions-Log.docx
@@ -46,7 +46,7 @@
           <w:sz w:val="22"/>
           <w:szCs w:val="22"/>
         </w:rPr>
-        <w:t xml:space="preserve">Version 0.2  |  Living Document  |  2025</w:t>
+        <w:t xml:space="preserve">Version 0.3  |  Living Document  |  2025</w:t>
       </w:r>
     </w:p>
     <w:p>
@@ -124,23 +124,6 @@
           <w:b w:val="false"/>
           <w:bCs w:val="false"/>
         </w:rPr>
-        <w:t xml:space="preserve">Include the date, decision area, all options seriously considered, and the full rationale</w:t>
-      </w:r>
-    </w:p>
-    <w:p>
-      <w:pPr>
-        <w:pStyle w:val="ListParagraph"/>
-        <w:numPr>
-          <w:ilvl w:val="0"/>
-          <w:numId w:val="2"/>
-        </w:numPr>
-        <w:spacing w:after="80"/>
-      </w:pPr>
-      <w:r>
-        <w:rPr>
-          <w:b w:val="false"/>
-          <w:bCs w:val="false"/>
-        </w:rPr>
         <w:t xml:space="preserve">Mark decisions as PROVISIONAL if they are expected to be revisited</w:t>
       </w:r>
     </w:p>
@@ -435,7 +418,7 @@
                 <w:sz w:val="20"/>
                 <w:szCs w:val="20"/>
               </w:rPr>
-              <w:t xml:space="preserve">AWS SELECTED. Unified ecosystem (domain, hosting, CI/CD, CDN). Tech admin AWS-comfortable. Cost manageable at CBM scale. Revisit if costs exceed budget.</w:t>
+              <w:t xml:space="preserve">AWS SELECTED. Unified ecosystem (domain, hosting, CI/CD, CDN). Tech admin AWS-comfortable. Cost manageable at CBM scale.</w:t>
             </w:r>
           </w:p>
         </w:tc>
@@ -549,7 +532,7 @@
                 <w:sz w:val="20"/>
                 <w:szCs w:val="20"/>
               </w:rPr>
-              <w:t xml:space="preserve">AWS Route 53 SELECTED. Stays within AWS ecosystem. Unified IAM access management. Integrated billing.</w:t>
+              <w:t xml:space="preserve">AWS Route 53 SELECTED. Stays within AWS ecosystem. Unified IAM. Integrated billing.</w:t>
             </w:r>
           </w:p>
         </w:tc>
@@ -635,7 +618,7 @@
                 <w:sz w:val="20"/>
                 <w:szCs w:val="20"/>
               </w:rPr>
-              <w:t xml:space="preserve">Google Workspace for Nonprofits, Proton Business, self-hosted Mailcow/iRedMail</w:t>
+              <w:t xml:space="preserve">Google Workspace for Nonprofits, Proton Business, self-hosted Mailcow</w:t>
             </w:r>
           </w:p>
         </w:tc>
@@ -663,7 +646,7 @@
                 <w:sz w:val="20"/>
                 <w:szCs w:val="20"/>
               </w:rPr>
-              <w:t xml:space="preserve">Google Workspace for Nonprofits SELECTED (provisional). Free for 501(c)(3), familiar UI, includes Drive/Docs/Calendar. PROVISIONAL: May migrate to Proton if CRM centralizes all client/mentor communication, reducing email platform dependency.</w:t>
+              <w:t xml:space="preserve">Google Workspace for Nonprofits SELECTED (provisional). Free for 501(c)(3), familiar UI. PROVISIONAL: May migrate if CRM centralizes all mentor-client communication.</w:t>
             </w:r>
           </w:p>
         </w:tc>
@@ -777,7 +760,7 @@
                 <w:sz w:val="20"/>
                 <w:szCs w:val="20"/>
               </w:rPr>
-              <w:t xml:space="preserve">Static HTML/CSS/JS SELECTED. Built with Claude Code. No CMS overhead, fast, cheap on S3, full control. Aligns with tech admin capability.</w:t>
+              <w:t xml:space="preserve">Static HTML/CSS/JS SELECTED. Built with Claude Code. No CMS overhead, fast, cheap on S3, full control.</w:t>
             </w:r>
           </w:p>
         </w:tc>
@@ -1005,7 +988,7 @@
                 <w:sz w:val="20"/>
                 <w:szCs w:val="20"/>
               </w:rPr>
-              <w:t xml:space="preserve">AWS CodePipeline + CodeCommit SELECTED. Single AWS ecosystem. Unified IAM. Future contributors submit changes via pull requests reviewed by tech admin.</w:t>
+              <w:t xml:space="preserve">AWS CodePipeline + CodeCommit SELECTED. Single AWS ecosystem. Unified IAM.</w:t>
             </w:r>
           </w:p>
         </w:tc>
@@ -1119,7 +1102,7 @@
                 <w:sz w:val="20"/>
                 <w:szCs w:val="20"/>
               </w:rPr>
-              <w:t xml:space="preserve">CRM-native forms SELECTED. Submissions go directly into CRM. No middleware. All intake, volunteer signup, and event registration become CRM records automatically.</w:t>
+              <w:t xml:space="preserve">CRM-native forms SELECTED. All intake, volunteer signup, and event registration become CRM records automatically.</w:t>
             </w:r>
           </w:p>
         </w:tc>
@@ -1233,7 +1216,7 @@
                 <w:sz w:val="20"/>
                 <w:szCs w:val="20"/>
               </w:rPr>
-              <w:t xml:space="preserve">GitHub SELECTED for planning documents (PRDs, Decisions Log). Accessible to board without AWS credentials. AWS CodeCommit reserved for website source code.</w:t>
+              <w:t xml:space="preserve">GitHub SELECTED for planning documents. Accessible to board without AWS credentials. AWS CodeCommit reserved for website source code.</w:t>
             </w:r>
           </w:p>
         </w:tc>
@@ -1347,7 +1330,7 @@
                 <w:sz w:val="20"/>
                 <w:szCs w:val="20"/>
               </w:rPr>
-              <w:t xml:space="preserve">EspoCRM SELECTED. FOSS, self-hosted on AWS, fully customizable data model, native email threading with inbound reply capture, workflow automation, REST API, no per-seat costs, modern senior-accessible UI. HubSpot evaluated but not selected (cost, not FOSS, not self-hosted, minimal volunteer familiarity). Attio retained as future fallback.</w:t>
+              <w:t xml:space="preserve">EspoCRM SELECTED. FOSS, self-hosted on AWS, fully customizable, native email threading, workflow automation, REST API, no per-seat costs. HubSpot evaluated but not selected. Attio retained as future fallback.</w:t>
             </w:r>
           </w:p>
         </w:tc>
@@ -1461,7 +1444,7 @@
                 <w:sz w:val="20"/>
                 <w:szCs w:val="20"/>
               </w:rPr>
-              <w:t xml:space="preserve">All mentor-client communication through CRM SELECTED. Enables inactivity tracking, maintains confidentiality, provides full audit trail. Clients interact via email reply or form link — no CRM login required.</w:t>
+              <w:t xml:space="preserve">All mentor-client communication through CRM SELECTED. Enables inactivity tracking, maintains confidentiality. Clients interact via email reply — no CRM login required.</w:t>
             </w:r>
           </w:p>
         </w:tc>
@@ -1575,7 +1558,7 @@
                 <w:sz w:val="20"/>
                 <w:szCs w:val="20"/>
               </w:rPr>
-              <w:t xml:space="preserve">Single profile with additive roles SELECTED. One profile per volunteer. Roles (mentor, co-mentor, SME) are additive. Capacity settings per role. SME availability managed separately from mentor capacity.</w:t>
+              <w:t xml:space="preserve">Single profile with additive roles SELECTED. One profile per volunteer supporting mentor, co-mentor, and/or SME roles concurrently.</w:t>
             </w:r>
           </w:p>
         </w:tc>
@@ -1633,7 +1616,7 @@
                 <w:sz w:val="20"/>
                 <w:szCs w:val="20"/>
               </w:rPr>
-              <w:t xml:space="preserve">Mentor Matching (Phase 1)</w:t>
+              <w:t xml:space="preserve">Mentor Matching Phase 1</w:t>
             </w:r>
           </w:p>
         </w:tc>
@@ -1689,7 +1672,7 @@
                 <w:sz w:val="20"/>
                 <w:szCs w:val="20"/>
               </w:rPr>
-              <w:t xml:space="preserve">Admin-assisted manual matching SELECTED for Phase 1. Admin reviews intake, browses filtered mentor pool, makes assignment. Automated suggestion system planned for Phase 2 — data model designed to support it from day one.</w:t>
+              <w:t xml:space="preserve">Admin-assisted manual matching SELECTED for Phase 1. Automated suggestion system planned for Phase 2 — data model supports it from day one.</w:t>
             </w:r>
           </w:p>
         </w:tc>
@@ -1803,7 +1786,7 @@
                 <w:sz w:val="20"/>
                 <w:szCs w:val="20"/>
               </w:rPr>
-              <w:t xml:space="preserve">Mentor-initiated request workflow SELECTED. Primary mentor identifies SME need, browses pool, submits request. SME accepts or declines. Admin has visibility but is not the bottleneck.</w:t>
+              <w:t xml:space="preserve">Mentor-initiated request workflow SELECTED. SME accepts or declines. Admin has visibility but is not the bottleneck.</w:t>
             </w:r>
           </w:p>
         </w:tc>
@@ -1917,7 +1900,7 @@
                 <w:sz w:val="20"/>
                 <w:szCs w:val="20"/>
               </w:rPr>
-              <w:t xml:space="preserve">CRM-triggered NPS SELECTED. Automated trigger at engagement close. Email link to form — no client login required. Score recorded in CRM. Integrate external tool (e.g., LimeSurvey) if CRM-native capability insufficient.</w:t>
+              <w:t xml:space="preserve">CRM-triggered NPS SELECTED. Automated trigger at engagement close. Integrate LimeSurvey if CRM-native insufficient.</w:t>
             </w:r>
           </w:p>
         </w:tc>
@@ -1975,7 +1958,7 @@
                 <w:sz w:val="20"/>
                 <w:szCs w:val="20"/>
               </w:rPr>
-              <w:t xml:space="preserve">Scheduling (DEFERRED)</w:t>
+              <w:t xml:space="preserve">Session Scheduling</w:t>
             </w:r>
           </w:p>
         </w:tc>
@@ -2003,7 +1986,7 @@
                 <w:sz w:val="20"/>
                 <w:szCs w:val="20"/>
               </w:rPr>
-              <w:t xml:space="preserve">CRM-native calendar, dedicated tool (Cal.com), admin-managed</w:t>
+              <w:t xml:space="preserve">CRM-native only, dedicated tool only, hybrid</w:t>
             </w:r>
           </w:p>
         </w:tc>
@@ -2031,7 +2014,235 @@
                 <w:sz w:val="20"/>
                 <w:szCs w:val="20"/>
               </w:rPr>
-              <w:t xml:space="preserve">DEFERRED to Section 5 — Scheduling conversation. Key question: client self-scheduling vs. admin/mentor-controlled booking.</w:t>
+              <w:t xml:space="preserve">Hybrid SELECTED. EspoCRM native for mentor-proposed sessions (default). Cal.com self-hosted for optional client self-scheduling. Both log sessions back to EspoCRM.</w:t>
+            </w:r>
+          </w:p>
+        </w:tc>
+      </w:tr>
+      <w:tr>
+        <w:tc>
+          <w:tcPr>
+            <w:tcW w:type="dxa" w:w="800"/>
+            <w:tcBorders>
+              <w:top w:val="single" w:color="CCCCCC" w:sz="1"/>
+              <w:left w:val="single" w:color="CCCCCC" w:sz="1"/>
+              <w:bottom w:val="single" w:color="CCCCCC" w:sz="1"/>
+              <w:right w:val="single" w:color="CCCCCC" w:sz="1"/>
+            </w:tcBorders>
+            <w:shd w:fill="F2F2F2" w:val="clear"/>
+            <w:tcMar>
+              <w:top w:type="dxa" w:w="80"/>
+              <w:left w:type="dxa" w:w="120"/>
+              <w:bottom w:type="dxa" w:w="80"/>
+              <w:right w:type="dxa" w:w="120"/>
+            </w:tcMar>
+          </w:tcPr>
+          <w:p>
+            <w:r>
+              <w:rPr>
+                <w:rFonts w:ascii="Arial" w:cs="Arial" w:eastAsia="Arial" w:hAnsi="Arial"/>
+                <w:sz w:val="20"/>
+                <w:szCs w:val="20"/>
+              </w:rPr>
+              <w:t xml:space="preserve">D-016</w:t>
+            </w:r>
+          </w:p>
+        </w:tc>
+        <w:tc>
+          <w:tcPr>
+            <w:tcW w:type="dxa" w:w="1600"/>
+            <w:tcBorders>
+              <w:top w:val="single" w:color="CCCCCC" w:sz="1"/>
+              <w:left w:val="single" w:color="CCCCCC" w:sz="1"/>
+              <w:bottom w:val="single" w:color="CCCCCC" w:sz="1"/>
+              <w:right w:val="single" w:color="CCCCCC" w:sz="1"/>
+            </w:tcBorders>
+            <w:shd w:fill="F2F2F2" w:val="clear"/>
+            <w:tcMar>
+              <w:top w:type="dxa" w:w="80"/>
+              <w:left w:type="dxa" w:w="120"/>
+              <w:bottom w:type="dxa" w:w="80"/>
+              <w:right w:type="dxa" w:w="120"/>
+            </w:tcMar>
+          </w:tcPr>
+          <w:p>
+            <w:r>
+              <w:rPr>
+                <w:rFonts w:ascii="Arial" w:cs="Arial" w:eastAsia="Arial" w:hAnsi="Arial"/>
+                <w:sz w:val="20"/>
+                <w:szCs w:val="20"/>
+              </w:rPr>
+              <w:t xml:space="preserve">Client-Facing Video</w:t>
+            </w:r>
+          </w:p>
+        </w:tc>
+        <w:tc>
+          <w:tcPr>
+            <w:tcW w:type="dxa" w:w="2000"/>
+            <w:tcBorders>
+              <w:top w:val="single" w:color="CCCCCC" w:sz="1"/>
+              <w:left w:val="single" w:color="CCCCCC" w:sz="1"/>
+              <w:bottom w:val="single" w:color="CCCCCC" w:sz="1"/>
+              <w:right w:val="single" w:color="CCCCCC" w:sz="1"/>
+            </w:tcBorders>
+            <w:shd w:fill="F2F2F2" w:val="clear"/>
+            <w:tcMar>
+              <w:top w:type="dxa" w:w="80"/>
+              <w:left w:type="dxa" w:w="120"/>
+              <w:bottom w:type="dxa" w:w="80"/>
+              <w:right w:type="dxa" w:w="120"/>
+            </w:tcMar>
+          </w:tcPr>
+          <w:p>
+            <w:r>
+              <w:rPr>
+                <w:rFonts w:ascii="Arial" w:cs="Arial" w:eastAsia="Arial" w:hAnsi="Arial"/>
+                <w:sz w:val="20"/>
+                <w:szCs w:val="20"/>
+              </w:rPr>
+              <w:t xml:space="preserve">Google Meet, Zoom, Jitsi Meet, Microsoft Teams</w:t>
+            </w:r>
+          </w:p>
+        </w:tc>
+        <w:tc>
+          <w:tcPr>
+            <w:tcW w:type="dxa" w:w="4960"/>
+            <w:tcBorders>
+              <w:top w:val="single" w:color="CCCCCC" w:sz="1"/>
+              <w:left w:val="single" w:color="CCCCCC" w:sz="1"/>
+              <w:bottom w:val="single" w:color="CCCCCC" w:sz="1"/>
+              <w:right w:val="single" w:color="CCCCCC" w:sz="1"/>
+            </w:tcBorders>
+            <w:shd w:fill="F2F2F2" w:val="clear"/>
+            <w:tcMar>
+              <w:top w:type="dxa" w:w="80"/>
+              <w:left w:type="dxa" w:w="120"/>
+              <w:bottom w:type="dxa" w:w="80"/>
+              <w:right w:type="dxa" w:w="120"/>
+            </w:tcMar>
+          </w:tcPr>
+          <w:p>
+            <w:r>
+              <w:rPr>
+                <w:rFonts w:ascii="Arial" w:cs="Arial" w:eastAsia="Arial" w:hAnsi="Arial"/>
+                <w:sz w:val="20"/>
+                <w:szCs w:val="20"/>
+              </w:rPr>
+              <w:t xml:space="preserve">Google Meet SELECTED for client-facing sessions. Included in Google Workspace for Nonprofits. No client login required. Familiar to senior mentors. No time limit for 1:1 sessions.</w:t>
+            </w:r>
+          </w:p>
+        </w:tc>
+      </w:tr>
+      <w:tr>
+        <w:tc>
+          <w:tcPr>
+            <w:tcW w:type="dxa" w:w="800"/>
+            <w:tcBorders>
+              <w:top w:val="single" w:color="CCCCCC" w:sz="1"/>
+              <w:left w:val="single" w:color="CCCCCC" w:sz="1"/>
+              <w:bottom w:val="single" w:color="CCCCCC" w:sz="1"/>
+              <w:right w:val="single" w:color="CCCCCC" w:sz="1"/>
+            </w:tcBorders>
+            <w:shd w:fill="FFFFFF" w:val="clear"/>
+            <w:tcMar>
+              <w:top w:type="dxa" w:w="80"/>
+              <w:left w:type="dxa" w:w="120"/>
+              <w:bottom w:type="dxa" w:w="80"/>
+              <w:right w:type="dxa" w:w="120"/>
+            </w:tcMar>
+          </w:tcPr>
+          <w:p>
+            <w:r>
+              <w:rPr>
+                <w:rFonts w:ascii="Arial" w:cs="Arial" w:eastAsia="Arial" w:hAnsi="Arial"/>
+                <w:sz w:val="20"/>
+                <w:szCs w:val="20"/>
+              </w:rPr>
+              <w:t xml:space="preserve">D-017</w:t>
+            </w:r>
+          </w:p>
+        </w:tc>
+        <w:tc>
+          <w:tcPr>
+            <w:tcW w:type="dxa" w:w="1600"/>
+            <w:tcBorders>
+              <w:top w:val="single" w:color="CCCCCC" w:sz="1"/>
+              <w:left w:val="single" w:color="CCCCCC" w:sz="1"/>
+              <w:bottom w:val="single" w:color="CCCCCC" w:sz="1"/>
+              <w:right w:val="single" w:color="CCCCCC" w:sz="1"/>
+            </w:tcBorders>
+            <w:shd w:fill="FFFFFF" w:val="clear"/>
+            <w:tcMar>
+              <w:top w:type="dxa" w:w="80"/>
+              <w:left w:type="dxa" w:w="120"/>
+              <w:bottom w:type="dxa" w:w="80"/>
+              <w:right w:type="dxa" w:w="120"/>
+            </w:tcMar>
+          </w:tcPr>
+          <w:p>
+            <w:r>
+              <w:rPr>
+                <w:rFonts w:ascii="Arial" w:cs="Arial" w:eastAsia="Arial" w:hAnsi="Arial"/>
+                <w:sz w:val="20"/>
+                <w:szCs w:val="20"/>
+              </w:rPr>
+              <w:t xml:space="preserve">Internal Meeting Video</w:t>
+            </w:r>
+          </w:p>
+        </w:tc>
+        <w:tc>
+          <w:tcPr>
+            <w:tcW w:type="dxa" w:w="2000"/>
+            <w:tcBorders>
+              <w:top w:val="single" w:color="CCCCCC" w:sz="1"/>
+              <w:left w:val="single" w:color="CCCCCC" w:sz="1"/>
+              <w:bottom w:val="single" w:color="CCCCCC" w:sz="1"/>
+              <w:right w:val="single" w:color="CCCCCC" w:sz="1"/>
+            </w:tcBorders>
+            <w:shd w:fill="FFFFFF" w:val="clear"/>
+            <w:tcMar>
+              <w:top w:type="dxa" w:w="80"/>
+              <w:left w:type="dxa" w:w="120"/>
+              <w:bottom w:type="dxa" w:w="80"/>
+              <w:right w:type="dxa" w:w="120"/>
+            </w:tcMar>
+          </w:tcPr>
+          <w:p>
+            <w:r>
+              <w:rPr>
+                <w:rFonts w:ascii="Arial" w:cs="Arial" w:eastAsia="Arial" w:hAnsi="Arial"/>
+                <w:sz w:val="20"/>
+                <w:szCs w:val="20"/>
+              </w:rPr>
+              <w:t xml:space="preserve">Google Meet, Zoom, Jitsi Meet, Microsoft Teams</w:t>
+            </w:r>
+          </w:p>
+        </w:tc>
+        <w:tc>
+          <w:tcPr>
+            <w:tcW w:type="dxa" w:w="4960"/>
+            <w:tcBorders>
+              <w:top w:val="single" w:color="CCCCCC" w:sz="1"/>
+              <w:left w:val="single" w:color="CCCCCC" w:sz="1"/>
+              <w:bottom w:val="single" w:color="CCCCCC" w:sz="1"/>
+              <w:right w:val="single" w:color="CCCCCC" w:sz="1"/>
+            </w:tcBorders>
+            <w:shd w:fill="FFFFFF" w:val="clear"/>
+            <w:tcMar>
+              <w:top w:type="dxa" w:w="80"/>
+              <w:left w:type="dxa" w:w="120"/>
+              <w:bottom w:type="dxa" w:w="80"/>
+              <w:right w:type="dxa" w:w="120"/>
+            </w:tcMar>
+          </w:tcPr>
+          <w:p>
+            <w:r>
+              <w:rPr>
+                <w:rFonts w:ascii="Arial" w:cs="Arial" w:eastAsia="Arial" w:hAnsi="Arial"/>
+                <w:sz w:val="20"/>
+                <w:szCs w:val="20"/>
+              </w:rPr>
+              <w:t xml:space="preserve">Jitsi Meet (self-hosted on AWS) SELECTED for internal meetings. Fully FOSS. No time limits. No per-seat costs. No participant caps. Internal audience can be coached to use it. Solves group meeting duration concern without cost.</w:t>
             </w:r>
           </w:p>
         </w:tc>
@@ -2048,19 +2259,6 @@
       </w:pPr>
       <w:r>
         <w:t xml:space="preserve">Pending Decisions</w:t>
-      </w:r>
-    </w:p>
-    <w:p>
-      <w:pPr>
-        <w:spacing w:after="120"/>
-      </w:pPr>
-      <w:r>
-        <w:t xml:space="preserve">The following decisions are still under evaluation:</w:t>
-      </w:r>
-    </w:p>
-    <w:p>
-      <w:r>
-        <w:t xml:space="preserve"/>
       </w:r>
     </w:p>
     <w:tbl>
@@ -2171,7 +2369,7 @@
                 <w:sz w:val="20"/>
                 <w:szCs w:val="20"/>
               </w:rPr>
-              <w:t xml:space="preserve">Scheduling Tool</w:t>
+              <w:t xml:space="preserve">Online Learning Platform</w:t>
             </w:r>
           </w:p>
         </w:tc>
@@ -2199,7 +2397,7 @@
                 <w:sz w:val="20"/>
                 <w:szCs w:val="20"/>
               </w:rPr>
-              <w:t xml:space="preserve">Deferred — Section 5 conversation pending</w:t>
+              <w:t xml:space="preserve">Pending — Section 8 conversation pending</w:t>
             </w:r>
           </w:p>
         </w:tc>
@@ -2229,7 +2427,7 @@
                 <w:sz w:val="20"/>
                 <w:szCs w:val="20"/>
               </w:rPr>
-              <w:t xml:space="preserve">Online Learning Platform</w:t>
+              <w:t xml:space="preserve">Volunteer Coordination Tools</w:t>
             </w:r>
           </w:p>
         </w:tc>
@@ -2257,7 +2455,7 @@
                 <w:sz w:val="20"/>
                 <w:szCs w:val="20"/>
               </w:rPr>
-              <w:t xml:space="preserve">Pending — Section 8 conversation pending</w:t>
+              <w:t xml:space="preserve">Largely resolved by EspoCRM — confirm in section conversation</w:t>
             </w:r>
           </w:p>
         </w:tc>
@@ -2287,7 +2485,7 @@
                 <w:sz w:val="20"/>
                 <w:szCs w:val="20"/>
               </w:rPr>
-              <w:t xml:space="preserve">Volunteer Coordination Tools</w:t>
+              <w:t xml:space="preserve">Donor Management</w:t>
             </w:r>
           </w:p>
         </w:tc>
@@ -2315,7 +2513,7 @@
                 <w:sz w:val="20"/>
                 <w:szCs w:val="20"/>
               </w:rPr>
-              <w:t xml:space="preserve">Largely resolved by EspoCRM selection — confirm in section conversation</w:t>
+              <w:t xml:space="preserve">Evaluate EspoCRM native capability first</w:t>
             </w:r>
           </w:p>
         </w:tc>
@@ -2345,7 +2543,7 @@
                 <w:sz w:val="20"/>
                 <w:szCs w:val="20"/>
               </w:rPr>
-              <w:t xml:space="preserve">Donor Management</w:t>
+              <w:t xml:space="preserve">Document &amp; Resource Sharing</w:t>
             </w:r>
           </w:p>
         </w:tc>
@@ -2373,7 +2571,7 @@
                 <w:sz w:val="20"/>
                 <w:szCs w:val="20"/>
               </w:rPr>
-              <w:t xml:space="preserve">Evaluate EspoCRM native capability first</w:t>
+              <w:t xml:space="preserve">Pending — evaluate Google Drive vs FOSS alternatives</w:t>
             </w:r>
           </w:p>
         </w:tc>
@@ -2403,7 +2601,7 @@
                 <w:sz w:val="20"/>
                 <w:szCs w:val="20"/>
               </w:rPr>
-              <w:t xml:space="preserve">Document &amp; Resource Sharing</w:t>
+              <w:t xml:space="preserve">Reporting &amp; Analytics</w:t>
             </w:r>
           </w:p>
         </w:tc>
@@ -2431,7 +2629,7 @@
                 <w:sz w:val="20"/>
                 <w:szCs w:val="20"/>
               </w:rPr>
-              <w:t xml:space="preserve">Pending — evaluate Google Drive vs FOSS alternatives</w:t>
+              <w:t xml:space="preserve">Largely resolved by EspoCRM — confirm dashboards adequate</w:t>
             </w:r>
           </w:p>
         </w:tc>
@@ -2461,7 +2659,7 @@
                 <w:sz w:val="20"/>
                 <w:szCs w:val="20"/>
               </w:rPr>
-              <w:t xml:space="preserve">Reporting &amp; Analytics</w:t>
+              <w:t xml:space="preserve">Email Platform (Final)</w:t>
             </w:r>
           </w:p>
         </w:tc>
@@ -2489,7 +2687,7 @@
                 <w:sz w:val="20"/>
                 <w:szCs w:val="20"/>
               </w:rPr>
-              <w:t xml:space="preserve">Largely resolved by EspoCRM selection — confirm dashboards adequate</w:t>
+              <w:t xml:space="preserve">Provisional — pending CRM communication capability assessment</w:t>
             </w:r>
           </w:p>
         </w:tc>
@@ -2519,7 +2717,7 @@
                 <w:sz w:val="20"/>
                 <w:szCs w:val="20"/>
               </w:rPr>
-              <w:t xml:space="preserve">Email Platform (Final)</w:t>
+              <w:t xml:space="preserve">Google Meet Group Limit Verification</w:t>
             </w:r>
           </w:p>
         </w:tc>
@@ -2547,7 +2745,7 @@
                 <w:sz w:val="20"/>
                 <w:szCs w:val="20"/>
               </w:rPr>
-              <w:t xml:space="preserve">Provisional — pending CRM communication capability assessment</w:t>
+              <w:t xml:space="preserve">Action required — verify free nonprofit tier removes 60-min group limit</w:t>
             </w:r>
           </w:p>
         </w:tc>
@@ -2577,7 +2775,7 @@
                 <w:sz w:val="20"/>
                 <w:szCs w:val="20"/>
               </w:rPr>
-              <w:t xml:space="preserve">Video/Virtual Meeting Integration</w:t>
+              <w:t xml:space="preserve">Dues Payment Processing</w:t>
             </w:r>
           </w:p>
         </w:tc>
@@ -2605,7 +2803,7 @@
                 <w:sz w:val="20"/>
                 <w:szCs w:val="20"/>
               </w:rPr>
-              <w:t xml:space="preserve">Open — how are virtual sessions initiated and logged?</w:t>
+              <w:t xml:space="preserve">Open — PCI-compliant payment integration needed</w:t>
             </w:r>
           </w:p>
         </w:tc>
@@ -2635,7 +2833,7 @@
                 <w:sz w:val="20"/>
                 <w:szCs w:val="20"/>
               </w:rPr>
-              <w:t xml:space="preserve">Dues Payment Processing</w:t>
+              <w:t xml:space="preserve">Backup &amp; Recovery Strategy</w:t>
             </w:r>
           </w:p>
         </w:tc>
@@ -2663,65 +2861,7 @@
                 <w:sz w:val="20"/>
                 <w:szCs w:val="20"/>
               </w:rPr>
-              <w:t xml:space="preserve">Open — PCI-compliant payment integration needed</w:t>
-            </w:r>
-          </w:p>
-        </w:tc>
-      </w:tr>
-      <w:tr>
-        <w:tc>
-          <w:tcPr>
-            <w:tcW w:type="dxa" w:w="3500"/>
-            <w:tcBorders>
-              <w:top w:val="single" w:color="CCCCCC" w:sz="1"/>
-              <w:left w:val="single" w:color="CCCCCC" w:sz="1"/>
-              <w:bottom w:val="single" w:color="CCCCCC" w:sz="1"/>
-              <w:right w:val="single" w:color="CCCCCC" w:sz="1"/>
-            </w:tcBorders>
-            <w:shd w:fill="F2F2F2" w:val="clear"/>
-            <w:tcMar>
-              <w:top w:type="dxa" w:w="80"/>
-              <w:left w:type="dxa" w:w="120"/>
-              <w:bottom w:type="dxa" w:w="80"/>
-              <w:right w:type="dxa" w:w="120"/>
-            </w:tcMar>
-          </w:tcPr>
-          <w:p>
-            <w:r>
-              <w:rPr>
-                <w:rFonts w:ascii="Arial" w:cs="Arial" w:eastAsia="Arial" w:hAnsi="Arial"/>
-                <w:sz w:val="20"/>
-                <w:szCs w:val="20"/>
-              </w:rPr>
-              <w:t xml:space="preserve">Backup &amp; Recovery Strategy</w:t>
-            </w:r>
-          </w:p>
-        </w:tc>
-        <w:tc>
-          <w:tcPr>
-            <w:tcW w:type="dxa" w:w="5860"/>
-            <w:tcBorders>
-              <w:top w:val="single" w:color="CCCCCC" w:sz="1"/>
-              <w:left w:val="single" w:color="CCCCCC" w:sz="1"/>
-              <w:bottom w:val="single" w:color="CCCCCC" w:sz="1"/>
-              <w:right w:val="single" w:color="CCCCCC" w:sz="1"/>
-            </w:tcBorders>
-            <w:shd w:fill="F2F2F2" w:val="clear"/>
-            <w:tcMar>
-              <w:top w:type="dxa" w:w="80"/>
-              <w:left w:type="dxa" w:w="120"/>
-              <w:bottom w:type="dxa" w:w="80"/>
-              <w:right w:type="dxa" w:w="120"/>
-            </w:tcMar>
-          </w:tcPr>
-          <w:p>
-            <w:r>
-              <w:rPr>
-                <w:rFonts w:ascii="Arial" w:cs="Arial" w:eastAsia="Arial" w:hAnsi="Arial"/>
-                <w:sz w:val="20"/>
-                <w:szCs w:val="20"/>
-              </w:rPr>
-              <w:t xml:space="preserve">Open — self-hosted EspoCRM on AWS</w:t>
+              <w:t xml:space="preserve">Open — self-hosted EspoCRM and Jitsi on AWS</w:t>
             </w:r>
           </w:p>
         </w:tc>

</xml_diff>

<commit_message>
Add Sections 6-8 PRD and update Decisions Log v0.4
New document:
- CBM-PRD-Communication-Workshops-Learning.docx (Sections 6, 7 & 8)
  - Section 6: Communication stack (Flarum x2, Jitsi, Google Meet, EspoCRM)
  - Section 7: Workshop & Event Management (BigBlueButton, EspoCRM workflows)
  - Section 8: Online Learning Platform (Moodle, dual-audience, BBB integration)
  - Mentor onboarding curriculum with ethics checkbox sign-off

Decisions Log v0.4:
- Added D-018 through D-026
- Discourse ruled out (facial recognition/age verification policy)
- Flarum two-instance architecture selected
- BigBlueButton for virtual workshops
- Moodle selected (admin has existing experience)
- Dual-audience LMS architecture
- Ethics sign-off via Moodle checkbox
- Bulk email deferred pending EspoCRM evaluation
</commit_message>
<xml_diff>
--- a/PRDs/CBM-Decisions-Log.docx
+++ b/PRDs/CBM-Decisions-Log.docx
@@ -46,7 +46,7 @@
           <w:sz w:val="22"/>
           <w:szCs w:val="22"/>
         </w:rPr>
-        <w:t xml:space="preserve">Version 0.3  |  Living Document  |  2025</w:t>
+        <w:t xml:space="preserve">Version 0.4  |  Living Document  |  2025</w:t>
       </w:r>
     </w:p>
     <w:p>
@@ -90,70 +90,6 @@
         <w:pStyle w:val="Heading1"/>
       </w:pPr>
       <w:r>
-        <w:t xml:space="preserve">How to Use This Log</w:t>
-      </w:r>
-    </w:p>
-    <w:p>
-      <w:pPr>
-        <w:pStyle w:val="ListParagraph"/>
-        <w:numPr>
-          <w:ilvl w:val="0"/>
-          <w:numId w:val="2"/>
-        </w:numPr>
-        <w:spacing w:after="80"/>
-      </w:pPr>
-      <w:r>
-        <w:rPr>
-          <w:b w:val="false"/>
-          <w:bCs w:val="false"/>
-        </w:rPr>
-        <w:t xml:space="preserve">Add a new row whenever a significant technology decision is made</w:t>
-      </w:r>
-    </w:p>
-    <w:p>
-      <w:pPr>
-        <w:pStyle w:val="ListParagraph"/>
-        <w:numPr>
-          <w:ilvl w:val="0"/>
-          <w:numId w:val="2"/>
-        </w:numPr>
-        <w:spacing w:after="80"/>
-      </w:pPr>
-      <w:r>
-        <w:rPr>
-          <w:b w:val="false"/>
-          <w:bCs w:val="false"/>
-        </w:rPr>
-        <w:t xml:space="preserve">Mark decisions as PROVISIONAL if they are expected to be revisited</w:t>
-      </w:r>
-    </w:p>
-    <w:p>
-      <w:pPr>
-        <w:pStyle w:val="ListParagraph"/>
-        <w:numPr>
-          <w:ilvl w:val="0"/>
-          <w:numId w:val="2"/>
-        </w:numPr>
-        <w:spacing w:after="80"/>
-      </w:pPr>
-      <w:r>
-        <w:rPr>
-          <w:b w:val="false"/>
-          <w:bCs w:val="false"/>
-        </w:rPr>
-        <w:t xml:space="preserve">Add a REVISIT trigger — the condition under which the decision should be re-evaluated</w:t>
-      </w:r>
-    </w:p>
-    <w:p>
-      <w:r>
-        <w:t xml:space="preserve"/>
-      </w:r>
-    </w:p>
-    <w:p>
-      <w:pPr>
-        <w:pStyle w:val="Heading1"/>
-      </w:pPr>
-      <w:r>
         <w:t xml:space="preserve">Decision Log</w:t>
       </w:r>
     </w:p>
@@ -390,7 +326,7 @@
                 <w:sz w:val="20"/>
                 <w:szCs w:val="20"/>
               </w:rPr>
-              <w:t xml:space="preserve">AWS, GCP, Azure, DigitalOcean, self-hosted VPS</w:t>
+              <w:t xml:space="preserve">AWS, GCP, Azure, DigitalOcean, VPS</w:t>
             </w:r>
           </w:p>
         </w:tc>
@@ -418,7 +354,7 @@
                 <w:sz w:val="20"/>
                 <w:szCs w:val="20"/>
               </w:rPr>
-              <w:t xml:space="preserve">AWS SELECTED. Unified ecosystem (domain, hosting, CI/CD, CDN). Tech admin AWS-comfortable. Cost manageable at CBM scale.</w:t>
+              <w:t xml:space="preserve">AWS SELECTED. Unified ecosystem, tech admin experienced, cost manageable at CBM scale.</w:t>
             </w:r>
           </w:p>
         </w:tc>
@@ -504,7 +440,7 @@
                 <w:sz w:val="20"/>
                 <w:szCs w:val="20"/>
               </w:rPr>
-              <w:t xml:space="preserve">Namecheap, Cloudflare, AWS Route 53</w:t>
+              <w:t xml:space="preserve">Namecheap, Cloudflare, Route 53</w:t>
             </w:r>
           </w:p>
         </w:tc>
@@ -532,7 +468,7 @@
                 <w:sz w:val="20"/>
                 <w:szCs w:val="20"/>
               </w:rPr>
-              <w:t xml:space="preserve">AWS Route 53 SELECTED. Stays within AWS ecosystem. Unified IAM. Integrated billing.</w:t>
+              <w:t xml:space="preserve">AWS Route 53 SELECTED. Unified AWS ecosystem, integrated billing.</w:t>
             </w:r>
           </w:p>
         </w:tc>
@@ -590,7 +526,7 @@
                 <w:sz w:val="20"/>
                 <w:szCs w:val="20"/>
               </w:rPr>
-              <w:t xml:space="preserve">Email Platform (PROVISIONAL)</w:t>
+              <w:t xml:space="preserve">Email (PROVISIONAL)</w:t>
             </w:r>
           </w:p>
         </w:tc>
@@ -618,7 +554,7 @@
                 <w:sz w:val="20"/>
                 <w:szCs w:val="20"/>
               </w:rPr>
-              <w:t xml:space="preserve">Google Workspace for Nonprofits, Proton Business, self-hosted Mailcow</w:t>
+              <w:t xml:space="preserve">Google Workspace, Proton, Mailcow</w:t>
             </w:r>
           </w:p>
         </w:tc>
@@ -646,7 +582,7 @@
                 <w:sz w:val="20"/>
                 <w:szCs w:val="20"/>
               </w:rPr>
-              <w:t xml:space="preserve">Google Workspace for Nonprofits SELECTED (provisional). Free for 501(c)(3), familiar UI. PROVISIONAL: May migrate if CRM centralizes all mentor-client communication.</w:t>
+              <w:t xml:space="preserve">Google Workspace for Nonprofits SELECTED (provisional). Free for 501(c)(3). May migrate if CRM centralizes mentor-client communication.</w:t>
             </w:r>
           </w:p>
         </w:tc>
@@ -760,7 +696,7 @@
                 <w:sz w:val="20"/>
                 <w:szCs w:val="20"/>
               </w:rPr>
-              <w:t xml:space="preserve">Static HTML/CSS/JS SELECTED. Built with Claude Code. No CMS overhead, fast, cheap on S3, full control.</w:t>
+              <w:t xml:space="preserve">Static HTML/CSS/JS SELECTED. Built with Claude Code. No CMS overhead, fast, cheap on S3.</w:t>
             </w:r>
           </w:p>
         </w:tc>
@@ -846,7 +782,7 @@
                 <w:sz w:val="20"/>
                 <w:szCs w:val="20"/>
               </w:rPr>
-              <w:t xml:space="preserve">AWS S3+CloudFront, Netlify, Vercel, GitHub Pages</w:t>
+              <w:t xml:space="preserve">S3+CloudFront, Netlify, Vercel</w:t>
             </w:r>
           </w:p>
         </w:tc>
@@ -874,7 +810,7 @@
                 <w:sz w:val="20"/>
                 <w:szCs w:val="20"/>
               </w:rPr>
-              <w:t xml:space="preserve">AWS S3 + CloudFront SELECTED. Natural AWS ecosystem fit. Negligible cost. CloudFront provides CDN and SSL.</w:t>
+              <w:t xml:space="preserve">AWS S3 + CloudFront SELECTED. Natural AWS fit. Negligible cost. SSL via CloudFront.</w:t>
             </w:r>
           </w:p>
         </w:tc>
@@ -960,7 +896,7 @@
                 <w:sz w:val="20"/>
                 <w:szCs w:val="20"/>
               </w:rPr>
-              <w:t xml:space="preserve">AWS CodePipeline + CodeCommit, GitHub Actions, GitLab CI</w:t>
+              <w:t xml:space="preserve">CodePipeline+CodeCommit, GitHub Actions</w:t>
             </w:r>
           </w:p>
         </w:tc>
@@ -988,7 +924,7 @@
                 <w:sz w:val="20"/>
                 <w:szCs w:val="20"/>
               </w:rPr>
-              <w:t xml:space="preserve">AWS CodePipeline + CodeCommit SELECTED. Single AWS ecosystem. Unified IAM.</w:t>
+              <w:t xml:space="preserve">AWS CodePipeline + CodeCommit SELECTED. Single AWS ecosystem, unified IAM.</w:t>
             </w:r>
           </w:p>
         </w:tc>
@@ -1046,7 +982,7 @@
                 <w:sz w:val="20"/>
                 <w:szCs w:val="20"/>
               </w:rPr>
-              <w:t xml:space="preserve">Form &amp; Intake Strategy</w:t>
+              <w:t xml:space="preserve">Form &amp; Intake</w:t>
             </w:r>
           </w:p>
         </w:tc>
@@ -1074,7 +1010,7 @@
                 <w:sz w:val="20"/>
                 <w:szCs w:val="20"/>
               </w:rPr>
-              <w:t xml:space="preserve">Third-party form tools, CRM-native forms, custom API</w:t>
+              <w:t xml:space="preserve">Third-party tools, CRM-native, custom API</w:t>
             </w:r>
           </w:p>
         </w:tc>
@@ -1102,7 +1038,7 @@
                 <w:sz w:val="20"/>
                 <w:szCs w:val="20"/>
               </w:rPr>
-              <w:t xml:space="preserve">CRM-native forms SELECTED. All intake, volunteer signup, and event registration become CRM records automatically.</w:t>
+              <w:t xml:space="preserve">CRM-native forms SELECTED. All intake flows directly into CRM as records.</w:t>
             </w:r>
           </w:p>
         </w:tc>
@@ -1188,7 +1124,7 @@
                 <w:sz w:val="20"/>
                 <w:szCs w:val="20"/>
               </w:rPr>
-              <w:t xml:space="preserve">AWS CodeCommit, GitHub, GitLab</w:t>
+              <w:t xml:space="preserve">CodeCommit, GitHub, GitLab</w:t>
             </w:r>
           </w:p>
         </w:tc>
@@ -1216,7 +1152,7 @@
                 <w:sz w:val="20"/>
                 <w:szCs w:val="20"/>
               </w:rPr>
-              <w:t xml:space="preserve">GitHub SELECTED for planning documents. Accessible to board without AWS credentials. AWS CodeCommit reserved for website source code.</w:t>
+              <w:t xml:space="preserve">GitHub SELECTED for planning docs. AWS CodeCommit reserved for website source code.</w:t>
             </w:r>
           </w:p>
         </w:tc>
@@ -1330,7 +1266,7 @@
                 <w:sz w:val="20"/>
                 <w:szCs w:val="20"/>
               </w:rPr>
-              <w:t xml:space="preserve">EspoCRM SELECTED. FOSS, self-hosted on AWS, fully customizable, native email threading, workflow automation, REST API, no per-seat costs. HubSpot evaluated but not selected. Attio retained as future fallback.</w:t>
+              <w:t xml:space="preserve">EspoCRM SELECTED. FOSS, self-hosted, customizable, email threading, workflow automation, REST API, no per-seat costs. HubSpot not selected. Attio future fallback.</w:t>
             </w:r>
           </w:p>
         </w:tc>
@@ -1388,7 +1324,7 @@
                 <w:sz w:val="20"/>
                 <w:szCs w:val="20"/>
               </w:rPr>
-              <w:t xml:space="preserve">CRM Communication Strategy</w:t>
+              <w:t xml:space="preserve">CRM Communication</w:t>
             </w:r>
           </w:p>
         </w:tc>
@@ -1416,7 +1352,7 @@
                 <w:sz w:val="20"/>
                 <w:szCs w:val="20"/>
               </w:rPr>
-              <w:t xml:space="preserve">Personal email, organizational email, CRM-native</w:t>
+              <w:t xml:space="preserve">Personal email, org email, CRM-native</w:t>
             </w:r>
           </w:p>
         </w:tc>
@@ -1444,7 +1380,7 @@
                 <w:sz w:val="20"/>
                 <w:szCs w:val="20"/>
               </w:rPr>
-              <w:t xml:space="preserve">All mentor-client communication through CRM SELECTED. Enables inactivity tracking, maintains confidentiality. Clients interact via email reply — no CRM login required.</w:t>
+              <w:t xml:space="preserve">All mentor-client communication through CRM. Enables inactivity tracking. Clients use email reply — no CRM login.</w:t>
             </w:r>
           </w:p>
         </w:tc>
@@ -1530,7 +1466,7 @@
                 <w:sz w:val="20"/>
                 <w:szCs w:val="20"/>
               </w:rPr>
-              <w:t xml:space="preserve">Single role per volunteer, multiple profiles, single profile multi-role</w:t>
+              <w:t xml:space="preserve">Single role, multiple profiles, multi-role profile</w:t>
             </w:r>
           </w:p>
         </w:tc>
@@ -1558,7 +1494,7 @@
                 <w:sz w:val="20"/>
                 <w:szCs w:val="20"/>
               </w:rPr>
-              <w:t xml:space="preserve">Single profile with additive roles SELECTED. One profile per volunteer supporting mentor, co-mentor, and/or SME roles concurrently.</w:t>
+              <w:t xml:space="preserve">Single profile with additive roles. One profile supports mentor, co-mentor, and/or SME concurrently.</w:t>
             </w:r>
           </w:p>
         </w:tc>
@@ -1616,7 +1552,7 @@
                 <w:sz w:val="20"/>
                 <w:szCs w:val="20"/>
               </w:rPr>
-              <w:t xml:space="preserve">Mentor Matching Phase 1</w:t>
+              <w:t xml:space="preserve">Mentor Matching P1</w:t>
             </w:r>
           </w:p>
         </w:tc>
@@ -1644,7 +1580,7 @@
                 <w:sz w:val="20"/>
                 <w:szCs w:val="20"/>
               </w:rPr>
-              <w:t xml:space="preserve">Fully automated, fully manual, admin-assisted manual</w:t>
+              <w:t xml:space="preserve">Automated, manual, admin-assisted manual</w:t>
             </w:r>
           </w:p>
         </w:tc>
@@ -1672,7 +1608,7 @@
                 <w:sz w:val="20"/>
                 <w:szCs w:val="20"/>
               </w:rPr>
-              <w:t xml:space="preserve">Admin-assisted manual matching SELECTED for Phase 1. Automated suggestion system planned for Phase 2 — data model supports it from day one.</w:t>
+              <w:t xml:space="preserve">Admin-assisted manual for Phase 1. Automated suggestions planned Phase 2 — data model ready.</w:t>
             </w:r>
           </w:p>
         </w:tc>
@@ -1786,7 +1722,7 @@
                 <w:sz w:val="20"/>
                 <w:szCs w:val="20"/>
               </w:rPr>
-              <w:t xml:space="preserve">Mentor-initiated request workflow SELECTED. SME accepts or declines. Admin has visibility but is not the bottleneck.</w:t>
+              <w:t xml:space="preserve">Mentor-initiated. SME accepts or declines. Admin has visibility but not bottleneck.</w:t>
             </w:r>
           </w:p>
         </w:tc>
@@ -1872,7 +1808,7 @@
                 <w:sz w:val="20"/>
                 <w:szCs w:val="20"/>
               </w:rPr>
-              <w:t xml:space="preserve">Manual surveys, CRM-native, integrated survey tool</w:t>
+              <w:t xml:space="preserve">Manual, CRM-native, survey tool integration</w:t>
             </w:r>
           </w:p>
         </w:tc>
@@ -1900,7 +1836,7 @@
                 <w:sz w:val="20"/>
                 <w:szCs w:val="20"/>
               </w:rPr>
-              <w:t xml:space="preserve">CRM-triggered NPS SELECTED. Automated trigger at engagement close. Integrate LimeSurvey if CRM-native insufficient.</w:t>
+              <w:t xml:space="preserve">CRM-triggered NPS at engagement close. LimeSurvey integration if CRM-native insufficient.</w:t>
             </w:r>
           </w:p>
         </w:tc>
@@ -1986,7 +1922,7 @@
                 <w:sz w:val="20"/>
                 <w:szCs w:val="20"/>
               </w:rPr>
-              <w:t xml:space="preserve">CRM-native only, dedicated tool only, hybrid</w:t>
+              <w:t xml:space="preserve">CRM-native only, dedicated tool, hybrid</w:t>
             </w:r>
           </w:p>
         </w:tc>
@@ -2014,7 +1950,7 @@
                 <w:sz w:val="20"/>
                 <w:szCs w:val="20"/>
               </w:rPr>
-              <w:t xml:space="preserve">Hybrid SELECTED. EspoCRM native for mentor-proposed sessions (default). Cal.com self-hosted for optional client self-scheduling. Both log sessions back to EspoCRM.</w:t>
+              <w:t xml:space="preserve">Hybrid: EspoCRM native (mentor-proposed, default) + Cal.com self-hosted (client self-schedule, optional).</w:t>
             </w:r>
           </w:p>
         </w:tc>
@@ -2072,7 +2008,7 @@
                 <w:sz w:val="20"/>
                 <w:szCs w:val="20"/>
               </w:rPr>
-              <w:t xml:space="preserve">Client-Facing Video</w:t>
+              <w:t xml:space="preserve">Client Video</w:t>
             </w:r>
           </w:p>
         </w:tc>
@@ -2100,7 +2036,7 @@
                 <w:sz w:val="20"/>
                 <w:szCs w:val="20"/>
               </w:rPr>
-              <w:t xml:space="preserve">Google Meet, Zoom, Jitsi Meet, Microsoft Teams</w:t>
+              <w:t xml:space="preserve">Google Meet, Zoom, Jitsi, Teams</w:t>
             </w:r>
           </w:p>
         </w:tc>
@@ -2128,7 +2064,7 @@
                 <w:sz w:val="20"/>
                 <w:szCs w:val="20"/>
               </w:rPr>
-              <w:t xml:space="preserve">Google Meet SELECTED for client-facing sessions. Included in Google Workspace for Nonprofits. No client login required. Familiar to senior mentors. No time limit for 1:1 sessions.</w:t>
+              <w:t xml:space="preserve">Google Meet SELECTED. Included in Google Workspace for Nonprofits. Familiar, no client login, no 1:1 time limit.</w:t>
             </w:r>
           </w:p>
         </w:tc>
@@ -2186,7 +2122,7 @@
                 <w:sz w:val="20"/>
                 <w:szCs w:val="20"/>
               </w:rPr>
-              <w:t xml:space="preserve">Internal Meeting Video</w:t>
+              <w:t xml:space="preserve">Internal Video</w:t>
             </w:r>
           </w:p>
         </w:tc>
@@ -2214,7 +2150,7 @@
                 <w:sz w:val="20"/>
                 <w:szCs w:val="20"/>
               </w:rPr>
-              <w:t xml:space="preserve">Google Meet, Zoom, Jitsi Meet, Microsoft Teams</w:t>
+              <w:t xml:space="preserve">Google Meet, Zoom, Jitsi, Teams</w:t>
             </w:r>
           </w:p>
         </w:tc>
@@ -2242,7 +2178,1033 @@
                 <w:sz w:val="20"/>
                 <w:szCs w:val="20"/>
               </w:rPr>
-              <w:t xml:space="preserve">Jitsi Meet (self-hosted on AWS) SELECTED for internal meetings. Fully FOSS. No time limits. No per-seat costs. No participant caps. Internal audience can be coached to use it. Solves group meeting duration concern without cost.</w:t>
+              <w:t xml:space="preserve">Jitsi Meet (self-hosted AWS) SELECTED. FOSS, no time limits, no per-seat costs, no participant caps.</w:t>
+            </w:r>
+          </w:p>
+        </w:tc>
+      </w:tr>
+      <w:tr>
+        <w:tc>
+          <w:tcPr>
+            <w:tcW w:type="dxa" w:w="800"/>
+            <w:tcBorders>
+              <w:top w:val="single" w:color="CCCCCC" w:sz="1"/>
+              <w:left w:val="single" w:color="CCCCCC" w:sz="1"/>
+              <w:bottom w:val="single" w:color="CCCCCC" w:sz="1"/>
+              <w:right w:val="single" w:color="CCCCCC" w:sz="1"/>
+            </w:tcBorders>
+            <w:shd w:fill="F2F2F2" w:val="clear"/>
+            <w:tcMar>
+              <w:top w:type="dxa" w:w="80"/>
+              <w:left w:type="dxa" w:w="120"/>
+              <w:bottom w:type="dxa" w:w="80"/>
+              <w:right w:type="dxa" w:w="120"/>
+            </w:tcMar>
+          </w:tcPr>
+          <w:p>
+            <w:r>
+              <w:rPr>
+                <w:rFonts w:ascii="Arial" w:cs="Arial" w:eastAsia="Arial" w:hAnsi="Arial"/>
+                <w:sz w:val="20"/>
+                <w:szCs w:val="20"/>
+              </w:rPr>
+              <w:t xml:space="preserve">D-018</w:t>
+            </w:r>
+          </w:p>
+        </w:tc>
+        <w:tc>
+          <w:tcPr>
+            <w:tcW w:type="dxa" w:w="1600"/>
+            <w:tcBorders>
+              <w:top w:val="single" w:color="CCCCCC" w:sz="1"/>
+              <w:left w:val="single" w:color="CCCCCC" w:sz="1"/>
+              <w:bottom w:val="single" w:color="CCCCCC" w:sz="1"/>
+              <w:right w:val="single" w:color="CCCCCC" w:sz="1"/>
+            </w:tcBorders>
+            <w:shd w:fill="F2F2F2" w:val="clear"/>
+            <w:tcMar>
+              <w:top w:type="dxa" w:w="80"/>
+              <w:left w:type="dxa" w:w="120"/>
+              <w:bottom w:type="dxa" w:w="80"/>
+              <w:right w:type="dxa" w:w="120"/>
+            </w:tcMar>
+          </w:tcPr>
+          <w:p>
+            <w:r>
+              <w:rPr>
+                <w:rFonts w:ascii="Arial" w:cs="Arial" w:eastAsia="Arial" w:hAnsi="Arial"/>
+                <w:sz w:val="20"/>
+                <w:szCs w:val="20"/>
+              </w:rPr>
+              <w:t xml:space="preserve">Community Forums</w:t>
+            </w:r>
+          </w:p>
+        </w:tc>
+        <w:tc>
+          <w:tcPr>
+            <w:tcW w:type="dxa" w:w="2000"/>
+            <w:tcBorders>
+              <w:top w:val="single" w:color="CCCCCC" w:sz="1"/>
+              <w:left w:val="single" w:color="CCCCCC" w:sz="1"/>
+              <w:bottom w:val="single" w:color="CCCCCC" w:sz="1"/>
+              <w:right w:val="single" w:color="CCCCCC" w:sz="1"/>
+            </w:tcBorders>
+            <w:shd w:fill="F2F2F2" w:val="clear"/>
+            <w:tcMar>
+              <w:top w:type="dxa" w:w="80"/>
+              <w:left w:type="dxa" w:w="120"/>
+              <w:bottom w:type="dxa" w:w="80"/>
+              <w:right w:type="dxa" w:w="120"/>
+            </w:tcMar>
+          </w:tcPr>
+          <w:p>
+            <w:r>
+              <w:rPr>
+                <w:rFonts w:ascii="Arial" w:cs="Arial" w:eastAsia="Arial" w:hAnsi="Arial"/>
+                <w:sz w:val="20"/>
+                <w:szCs w:val="20"/>
+              </w:rPr>
+              <w:t xml:space="preserve">Discourse, Mattermost, Flarum, NodeBB</w:t>
+            </w:r>
+          </w:p>
+        </w:tc>
+        <w:tc>
+          <w:tcPr>
+            <w:tcW w:type="dxa" w:w="4960"/>
+            <w:tcBorders>
+              <w:top w:val="single" w:color="CCCCCC" w:sz="1"/>
+              <w:left w:val="single" w:color="CCCCCC" w:sz="1"/>
+              <w:bottom w:val="single" w:color="CCCCCC" w:sz="1"/>
+              <w:right w:val="single" w:color="CCCCCC" w:sz="1"/>
+            </w:tcBorders>
+            <w:shd w:fill="F2F2F2" w:val="clear"/>
+            <w:tcMar>
+              <w:top w:type="dxa" w:w="80"/>
+              <w:left w:type="dxa" w:w="120"/>
+              <w:bottom w:type="dxa" w:w="80"/>
+              <w:right w:type="dxa" w:w="120"/>
+            </w:tcMar>
+          </w:tcPr>
+          <w:p>
+            <w:r>
+              <w:rPr>
+                <w:rFonts w:ascii="Arial" w:cs="Arial" w:eastAsia="Arial" w:hAnsi="Arial"/>
+                <w:sz w:val="20"/>
+                <w:szCs w:val="20"/>
+              </w:rPr>
+              <w:t xml:space="preserve">Flarum SELECTED (two separate self-hosted instances on AWS). Discourse ruled out — facial recognition/age verification policy conflicts with CBM privacy values. Instance 1: mentor community. Instance 2: client community. No public access to either.</w:t>
+            </w:r>
+          </w:p>
+        </w:tc>
+      </w:tr>
+      <w:tr>
+        <w:tc>
+          <w:tcPr>
+            <w:tcW w:type="dxa" w:w="800"/>
+            <w:tcBorders>
+              <w:top w:val="single" w:color="CCCCCC" w:sz="1"/>
+              <w:left w:val="single" w:color="CCCCCC" w:sz="1"/>
+              <w:bottom w:val="single" w:color="CCCCCC" w:sz="1"/>
+              <w:right w:val="single" w:color="CCCCCC" w:sz="1"/>
+            </w:tcBorders>
+            <w:shd w:fill="FFFFFF" w:val="clear"/>
+            <w:tcMar>
+              <w:top w:type="dxa" w:w="80"/>
+              <w:left w:type="dxa" w:w="120"/>
+              <w:bottom w:type="dxa" w:w="80"/>
+              <w:right w:type="dxa" w:w="120"/>
+            </w:tcMar>
+          </w:tcPr>
+          <w:p>
+            <w:r>
+              <w:rPr>
+                <w:rFonts w:ascii="Arial" w:cs="Arial" w:eastAsia="Arial" w:hAnsi="Arial"/>
+                <w:sz w:val="20"/>
+                <w:szCs w:val="20"/>
+              </w:rPr>
+              <w:t xml:space="preserve">D-019</w:t>
+            </w:r>
+          </w:p>
+        </w:tc>
+        <w:tc>
+          <w:tcPr>
+            <w:tcW w:type="dxa" w:w="1600"/>
+            <w:tcBorders>
+              <w:top w:val="single" w:color="CCCCCC" w:sz="1"/>
+              <w:left w:val="single" w:color="CCCCCC" w:sz="1"/>
+              <w:bottom w:val="single" w:color="CCCCCC" w:sz="1"/>
+              <w:right w:val="single" w:color="CCCCCC" w:sz="1"/>
+            </w:tcBorders>
+            <w:shd w:fill="FFFFFF" w:val="clear"/>
+            <w:tcMar>
+              <w:top w:type="dxa" w:w="80"/>
+              <w:left w:type="dxa" w:w="120"/>
+              <w:bottom w:type="dxa" w:w="80"/>
+              <w:right w:type="dxa" w:w="120"/>
+            </w:tcMar>
+          </w:tcPr>
+          <w:p>
+            <w:r>
+              <w:rPr>
+                <w:rFonts w:ascii="Arial" w:cs="Arial" w:eastAsia="Arial" w:hAnsi="Arial"/>
+                <w:sz w:val="20"/>
+                <w:szCs w:val="20"/>
+              </w:rPr>
+              <w:t xml:space="preserve">Forum Architecture</w:t>
+            </w:r>
+          </w:p>
+        </w:tc>
+        <w:tc>
+          <w:tcPr>
+            <w:tcW w:type="dxa" w:w="2000"/>
+            <w:tcBorders>
+              <w:top w:val="single" w:color="CCCCCC" w:sz="1"/>
+              <w:left w:val="single" w:color="CCCCCC" w:sz="1"/>
+              <w:bottom w:val="single" w:color="CCCCCC" w:sz="1"/>
+              <w:right w:val="single" w:color="CCCCCC" w:sz="1"/>
+            </w:tcBorders>
+            <w:shd w:fill="FFFFFF" w:val="clear"/>
+            <w:tcMar>
+              <w:top w:type="dxa" w:w="80"/>
+              <w:left w:type="dxa" w:w="120"/>
+              <w:bottom w:type="dxa" w:w="80"/>
+              <w:right w:type="dxa" w:w="120"/>
+            </w:tcMar>
+          </w:tcPr>
+          <w:p>
+            <w:r>
+              <w:rPr>
+                <w:rFonts w:ascii="Arial" w:cs="Arial" w:eastAsia="Arial" w:hAnsi="Arial"/>
+                <w:sz w:val="20"/>
+                <w:szCs w:val="20"/>
+              </w:rPr>
+              <w:t xml:space="preserve">Single instance with permissions, two instances</w:t>
+            </w:r>
+          </w:p>
+        </w:tc>
+        <w:tc>
+          <w:tcPr>
+            <w:tcW w:type="dxa" w:w="4960"/>
+            <w:tcBorders>
+              <w:top w:val="single" w:color="CCCCCC" w:sz="1"/>
+              <w:left w:val="single" w:color="CCCCCC" w:sz="1"/>
+              <w:bottom w:val="single" w:color="CCCCCC" w:sz="1"/>
+              <w:right w:val="single" w:color="CCCCCC" w:sz="1"/>
+            </w:tcBorders>
+            <w:shd w:fill="FFFFFF" w:val="clear"/>
+            <w:tcMar>
+              <w:top w:type="dxa" w:w="80"/>
+              <w:left w:type="dxa" w:w="120"/>
+              <w:bottom w:type="dxa" w:w="80"/>
+              <w:right w:type="dxa" w:w="120"/>
+            </w:tcMar>
+          </w:tcPr>
+          <w:p>
+            <w:r>
+              <w:rPr>
+                <w:rFonts w:ascii="Arial" w:cs="Arial" w:eastAsia="Arial" w:hAnsi="Arial"/>
+                <w:sz w:val="20"/>
+                <w:szCs w:val="20"/>
+              </w:rPr>
+              <w:t xml:space="preserve">Two separate Flarum instances SELECTED. Complete isolation for confidentiality. Mentor discussions fully separated from client access.</w:t>
+            </w:r>
+          </w:p>
+        </w:tc>
+      </w:tr>
+      <w:tr>
+        <w:tc>
+          <w:tcPr>
+            <w:tcW w:type="dxa" w:w="800"/>
+            <w:tcBorders>
+              <w:top w:val="single" w:color="CCCCCC" w:sz="1"/>
+              <w:left w:val="single" w:color="CCCCCC" w:sz="1"/>
+              <w:bottom w:val="single" w:color="CCCCCC" w:sz="1"/>
+              <w:right w:val="single" w:color="CCCCCC" w:sz="1"/>
+            </w:tcBorders>
+            <w:shd w:fill="F2F2F2" w:val="clear"/>
+            <w:tcMar>
+              <w:top w:type="dxa" w:w="80"/>
+              <w:left w:type="dxa" w:w="120"/>
+              <w:bottom w:type="dxa" w:w="80"/>
+              <w:right w:type="dxa" w:w="120"/>
+            </w:tcMar>
+          </w:tcPr>
+          <w:p>
+            <w:r>
+              <w:rPr>
+                <w:rFonts w:ascii="Arial" w:cs="Arial" w:eastAsia="Arial" w:hAnsi="Arial"/>
+                <w:sz w:val="20"/>
+                <w:szCs w:val="20"/>
+              </w:rPr>
+              <w:t xml:space="preserve">D-020</w:t>
+            </w:r>
+          </w:p>
+        </w:tc>
+        <w:tc>
+          <w:tcPr>
+            <w:tcW w:type="dxa" w:w="1600"/>
+            <w:tcBorders>
+              <w:top w:val="single" w:color="CCCCCC" w:sz="1"/>
+              <w:left w:val="single" w:color="CCCCCC" w:sz="1"/>
+              <w:bottom w:val="single" w:color="CCCCCC" w:sz="1"/>
+              <w:right w:val="single" w:color="CCCCCC" w:sz="1"/>
+            </w:tcBorders>
+            <w:shd w:fill="F2F2F2" w:val="clear"/>
+            <w:tcMar>
+              <w:top w:type="dxa" w:w="80"/>
+              <w:left w:type="dxa" w:w="120"/>
+              <w:bottom w:type="dxa" w:w="80"/>
+              <w:right w:type="dxa" w:w="120"/>
+            </w:tcMar>
+          </w:tcPr>
+          <w:p>
+            <w:r>
+              <w:rPr>
+                <w:rFonts w:ascii="Arial" w:cs="Arial" w:eastAsia="Arial" w:hAnsi="Arial"/>
+                <w:sz w:val="20"/>
+                <w:szCs w:val="20"/>
+              </w:rPr>
+              <w:t xml:space="preserve">Virtual Workshops</w:t>
+            </w:r>
+          </w:p>
+        </w:tc>
+        <w:tc>
+          <w:tcPr>
+            <w:tcW w:type="dxa" w:w="2000"/>
+            <w:tcBorders>
+              <w:top w:val="single" w:color="CCCCCC" w:sz="1"/>
+              <w:left w:val="single" w:color="CCCCCC" w:sz="1"/>
+              <w:bottom w:val="single" w:color="CCCCCC" w:sz="1"/>
+              <w:right w:val="single" w:color="CCCCCC" w:sz="1"/>
+            </w:tcBorders>
+            <w:shd w:fill="F2F2F2" w:val="clear"/>
+            <w:tcMar>
+              <w:top w:type="dxa" w:w="80"/>
+              <w:left w:type="dxa" w:w="120"/>
+              <w:bottom w:type="dxa" w:w="80"/>
+              <w:right w:type="dxa" w:w="120"/>
+            </w:tcMar>
+          </w:tcPr>
+          <w:p>
+            <w:r>
+              <w:rPr>
+                <w:rFonts w:ascii="Arial" w:cs="Arial" w:eastAsia="Arial" w:hAnsi="Arial"/>
+                <w:sz w:val="20"/>
+                <w:szCs w:val="20"/>
+              </w:rPr>
+              <w:t xml:space="preserve">Google Meet, Zoom, BigBlueButton, Teams</w:t>
+            </w:r>
+          </w:p>
+        </w:tc>
+        <w:tc>
+          <w:tcPr>
+            <w:tcW w:type="dxa" w:w="4960"/>
+            <w:tcBorders>
+              <w:top w:val="single" w:color="CCCCCC" w:sz="1"/>
+              <w:left w:val="single" w:color="CCCCCC" w:sz="1"/>
+              <w:bottom w:val="single" w:color="CCCCCC" w:sz="1"/>
+              <w:right w:val="single" w:color="CCCCCC" w:sz="1"/>
+            </w:tcBorders>
+            <w:shd w:fill="F2F2F2" w:val="clear"/>
+            <w:tcMar>
+              <w:top w:type="dxa" w:w="80"/>
+              <w:left w:type="dxa" w:w="120"/>
+              <w:bottom w:type="dxa" w:w="80"/>
+              <w:right w:type="dxa" w:w="120"/>
+            </w:tcMar>
+          </w:tcPr>
+          <w:p>
+            <w:r>
+              <w:rPr>
+                <w:rFonts w:ascii="Arial" w:cs="Arial" w:eastAsia="Arial" w:hAnsi="Arial"/>
+                <w:sz w:val="20"/>
+                <w:szCs w:val="20"/>
+              </w:rPr>
+              <w:t xml:space="preserve">BigBlueButton (self-hosted AWS) SELECTED. Full webinar controls, native recording, native Moodle integration. Google Meet lacks webinar controls needed for workshop delivery.</w:t>
+            </w:r>
+          </w:p>
+        </w:tc>
+      </w:tr>
+      <w:tr>
+        <w:tc>
+          <w:tcPr>
+            <w:tcW w:type="dxa" w:w="800"/>
+            <w:tcBorders>
+              <w:top w:val="single" w:color="CCCCCC" w:sz="1"/>
+              <w:left w:val="single" w:color="CCCCCC" w:sz="1"/>
+              <w:bottom w:val="single" w:color="CCCCCC" w:sz="1"/>
+              <w:right w:val="single" w:color="CCCCCC" w:sz="1"/>
+            </w:tcBorders>
+            <w:shd w:fill="FFFFFF" w:val="clear"/>
+            <w:tcMar>
+              <w:top w:type="dxa" w:w="80"/>
+              <w:left w:type="dxa" w:w="120"/>
+              <w:bottom w:type="dxa" w:w="80"/>
+              <w:right w:type="dxa" w:w="120"/>
+            </w:tcMar>
+          </w:tcPr>
+          <w:p>
+            <w:r>
+              <w:rPr>
+                <w:rFonts w:ascii="Arial" w:cs="Arial" w:eastAsia="Arial" w:hAnsi="Arial"/>
+                <w:sz w:val="20"/>
+                <w:szCs w:val="20"/>
+              </w:rPr>
+              <w:t xml:space="preserve">D-021</w:t>
+            </w:r>
+          </w:p>
+        </w:tc>
+        <w:tc>
+          <w:tcPr>
+            <w:tcW w:type="dxa" w:w="1600"/>
+            <w:tcBorders>
+              <w:top w:val="single" w:color="CCCCCC" w:sz="1"/>
+              <w:left w:val="single" w:color="CCCCCC" w:sz="1"/>
+              <w:bottom w:val="single" w:color="CCCCCC" w:sz="1"/>
+              <w:right w:val="single" w:color="CCCCCC" w:sz="1"/>
+            </w:tcBorders>
+            <w:shd w:fill="FFFFFF" w:val="clear"/>
+            <w:tcMar>
+              <w:top w:type="dxa" w:w="80"/>
+              <w:left w:type="dxa" w:w="120"/>
+              <w:bottom w:type="dxa" w:w="80"/>
+              <w:right w:type="dxa" w:w="120"/>
+            </w:tcMar>
+          </w:tcPr>
+          <w:p>
+            <w:r>
+              <w:rPr>
+                <w:rFonts w:ascii="Arial" w:cs="Arial" w:eastAsia="Arial" w:hAnsi="Arial"/>
+                <w:sz w:val="20"/>
+                <w:szCs w:val="20"/>
+              </w:rPr>
+              <w:t xml:space="preserve">In-Person Check-in</w:t>
+            </w:r>
+          </w:p>
+        </w:tc>
+        <w:tc>
+          <w:tcPr>
+            <w:tcW w:type="dxa" w:w="2000"/>
+            <w:tcBorders>
+              <w:top w:val="single" w:color="CCCCCC" w:sz="1"/>
+              <w:left w:val="single" w:color="CCCCCC" w:sz="1"/>
+              <w:bottom w:val="single" w:color="CCCCCC" w:sz="1"/>
+              <w:right w:val="single" w:color="CCCCCC" w:sz="1"/>
+            </w:tcBorders>
+            <w:shd w:fill="FFFFFF" w:val="clear"/>
+            <w:tcMar>
+              <w:top w:type="dxa" w:w="80"/>
+              <w:left w:type="dxa" w:w="120"/>
+              <w:bottom w:type="dxa" w:w="80"/>
+              <w:right w:type="dxa" w:w="120"/>
+            </w:tcMar>
+          </w:tcPr>
+          <w:p>
+            <w:r>
+              <w:rPr>
+                <w:rFonts w:ascii="Arial" w:cs="Arial" w:eastAsia="Arial" w:hAnsi="Arial"/>
+                <w:sz w:val="20"/>
+                <w:szCs w:val="20"/>
+              </w:rPr>
+              <w:t xml:space="preserve">Automated QR/tablet, manual EspoCRM entry</w:t>
+            </w:r>
+          </w:p>
+        </w:tc>
+        <w:tc>
+          <w:tcPr>
+            <w:tcW w:type="dxa" w:w="4960"/>
+            <w:tcBorders>
+              <w:top w:val="single" w:color="CCCCCC" w:sz="1"/>
+              <w:left w:val="single" w:color="CCCCCC" w:sz="1"/>
+              <w:bottom w:val="single" w:color="CCCCCC" w:sz="1"/>
+              <w:right w:val="single" w:color="CCCCCC" w:sz="1"/>
+            </w:tcBorders>
+            <w:shd w:fill="FFFFFF" w:val="clear"/>
+            <w:tcMar>
+              <w:top w:type="dxa" w:w="80"/>
+              <w:left w:type="dxa" w:w="120"/>
+              <w:bottom w:type="dxa" w:w="80"/>
+              <w:right w:type="dxa" w:w="120"/>
+            </w:tcMar>
+          </w:tcPr>
+          <w:p>
+            <w:r>
+              <w:rPr>
+                <w:rFonts w:ascii="Arial" w:cs="Arial" w:eastAsia="Arial" w:hAnsi="Arial"/>
+                <w:sz w:val="20"/>
+                <w:szCs w:val="20"/>
+              </w:rPr>
+              <w:t xml:space="preserve">Manual EspoCRM attendance entry SELECTED for Phase 1. Automated digital check-in deferred to Phase 2.</w:t>
+            </w:r>
+          </w:p>
+        </w:tc>
+      </w:tr>
+      <w:tr>
+        <w:tc>
+          <w:tcPr>
+            <w:tcW w:type="dxa" w:w="800"/>
+            <w:tcBorders>
+              <w:top w:val="single" w:color="CCCCCC" w:sz="1"/>
+              <w:left w:val="single" w:color="CCCCCC" w:sz="1"/>
+              <w:bottom w:val="single" w:color="CCCCCC" w:sz="1"/>
+              <w:right w:val="single" w:color="CCCCCC" w:sz="1"/>
+            </w:tcBorders>
+            <w:shd w:fill="F2F2F2" w:val="clear"/>
+            <w:tcMar>
+              <w:top w:type="dxa" w:w="80"/>
+              <w:left w:type="dxa" w:w="120"/>
+              <w:bottom w:type="dxa" w:w="80"/>
+              <w:right w:type="dxa" w:w="120"/>
+            </w:tcMar>
+          </w:tcPr>
+          <w:p>
+            <w:r>
+              <w:rPr>
+                <w:rFonts w:ascii="Arial" w:cs="Arial" w:eastAsia="Arial" w:hAnsi="Arial"/>
+                <w:sz w:val="20"/>
+                <w:szCs w:val="20"/>
+              </w:rPr>
+              <w:t xml:space="preserve">D-022</w:t>
+            </w:r>
+          </w:p>
+        </w:tc>
+        <w:tc>
+          <w:tcPr>
+            <w:tcW w:type="dxa" w:w="1600"/>
+            <w:tcBorders>
+              <w:top w:val="single" w:color="CCCCCC" w:sz="1"/>
+              <w:left w:val="single" w:color="CCCCCC" w:sz="1"/>
+              <w:bottom w:val="single" w:color="CCCCCC" w:sz="1"/>
+              <w:right w:val="single" w:color="CCCCCC" w:sz="1"/>
+            </w:tcBorders>
+            <w:shd w:fill="F2F2F2" w:val="clear"/>
+            <w:tcMar>
+              <w:top w:type="dxa" w:w="80"/>
+              <w:left w:type="dxa" w:w="120"/>
+              <w:bottom w:type="dxa" w:w="80"/>
+              <w:right w:type="dxa" w:w="120"/>
+            </w:tcMar>
+          </w:tcPr>
+          <w:p>
+            <w:r>
+              <w:rPr>
+                <w:rFonts w:ascii="Arial" w:cs="Arial" w:eastAsia="Arial" w:hAnsi="Arial"/>
+                <w:sz w:val="20"/>
+                <w:szCs w:val="20"/>
+              </w:rPr>
+              <w:t xml:space="preserve">Learning Platform</w:t>
+            </w:r>
+          </w:p>
+        </w:tc>
+        <w:tc>
+          <w:tcPr>
+            <w:tcW w:type="dxa" w:w="2000"/>
+            <w:tcBorders>
+              <w:top w:val="single" w:color="CCCCCC" w:sz="1"/>
+              <w:left w:val="single" w:color="CCCCCC" w:sz="1"/>
+              <w:bottom w:val="single" w:color="CCCCCC" w:sz="1"/>
+              <w:right w:val="single" w:color="CCCCCC" w:sz="1"/>
+            </w:tcBorders>
+            <w:shd w:fill="F2F2F2" w:val="clear"/>
+            <w:tcMar>
+              <w:top w:type="dxa" w:w="80"/>
+              <w:left w:type="dxa" w:w="120"/>
+              <w:bottom w:type="dxa" w:w="80"/>
+              <w:right w:type="dxa" w:w="120"/>
+            </w:tcMar>
+          </w:tcPr>
+          <w:p>
+            <w:r>
+              <w:rPr>
+                <w:rFonts w:ascii="Arial" w:cs="Arial" w:eastAsia="Arial" w:hAnsi="Arial"/>
+                <w:sz w:val="20"/>
+                <w:szCs w:val="20"/>
+              </w:rPr>
+              <w:t xml:space="preserve">Moodle, Chamilo, Canvas OSS, Open edX</w:t>
+            </w:r>
+          </w:p>
+        </w:tc>
+        <w:tc>
+          <w:tcPr>
+            <w:tcW w:type="dxa" w:w="4960"/>
+            <w:tcBorders>
+              <w:top w:val="single" w:color="CCCCCC" w:sz="1"/>
+              <w:left w:val="single" w:color="CCCCCC" w:sz="1"/>
+              <w:bottom w:val="single" w:color="CCCCCC" w:sz="1"/>
+              <w:right w:val="single" w:color="CCCCCC" w:sz="1"/>
+            </w:tcBorders>
+            <w:shd w:fill="F2F2F2" w:val="clear"/>
+            <w:tcMar>
+              <w:top w:type="dxa" w:w="80"/>
+              <w:left w:type="dxa" w:w="120"/>
+              <w:bottom w:type="dxa" w:w="80"/>
+              <w:right w:type="dxa" w:w="120"/>
+            </w:tcMar>
+          </w:tcPr>
+          <w:p>
+            <w:r>
+              <w:rPr>
+                <w:rFonts w:ascii="Arial" w:cs="Arial" w:eastAsia="Arial" w:hAnsi="Arial"/>
+                <w:sz w:val="20"/>
+                <w:szCs w:val="20"/>
+              </w:rPr>
+              <w:t xml:space="preserve">Moodle (self-hosted AWS) SELECTED. Tech admin has existing Moodle experience. Native BigBlueButton integration in Moodle 4.0+ core — workshop recordings flow directly into courses. Largest FOSS LMS community.</w:t>
+            </w:r>
+          </w:p>
+        </w:tc>
+      </w:tr>
+      <w:tr>
+        <w:tc>
+          <w:tcPr>
+            <w:tcW w:type="dxa" w:w="800"/>
+            <w:tcBorders>
+              <w:top w:val="single" w:color="CCCCCC" w:sz="1"/>
+              <w:left w:val="single" w:color="CCCCCC" w:sz="1"/>
+              <w:bottom w:val="single" w:color="CCCCCC" w:sz="1"/>
+              <w:right w:val="single" w:color="CCCCCC" w:sz="1"/>
+            </w:tcBorders>
+            <w:shd w:fill="FFFFFF" w:val="clear"/>
+            <w:tcMar>
+              <w:top w:type="dxa" w:w="80"/>
+              <w:left w:type="dxa" w:w="120"/>
+              <w:bottom w:type="dxa" w:w="80"/>
+              <w:right w:type="dxa" w:w="120"/>
+            </w:tcMar>
+          </w:tcPr>
+          <w:p>
+            <w:r>
+              <w:rPr>
+                <w:rFonts w:ascii="Arial" w:cs="Arial" w:eastAsia="Arial" w:hAnsi="Arial"/>
+                <w:sz w:val="20"/>
+                <w:szCs w:val="20"/>
+              </w:rPr>
+              <w:t xml:space="preserve">D-023</w:t>
+            </w:r>
+          </w:p>
+        </w:tc>
+        <w:tc>
+          <w:tcPr>
+            <w:tcW w:type="dxa" w:w="1600"/>
+            <w:tcBorders>
+              <w:top w:val="single" w:color="CCCCCC" w:sz="1"/>
+              <w:left w:val="single" w:color="CCCCCC" w:sz="1"/>
+              <w:bottom w:val="single" w:color="CCCCCC" w:sz="1"/>
+              <w:right w:val="single" w:color="CCCCCC" w:sz="1"/>
+            </w:tcBorders>
+            <w:shd w:fill="FFFFFF" w:val="clear"/>
+            <w:tcMar>
+              <w:top w:type="dxa" w:w="80"/>
+              <w:left w:type="dxa" w:w="120"/>
+              <w:bottom w:type="dxa" w:w="80"/>
+              <w:right w:type="dxa" w:w="120"/>
+            </w:tcMar>
+          </w:tcPr>
+          <w:p>
+            <w:r>
+              <w:rPr>
+                <w:rFonts w:ascii="Arial" w:cs="Arial" w:eastAsia="Arial" w:hAnsi="Arial"/>
+                <w:sz w:val="20"/>
+                <w:szCs w:val="20"/>
+              </w:rPr>
+              <w:t xml:space="preserve">LMS Audience Model</w:t>
+            </w:r>
+          </w:p>
+        </w:tc>
+        <w:tc>
+          <w:tcPr>
+            <w:tcW w:type="dxa" w:w="2000"/>
+            <w:tcBorders>
+              <w:top w:val="single" w:color="CCCCCC" w:sz="1"/>
+              <w:left w:val="single" w:color="CCCCCC" w:sz="1"/>
+              <w:bottom w:val="single" w:color="CCCCCC" w:sz="1"/>
+              <w:right w:val="single" w:color="CCCCCC" w:sz="1"/>
+            </w:tcBorders>
+            <w:shd w:fill="FFFFFF" w:val="clear"/>
+            <w:tcMar>
+              <w:top w:type="dxa" w:w="80"/>
+              <w:left w:type="dxa" w:w="120"/>
+              <w:bottom w:type="dxa" w:w="80"/>
+              <w:right w:type="dxa" w:w="120"/>
+            </w:tcMar>
+          </w:tcPr>
+          <w:p>
+            <w:r>
+              <w:rPr>
+                <w:rFonts w:ascii="Arial" w:cs="Arial" w:eastAsia="Arial" w:hAnsi="Arial"/>
+                <w:sz w:val="20"/>
+                <w:szCs w:val="20"/>
+              </w:rPr>
+              <w:t xml:space="preserve">Client-only, mentor-only, dual-audience</w:t>
+            </w:r>
+          </w:p>
+        </w:tc>
+        <w:tc>
+          <w:tcPr>
+            <w:tcW w:type="dxa" w:w="4960"/>
+            <w:tcBorders>
+              <w:top w:val="single" w:color="CCCCCC" w:sz="1"/>
+              <w:left w:val="single" w:color="CCCCCC" w:sz="1"/>
+              <w:bottom w:val="single" w:color="CCCCCC" w:sz="1"/>
+              <w:right w:val="single" w:color="CCCCCC" w:sz="1"/>
+            </w:tcBorders>
+            <w:shd w:fill="FFFFFF" w:val="clear"/>
+            <w:tcMar>
+              <w:top w:type="dxa" w:w="80"/>
+              <w:left w:type="dxa" w:w="120"/>
+              <w:bottom w:type="dxa" w:w="80"/>
+              <w:right w:type="dxa" w:w="120"/>
+            </w:tcMar>
+          </w:tcPr>
+          <w:p>
+            <w:r>
+              <w:rPr>
+                <w:rFonts w:ascii="Arial" w:cs="Arial" w:eastAsia="Arial" w:hAnsi="Arial"/>
+                <w:sz w:val="20"/>
+                <w:szCs w:val="20"/>
+              </w:rPr>
+              <w:t xml:space="preserve">Dual-audience SELECTED. Two separate content areas with distinct access controls — client business education library and mentor onboarding/training library.</w:t>
+            </w:r>
+          </w:p>
+        </w:tc>
+      </w:tr>
+      <w:tr>
+        <w:tc>
+          <w:tcPr>
+            <w:tcW w:type="dxa" w:w="800"/>
+            <w:tcBorders>
+              <w:top w:val="single" w:color="CCCCCC" w:sz="1"/>
+              <w:left w:val="single" w:color="CCCCCC" w:sz="1"/>
+              <w:bottom w:val="single" w:color="CCCCCC" w:sz="1"/>
+              <w:right w:val="single" w:color="CCCCCC" w:sz="1"/>
+            </w:tcBorders>
+            <w:shd w:fill="F2F2F2" w:val="clear"/>
+            <w:tcMar>
+              <w:top w:type="dxa" w:w="80"/>
+              <w:left w:type="dxa" w:w="120"/>
+              <w:bottom w:type="dxa" w:w="80"/>
+              <w:right w:type="dxa" w:w="120"/>
+            </w:tcMar>
+          </w:tcPr>
+          <w:p>
+            <w:r>
+              <w:rPr>
+                <w:rFonts w:ascii="Arial" w:cs="Arial" w:eastAsia="Arial" w:hAnsi="Arial"/>
+                <w:sz w:val="20"/>
+                <w:szCs w:val="20"/>
+              </w:rPr>
+              <w:t xml:space="preserve">D-024</w:t>
+            </w:r>
+          </w:p>
+        </w:tc>
+        <w:tc>
+          <w:tcPr>
+            <w:tcW w:type="dxa" w:w="1600"/>
+            <w:tcBorders>
+              <w:top w:val="single" w:color="CCCCCC" w:sz="1"/>
+              <w:left w:val="single" w:color="CCCCCC" w:sz="1"/>
+              <w:bottom w:val="single" w:color="CCCCCC" w:sz="1"/>
+              <w:right w:val="single" w:color="CCCCCC" w:sz="1"/>
+            </w:tcBorders>
+            <w:shd w:fill="F2F2F2" w:val="clear"/>
+            <w:tcMar>
+              <w:top w:type="dxa" w:w="80"/>
+              <w:left w:type="dxa" w:w="120"/>
+              <w:bottom w:type="dxa" w:w="80"/>
+              <w:right w:type="dxa" w:w="120"/>
+            </w:tcMar>
+          </w:tcPr>
+          <w:p>
+            <w:r>
+              <w:rPr>
+                <w:rFonts w:ascii="Arial" w:cs="Arial" w:eastAsia="Arial" w:hAnsi="Arial"/>
+                <w:sz w:val="20"/>
+                <w:szCs w:val="20"/>
+              </w:rPr>
+              <w:t xml:space="preserve">Mentor Onboarding</w:t>
+            </w:r>
+          </w:p>
+        </w:tc>
+        <w:tc>
+          <w:tcPr>
+            <w:tcW w:type="dxa" w:w="2000"/>
+            <w:tcBorders>
+              <w:top w:val="single" w:color="CCCCCC" w:sz="1"/>
+              <w:left w:val="single" w:color="CCCCCC" w:sz="1"/>
+              <w:bottom w:val="single" w:color="CCCCCC" w:sz="1"/>
+              <w:right w:val="single" w:color="CCCCCC" w:sz="1"/>
+            </w:tcBorders>
+            <w:shd w:fill="F2F2F2" w:val="clear"/>
+            <w:tcMar>
+              <w:top w:type="dxa" w:w="80"/>
+              <w:left w:type="dxa" w:w="120"/>
+              <w:bottom w:type="dxa" w:w="80"/>
+              <w:right w:type="dxa" w:w="120"/>
+            </w:tcMar>
+          </w:tcPr>
+          <w:p>
+            <w:r>
+              <w:rPr>
+                <w:rFonts w:ascii="Arial" w:cs="Arial" w:eastAsia="Arial" w:hAnsi="Arial"/>
+                <w:sz w:val="20"/>
+                <w:szCs w:val="20"/>
+              </w:rPr>
+              <w:t xml:space="preserve">Informal, structured Moodle curriculum, external tool</w:t>
+            </w:r>
+          </w:p>
+        </w:tc>
+        <w:tc>
+          <w:tcPr>
+            <w:tcW w:type="dxa" w:w="4960"/>
+            <w:tcBorders>
+              <w:top w:val="single" w:color="CCCCCC" w:sz="1"/>
+              <w:left w:val="single" w:color="CCCCCC" w:sz="1"/>
+              <w:bottom w:val="single" w:color="CCCCCC" w:sz="1"/>
+              <w:right w:val="single" w:color="CCCCCC" w:sz="1"/>
+            </w:tcBorders>
+            <w:shd w:fill="F2F2F2" w:val="clear"/>
+            <w:tcMar>
+              <w:top w:type="dxa" w:w="80"/>
+              <w:left w:type="dxa" w:w="120"/>
+              <w:bottom w:type="dxa" w:w="80"/>
+              <w:right w:type="dxa" w:w="120"/>
+            </w:tcMar>
+          </w:tcPr>
+          <w:p>
+            <w:r>
+              <w:rPr>
+                <w:rFonts w:ascii="Arial" w:cs="Arial" w:eastAsia="Arial" w:hAnsi="Arial"/>
+                <w:sz w:val="20"/>
+                <w:szCs w:val="20"/>
+              </w:rPr>
+              <w:t xml:space="preserve">Structured Moodle curriculum SELECTED. Required completion before EspoCRM activation. Includes ethics checkbox sign-off (timestamped). Completion triggers admin notification.</w:t>
+            </w:r>
+          </w:p>
+        </w:tc>
+      </w:tr>
+      <w:tr>
+        <w:tc>
+          <w:tcPr>
+            <w:tcW w:type="dxa" w:w="800"/>
+            <w:tcBorders>
+              <w:top w:val="single" w:color="CCCCCC" w:sz="1"/>
+              <w:left w:val="single" w:color="CCCCCC" w:sz="1"/>
+              <w:bottom w:val="single" w:color="CCCCCC" w:sz="1"/>
+              <w:right w:val="single" w:color="CCCCCC" w:sz="1"/>
+            </w:tcBorders>
+            <w:shd w:fill="FFFFFF" w:val="clear"/>
+            <w:tcMar>
+              <w:top w:type="dxa" w:w="80"/>
+              <w:left w:type="dxa" w:w="120"/>
+              <w:bottom w:type="dxa" w:w="80"/>
+              <w:right w:type="dxa" w:w="120"/>
+            </w:tcMar>
+          </w:tcPr>
+          <w:p>
+            <w:r>
+              <w:rPr>
+                <w:rFonts w:ascii="Arial" w:cs="Arial" w:eastAsia="Arial" w:hAnsi="Arial"/>
+                <w:sz w:val="20"/>
+                <w:szCs w:val="20"/>
+              </w:rPr>
+              <w:t xml:space="preserve">D-025</w:t>
+            </w:r>
+          </w:p>
+        </w:tc>
+        <w:tc>
+          <w:tcPr>
+            <w:tcW w:type="dxa" w:w="1600"/>
+            <w:tcBorders>
+              <w:top w:val="single" w:color="CCCCCC" w:sz="1"/>
+              <w:left w:val="single" w:color="CCCCCC" w:sz="1"/>
+              <w:bottom w:val="single" w:color="CCCCCC" w:sz="1"/>
+              <w:right w:val="single" w:color="CCCCCC" w:sz="1"/>
+            </w:tcBorders>
+            <w:shd w:fill="FFFFFF" w:val="clear"/>
+            <w:tcMar>
+              <w:top w:type="dxa" w:w="80"/>
+              <w:left w:type="dxa" w:w="120"/>
+              <w:bottom w:type="dxa" w:w="80"/>
+              <w:right w:type="dxa" w:w="120"/>
+            </w:tcMar>
+          </w:tcPr>
+          <w:p>
+            <w:r>
+              <w:rPr>
+                <w:rFonts w:ascii="Arial" w:cs="Arial" w:eastAsia="Arial" w:hAnsi="Arial"/>
+                <w:sz w:val="20"/>
+                <w:szCs w:val="20"/>
+              </w:rPr>
+              <w:t xml:space="preserve">Ethics Sign-Off</w:t>
+            </w:r>
+          </w:p>
+        </w:tc>
+        <w:tc>
+          <w:tcPr>
+            <w:tcW w:type="dxa" w:w="2000"/>
+            <w:tcBorders>
+              <w:top w:val="single" w:color="CCCCCC" w:sz="1"/>
+              <w:left w:val="single" w:color="CCCCCC" w:sz="1"/>
+              <w:bottom w:val="single" w:color="CCCCCC" w:sz="1"/>
+              <w:right w:val="single" w:color="CCCCCC" w:sz="1"/>
+            </w:tcBorders>
+            <w:shd w:fill="FFFFFF" w:val="clear"/>
+            <w:tcMar>
+              <w:top w:type="dxa" w:w="80"/>
+              <w:left w:type="dxa" w:w="120"/>
+              <w:bottom w:type="dxa" w:w="80"/>
+              <w:right w:type="dxa" w:w="120"/>
+            </w:tcMar>
+          </w:tcPr>
+          <w:p>
+            <w:r>
+              <w:rPr>
+                <w:rFonts w:ascii="Arial" w:cs="Arial" w:eastAsia="Arial" w:hAnsi="Arial"/>
+                <w:sz w:val="20"/>
+                <w:szCs w:val="20"/>
+              </w:rPr>
+              <w:t xml:space="preserve">Checkbox in Moodle, digital signature, PDF workflow</w:t>
+            </w:r>
+          </w:p>
+        </w:tc>
+        <w:tc>
+          <w:tcPr>
+            <w:tcW w:type="dxa" w:w="4960"/>
+            <w:tcBorders>
+              <w:top w:val="single" w:color="CCCCCC" w:sz="1"/>
+              <w:left w:val="single" w:color="CCCCCC" w:sz="1"/>
+              <w:bottom w:val="single" w:color="CCCCCC" w:sz="1"/>
+              <w:right w:val="single" w:color="CCCCCC" w:sz="1"/>
+            </w:tcBorders>
+            <w:shd w:fill="FFFFFF" w:val="clear"/>
+            <w:tcMar>
+              <w:top w:type="dxa" w:w="80"/>
+              <w:left w:type="dxa" w:w="120"/>
+              <w:bottom w:type="dxa" w:w="80"/>
+              <w:right w:type="dxa" w:w="120"/>
+            </w:tcMar>
+          </w:tcPr>
+          <w:p>
+            <w:r>
+              <w:rPr>
+                <w:rFonts w:ascii="Arial" w:cs="Arial" w:eastAsia="Arial" w:hAnsi="Arial"/>
+                <w:sz w:val="20"/>
+                <w:szCs w:val="20"/>
+              </w:rPr>
+              <w:t xml:space="preserve">Checkbox acknowledgment in Moodle SELECTED. Timestamped completion record sufficient for governance needs. No external e-signature tool required.</w:t>
+            </w:r>
+          </w:p>
+        </w:tc>
+      </w:tr>
+      <w:tr>
+        <w:tc>
+          <w:tcPr>
+            <w:tcW w:type="dxa" w:w="800"/>
+            <w:tcBorders>
+              <w:top w:val="single" w:color="CCCCCC" w:sz="1"/>
+              <w:left w:val="single" w:color="CCCCCC" w:sz="1"/>
+              <w:bottom w:val="single" w:color="CCCCCC" w:sz="1"/>
+              <w:right w:val="single" w:color="CCCCCC" w:sz="1"/>
+            </w:tcBorders>
+            <w:shd w:fill="F2F2F2" w:val="clear"/>
+            <w:tcMar>
+              <w:top w:type="dxa" w:w="80"/>
+              <w:left w:type="dxa" w:w="120"/>
+              <w:bottom w:type="dxa" w:w="80"/>
+              <w:right w:type="dxa" w:w="120"/>
+            </w:tcMar>
+          </w:tcPr>
+          <w:p>
+            <w:r>
+              <w:rPr>
+                <w:rFonts w:ascii="Arial" w:cs="Arial" w:eastAsia="Arial" w:hAnsi="Arial"/>
+                <w:sz w:val="20"/>
+                <w:szCs w:val="20"/>
+              </w:rPr>
+              <w:t xml:space="preserve">D-026</w:t>
+            </w:r>
+          </w:p>
+        </w:tc>
+        <w:tc>
+          <w:tcPr>
+            <w:tcW w:type="dxa" w:w="1600"/>
+            <w:tcBorders>
+              <w:top w:val="single" w:color="CCCCCC" w:sz="1"/>
+              <w:left w:val="single" w:color="CCCCCC" w:sz="1"/>
+              <w:bottom w:val="single" w:color="CCCCCC" w:sz="1"/>
+              <w:right w:val="single" w:color="CCCCCC" w:sz="1"/>
+            </w:tcBorders>
+            <w:shd w:fill="F2F2F2" w:val="clear"/>
+            <w:tcMar>
+              <w:top w:type="dxa" w:w="80"/>
+              <w:left w:type="dxa" w:w="120"/>
+              <w:bottom w:type="dxa" w:w="80"/>
+              <w:right w:type="dxa" w:w="120"/>
+            </w:tcMar>
+          </w:tcPr>
+          <w:p>
+            <w:r>
+              <w:rPr>
+                <w:rFonts w:ascii="Arial" w:cs="Arial" w:eastAsia="Arial" w:hAnsi="Arial"/>
+                <w:sz w:val="20"/>
+                <w:szCs w:val="20"/>
+              </w:rPr>
+              <w:t xml:space="preserve">Bulk Email (DEFERRED)</w:t>
+            </w:r>
+          </w:p>
+        </w:tc>
+        <w:tc>
+          <w:tcPr>
+            <w:tcW w:type="dxa" w:w="2000"/>
+            <w:tcBorders>
+              <w:top w:val="single" w:color="CCCCCC" w:sz="1"/>
+              <w:left w:val="single" w:color="CCCCCC" w:sz="1"/>
+              <w:bottom w:val="single" w:color="CCCCCC" w:sz="1"/>
+              <w:right w:val="single" w:color="CCCCCC" w:sz="1"/>
+            </w:tcBorders>
+            <w:shd w:fill="F2F2F2" w:val="clear"/>
+            <w:tcMar>
+              <w:top w:type="dxa" w:w="80"/>
+              <w:left w:type="dxa" w:w="120"/>
+              <w:bottom w:type="dxa" w:w="80"/>
+              <w:right w:type="dxa" w:w="120"/>
+            </w:tcMar>
+          </w:tcPr>
+          <w:p>
+            <w:r>
+              <w:rPr>
+                <w:rFonts w:ascii="Arial" w:cs="Arial" w:eastAsia="Arial" w:hAnsi="Arial"/>
+                <w:sz w:val="20"/>
+                <w:szCs w:val="20"/>
+              </w:rPr>
+              <w:t xml:space="preserve">EspoCRM native, Mautic, Mailchimp, Sendinblue</w:t>
+            </w:r>
+          </w:p>
+        </w:tc>
+        <w:tc>
+          <w:tcPr>
+            <w:tcW w:type="dxa" w:w="4960"/>
+            <w:tcBorders>
+              <w:top w:val="single" w:color="CCCCCC" w:sz="1"/>
+              <w:left w:val="single" w:color="CCCCCC" w:sz="1"/>
+              <w:bottom w:val="single" w:color="CCCCCC" w:sz="1"/>
+              <w:right w:val="single" w:color="CCCCCC" w:sz="1"/>
+            </w:tcBorders>
+            <w:shd w:fill="F2F2F2" w:val="clear"/>
+            <w:tcMar>
+              <w:top w:type="dxa" w:w="80"/>
+              <w:left w:type="dxa" w:w="120"/>
+              <w:bottom w:type="dxa" w:w="80"/>
+              <w:right w:type="dxa" w:w="120"/>
+            </w:tcMar>
+          </w:tcPr>
+          <w:p>
+            <w:r>
+              <w:rPr>
+                <w:rFonts w:ascii="Arial" w:cs="Arial" w:eastAsia="Arial" w:hAnsi="Arial"/>
+                <w:sz w:val="20"/>
+                <w:szCs w:val="20"/>
+              </w:rPr>
+              <w:t xml:space="preserve">DEFERRED. Evaluate EspoCRM native mass email capability first. Mautic (FOSS, self-hosted) designated upgrade path if EspoCRM insufficient.</w:t>
             </w:r>
           </w:p>
         </w:tc>
@@ -2369,7 +3331,7 @@
                 <w:sz w:val="20"/>
                 <w:szCs w:val="20"/>
               </w:rPr>
-              <w:t xml:space="preserve">Online Learning Platform</w:t>
+              <w:t xml:space="preserve">Bulk Email Tool</w:t>
             </w:r>
           </w:p>
         </w:tc>
@@ -2397,7 +3359,7 @@
                 <w:sz w:val="20"/>
                 <w:szCs w:val="20"/>
               </w:rPr>
-              <w:t xml:space="preserve">Pending — Section 8 conversation pending</w:t>
+              <w:t xml:space="preserve">Deferred — evaluate EspoCRM native capability first; Mautic as upgrade path</w:t>
             </w:r>
           </w:p>
         </w:tc>
@@ -2455,7 +3417,7 @@
                 <w:sz w:val="20"/>
                 <w:szCs w:val="20"/>
               </w:rPr>
-              <w:t xml:space="preserve">Largely resolved by EspoCRM — confirm in section conversation</w:t>
+              <w:t xml:space="preserve">Largely resolved by EspoCRM — confirm in Section 9 conversation</w:t>
             </w:r>
           </w:p>
         </w:tc>
@@ -2513,7 +3475,7 @@
                 <w:sz w:val="20"/>
                 <w:szCs w:val="20"/>
               </w:rPr>
-              <w:t xml:space="preserve">Evaluate EspoCRM native capability first</w:t>
+              <w:t xml:space="preserve">Evaluate EspoCRM native capability — Section 10 conversation</w:t>
             </w:r>
           </w:p>
         </w:tc>
@@ -2571,7 +3533,7 @@
                 <w:sz w:val="20"/>
                 <w:szCs w:val="20"/>
               </w:rPr>
-              <w:t xml:space="preserve">Pending — evaluate Google Drive vs FOSS alternatives</w:t>
+              <w:t xml:space="preserve">Pending — Section 11 conversation</w:t>
             </w:r>
           </w:p>
         </w:tc>
@@ -2629,7 +3591,7 @@
                 <w:sz w:val="20"/>
                 <w:szCs w:val="20"/>
               </w:rPr>
-              <w:t xml:space="preserve">Largely resolved by EspoCRM — confirm dashboards adequate</w:t>
+              <w:t xml:space="preserve">Largely resolved by EspoCRM — confirm in Section 12 conversation</w:t>
             </w:r>
           </w:p>
         </w:tc>
@@ -2717,7 +3679,7 @@
                 <w:sz w:val="20"/>
                 <w:szCs w:val="20"/>
               </w:rPr>
-              <w:t xml:space="preserve">Google Meet Group Limit Verification</w:t>
+              <w:t xml:space="preserve">Google Meet Group Limit</w:t>
             </w:r>
           </w:p>
         </w:tc>
@@ -2861,7 +3823,181 @@
                 <w:sz w:val="20"/>
                 <w:szCs w:val="20"/>
               </w:rPr>
-              <w:t xml:space="preserve">Open — self-hosted EspoCRM and Jitsi on AWS</w:t>
+              <w:t xml:space="preserve">Open — self-hosted stack on AWS (EspoCRM, Moodle, Jitsi, Flarum, BigBlueButton)</w:t>
+            </w:r>
+          </w:p>
+        </w:tc>
+      </w:tr>
+      <w:tr>
+        <w:tc>
+          <w:tcPr>
+            <w:tcW w:type="dxa" w:w="3500"/>
+            <w:tcBorders>
+              <w:top w:val="single" w:color="CCCCCC" w:sz="1"/>
+              <w:left w:val="single" w:color="CCCCCC" w:sz="1"/>
+              <w:bottom w:val="single" w:color="CCCCCC" w:sz="1"/>
+              <w:right w:val="single" w:color="CCCCCC" w:sz="1"/>
+            </w:tcBorders>
+            <w:shd w:fill="F2F2F2" w:val="clear"/>
+            <w:tcMar>
+              <w:top w:type="dxa" w:w="80"/>
+              <w:left w:type="dxa" w:w="120"/>
+              <w:bottom w:type="dxa" w:w="80"/>
+              <w:right w:type="dxa" w:w="120"/>
+            </w:tcMar>
+          </w:tcPr>
+          <w:p>
+            <w:r>
+              <w:rPr>
+                <w:rFonts w:ascii="Arial" w:cs="Arial" w:eastAsia="Arial" w:hAnsi="Arial"/>
+                <w:sz w:val="20"/>
+                <w:szCs w:val="20"/>
+              </w:rPr>
+              <w:t xml:space="preserve">EspoCRM-Moodle Integration</w:t>
+            </w:r>
+          </w:p>
+        </w:tc>
+        <w:tc>
+          <w:tcPr>
+            <w:tcW w:type="dxa" w:w="5860"/>
+            <w:tcBorders>
+              <w:top w:val="single" w:color="CCCCCC" w:sz="1"/>
+              <w:left w:val="single" w:color="CCCCCC" w:sz="1"/>
+              <w:bottom w:val="single" w:color="CCCCCC" w:sz="1"/>
+              <w:right w:val="single" w:color="CCCCCC" w:sz="1"/>
+            </w:tcBorders>
+            <w:shd w:fill="F2F2F2" w:val="clear"/>
+            <w:tcMar>
+              <w:top w:type="dxa" w:w="80"/>
+              <w:left w:type="dxa" w:w="120"/>
+              <w:bottom w:type="dxa" w:w="80"/>
+              <w:right w:type="dxa" w:w="120"/>
+            </w:tcMar>
+          </w:tcPr>
+          <w:p>
+            <w:r>
+              <w:rPr>
+                <w:rFonts w:ascii="Arial" w:cs="Arial" w:eastAsia="Arial" w:hAnsi="Arial"/>
+                <w:sz w:val="20"/>
+                <w:szCs w:val="20"/>
+              </w:rPr>
+              <w:t xml:space="preserve">Open — automate enrollment trigger from EspoCRM to Moodle</w:t>
+            </w:r>
+          </w:p>
+        </w:tc>
+      </w:tr>
+      <w:tr>
+        <w:tc>
+          <w:tcPr>
+            <w:tcW w:type="dxa" w:w="3500"/>
+            <w:tcBorders>
+              <w:top w:val="single" w:color="CCCCCC" w:sz="1"/>
+              <w:left w:val="single" w:color="CCCCCC" w:sz="1"/>
+              <w:bottom w:val="single" w:color="CCCCCC" w:sz="1"/>
+              <w:right w:val="single" w:color="CCCCCC" w:sz="1"/>
+            </w:tcBorders>
+            <w:shd w:fill="FFFFFF" w:val="clear"/>
+            <w:tcMar>
+              <w:top w:type="dxa" w:w="80"/>
+              <w:left w:type="dxa" w:w="120"/>
+              <w:bottom w:type="dxa" w:w="80"/>
+              <w:right w:type="dxa" w:w="120"/>
+            </w:tcMar>
+          </w:tcPr>
+          <w:p>
+            <w:r>
+              <w:rPr>
+                <w:rFonts w:ascii="Arial" w:cs="Arial" w:eastAsia="Arial" w:hAnsi="Arial"/>
+                <w:sz w:val="20"/>
+                <w:szCs w:val="20"/>
+              </w:rPr>
+              <w:t xml:space="preserve">Phase 2: Automated Mentor Matching</w:t>
+            </w:r>
+          </w:p>
+        </w:tc>
+        <w:tc>
+          <w:tcPr>
+            <w:tcW w:type="dxa" w:w="5860"/>
+            <w:tcBorders>
+              <w:top w:val="single" w:color="CCCCCC" w:sz="1"/>
+              <w:left w:val="single" w:color="CCCCCC" w:sz="1"/>
+              <w:bottom w:val="single" w:color="CCCCCC" w:sz="1"/>
+              <w:right w:val="single" w:color="CCCCCC" w:sz="1"/>
+            </w:tcBorders>
+            <w:shd w:fill="FFFFFF" w:val="clear"/>
+            <w:tcMar>
+              <w:top w:type="dxa" w:w="80"/>
+              <w:left w:type="dxa" w:w="120"/>
+              <w:bottom w:type="dxa" w:w="80"/>
+              <w:right w:type="dxa" w:w="120"/>
+            </w:tcMar>
+          </w:tcPr>
+          <w:p>
+            <w:r>
+              <w:rPr>
+                <w:rFonts w:ascii="Arial" w:cs="Arial" w:eastAsia="Arial" w:hAnsi="Arial"/>
+                <w:sz w:val="20"/>
+                <w:szCs w:val="20"/>
+              </w:rPr>
+              <w:t xml:space="preserve">Planned — data model designed to support from day one</w:t>
+            </w:r>
+          </w:p>
+        </w:tc>
+      </w:tr>
+      <w:tr>
+        <w:tc>
+          <w:tcPr>
+            <w:tcW w:type="dxa" w:w="3500"/>
+            <w:tcBorders>
+              <w:top w:val="single" w:color="CCCCCC" w:sz="1"/>
+              <w:left w:val="single" w:color="CCCCCC" w:sz="1"/>
+              <w:bottom w:val="single" w:color="CCCCCC" w:sz="1"/>
+              <w:right w:val="single" w:color="CCCCCC" w:sz="1"/>
+            </w:tcBorders>
+            <w:shd w:fill="F2F2F2" w:val="clear"/>
+            <w:tcMar>
+              <w:top w:type="dxa" w:w="80"/>
+              <w:left w:type="dxa" w:w="120"/>
+              <w:bottom w:type="dxa" w:w="80"/>
+              <w:right w:type="dxa" w:w="120"/>
+            </w:tcMar>
+          </w:tcPr>
+          <w:p>
+            <w:r>
+              <w:rPr>
+                <w:rFonts w:ascii="Arial" w:cs="Arial" w:eastAsia="Arial" w:hAnsi="Arial"/>
+                <w:sz w:val="20"/>
+                <w:szCs w:val="20"/>
+              </w:rPr>
+              <w:t xml:space="preserve">Phase 2: Digital Event Check-in</w:t>
+            </w:r>
+          </w:p>
+        </w:tc>
+        <w:tc>
+          <w:tcPr>
+            <w:tcW w:type="dxa" w:w="5860"/>
+            <w:tcBorders>
+              <w:top w:val="single" w:color="CCCCCC" w:sz="1"/>
+              <w:left w:val="single" w:color="CCCCCC" w:sz="1"/>
+              <w:bottom w:val="single" w:color="CCCCCC" w:sz="1"/>
+              <w:right w:val="single" w:color="CCCCCC" w:sz="1"/>
+            </w:tcBorders>
+            <w:shd w:fill="F2F2F2" w:val="clear"/>
+            <w:tcMar>
+              <w:top w:type="dxa" w:w="80"/>
+              <w:left w:type="dxa" w:w="120"/>
+              <w:bottom w:type="dxa" w:w="80"/>
+              <w:right w:type="dxa" w:w="120"/>
+            </w:tcMar>
+          </w:tcPr>
+          <w:p>
+            <w:r>
+              <w:rPr>
+                <w:rFonts w:ascii="Arial" w:cs="Arial" w:eastAsia="Arial" w:hAnsi="Arial"/>
+                <w:sz w:val="20"/>
+                <w:szCs w:val="20"/>
+              </w:rPr>
+              <w:t xml:space="preserve">Planned — QR/tablet check-in for in-person workshops</w:t>
             </w:r>
           </w:p>
         </w:tc>
@@ -3150,12 +4286,6 @@
       <w:startOverride w:val="1"/>
     </w:lvlOverride>
   </w:num>
-  <w:num w:numId="2">
-    <w:abstractNumId w:val="2"/>
-    <w:lvlOverride w:ilvl="0">
-      <w:startOverride w:val="1"/>
-    </w:lvlOverride>
-  </w:num>
 </w:numbering>
 </file>
 

</xml_diff>

<commit_message>
Add Sections 9-13 PRD and update Decisions Log v0.5
New document:
- CBM-PRD-Volunteer-Donor-Documents-Reporting-Security.docx
  - Section 9: Volunteer Coordination (Stripe dues, KPI tracking, no background checks)
  - Section 10: Donor Management (EspoCRM native, grant lifecycle, donations deferred)
  - Section 11: Document Sharing (Google Drive, 3 shared drives)
  - Section 12: Reporting (EspoCRM + Google Workspace, Metabase upgrade path)
  - Section 13: Security & Data Privacy (retention schedule, backup, offboarding, incident response)

Decisions Log v0.5:
- Added D-027 through D-037
- 37 total decisions logged
- Updated pending decisions tracker
- All major technology domains now decided except Implementation Roadmap
</commit_message>
<xml_diff>
--- a/PRDs/CBM-Decisions-Log.docx
+++ b/PRDs/CBM-Decisions-Log.docx
@@ -46,7 +46,7 @@
           <w:sz w:val="22"/>
           <w:szCs w:val="22"/>
         </w:rPr>
-        <w:t xml:space="preserve">Version 0.4  |  Living Document  |  2025</w:t>
+        <w:t xml:space="preserve">Version 0.5  |  Living Document  |  2025</w:t>
       </w:r>
     </w:p>
     <w:p>
@@ -1380,7 +1380,7 @@
                 <w:sz w:val="20"/>
                 <w:szCs w:val="20"/>
               </w:rPr>
-              <w:t xml:space="preserve">All mentor-client communication through CRM. Enables inactivity tracking. Clients use email reply — no CRM login.</w:t>
+              <w:t xml:space="preserve">All mentor-client communication through CRM. Clients use email reply — no CRM login.</w:t>
             </w:r>
           </w:p>
         </w:tc>
@@ -1808,7 +1808,7 @@
                 <w:sz w:val="20"/>
                 <w:szCs w:val="20"/>
               </w:rPr>
-              <w:t xml:space="preserve">Manual, CRM-native, survey tool integration</w:t>
+              <w:t xml:space="preserve">Manual, CRM-native, survey tool</w:t>
             </w:r>
           </w:p>
         </w:tc>
@@ -2064,7 +2064,7 @@
                 <w:sz w:val="20"/>
                 <w:szCs w:val="20"/>
               </w:rPr>
-              <w:t xml:space="preserve">Google Meet SELECTED. Included in Google Workspace for Nonprofits. Familiar, no client login, no 1:1 time limit.</w:t>
+              <w:t xml:space="preserve">Google Meet SELECTED. Included in Google Workspace for Nonprofits. No client login, no 1:1 time limit.</w:t>
             </w:r>
           </w:p>
         </w:tc>
@@ -2292,7 +2292,7 @@
                 <w:sz w:val="20"/>
                 <w:szCs w:val="20"/>
               </w:rPr>
-              <w:t xml:space="preserve">Flarum SELECTED (two separate self-hosted instances on AWS). Discourse ruled out — facial recognition/age verification policy conflicts with CBM privacy values. Instance 1: mentor community. Instance 2: client community. No public access to either.</w:t>
+              <w:t xml:space="preserve">Flarum SELECTED (two separate self-hosted instances). Discourse ruled out — facial recognition/age verification policy conflicts with CBM privacy values.</w:t>
             </w:r>
           </w:p>
         </w:tc>
@@ -2406,7 +2406,7 @@
                 <w:sz w:val="20"/>
                 <w:szCs w:val="20"/>
               </w:rPr>
-              <w:t xml:space="preserve">Two separate Flarum instances SELECTED. Complete isolation for confidentiality. Mentor discussions fully separated from client access.</w:t>
+              <w:t xml:space="preserve">Two separate Flarum instances SELECTED. Complete isolation: Instance 1 mentor community, Instance 2 client community. No public access.</w:t>
             </w:r>
           </w:p>
         </w:tc>
@@ -2520,7 +2520,7 @@
                 <w:sz w:val="20"/>
                 <w:szCs w:val="20"/>
               </w:rPr>
-              <w:t xml:space="preserve">BigBlueButton (self-hosted AWS) SELECTED. Full webinar controls, native recording, native Moodle integration. Google Meet lacks webinar controls needed for workshop delivery.</w:t>
+              <w:t xml:space="preserve">BigBlueButton (self-hosted AWS) SELECTED. Full webinar controls, native recording, native Moodle integration.</w:t>
             </w:r>
           </w:p>
         </w:tc>
@@ -2634,7 +2634,7 @@
                 <w:sz w:val="20"/>
                 <w:szCs w:val="20"/>
               </w:rPr>
-              <w:t xml:space="preserve">Manual EspoCRM attendance entry SELECTED for Phase 1. Automated digital check-in deferred to Phase 2.</w:t>
+              <w:t xml:space="preserve">Manual EspoCRM attendance entry for Phase 1. Automated digital check-in deferred to Phase 2.</w:t>
             </w:r>
           </w:p>
         </w:tc>
@@ -2748,7 +2748,7 @@
                 <w:sz w:val="20"/>
                 <w:szCs w:val="20"/>
               </w:rPr>
-              <w:t xml:space="preserve">Moodle (self-hosted AWS) SELECTED. Tech admin has existing Moodle experience. Native BigBlueButton integration in Moodle 4.0+ core — workshop recordings flow directly into courses. Largest FOSS LMS community.</w:t>
+              <w:t xml:space="preserve">Moodle (self-hosted AWS) SELECTED. Admin has existing Moodle experience. Native BigBlueButton integration in Moodle 4.0+ core.</w:t>
             </w:r>
           </w:p>
         </w:tc>
@@ -2862,7 +2862,7 @@
                 <w:sz w:val="20"/>
                 <w:szCs w:val="20"/>
               </w:rPr>
-              <w:t xml:space="preserve">Dual-audience SELECTED. Two separate content areas with distinct access controls — client business education library and mentor onboarding/training library.</w:t>
+              <w:t xml:space="preserve">Dual-audience: separate content areas with distinct access controls — client business education and mentor onboarding/training.</w:t>
             </w:r>
           </w:p>
         </w:tc>
@@ -2948,7 +2948,7 @@
                 <w:sz w:val="20"/>
                 <w:szCs w:val="20"/>
               </w:rPr>
-              <w:t xml:space="preserve">Informal, structured Moodle curriculum, external tool</w:t>
+              <w:t xml:space="preserve">Informal, Moodle curriculum, external tool</w:t>
             </w:r>
           </w:p>
         </w:tc>
@@ -2976,7 +2976,7 @@
                 <w:sz w:val="20"/>
                 <w:szCs w:val="20"/>
               </w:rPr>
-              <w:t xml:space="preserve">Structured Moodle curriculum SELECTED. Required completion before EspoCRM activation. Includes ethics checkbox sign-off (timestamped). Completion triggers admin notification.</w:t>
+              <w:t xml:space="preserve">Structured Moodle curriculum required before EspoCRM activation. Includes ethics checkbox sign-off. Completion triggers admin notification.</w:t>
             </w:r>
           </w:p>
         </w:tc>
@@ -3062,7 +3062,7 @@
                 <w:sz w:val="20"/>
                 <w:szCs w:val="20"/>
               </w:rPr>
-              <w:t xml:space="preserve">Checkbox in Moodle, digital signature, PDF workflow</w:t>
+              <w:t xml:space="preserve">Checkbox Moodle, digital signature, PDF</w:t>
             </w:r>
           </w:p>
         </w:tc>
@@ -3090,7 +3090,7 @@
                 <w:sz w:val="20"/>
                 <w:szCs w:val="20"/>
               </w:rPr>
-              <w:t xml:space="preserve">Checkbox acknowledgment in Moodle SELECTED. Timestamped completion record sufficient for governance needs. No external e-signature tool required.</w:t>
+              <w:t xml:space="preserve">Checkbox acknowledgment in Moodle SELECTED. Timestamped completion record sufficient. No external e-signature tool required.</w:t>
             </w:r>
           </w:p>
         </w:tc>
@@ -3176,7 +3176,7 @@
                 <w:sz w:val="20"/>
                 <w:szCs w:val="20"/>
               </w:rPr>
-              <w:t xml:space="preserve">EspoCRM native, Mautic, Mailchimp, Sendinblue</w:t>
+              <w:t xml:space="preserve">EspoCRM native, Mautic, Mailchimp</w:t>
             </w:r>
           </w:p>
         </w:tc>
@@ -3204,7 +3204,1261 @@
                 <w:sz w:val="20"/>
                 <w:szCs w:val="20"/>
               </w:rPr>
-              <w:t xml:space="preserve">DEFERRED. Evaluate EspoCRM native mass email capability first. Mautic (FOSS, self-hosted) designated upgrade path if EspoCRM insufficient.</w:t>
+              <w:t xml:space="preserve">DEFERRED. Evaluate EspoCRM native mass email first. Mautic (FOSS, self-hosted) designated upgrade path.</w:t>
+            </w:r>
+          </w:p>
+        </w:tc>
+      </w:tr>
+      <w:tr>
+        <w:tc>
+          <w:tcPr>
+            <w:tcW w:type="dxa" w:w="800"/>
+            <w:tcBorders>
+              <w:top w:val="single" w:color="CCCCCC" w:sz="1"/>
+              <w:left w:val="single" w:color="CCCCCC" w:sz="1"/>
+              <w:bottom w:val="single" w:color="CCCCCC" w:sz="1"/>
+              <w:right w:val="single" w:color="CCCCCC" w:sz="1"/>
+            </w:tcBorders>
+            <w:shd w:fill="FFFFFF" w:val="clear"/>
+            <w:tcMar>
+              <w:top w:type="dxa" w:w="80"/>
+              <w:left w:type="dxa" w:w="120"/>
+              <w:bottom w:type="dxa" w:w="80"/>
+              <w:right w:type="dxa" w:w="120"/>
+            </w:tcMar>
+          </w:tcPr>
+          <w:p>
+            <w:r>
+              <w:rPr>
+                <w:rFonts w:ascii="Arial" w:cs="Arial" w:eastAsia="Arial" w:hAnsi="Arial"/>
+                <w:sz w:val="20"/>
+                <w:szCs w:val="20"/>
+              </w:rPr>
+              <w:t xml:space="preserve">D-027</w:t>
+            </w:r>
+          </w:p>
+        </w:tc>
+        <w:tc>
+          <w:tcPr>
+            <w:tcW w:type="dxa" w:w="1600"/>
+            <w:tcBorders>
+              <w:top w:val="single" w:color="CCCCCC" w:sz="1"/>
+              <w:left w:val="single" w:color="CCCCCC" w:sz="1"/>
+              <w:bottom w:val="single" w:color="CCCCCC" w:sz="1"/>
+              <w:right w:val="single" w:color="CCCCCC" w:sz="1"/>
+            </w:tcBorders>
+            <w:shd w:fill="FFFFFF" w:val="clear"/>
+            <w:tcMar>
+              <w:top w:type="dxa" w:w="80"/>
+              <w:left w:type="dxa" w:w="120"/>
+              <w:bottom w:type="dxa" w:w="80"/>
+              <w:right w:type="dxa" w:w="120"/>
+            </w:tcMar>
+          </w:tcPr>
+          <w:p>
+            <w:r>
+              <w:rPr>
+                <w:rFonts w:ascii="Arial" w:cs="Arial" w:eastAsia="Arial" w:hAnsi="Arial"/>
+                <w:sz w:val="20"/>
+                <w:szCs w:val="20"/>
+              </w:rPr>
+              <w:t xml:space="preserve">Dues Collection</w:t>
+            </w:r>
+          </w:p>
+        </w:tc>
+        <w:tc>
+          <w:tcPr>
+            <w:tcW w:type="dxa" w:w="2000"/>
+            <w:tcBorders>
+              <w:top w:val="single" w:color="CCCCCC" w:sz="1"/>
+              <w:left w:val="single" w:color="CCCCCC" w:sz="1"/>
+              <w:bottom w:val="single" w:color="CCCCCC" w:sz="1"/>
+              <w:right w:val="single" w:color="CCCCCC" w:sz="1"/>
+            </w:tcBorders>
+            <w:shd w:fill="FFFFFF" w:val="clear"/>
+            <w:tcMar>
+              <w:top w:type="dxa" w:w="80"/>
+              <w:left w:type="dxa" w:w="120"/>
+              <w:bottom w:type="dxa" w:w="80"/>
+              <w:right w:type="dxa" w:w="120"/>
+            </w:tcMar>
+          </w:tcPr>
+          <w:p>
+            <w:r>
+              <w:rPr>
+                <w:rFonts w:ascii="Arial" w:cs="Arial" w:eastAsia="Arial" w:hAnsi="Arial"/>
+                <w:sz w:val="20"/>
+                <w:szCs w:val="20"/>
+              </w:rPr>
+              <w:t xml:space="preserve">Stripe, PayPal, check only, Square</w:t>
+            </w:r>
+          </w:p>
+        </w:tc>
+        <w:tc>
+          <w:tcPr>
+            <w:tcW w:type="dxa" w:w="4960"/>
+            <w:tcBorders>
+              <w:top w:val="single" w:color="CCCCCC" w:sz="1"/>
+              <w:left w:val="single" w:color="CCCCCC" w:sz="1"/>
+              <w:bottom w:val="single" w:color="CCCCCC" w:sz="1"/>
+              <w:right w:val="single" w:color="CCCCCC" w:sz="1"/>
+            </w:tcBorders>
+            <w:shd w:fill="FFFFFF" w:val="clear"/>
+            <w:tcMar>
+              <w:top w:type="dxa" w:w="80"/>
+              <w:left w:type="dxa" w:w="120"/>
+              <w:bottom w:type="dxa" w:w="80"/>
+              <w:right w:type="dxa" w:w="120"/>
+            </w:tcMar>
+          </w:tcPr>
+          <w:p>
+            <w:r>
+              <w:rPr>
+                <w:rFonts w:ascii="Arial" w:cs="Arial" w:eastAsia="Arial" w:hAnsi="Arial"/>
+                <w:sz w:val="20"/>
+                <w:szCs w:val="20"/>
+              </w:rPr>
+              <w:t xml:space="preserve">Stripe (online) + manual EspoCRM entry (check/cash) SELECTED. Annual payment. Note: dues not eligible for Stripe nonprofit donation rate — standard rate applies.</w:t>
+            </w:r>
+          </w:p>
+        </w:tc>
+      </w:tr>
+      <w:tr>
+        <w:tc>
+          <w:tcPr>
+            <w:tcW w:type="dxa" w:w="800"/>
+            <w:tcBorders>
+              <w:top w:val="single" w:color="CCCCCC" w:sz="1"/>
+              <w:left w:val="single" w:color="CCCCCC" w:sz="1"/>
+              <w:bottom w:val="single" w:color="CCCCCC" w:sz="1"/>
+              <w:right w:val="single" w:color="CCCCCC" w:sz="1"/>
+            </w:tcBorders>
+            <w:shd w:fill="F2F2F2" w:val="clear"/>
+            <w:tcMar>
+              <w:top w:type="dxa" w:w="80"/>
+              <w:left w:type="dxa" w:w="120"/>
+              <w:bottom w:type="dxa" w:w="80"/>
+              <w:right w:type="dxa" w:w="120"/>
+            </w:tcMar>
+          </w:tcPr>
+          <w:p>
+            <w:r>
+              <w:rPr>
+                <w:rFonts w:ascii="Arial" w:cs="Arial" w:eastAsia="Arial" w:hAnsi="Arial"/>
+                <w:sz w:val="20"/>
+                <w:szCs w:val="20"/>
+              </w:rPr>
+              <w:t xml:space="preserve">D-028</w:t>
+            </w:r>
+          </w:p>
+        </w:tc>
+        <w:tc>
+          <w:tcPr>
+            <w:tcW w:type="dxa" w:w="1600"/>
+            <w:tcBorders>
+              <w:top w:val="single" w:color="CCCCCC" w:sz="1"/>
+              <w:left w:val="single" w:color="CCCCCC" w:sz="1"/>
+              <w:bottom w:val="single" w:color="CCCCCC" w:sz="1"/>
+              <w:right w:val="single" w:color="CCCCCC" w:sz="1"/>
+            </w:tcBorders>
+            <w:shd w:fill="F2F2F2" w:val="clear"/>
+            <w:tcMar>
+              <w:top w:type="dxa" w:w="80"/>
+              <w:left w:type="dxa" w:w="120"/>
+              <w:bottom w:type="dxa" w:w="80"/>
+              <w:right w:type="dxa" w:w="120"/>
+            </w:tcMar>
+          </w:tcPr>
+          <w:p>
+            <w:r>
+              <w:rPr>
+                <w:rFonts w:ascii="Arial" w:cs="Arial" w:eastAsia="Arial" w:hAnsi="Arial"/>
+                <w:sz w:val="20"/>
+                <w:szCs w:val="20"/>
+              </w:rPr>
+              <w:t xml:space="preserve">Volunteer KPIs</w:t>
+            </w:r>
+          </w:p>
+        </w:tc>
+        <w:tc>
+          <w:tcPr>
+            <w:tcW w:type="dxa" w:w="2000"/>
+            <w:tcBorders>
+              <w:top w:val="single" w:color="CCCCCC" w:sz="1"/>
+              <w:left w:val="single" w:color="CCCCCC" w:sz="1"/>
+              <w:bottom w:val="single" w:color="CCCCCC" w:sz="1"/>
+              <w:right w:val="single" w:color="CCCCCC" w:sz="1"/>
+            </w:tcBorders>
+            <w:shd w:fill="F2F2F2" w:val="clear"/>
+            <w:tcMar>
+              <w:top w:type="dxa" w:w="80"/>
+              <w:left w:type="dxa" w:w="120"/>
+              <w:bottom w:type="dxa" w:w="80"/>
+              <w:right w:type="dxa" w:w="120"/>
+            </w:tcMar>
+          </w:tcPr>
+          <w:p>
+            <w:r>
+              <w:rPr>
+                <w:rFonts w:ascii="Arial" w:cs="Arial" w:eastAsia="Arial" w:hAnsi="Arial"/>
+                <w:sz w:val="20"/>
+                <w:szCs w:val="20"/>
+              </w:rPr>
+              <w:t xml:space="preserve">Manual tracking, EspoCRM native, external tool</w:t>
+            </w:r>
+          </w:p>
+        </w:tc>
+        <w:tc>
+          <w:tcPr>
+            <w:tcW w:type="dxa" w:w="4960"/>
+            <w:tcBorders>
+              <w:top w:val="single" w:color="CCCCCC" w:sz="1"/>
+              <w:left w:val="single" w:color="CCCCCC" w:sz="1"/>
+              <w:bottom w:val="single" w:color="CCCCCC" w:sz="1"/>
+              <w:right w:val="single" w:color="CCCCCC" w:sz="1"/>
+            </w:tcBorders>
+            <w:shd w:fill="F2F2F2" w:val="clear"/>
+            <w:tcMar>
+              <w:top w:type="dxa" w:w="80"/>
+              <w:left w:type="dxa" w:w="120"/>
+              <w:bottom w:type="dxa" w:w="80"/>
+              <w:right w:type="dxa" w:w="120"/>
+            </w:tcMar>
+          </w:tcPr>
+          <w:p>
+            <w:r>
+              <w:rPr>
+                <w:rFonts w:ascii="Arial" w:cs="Arial" w:eastAsia="Arial" w:hAnsi="Arial"/>
+                <w:sz w:val="20"/>
+                <w:szCs w:val="20"/>
+              </w:rPr>
+              <w:t xml:space="preserve">EspoCRM native tracking SELECTED. Activity, outcome, tenure, and recognition trigger metrics. Dual purpose: internal recognition and funder/grant reporting.</w:t>
+            </w:r>
+          </w:p>
+        </w:tc>
+      </w:tr>
+      <w:tr>
+        <w:tc>
+          <w:tcPr>
+            <w:tcW w:type="dxa" w:w="800"/>
+            <w:tcBorders>
+              <w:top w:val="single" w:color="CCCCCC" w:sz="1"/>
+              <w:left w:val="single" w:color="CCCCCC" w:sz="1"/>
+              <w:bottom w:val="single" w:color="CCCCCC" w:sz="1"/>
+              <w:right w:val="single" w:color="CCCCCC" w:sz="1"/>
+            </w:tcBorders>
+            <w:shd w:fill="FFFFFF" w:val="clear"/>
+            <w:tcMar>
+              <w:top w:type="dxa" w:w="80"/>
+              <w:left w:type="dxa" w:w="120"/>
+              <w:bottom w:type="dxa" w:w="80"/>
+              <w:right w:type="dxa" w:w="120"/>
+            </w:tcMar>
+          </w:tcPr>
+          <w:p>
+            <w:r>
+              <w:rPr>
+                <w:rFonts w:ascii="Arial" w:cs="Arial" w:eastAsia="Arial" w:hAnsi="Arial"/>
+                <w:sz w:val="20"/>
+                <w:szCs w:val="20"/>
+              </w:rPr>
+              <w:t xml:space="preserve">D-029</w:t>
+            </w:r>
+          </w:p>
+        </w:tc>
+        <w:tc>
+          <w:tcPr>
+            <w:tcW w:type="dxa" w:w="1600"/>
+            <w:tcBorders>
+              <w:top w:val="single" w:color="CCCCCC" w:sz="1"/>
+              <w:left w:val="single" w:color="CCCCCC" w:sz="1"/>
+              <w:bottom w:val="single" w:color="CCCCCC" w:sz="1"/>
+              <w:right w:val="single" w:color="CCCCCC" w:sz="1"/>
+            </w:tcBorders>
+            <w:shd w:fill="FFFFFF" w:val="clear"/>
+            <w:tcMar>
+              <w:top w:type="dxa" w:w="80"/>
+              <w:left w:type="dxa" w:w="120"/>
+              <w:bottom w:type="dxa" w:w="80"/>
+              <w:right w:type="dxa" w:w="120"/>
+            </w:tcMar>
+          </w:tcPr>
+          <w:p>
+            <w:r>
+              <w:rPr>
+                <w:rFonts w:ascii="Arial" w:cs="Arial" w:eastAsia="Arial" w:hAnsi="Arial"/>
+                <w:sz w:val="20"/>
+                <w:szCs w:val="20"/>
+              </w:rPr>
+              <w:t xml:space="preserve">Background Checks</w:t>
+            </w:r>
+          </w:p>
+        </w:tc>
+        <w:tc>
+          <w:tcPr>
+            <w:tcW w:type="dxa" w:w="2000"/>
+            <w:tcBorders>
+              <w:top w:val="single" w:color="CCCCCC" w:sz="1"/>
+              <w:left w:val="single" w:color="CCCCCC" w:sz="1"/>
+              <w:bottom w:val="single" w:color="CCCCCC" w:sz="1"/>
+              <w:right w:val="single" w:color="CCCCCC" w:sz="1"/>
+            </w:tcBorders>
+            <w:shd w:fill="FFFFFF" w:val="clear"/>
+            <w:tcMar>
+              <w:top w:type="dxa" w:w="80"/>
+              <w:left w:type="dxa" w:w="120"/>
+              <w:bottom w:type="dxa" w:w="80"/>
+              <w:right w:type="dxa" w:w="120"/>
+            </w:tcMar>
+          </w:tcPr>
+          <w:p>
+            <w:r>
+              <w:rPr>
+                <w:rFonts w:ascii="Arial" w:cs="Arial" w:eastAsia="Arial" w:hAnsi="Arial"/>
+                <w:sz w:val="20"/>
+                <w:szCs w:val="20"/>
+              </w:rPr>
+              <w:t xml:space="preserve">Required, not required</w:t>
+            </w:r>
+          </w:p>
+        </w:tc>
+        <w:tc>
+          <w:tcPr>
+            <w:tcW w:type="dxa" w:w="4960"/>
+            <w:tcBorders>
+              <w:top w:val="single" w:color="CCCCCC" w:sz="1"/>
+              <w:left w:val="single" w:color="CCCCCC" w:sz="1"/>
+              <w:bottom w:val="single" w:color="CCCCCC" w:sz="1"/>
+              <w:right w:val="single" w:color="CCCCCC" w:sz="1"/>
+            </w:tcBorders>
+            <w:shd w:fill="FFFFFF" w:val="clear"/>
+            <w:tcMar>
+              <w:top w:type="dxa" w:w="80"/>
+              <w:left w:type="dxa" w:w="120"/>
+              <w:bottom w:type="dxa" w:w="80"/>
+              <w:right w:type="dxa" w:w="120"/>
+            </w:tcMar>
+          </w:tcPr>
+          <w:p>
+            <w:r>
+              <w:rPr>
+                <w:rFonts w:ascii="Arial" w:cs="Arial" w:eastAsia="Arial" w:hAnsi="Arial"/>
+                <w:sz w:val="20"/>
+                <w:szCs w:val="20"/>
+              </w:rPr>
+              <w:t xml:space="preserve">Not required. No background check process needed.</w:t>
+            </w:r>
+          </w:p>
+        </w:tc>
+      </w:tr>
+      <w:tr>
+        <w:tc>
+          <w:tcPr>
+            <w:tcW w:type="dxa" w:w="800"/>
+            <w:tcBorders>
+              <w:top w:val="single" w:color="CCCCCC" w:sz="1"/>
+              <w:left w:val="single" w:color="CCCCCC" w:sz="1"/>
+              <w:bottom w:val="single" w:color="CCCCCC" w:sz="1"/>
+              <w:right w:val="single" w:color="CCCCCC" w:sz="1"/>
+            </w:tcBorders>
+            <w:shd w:fill="F2F2F2" w:val="clear"/>
+            <w:tcMar>
+              <w:top w:type="dxa" w:w="80"/>
+              <w:left w:type="dxa" w:w="120"/>
+              <w:bottom w:type="dxa" w:w="80"/>
+              <w:right w:type="dxa" w:w="120"/>
+            </w:tcMar>
+          </w:tcPr>
+          <w:p>
+            <w:r>
+              <w:rPr>
+                <w:rFonts w:ascii="Arial" w:cs="Arial" w:eastAsia="Arial" w:hAnsi="Arial"/>
+                <w:sz w:val="20"/>
+                <w:szCs w:val="20"/>
+              </w:rPr>
+              <w:t xml:space="preserve">D-030</w:t>
+            </w:r>
+          </w:p>
+        </w:tc>
+        <w:tc>
+          <w:tcPr>
+            <w:tcW w:type="dxa" w:w="1600"/>
+            <w:tcBorders>
+              <w:top w:val="single" w:color="CCCCCC" w:sz="1"/>
+              <w:left w:val="single" w:color="CCCCCC" w:sz="1"/>
+              <w:bottom w:val="single" w:color="CCCCCC" w:sz="1"/>
+              <w:right w:val="single" w:color="CCCCCC" w:sz="1"/>
+            </w:tcBorders>
+            <w:shd w:fill="F2F2F2" w:val="clear"/>
+            <w:tcMar>
+              <w:top w:type="dxa" w:w="80"/>
+              <w:left w:type="dxa" w:w="120"/>
+              <w:bottom w:type="dxa" w:w="80"/>
+              <w:right w:type="dxa" w:w="120"/>
+            </w:tcMar>
+          </w:tcPr>
+          <w:p>
+            <w:r>
+              <w:rPr>
+                <w:rFonts w:ascii="Arial" w:cs="Arial" w:eastAsia="Arial" w:hAnsi="Arial"/>
+                <w:sz w:val="20"/>
+                <w:szCs w:val="20"/>
+              </w:rPr>
+              <w:t xml:space="preserve">Donor Management</w:t>
+            </w:r>
+          </w:p>
+        </w:tc>
+        <w:tc>
+          <w:tcPr>
+            <w:tcW w:type="dxa" w:w="2000"/>
+            <w:tcBorders>
+              <w:top w:val="single" w:color="CCCCCC" w:sz="1"/>
+              <w:left w:val="single" w:color="CCCCCC" w:sz="1"/>
+              <w:bottom w:val="single" w:color="CCCCCC" w:sz="1"/>
+              <w:right w:val="single" w:color="CCCCCC" w:sz="1"/>
+            </w:tcBorders>
+            <w:shd w:fill="F2F2F2" w:val="clear"/>
+            <w:tcMar>
+              <w:top w:type="dxa" w:w="80"/>
+              <w:left w:type="dxa" w:w="120"/>
+              <w:bottom w:type="dxa" w:w="80"/>
+              <w:right w:type="dxa" w:w="120"/>
+            </w:tcMar>
+          </w:tcPr>
+          <w:p>
+            <w:r>
+              <w:rPr>
+                <w:rFonts w:ascii="Arial" w:cs="Arial" w:eastAsia="Arial" w:hAnsi="Arial"/>
+                <w:sz w:val="20"/>
+                <w:szCs w:val="20"/>
+              </w:rPr>
+              <w:t xml:space="preserve">EspoCRM native, CiviCRM, Salesforce NPSP, Bloomerang</w:t>
+            </w:r>
+          </w:p>
+        </w:tc>
+        <w:tc>
+          <w:tcPr>
+            <w:tcW w:type="dxa" w:w="4960"/>
+            <w:tcBorders>
+              <w:top w:val="single" w:color="CCCCCC" w:sz="1"/>
+              <w:left w:val="single" w:color="CCCCCC" w:sz="1"/>
+              <w:bottom w:val="single" w:color="CCCCCC" w:sz="1"/>
+              <w:right w:val="single" w:color="CCCCCC" w:sz="1"/>
+            </w:tcBorders>
+            <w:shd w:fill="F2F2F2" w:val="clear"/>
+            <w:tcMar>
+              <w:top w:type="dxa" w:w="80"/>
+              <w:left w:type="dxa" w:w="120"/>
+              <w:bottom w:type="dxa" w:w="80"/>
+              <w:right w:type="dxa" w:w="120"/>
+            </w:tcMar>
+          </w:tcPr>
+          <w:p>
+            <w:r>
+              <w:rPr>
+                <w:rFonts w:ascii="Arial" w:cs="Arial" w:eastAsia="Arial" w:hAnsi="Arial"/>
+                <w:sz w:val="20"/>
+                <w:szCs w:val="20"/>
+              </w:rPr>
+              <w:t xml:space="preserve">EspoCRM native SELECTED for Year 1. Simple fundraising needs met natively. Revisit if donor base grows or grant portfolio becomes complex.</w:t>
+            </w:r>
+          </w:p>
+        </w:tc>
+      </w:tr>
+      <w:tr>
+        <w:tc>
+          <w:tcPr>
+            <w:tcW w:type="dxa" w:w="800"/>
+            <w:tcBorders>
+              <w:top w:val="single" w:color="CCCCCC" w:sz="1"/>
+              <w:left w:val="single" w:color="CCCCCC" w:sz="1"/>
+              <w:bottom w:val="single" w:color="CCCCCC" w:sz="1"/>
+              <w:right w:val="single" w:color="CCCCCC" w:sz="1"/>
+            </w:tcBorders>
+            <w:shd w:fill="FFFFFF" w:val="clear"/>
+            <w:tcMar>
+              <w:top w:type="dxa" w:w="80"/>
+              <w:left w:type="dxa" w:w="120"/>
+              <w:bottom w:type="dxa" w:w="80"/>
+              <w:right w:type="dxa" w:w="120"/>
+            </w:tcMar>
+          </w:tcPr>
+          <w:p>
+            <w:r>
+              <w:rPr>
+                <w:rFonts w:ascii="Arial" w:cs="Arial" w:eastAsia="Arial" w:hAnsi="Arial"/>
+                <w:sz w:val="20"/>
+                <w:szCs w:val="20"/>
+              </w:rPr>
+              <w:t xml:space="preserve">D-031</w:t>
+            </w:r>
+          </w:p>
+        </w:tc>
+        <w:tc>
+          <w:tcPr>
+            <w:tcW w:type="dxa" w:w="1600"/>
+            <w:tcBorders>
+              <w:top w:val="single" w:color="CCCCCC" w:sz="1"/>
+              <w:left w:val="single" w:color="CCCCCC" w:sz="1"/>
+              <w:bottom w:val="single" w:color="CCCCCC" w:sz="1"/>
+              <w:right w:val="single" w:color="CCCCCC" w:sz="1"/>
+            </w:tcBorders>
+            <w:shd w:fill="FFFFFF" w:val="clear"/>
+            <w:tcMar>
+              <w:top w:type="dxa" w:w="80"/>
+              <w:left w:type="dxa" w:w="120"/>
+              <w:bottom w:type="dxa" w:w="80"/>
+              <w:right w:type="dxa" w:w="120"/>
+            </w:tcMar>
+          </w:tcPr>
+          <w:p>
+            <w:r>
+              <w:rPr>
+                <w:rFonts w:ascii="Arial" w:cs="Arial" w:eastAsia="Arial" w:hAnsi="Arial"/>
+                <w:sz w:val="20"/>
+                <w:szCs w:val="20"/>
+              </w:rPr>
+              <w:t xml:space="preserve">Online Donations (Phase 2)</w:t>
+            </w:r>
+          </w:p>
+        </w:tc>
+        <w:tc>
+          <w:tcPr>
+            <w:tcW w:type="dxa" w:w="2000"/>
+            <w:tcBorders>
+              <w:top w:val="single" w:color="CCCCCC" w:sz="1"/>
+              <w:left w:val="single" w:color="CCCCCC" w:sz="1"/>
+              <w:bottom w:val="single" w:color="CCCCCC" w:sz="1"/>
+              <w:right w:val="single" w:color="CCCCCC" w:sz="1"/>
+            </w:tcBorders>
+            <w:shd w:fill="FFFFFF" w:val="clear"/>
+            <w:tcMar>
+              <w:top w:type="dxa" w:w="80"/>
+              <w:left w:type="dxa" w:w="120"/>
+              <w:bottom w:type="dxa" w:w="80"/>
+              <w:right w:type="dxa" w:w="120"/>
+            </w:tcMar>
+          </w:tcPr>
+          <w:p>
+            <w:r>
+              <w:rPr>
+                <w:rFonts w:ascii="Arial" w:cs="Arial" w:eastAsia="Arial" w:hAnsi="Arial"/>
+                <w:sz w:val="20"/>
+                <w:szCs w:val="20"/>
+              </w:rPr>
+              <w:t xml:space="preserve">Stripe, PayPal, Zeffy</w:t>
+            </w:r>
+          </w:p>
+        </w:tc>
+        <w:tc>
+          <w:tcPr>
+            <w:tcW w:type="dxa" w:w="4960"/>
+            <w:tcBorders>
+              <w:top w:val="single" w:color="CCCCCC" w:sz="1"/>
+              <w:left w:val="single" w:color="CCCCCC" w:sz="1"/>
+              <w:bottom w:val="single" w:color="CCCCCC" w:sz="1"/>
+              <w:right w:val="single" w:color="CCCCCC" w:sz="1"/>
+            </w:tcBorders>
+            <w:shd w:fill="FFFFFF" w:val="clear"/>
+            <w:tcMar>
+              <w:top w:type="dxa" w:w="80"/>
+              <w:left w:type="dxa" w:w="120"/>
+              <w:bottom w:type="dxa" w:w="80"/>
+              <w:right w:type="dxa" w:w="120"/>
+            </w:tcMar>
+          </w:tcPr>
+          <w:p>
+            <w:r>
+              <w:rPr>
+                <w:rFonts w:ascii="Arial" w:cs="Arial" w:eastAsia="Arial" w:hAnsi="Arial"/>
+                <w:sz w:val="20"/>
+                <w:szCs w:val="20"/>
+              </w:rPr>
+              <w:t xml:space="preserve">DEFERRED to Phase 2. Stripe designated (nonprofit donation rate 2.2% + $0.30 applies to charitable gifts). Simple form on website.</w:t>
+            </w:r>
+          </w:p>
+        </w:tc>
+      </w:tr>
+      <w:tr>
+        <w:tc>
+          <w:tcPr>
+            <w:tcW w:type="dxa" w:w="800"/>
+            <w:tcBorders>
+              <w:top w:val="single" w:color="CCCCCC" w:sz="1"/>
+              <w:left w:val="single" w:color="CCCCCC" w:sz="1"/>
+              <w:bottom w:val="single" w:color="CCCCCC" w:sz="1"/>
+              <w:right w:val="single" w:color="CCCCCC" w:sz="1"/>
+            </w:tcBorders>
+            <w:shd w:fill="F2F2F2" w:val="clear"/>
+            <w:tcMar>
+              <w:top w:type="dxa" w:w="80"/>
+              <w:left w:type="dxa" w:w="120"/>
+              <w:bottom w:type="dxa" w:w="80"/>
+              <w:right w:type="dxa" w:w="120"/>
+            </w:tcMar>
+          </w:tcPr>
+          <w:p>
+            <w:r>
+              <w:rPr>
+                <w:rFonts w:ascii="Arial" w:cs="Arial" w:eastAsia="Arial" w:hAnsi="Arial"/>
+                <w:sz w:val="20"/>
+                <w:szCs w:val="20"/>
+              </w:rPr>
+              <w:t xml:space="preserve">D-032</w:t>
+            </w:r>
+          </w:p>
+        </w:tc>
+        <w:tc>
+          <w:tcPr>
+            <w:tcW w:type="dxa" w:w="1600"/>
+            <w:tcBorders>
+              <w:top w:val="single" w:color="CCCCCC" w:sz="1"/>
+              <w:left w:val="single" w:color="CCCCCC" w:sz="1"/>
+              <w:bottom w:val="single" w:color="CCCCCC" w:sz="1"/>
+              <w:right w:val="single" w:color="CCCCCC" w:sz="1"/>
+            </w:tcBorders>
+            <w:shd w:fill="F2F2F2" w:val="clear"/>
+            <w:tcMar>
+              <w:top w:type="dxa" w:w="80"/>
+              <w:left w:type="dxa" w:w="120"/>
+              <w:bottom w:type="dxa" w:w="80"/>
+              <w:right w:type="dxa" w:w="120"/>
+            </w:tcMar>
+          </w:tcPr>
+          <w:p>
+            <w:r>
+              <w:rPr>
+                <w:rFonts w:ascii="Arial" w:cs="Arial" w:eastAsia="Arial" w:hAnsi="Arial"/>
+                <w:sz w:val="20"/>
+                <w:szCs w:val="20"/>
+              </w:rPr>
+              <w:t xml:space="preserve">Document Sharing</w:t>
+            </w:r>
+          </w:p>
+        </w:tc>
+        <w:tc>
+          <w:tcPr>
+            <w:tcW w:type="dxa" w:w="2000"/>
+            <w:tcBorders>
+              <w:top w:val="single" w:color="CCCCCC" w:sz="1"/>
+              <w:left w:val="single" w:color="CCCCCC" w:sz="1"/>
+              <w:bottom w:val="single" w:color="CCCCCC" w:sz="1"/>
+              <w:right w:val="single" w:color="CCCCCC" w:sz="1"/>
+            </w:tcBorders>
+            <w:shd w:fill="F2F2F2" w:val="clear"/>
+            <w:tcMar>
+              <w:top w:type="dxa" w:w="80"/>
+              <w:left w:type="dxa" w:w="120"/>
+              <w:bottom w:type="dxa" w:w="80"/>
+              <w:right w:type="dxa" w:w="120"/>
+            </w:tcMar>
+          </w:tcPr>
+          <w:p>
+            <w:r>
+              <w:rPr>
+                <w:rFonts w:ascii="Arial" w:cs="Arial" w:eastAsia="Arial" w:hAnsi="Arial"/>
+                <w:sz w:val="20"/>
+                <w:szCs w:val="20"/>
+              </w:rPr>
+              <w:t xml:space="preserve">Google Drive, Nextcloud, SharePoint, OneDrive</w:t>
+            </w:r>
+          </w:p>
+        </w:tc>
+        <w:tc>
+          <w:tcPr>
+            <w:tcW w:type="dxa" w:w="4960"/>
+            <w:tcBorders>
+              <w:top w:val="single" w:color="CCCCCC" w:sz="1"/>
+              <w:left w:val="single" w:color="CCCCCC" w:sz="1"/>
+              <w:bottom w:val="single" w:color="CCCCCC" w:sz="1"/>
+              <w:right w:val="single" w:color="CCCCCC" w:sz="1"/>
+            </w:tcBorders>
+            <w:shd w:fill="F2F2F2" w:val="clear"/>
+            <w:tcMar>
+              <w:top w:type="dxa" w:w="80"/>
+              <w:left w:type="dxa" w:w="120"/>
+              <w:bottom w:type="dxa" w:w="80"/>
+              <w:right w:type="dxa" w:w="120"/>
+            </w:tcMar>
+          </w:tcPr>
+          <w:p>
+            <w:r>
+              <w:rPr>
+                <w:rFonts w:ascii="Arial" w:cs="Arial" w:eastAsia="Arial" w:hAnsi="Arial"/>
+                <w:sz w:val="20"/>
+                <w:szCs w:val="20"/>
+              </w:rPr>
+              <w:t xml:space="preserve">Google Drive (Google Workspace for Nonprofits) SELECTED. Already in stack, 100TB shared storage, role-based shared drives, zero additional cost.</w:t>
+            </w:r>
+          </w:p>
+        </w:tc>
+      </w:tr>
+      <w:tr>
+        <w:tc>
+          <w:tcPr>
+            <w:tcW w:type="dxa" w:w="800"/>
+            <w:tcBorders>
+              <w:top w:val="single" w:color="CCCCCC" w:sz="1"/>
+              <w:left w:val="single" w:color="CCCCCC" w:sz="1"/>
+              <w:bottom w:val="single" w:color="CCCCCC" w:sz="1"/>
+              <w:right w:val="single" w:color="CCCCCC" w:sz="1"/>
+            </w:tcBorders>
+            <w:shd w:fill="FFFFFF" w:val="clear"/>
+            <w:tcMar>
+              <w:top w:type="dxa" w:w="80"/>
+              <w:left w:type="dxa" w:w="120"/>
+              <w:bottom w:type="dxa" w:w="80"/>
+              <w:right w:type="dxa" w:w="120"/>
+            </w:tcMar>
+          </w:tcPr>
+          <w:p>
+            <w:r>
+              <w:rPr>
+                <w:rFonts w:ascii="Arial" w:cs="Arial" w:eastAsia="Arial" w:hAnsi="Arial"/>
+                <w:sz w:val="20"/>
+                <w:szCs w:val="20"/>
+              </w:rPr>
+              <w:t xml:space="preserve">D-033</w:t>
+            </w:r>
+          </w:p>
+        </w:tc>
+        <w:tc>
+          <w:tcPr>
+            <w:tcW w:type="dxa" w:w="1600"/>
+            <w:tcBorders>
+              <w:top w:val="single" w:color="CCCCCC" w:sz="1"/>
+              <w:left w:val="single" w:color="CCCCCC" w:sz="1"/>
+              <w:bottom w:val="single" w:color="CCCCCC" w:sz="1"/>
+              <w:right w:val="single" w:color="CCCCCC" w:sz="1"/>
+            </w:tcBorders>
+            <w:shd w:fill="FFFFFF" w:val="clear"/>
+            <w:tcMar>
+              <w:top w:type="dxa" w:w="80"/>
+              <w:left w:type="dxa" w:w="120"/>
+              <w:bottom w:type="dxa" w:w="80"/>
+              <w:right w:type="dxa" w:w="120"/>
+            </w:tcMar>
+          </w:tcPr>
+          <w:p>
+            <w:r>
+              <w:rPr>
+                <w:rFonts w:ascii="Arial" w:cs="Arial" w:eastAsia="Arial" w:hAnsi="Arial"/>
+                <w:sz w:val="20"/>
+                <w:szCs w:val="20"/>
+              </w:rPr>
+              <w:t xml:space="preserve">Reporting Tools</w:t>
+            </w:r>
+          </w:p>
+        </w:tc>
+        <w:tc>
+          <w:tcPr>
+            <w:tcW w:type="dxa" w:w="2000"/>
+            <w:tcBorders>
+              <w:top w:val="single" w:color="CCCCCC" w:sz="1"/>
+              <w:left w:val="single" w:color="CCCCCC" w:sz="1"/>
+              <w:bottom w:val="single" w:color="CCCCCC" w:sz="1"/>
+              <w:right w:val="single" w:color="CCCCCC" w:sz="1"/>
+            </w:tcBorders>
+            <w:shd w:fill="FFFFFF" w:val="clear"/>
+            <w:tcMar>
+              <w:top w:type="dxa" w:w="80"/>
+              <w:left w:type="dxa" w:w="120"/>
+              <w:bottom w:type="dxa" w:w="80"/>
+              <w:right w:type="dxa" w:w="120"/>
+            </w:tcMar>
+          </w:tcPr>
+          <w:p>
+            <w:r>
+              <w:rPr>
+                <w:rFonts w:ascii="Arial" w:cs="Arial" w:eastAsia="Arial" w:hAnsi="Arial"/>
+                <w:sz w:val="20"/>
+                <w:szCs w:val="20"/>
+              </w:rPr>
+              <w:t xml:space="preserve">EspoCRM native, Metabase, Google Looker Studio, Tableau</w:t>
+            </w:r>
+          </w:p>
+        </w:tc>
+        <w:tc>
+          <w:tcPr>
+            <w:tcW w:type="dxa" w:w="4960"/>
+            <w:tcBorders>
+              <w:top w:val="single" w:color="CCCCCC" w:sz="1"/>
+              <w:left w:val="single" w:color="CCCCCC" w:sz="1"/>
+              <w:bottom w:val="single" w:color="CCCCCC" w:sz="1"/>
+              <w:right w:val="single" w:color="CCCCCC" w:sz="1"/>
+            </w:tcBorders>
+            <w:shd w:fill="FFFFFF" w:val="clear"/>
+            <w:tcMar>
+              <w:top w:type="dxa" w:w="80"/>
+              <w:left w:type="dxa" w:w="120"/>
+              <w:bottom w:type="dxa" w:w="80"/>
+              <w:right w:type="dxa" w:w="120"/>
+            </w:tcMar>
+          </w:tcPr>
+          <w:p>
+            <w:r>
+              <w:rPr>
+                <w:rFonts w:ascii="Arial" w:cs="Arial" w:eastAsia="Arial" w:hAnsi="Arial"/>
+                <w:sz w:val="20"/>
+                <w:szCs w:val="20"/>
+              </w:rPr>
+              <w:t xml:space="preserve">EspoCRM native dashboards + Google Workspace (Slides, Docs, Sheets) for Year 1. Metabase (FOSS) designated upgrade path if needed.</w:t>
+            </w:r>
+          </w:p>
+        </w:tc>
+      </w:tr>
+      <w:tr>
+        <w:tc>
+          <w:tcPr>
+            <w:tcW w:type="dxa" w:w="800"/>
+            <w:tcBorders>
+              <w:top w:val="single" w:color="CCCCCC" w:sz="1"/>
+              <w:left w:val="single" w:color="CCCCCC" w:sz="1"/>
+              <w:bottom w:val="single" w:color="CCCCCC" w:sz="1"/>
+              <w:right w:val="single" w:color="CCCCCC" w:sz="1"/>
+            </w:tcBorders>
+            <w:shd w:fill="F2F2F2" w:val="clear"/>
+            <w:tcMar>
+              <w:top w:type="dxa" w:w="80"/>
+              <w:left w:type="dxa" w:w="120"/>
+              <w:bottom w:type="dxa" w:w="80"/>
+              <w:right w:type="dxa" w:w="120"/>
+            </w:tcMar>
+          </w:tcPr>
+          <w:p>
+            <w:r>
+              <w:rPr>
+                <w:rFonts w:ascii="Arial" w:cs="Arial" w:eastAsia="Arial" w:hAnsi="Arial"/>
+                <w:sz w:val="20"/>
+                <w:szCs w:val="20"/>
+              </w:rPr>
+              <w:t xml:space="preserve">D-034</w:t>
+            </w:r>
+          </w:p>
+        </w:tc>
+        <w:tc>
+          <w:tcPr>
+            <w:tcW w:type="dxa" w:w="1600"/>
+            <w:tcBorders>
+              <w:top w:val="single" w:color="CCCCCC" w:sz="1"/>
+              <w:left w:val="single" w:color="CCCCCC" w:sz="1"/>
+              <w:bottom w:val="single" w:color="CCCCCC" w:sz="1"/>
+              <w:right w:val="single" w:color="CCCCCC" w:sz="1"/>
+            </w:tcBorders>
+            <w:shd w:fill="F2F2F2" w:val="clear"/>
+            <w:tcMar>
+              <w:top w:type="dxa" w:w="80"/>
+              <w:left w:type="dxa" w:w="120"/>
+              <w:bottom w:type="dxa" w:w="80"/>
+              <w:right w:type="dxa" w:w="120"/>
+            </w:tcMar>
+          </w:tcPr>
+          <w:p>
+            <w:r>
+              <w:rPr>
+                <w:rFonts w:ascii="Arial" w:cs="Arial" w:eastAsia="Arial" w:hAnsi="Arial"/>
+                <w:sz w:val="20"/>
+                <w:szCs w:val="20"/>
+              </w:rPr>
+              <w:t xml:space="preserve">Data Retention Policy</w:t>
+            </w:r>
+          </w:p>
+        </w:tc>
+        <w:tc>
+          <w:tcPr>
+            <w:tcW w:type="dxa" w:w="2000"/>
+            <w:tcBorders>
+              <w:top w:val="single" w:color="CCCCCC" w:sz="1"/>
+              <w:left w:val="single" w:color="CCCCCC" w:sz="1"/>
+              <w:bottom w:val="single" w:color="CCCCCC" w:sz="1"/>
+              <w:right w:val="single" w:color="CCCCCC" w:sz="1"/>
+            </w:tcBorders>
+            <w:shd w:fill="F2F2F2" w:val="clear"/>
+            <w:tcMar>
+              <w:top w:type="dxa" w:w="80"/>
+              <w:left w:type="dxa" w:w="120"/>
+              <w:bottom w:type="dxa" w:w="80"/>
+              <w:right w:type="dxa" w:w="120"/>
+            </w:tcMar>
+          </w:tcPr>
+          <w:p>
+            <w:r>
+              <w:rPr>
+                <w:rFonts w:ascii="Arial" w:cs="Arial" w:eastAsia="Arial" w:hAnsi="Arial"/>
+                <w:sz w:val="20"/>
+                <w:szCs w:val="20"/>
+              </w:rPr>
+              <w:t xml:space="preserve">Custom periods, standard nonprofit practice</w:t>
+            </w:r>
+          </w:p>
+        </w:tc>
+        <w:tc>
+          <w:tcPr>
+            <w:tcW w:type="dxa" w:w="4960"/>
+            <w:tcBorders>
+              <w:top w:val="single" w:color="CCCCCC" w:sz="1"/>
+              <w:left w:val="single" w:color="CCCCCC" w:sz="1"/>
+              <w:bottom w:val="single" w:color="CCCCCC" w:sz="1"/>
+              <w:right w:val="single" w:color="CCCCCC" w:sz="1"/>
+            </w:tcBorders>
+            <w:shd w:fill="F2F2F2" w:val="clear"/>
+            <w:tcMar>
+              <w:top w:type="dxa" w:w="80"/>
+              <w:left w:type="dxa" w:w="120"/>
+              <w:bottom w:type="dxa" w:w="80"/>
+              <w:right w:type="dxa" w:w="120"/>
+            </w:tcMar>
+          </w:tcPr>
+          <w:p>
+            <w:r>
+              <w:rPr>
+                <w:rFonts w:ascii="Arial" w:cs="Arial" w:eastAsia="Arial" w:hAnsi="Arial"/>
+                <w:sz w:val="20"/>
+                <w:szCs w:val="20"/>
+              </w:rPr>
+              <w:t xml:space="preserve">Standard nonprofit practice SELECTED. Permanent: governance docs, 990s, board minutes. 7 years: financial, grant, donor, client, volunteer records. 3 years: workshop attendance. 2 years: general correspondence. Ohio legal review required before board adoption.</w:t>
+            </w:r>
+          </w:p>
+        </w:tc>
+      </w:tr>
+      <w:tr>
+        <w:tc>
+          <w:tcPr>
+            <w:tcW w:type="dxa" w:w="800"/>
+            <w:tcBorders>
+              <w:top w:val="single" w:color="CCCCCC" w:sz="1"/>
+              <w:left w:val="single" w:color="CCCCCC" w:sz="1"/>
+              <w:bottom w:val="single" w:color="CCCCCC" w:sz="1"/>
+              <w:right w:val="single" w:color="CCCCCC" w:sz="1"/>
+            </w:tcBorders>
+            <w:shd w:fill="FFFFFF" w:val="clear"/>
+            <w:tcMar>
+              <w:top w:type="dxa" w:w="80"/>
+              <w:left w:type="dxa" w:w="120"/>
+              <w:bottom w:type="dxa" w:w="80"/>
+              <w:right w:type="dxa" w:w="120"/>
+            </w:tcMar>
+          </w:tcPr>
+          <w:p>
+            <w:r>
+              <w:rPr>
+                <w:rFonts w:ascii="Arial" w:cs="Arial" w:eastAsia="Arial" w:hAnsi="Arial"/>
+                <w:sz w:val="20"/>
+                <w:szCs w:val="20"/>
+              </w:rPr>
+              <w:t xml:space="preserve">D-035</w:t>
+            </w:r>
+          </w:p>
+        </w:tc>
+        <w:tc>
+          <w:tcPr>
+            <w:tcW w:type="dxa" w:w="1600"/>
+            <w:tcBorders>
+              <w:top w:val="single" w:color="CCCCCC" w:sz="1"/>
+              <w:left w:val="single" w:color="CCCCCC" w:sz="1"/>
+              <w:bottom w:val="single" w:color="CCCCCC" w:sz="1"/>
+              <w:right w:val="single" w:color="CCCCCC" w:sz="1"/>
+            </w:tcBorders>
+            <w:shd w:fill="FFFFFF" w:val="clear"/>
+            <w:tcMar>
+              <w:top w:type="dxa" w:w="80"/>
+              <w:left w:type="dxa" w:w="120"/>
+              <w:bottom w:type="dxa" w:w="80"/>
+              <w:right w:type="dxa" w:w="120"/>
+            </w:tcMar>
+          </w:tcPr>
+          <w:p>
+            <w:r>
+              <w:rPr>
+                <w:rFonts w:ascii="Arial" w:cs="Arial" w:eastAsia="Arial" w:hAnsi="Arial"/>
+                <w:sz w:val="20"/>
+                <w:szCs w:val="20"/>
+              </w:rPr>
+              <w:t xml:space="preserve">Backup Strategy</w:t>
+            </w:r>
+          </w:p>
+        </w:tc>
+        <w:tc>
+          <w:tcPr>
+            <w:tcW w:type="dxa" w:w="2000"/>
+            <w:tcBorders>
+              <w:top w:val="single" w:color="CCCCCC" w:sz="1"/>
+              <w:left w:val="single" w:color="CCCCCC" w:sz="1"/>
+              <w:bottom w:val="single" w:color="CCCCCC" w:sz="1"/>
+              <w:right w:val="single" w:color="CCCCCC" w:sz="1"/>
+            </w:tcBorders>
+            <w:shd w:fill="FFFFFF" w:val="clear"/>
+            <w:tcMar>
+              <w:top w:type="dxa" w:w="80"/>
+              <w:left w:type="dxa" w:w="120"/>
+              <w:bottom w:type="dxa" w:w="80"/>
+              <w:right w:type="dxa" w:w="120"/>
+            </w:tcMar>
+          </w:tcPr>
+          <w:p>
+            <w:r>
+              <w:rPr>
+                <w:rFonts w:ascii="Arial" w:cs="Arial" w:eastAsia="Arial" w:hAnsi="Arial"/>
+                <w:sz w:val="20"/>
+                <w:szCs w:val="20"/>
+              </w:rPr>
+              <w:t xml:space="preserve">AWS snapshots only, offsite backup, third-party backup</w:t>
+            </w:r>
+          </w:p>
+        </w:tc>
+        <w:tc>
+          <w:tcPr>
+            <w:tcW w:type="dxa" w:w="4960"/>
+            <w:tcBorders>
+              <w:top w:val="single" w:color="CCCCCC" w:sz="1"/>
+              <w:left w:val="single" w:color="CCCCCC" w:sz="1"/>
+              <w:bottom w:val="single" w:color="CCCCCC" w:sz="1"/>
+              <w:right w:val="single" w:color="CCCCCC" w:sz="1"/>
+            </w:tcBorders>
+            <w:shd w:fill="FFFFFF" w:val="clear"/>
+            <w:tcMar>
+              <w:top w:type="dxa" w:w="80"/>
+              <w:left w:type="dxa" w:w="120"/>
+              <w:bottom w:type="dxa" w:w="80"/>
+              <w:right w:type="dxa" w:w="120"/>
+            </w:tcMar>
+          </w:tcPr>
+          <w:p>
+            <w:r>
+              <w:rPr>
+                <w:rFonts w:ascii="Arial" w:cs="Arial" w:eastAsia="Arial" w:hAnsi="Arial"/>
+                <w:sz w:val="20"/>
+                <w:szCs w:val="20"/>
+              </w:rPr>
+              <w:t xml:space="preserve">AWS daily snapshots (30-day retention) + monthly offsite export to separate AWS region + S3 versioning. RTO: 24 hours. RPO: 24 hours. Annual restoration test.</w:t>
+            </w:r>
+          </w:p>
+        </w:tc>
+      </w:tr>
+      <w:tr>
+        <w:tc>
+          <w:tcPr>
+            <w:tcW w:type="dxa" w:w="800"/>
+            <w:tcBorders>
+              <w:top w:val="single" w:color="CCCCCC" w:sz="1"/>
+              <w:left w:val="single" w:color="CCCCCC" w:sz="1"/>
+              <w:bottom w:val="single" w:color="CCCCCC" w:sz="1"/>
+              <w:right w:val="single" w:color="CCCCCC" w:sz="1"/>
+            </w:tcBorders>
+            <w:shd w:fill="F2F2F2" w:val="clear"/>
+            <w:tcMar>
+              <w:top w:type="dxa" w:w="80"/>
+              <w:left w:type="dxa" w:w="120"/>
+              <w:bottom w:type="dxa" w:w="80"/>
+              <w:right w:type="dxa" w:w="120"/>
+            </w:tcMar>
+          </w:tcPr>
+          <w:p>
+            <w:r>
+              <w:rPr>
+                <w:rFonts w:ascii="Arial" w:cs="Arial" w:eastAsia="Arial" w:hAnsi="Arial"/>
+                <w:sz w:val="20"/>
+                <w:szCs w:val="20"/>
+              </w:rPr>
+              <w:t xml:space="preserve">D-036</w:t>
+            </w:r>
+          </w:p>
+        </w:tc>
+        <w:tc>
+          <w:tcPr>
+            <w:tcW w:type="dxa" w:w="1600"/>
+            <w:tcBorders>
+              <w:top w:val="single" w:color="CCCCCC" w:sz="1"/>
+              <w:left w:val="single" w:color="CCCCCC" w:sz="1"/>
+              <w:bottom w:val="single" w:color="CCCCCC" w:sz="1"/>
+              <w:right w:val="single" w:color="CCCCCC" w:sz="1"/>
+            </w:tcBorders>
+            <w:shd w:fill="F2F2F2" w:val="clear"/>
+            <w:tcMar>
+              <w:top w:type="dxa" w:w="80"/>
+              <w:left w:type="dxa" w:w="120"/>
+              <w:bottom w:type="dxa" w:w="80"/>
+              <w:right w:type="dxa" w:w="120"/>
+            </w:tcMar>
+          </w:tcPr>
+          <w:p>
+            <w:r>
+              <w:rPr>
+                <w:rFonts w:ascii="Arial" w:cs="Arial" w:eastAsia="Arial" w:hAnsi="Arial"/>
+                <w:sz w:val="20"/>
+                <w:szCs w:val="20"/>
+              </w:rPr>
+              <w:t xml:space="preserve">Offboarding Process</w:t>
+            </w:r>
+          </w:p>
+        </w:tc>
+        <w:tc>
+          <w:tcPr>
+            <w:tcW w:type="dxa" w:w="2000"/>
+            <w:tcBorders>
+              <w:top w:val="single" w:color="CCCCCC" w:sz="1"/>
+              <w:left w:val="single" w:color="CCCCCC" w:sz="1"/>
+              <w:bottom w:val="single" w:color="CCCCCC" w:sz="1"/>
+              <w:right w:val="single" w:color="CCCCCC" w:sz="1"/>
+            </w:tcBorders>
+            <w:shd w:fill="F2F2F2" w:val="clear"/>
+            <w:tcMar>
+              <w:top w:type="dxa" w:w="80"/>
+              <w:left w:type="dxa" w:w="120"/>
+              <w:bottom w:type="dxa" w:w="80"/>
+              <w:right w:type="dxa" w:w="120"/>
+            </w:tcMar>
+          </w:tcPr>
+          <w:p>
+            <w:r>
+              <w:rPr>
+                <w:rFonts w:ascii="Arial" w:cs="Arial" w:eastAsia="Arial" w:hAnsi="Arial"/>
+                <w:sz w:val="20"/>
+                <w:szCs w:val="20"/>
+              </w:rPr>
+              <w:t xml:space="preserve">Manual ad hoc, formal checklist, automated</w:t>
+            </w:r>
+          </w:p>
+        </w:tc>
+        <w:tc>
+          <w:tcPr>
+            <w:tcW w:type="dxa" w:w="4960"/>
+            <w:tcBorders>
+              <w:top w:val="single" w:color="CCCCCC" w:sz="1"/>
+              <w:left w:val="single" w:color="CCCCCC" w:sz="1"/>
+              <w:bottom w:val="single" w:color="CCCCCC" w:sz="1"/>
+              <w:right w:val="single" w:color="CCCCCC" w:sz="1"/>
+            </w:tcBorders>
+            <w:shd w:fill="F2F2F2" w:val="clear"/>
+            <w:tcMar>
+              <w:top w:type="dxa" w:w="80"/>
+              <w:left w:type="dxa" w:w="120"/>
+              <w:bottom w:type="dxa" w:w="80"/>
+              <w:right w:type="dxa" w:w="120"/>
+            </w:tcMar>
+          </w:tcPr>
+          <w:p>
+            <w:r>
+              <w:rPr>
+                <w:rFonts w:ascii="Arial" w:cs="Arial" w:eastAsia="Arial" w:hAnsi="Arial"/>
+                <w:sz w:val="20"/>
+                <w:szCs w:val="20"/>
+              </w:rPr>
+              <w:t xml:space="preserve">Mandatory 24-hour offboarding checklist covering all systems. Stored in Google Drive. Board president notified for involuntary departures.</w:t>
+            </w:r>
+          </w:p>
+        </w:tc>
+      </w:tr>
+      <w:tr>
+        <w:tc>
+          <w:tcPr>
+            <w:tcW w:type="dxa" w:w="800"/>
+            <w:tcBorders>
+              <w:top w:val="single" w:color="CCCCCC" w:sz="1"/>
+              <w:left w:val="single" w:color="CCCCCC" w:sz="1"/>
+              <w:bottom w:val="single" w:color="CCCCCC" w:sz="1"/>
+              <w:right w:val="single" w:color="CCCCCC" w:sz="1"/>
+            </w:tcBorders>
+            <w:shd w:fill="FFFFFF" w:val="clear"/>
+            <w:tcMar>
+              <w:top w:type="dxa" w:w="80"/>
+              <w:left w:type="dxa" w:w="120"/>
+              <w:bottom w:type="dxa" w:w="80"/>
+              <w:right w:type="dxa" w:w="120"/>
+            </w:tcMar>
+          </w:tcPr>
+          <w:p>
+            <w:r>
+              <w:rPr>
+                <w:rFonts w:ascii="Arial" w:cs="Arial" w:eastAsia="Arial" w:hAnsi="Arial"/>
+                <w:sz w:val="20"/>
+                <w:szCs w:val="20"/>
+              </w:rPr>
+              <w:t xml:space="preserve">D-037</w:t>
+            </w:r>
+          </w:p>
+        </w:tc>
+        <w:tc>
+          <w:tcPr>
+            <w:tcW w:type="dxa" w:w="1600"/>
+            <w:tcBorders>
+              <w:top w:val="single" w:color="CCCCCC" w:sz="1"/>
+              <w:left w:val="single" w:color="CCCCCC" w:sz="1"/>
+              <w:bottom w:val="single" w:color="CCCCCC" w:sz="1"/>
+              <w:right w:val="single" w:color="CCCCCC" w:sz="1"/>
+            </w:tcBorders>
+            <w:shd w:fill="FFFFFF" w:val="clear"/>
+            <w:tcMar>
+              <w:top w:type="dxa" w:w="80"/>
+              <w:left w:type="dxa" w:w="120"/>
+              <w:bottom w:type="dxa" w:w="80"/>
+              <w:right w:type="dxa" w:w="120"/>
+            </w:tcMar>
+          </w:tcPr>
+          <w:p>
+            <w:r>
+              <w:rPr>
+                <w:rFonts w:ascii="Arial" w:cs="Arial" w:eastAsia="Arial" w:hAnsi="Arial"/>
+                <w:sz w:val="20"/>
+                <w:szCs w:val="20"/>
+              </w:rPr>
+              <w:t xml:space="preserve">Incident Response</w:t>
+            </w:r>
+          </w:p>
+        </w:tc>
+        <w:tc>
+          <w:tcPr>
+            <w:tcW w:type="dxa" w:w="2000"/>
+            <w:tcBorders>
+              <w:top w:val="single" w:color="CCCCCC" w:sz="1"/>
+              <w:left w:val="single" w:color="CCCCCC" w:sz="1"/>
+              <w:bottom w:val="single" w:color="CCCCCC" w:sz="1"/>
+              <w:right w:val="single" w:color="CCCCCC" w:sz="1"/>
+            </w:tcBorders>
+            <w:shd w:fill="FFFFFF" w:val="clear"/>
+            <w:tcMar>
+              <w:top w:type="dxa" w:w="80"/>
+              <w:left w:type="dxa" w:w="120"/>
+              <w:bottom w:type="dxa" w:w="80"/>
+              <w:right w:type="dxa" w:w="120"/>
+            </w:tcMar>
+          </w:tcPr>
+          <w:p>
+            <w:r>
+              <w:rPr>
+                <w:rFonts w:ascii="Arial" w:cs="Arial" w:eastAsia="Arial" w:hAnsi="Arial"/>
+                <w:sz w:val="20"/>
+                <w:szCs w:val="20"/>
+              </w:rPr>
+              <w:t xml:space="preserve">Ad hoc, formal documented process</w:t>
+            </w:r>
+          </w:p>
+        </w:tc>
+        <w:tc>
+          <w:tcPr>
+            <w:tcW w:type="dxa" w:w="4960"/>
+            <w:tcBorders>
+              <w:top w:val="single" w:color="CCCCCC" w:sz="1"/>
+              <w:left w:val="single" w:color="CCCCCC" w:sz="1"/>
+              <w:bottom w:val="single" w:color="CCCCCC" w:sz="1"/>
+              <w:right w:val="single" w:color="CCCCCC" w:sz="1"/>
+            </w:tcBorders>
+            <w:shd w:fill="FFFFFF" w:val="clear"/>
+            <w:tcMar>
+              <w:top w:type="dxa" w:w="80"/>
+              <w:left w:type="dxa" w:w="120"/>
+              <w:bottom w:type="dxa" w:w="80"/>
+              <w:right w:type="dxa" w:w="120"/>
+            </w:tcMar>
+          </w:tcPr>
+          <w:p>
+            <w:r>
+              <w:rPr>
+                <w:rFonts w:ascii="Arial" w:cs="Arial" w:eastAsia="Arial" w:hAnsi="Arial"/>
+                <w:sz w:val="20"/>
+                <w:szCs w:val="20"/>
+              </w:rPr>
+              <w:t xml:space="preserve">6-step process: Detect → Contain → Assess → Notify → Remediate → Review. Ohio 45-day breach notification law applies. Legal counsel engaged for client data breaches.</w:t>
             </w:r>
           </w:p>
         </w:tc>
@@ -3389,7 +4643,7 @@
                 <w:sz w:val="20"/>
                 <w:szCs w:val="20"/>
               </w:rPr>
-              <w:t xml:space="preserve">Volunteer Coordination Tools</w:t>
+              <w:t xml:space="preserve">Email Platform (Final)</w:t>
             </w:r>
           </w:p>
         </w:tc>
@@ -3417,7 +4671,7 @@
                 <w:sz w:val="20"/>
                 <w:szCs w:val="20"/>
               </w:rPr>
-              <w:t xml:space="preserve">Largely resolved by EspoCRM — confirm in Section 9 conversation</w:t>
+              <w:t xml:space="preserve">Provisional Google Workspace — pending CRM communication capability assessment</w:t>
             </w:r>
           </w:p>
         </w:tc>
@@ -3447,7 +4701,7 @@
                 <w:sz w:val="20"/>
                 <w:szCs w:val="20"/>
               </w:rPr>
-              <w:t xml:space="preserve">Donor Management</w:t>
+              <w:t xml:space="preserve">Google Meet Group Time Limit</w:t>
             </w:r>
           </w:p>
         </w:tc>
@@ -3475,7 +4729,7 @@
                 <w:sz w:val="20"/>
                 <w:szCs w:val="20"/>
               </w:rPr>
-              <w:t xml:space="preserve">Evaluate EspoCRM native capability — Section 10 conversation</w:t>
+              <w:t xml:space="preserve">Action required — verify free nonprofit tier removes 60-min group meeting limit</w:t>
             </w:r>
           </w:p>
         </w:tc>
@@ -3505,7 +4759,7 @@
                 <w:sz w:val="20"/>
                 <w:szCs w:val="20"/>
               </w:rPr>
-              <w:t xml:space="preserve">Document &amp; Resource Sharing</w:t>
+              <w:t xml:space="preserve">Dues Amount</w:t>
             </w:r>
           </w:p>
         </w:tc>
@@ -3533,7 +4787,7 @@
                 <w:sz w:val="20"/>
                 <w:szCs w:val="20"/>
               </w:rPr>
-              <w:t xml:space="preserve">Pending — Section 11 conversation</w:t>
+              <w:t xml:space="preserve">Open — board to determine annual dues level before system configuration</w:t>
             </w:r>
           </w:p>
         </w:tc>
@@ -3563,7 +4817,7 @@
                 <w:sz w:val="20"/>
                 <w:szCs w:val="20"/>
               </w:rPr>
-              <w:t xml:space="preserve">Reporting &amp; Analytics</w:t>
+              <w:t xml:space="preserve">Ohio Legal Review — Retention Policy</w:t>
             </w:r>
           </w:p>
         </w:tc>
@@ -3591,7 +4845,7 @@
                 <w:sz w:val="20"/>
                 <w:szCs w:val="20"/>
               </w:rPr>
-              <w:t xml:space="preserve">Largely resolved by EspoCRM — confirm in Section 12 conversation</w:t>
+              <w:t xml:space="preserve">Action required — verify retention schedule against Ohio state law before board adoption</w:t>
             </w:r>
           </w:p>
         </w:tc>
@@ -3621,7 +4875,7 @@
                 <w:sz w:val="20"/>
                 <w:szCs w:val="20"/>
               </w:rPr>
-              <w:t xml:space="preserve">Email Platform (Final)</w:t>
+              <w:t xml:space="preserve">Privacy Policy (Public)</w:t>
             </w:r>
           </w:p>
         </w:tc>
@@ -3649,7 +4903,7 @@
                 <w:sz w:val="20"/>
                 <w:szCs w:val="20"/>
               </w:rPr>
-              <w:t xml:space="preserve">Provisional — pending CRM communication capability assessment</w:t>
+              <w:t xml:space="preserve">Open — draft required before website launch</w:t>
             </w:r>
           </w:p>
         </w:tc>
@@ -3679,7 +4933,7 @@
                 <w:sz w:val="20"/>
                 <w:szCs w:val="20"/>
               </w:rPr>
-              <w:t xml:space="preserve">Google Meet Group Limit</w:t>
+              <w:t xml:space="preserve">Online Donations</w:t>
             </w:r>
           </w:p>
         </w:tc>
@@ -3707,7 +4961,7 @@
                 <w:sz w:val="20"/>
                 <w:szCs w:val="20"/>
               </w:rPr>
-              <w:t xml:space="preserve">Action required — verify free nonprofit tier removes 60-min group limit</w:t>
+              <w:t xml:space="preserve">Deferred to Phase 2 — Stripe designated</w:t>
             </w:r>
           </w:p>
         </w:tc>
@@ -3737,7 +4991,7 @@
                 <w:sz w:val="20"/>
                 <w:szCs w:val="20"/>
               </w:rPr>
-              <w:t xml:space="preserve">Dues Payment Processing</w:t>
+              <w:t xml:space="preserve">Phase 2: Automated Mentor Matching</w:t>
             </w:r>
           </w:p>
         </w:tc>
@@ -3765,7 +5019,7 @@
                 <w:sz w:val="20"/>
                 <w:szCs w:val="20"/>
               </w:rPr>
-              <w:t xml:space="preserve">Open — PCI-compliant payment integration needed</w:t>
+              <w:t xml:space="preserve">Planned — data model designed from day one</w:t>
             </w:r>
           </w:p>
         </w:tc>
@@ -3795,7 +5049,7 @@
                 <w:sz w:val="20"/>
                 <w:szCs w:val="20"/>
               </w:rPr>
-              <w:t xml:space="preserve">Backup &amp; Recovery Strategy</w:t>
+              <w:t xml:space="preserve">Phase 2: Digital Event Check-in</w:t>
             </w:r>
           </w:p>
         </w:tc>
@@ -3823,7 +5077,7 @@
                 <w:sz w:val="20"/>
                 <w:szCs w:val="20"/>
               </w:rPr>
-              <w:t xml:space="preserve">Open — self-hosted stack on AWS (EspoCRM, Moodle, Jitsi, Flarum, BigBlueButton)</w:t>
+              <w:t xml:space="preserve">Planned — QR/tablet check-in for in-person workshops</w:t>
             </w:r>
           </w:p>
         </w:tc>
@@ -3853,7 +5107,7 @@
                 <w:sz w:val="20"/>
                 <w:szCs w:val="20"/>
               </w:rPr>
-              <w:t xml:space="preserve">EspoCRM-Moodle Integration</w:t>
+              <w:t xml:space="preserve">Phase 2: Metabase Reporting</w:t>
             </w:r>
           </w:p>
         </w:tc>
@@ -3881,7 +5135,7 @@
                 <w:sz w:val="20"/>
                 <w:szCs w:val="20"/>
               </w:rPr>
-              <w:t xml:space="preserve">Open — automate enrollment trigger from EspoCRM to Moodle</w:t>
+              <w:t xml:space="preserve">Revisit trigger — if funder reporting exceeds EspoCRM native capability</w:t>
             </w:r>
           </w:p>
         </w:tc>
@@ -3911,7 +5165,7 @@
                 <w:sz w:val="20"/>
                 <w:szCs w:val="20"/>
               </w:rPr>
-              <w:t xml:space="preserve">Phase 2: Automated Mentor Matching</w:t>
+              <w:t xml:space="preserve">Section 14: Implementation Roadmap</w:t>
             </w:r>
           </w:p>
         </w:tc>
@@ -3939,65 +5193,7 @@
                 <w:sz w:val="20"/>
                 <w:szCs w:val="20"/>
               </w:rPr>
-              <w:t xml:space="preserve">Planned — data model designed to support from day one</w:t>
-            </w:r>
-          </w:p>
-        </w:tc>
-      </w:tr>
-      <w:tr>
-        <w:tc>
-          <w:tcPr>
-            <w:tcW w:type="dxa" w:w="3500"/>
-            <w:tcBorders>
-              <w:top w:val="single" w:color="CCCCCC" w:sz="1"/>
-              <w:left w:val="single" w:color="CCCCCC" w:sz="1"/>
-              <w:bottom w:val="single" w:color="CCCCCC" w:sz="1"/>
-              <w:right w:val="single" w:color="CCCCCC" w:sz="1"/>
-            </w:tcBorders>
-            <w:shd w:fill="F2F2F2" w:val="clear"/>
-            <w:tcMar>
-              <w:top w:type="dxa" w:w="80"/>
-              <w:left w:type="dxa" w:w="120"/>
-              <w:bottom w:type="dxa" w:w="80"/>
-              <w:right w:type="dxa" w:w="120"/>
-            </w:tcMar>
-          </w:tcPr>
-          <w:p>
-            <w:r>
-              <w:rPr>
-                <w:rFonts w:ascii="Arial" w:cs="Arial" w:eastAsia="Arial" w:hAnsi="Arial"/>
-                <w:sz w:val="20"/>
-                <w:szCs w:val="20"/>
-              </w:rPr>
-              <w:t xml:space="preserve">Phase 2: Digital Event Check-in</w:t>
-            </w:r>
-          </w:p>
-        </w:tc>
-        <w:tc>
-          <w:tcPr>
-            <w:tcW w:type="dxa" w:w="5860"/>
-            <w:tcBorders>
-              <w:top w:val="single" w:color="CCCCCC" w:sz="1"/>
-              <w:left w:val="single" w:color="CCCCCC" w:sz="1"/>
-              <w:bottom w:val="single" w:color="CCCCCC" w:sz="1"/>
-              <w:right w:val="single" w:color="CCCCCC" w:sz="1"/>
-            </w:tcBorders>
-            <w:shd w:fill="F2F2F2" w:val="clear"/>
-            <w:tcMar>
-              <w:top w:type="dxa" w:w="80"/>
-              <w:left w:type="dxa" w:w="120"/>
-              <w:bottom w:type="dxa" w:w="80"/>
-              <w:right w:type="dxa" w:w="120"/>
-            </w:tcMar>
-          </w:tcPr>
-          <w:p>
-            <w:r>
-              <w:rPr>
-                <w:rFonts w:ascii="Arial" w:cs="Arial" w:eastAsia="Arial" w:hAnsi="Arial"/>
-                <w:sz w:val="20"/>
-                <w:szCs w:val="20"/>
-              </w:rPr>
-              <w:t xml:space="preserve">Planned — QR/tablet check-in for in-person workshops</w:t>
+              <w:t xml:space="preserve">Pending — next planning session</w:t>
             </w:r>
           </w:p>
         </w:tc>

</xml_diff>

<commit_message>
Update CRM PRD and Decisions Log — dynamic date/time, version to 0.4
- Last Updated field now auto-populates with current date and time on each script run
- Version updated to 0.4 in title blocks and Document Control table
- Status updated to 'Active — Ongoing Review'
- Both documents updated: CBM-PRD-CRM.docx and CBM-Decisions-Log.docx
</commit_message>
<xml_diff>
--- a/PRDs/CBM-Decisions-Log.docx
+++ b/PRDs/CBM-Decisions-Log.docx
@@ -46,7 +46,7 @@
           <w:sz w:val="22"/>
           <w:szCs w:val="22"/>
         </w:rPr>
-        <w:t xml:space="preserve">Version 0.5  |  Living Document  |  2025</w:t>
+        <w:t xml:space="preserve">Version 0.4  |  Living Document  |  March 15, 2026 at 03:25 PM UTC</w:t>
       </w:r>
     </w:p>
     <w:p>
@@ -90,6 +90,70 @@
         <w:pStyle w:val="Heading1"/>
       </w:pPr>
       <w:r>
+        <w:t xml:space="preserve">How to Use This Log</w:t>
+      </w:r>
+    </w:p>
+    <w:p>
+      <w:pPr>
+        <w:pStyle w:val="ListParagraph"/>
+        <w:numPr>
+          <w:ilvl w:val="0"/>
+          <w:numId w:val="2"/>
+        </w:numPr>
+        <w:spacing w:after="80"/>
+      </w:pPr>
+      <w:r>
+        <w:rPr>
+          <w:b w:val="false"/>
+          <w:bCs w:val="false"/>
+        </w:rPr>
+        <w:t xml:space="preserve">Add a new row whenever a significant technology decision is made</w:t>
+      </w:r>
+    </w:p>
+    <w:p>
+      <w:pPr>
+        <w:pStyle w:val="ListParagraph"/>
+        <w:numPr>
+          <w:ilvl w:val="0"/>
+          <w:numId w:val="2"/>
+        </w:numPr>
+        <w:spacing w:after="80"/>
+      </w:pPr>
+      <w:r>
+        <w:rPr>
+          <w:b w:val="false"/>
+          <w:bCs w:val="false"/>
+        </w:rPr>
+        <w:t xml:space="preserve">Mark decisions as PROVISIONAL if they are expected to be revisited</w:t>
+      </w:r>
+    </w:p>
+    <w:p>
+      <w:pPr>
+        <w:pStyle w:val="ListParagraph"/>
+        <w:numPr>
+          <w:ilvl w:val="0"/>
+          <w:numId w:val="2"/>
+        </w:numPr>
+        <w:spacing w:after="80"/>
+      </w:pPr>
+      <w:r>
+        <w:rPr>
+          <w:b w:val="false"/>
+          <w:bCs w:val="false"/>
+        </w:rPr>
+        <w:t xml:space="preserve">Add a REVISIT trigger — the condition under which the decision should be re-evaluated</w:t>
+      </w:r>
+    </w:p>
+    <w:p>
+      <w:r>
+        <w:t xml:space="preserve"/>
+      </w:r>
+    </w:p>
+    <w:p>
+      <w:pPr>
+        <w:pStyle w:val="Heading1"/>
+      </w:pPr>
+      <w:r>
         <w:t xml:space="preserve">Decision Log</w:t>
       </w:r>
     </w:p>
@@ -326,7 +390,7 @@
                 <w:sz w:val="20"/>
                 <w:szCs w:val="20"/>
               </w:rPr>
-              <w:t xml:space="preserve">AWS, GCP, Azure, DigitalOcean, VPS</w:t>
+              <w:t xml:space="preserve">AWS, GCP, Azure, DigitalOcean, self-hosted VPS</w:t>
             </w:r>
           </w:p>
         </w:tc>
@@ -354,7 +418,7 @@
                 <w:sz w:val="20"/>
                 <w:szCs w:val="20"/>
               </w:rPr>
-              <w:t xml:space="preserve">AWS SELECTED. Unified ecosystem, tech admin experienced, cost manageable at CBM scale.</w:t>
+              <w:t xml:space="preserve">AWS SELECTED. Unified ecosystem (domain, hosting, CI/CD, CDN). Tech admin AWS-comfortable. Cost manageable at CBM scale.</w:t>
             </w:r>
           </w:p>
         </w:tc>
@@ -440,7 +504,7 @@
                 <w:sz w:val="20"/>
                 <w:szCs w:val="20"/>
               </w:rPr>
-              <w:t xml:space="preserve">Namecheap, Cloudflare, Route 53</w:t>
+              <w:t xml:space="preserve">Namecheap, Cloudflare, AWS Route 53</w:t>
             </w:r>
           </w:p>
         </w:tc>
@@ -468,7 +532,7 @@
                 <w:sz w:val="20"/>
                 <w:szCs w:val="20"/>
               </w:rPr>
-              <w:t xml:space="preserve">AWS Route 53 SELECTED. Unified AWS ecosystem, integrated billing.</w:t>
+              <w:t xml:space="preserve">AWS Route 53 SELECTED. Stays within AWS ecosystem. Unified IAM. Integrated billing.</w:t>
             </w:r>
           </w:p>
         </w:tc>
@@ -526,7 +590,7 @@
                 <w:sz w:val="20"/>
                 <w:szCs w:val="20"/>
               </w:rPr>
-              <w:t xml:space="preserve">Email (PROVISIONAL)</w:t>
+              <w:t xml:space="preserve">Email Platform (PROVISIONAL)</w:t>
             </w:r>
           </w:p>
         </w:tc>
@@ -554,7 +618,7 @@
                 <w:sz w:val="20"/>
                 <w:szCs w:val="20"/>
               </w:rPr>
-              <w:t xml:space="preserve">Google Workspace, Proton, Mailcow</w:t>
+              <w:t xml:space="preserve">Google Workspace for Nonprofits, Proton Business, self-hosted Mailcow</w:t>
             </w:r>
           </w:p>
         </w:tc>
@@ -582,7 +646,7 @@
                 <w:sz w:val="20"/>
                 <w:szCs w:val="20"/>
               </w:rPr>
-              <w:t xml:space="preserve">Google Workspace for Nonprofits SELECTED (provisional). Free for 501(c)(3). May migrate if CRM centralizes mentor-client communication.</w:t>
+              <w:t xml:space="preserve">Google Workspace for Nonprofits SELECTED (provisional). Free for 501(c)(3), familiar UI. PROVISIONAL: May migrate if CRM centralizes all mentor-client communication.</w:t>
             </w:r>
           </w:p>
         </w:tc>
@@ -696,7 +760,7 @@
                 <w:sz w:val="20"/>
                 <w:szCs w:val="20"/>
               </w:rPr>
-              <w:t xml:space="preserve">Static HTML/CSS/JS SELECTED. Built with Claude Code. No CMS overhead, fast, cheap on S3.</w:t>
+              <w:t xml:space="preserve">Static HTML/CSS/JS SELECTED. Built with Claude Code. No CMS overhead, fast, cheap on S3, full control.</w:t>
             </w:r>
           </w:p>
         </w:tc>
@@ -782,7 +846,7 @@
                 <w:sz w:val="20"/>
                 <w:szCs w:val="20"/>
               </w:rPr>
-              <w:t xml:space="preserve">S3+CloudFront, Netlify, Vercel</w:t>
+              <w:t xml:space="preserve">AWS S3+CloudFront, Netlify, Vercel, GitHub Pages</w:t>
             </w:r>
           </w:p>
         </w:tc>
@@ -810,7 +874,7 @@
                 <w:sz w:val="20"/>
                 <w:szCs w:val="20"/>
               </w:rPr>
-              <w:t xml:space="preserve">AWS S3 + CloudFront SELECTED. Natural AWS fit. Negligible cost. SSL via CloudFront.</w:t>
+              <w:t xml:space="preserve">AWS S3 + CloudFront SELECTED. Natural AWS ecosystem fit. Negligible cost. CloudFront provides CDN and SSL.</w:t>
             </w:r>
           </w:p>
         </w:tc>
@@ -896,7 +960,7 @@
                 <w:sz w:val="20"/>
                 <w:szCs w:val="20"/>
               </w:rPr>
-              <w:t xml:space="preserve">CodePipeline+CodeCommit, GitHub Actions</w:t>
+              <w:t xml:space="preserve">AWS CodePipeline + CodeCommit, GitHub Actions, GitLab CI</w:t>
             </w:r>
           </w:p>
         </w:tc>
@@ -924,7 +988,7 @@
                 <w:sz w:val="20"/>
                 <w:szCs w:val="20"/>
               </w:rPr>
-              <w:t xml:space="preserve">AWS CodePipeline + CodeCommit SELECTED. Single AWS ecosystem, unified IAM.</w:t>
+              <w:t xml:space="preserve">AWS CodePipeline + CodeCommit SELECTED. Single AWS ecosystem. Unified IAM.</w:t>
             </w:r>
           </w:p>
         </w:tc>
@@ -982,7 +1046,7 @@
                 <w:sz w:val="20"/>
                 <w:szCs w:val="20"/>
               </w:rPr>
-              <w:t xml:space="preserve">Form &amp; Intake</w:t>
+              <w:t xml:space="preserve">Form &amp; Intake Strategy</w:t>
             </w:r>
           </w:p>
         </w:tc>
@@ -1010,7 +1074,7 @@
                 <w:sz w:val="20"/>
                 <w:szCs w:val="20"/>
               </w:rPr>
-              <w:t xml:space="preserve">Third-party tools, CRM-native, custom API</w:t>
+              <w:t xml:space="preserve">Third-party form tools, CRM-native forms, custom API</w:t>
             </w:r>
           </w:p>
         </w:tc>
@@ -1038,7 +1102,7 @@
                 <w:sz w:val="20"/>
                 <w:szCs w:val="20"/>
               </w:rPr>
-              <w:t xml:space="preserve">CRM-native forms SELECTED. All intake flows directly into CRM as records.</w:t>
+              <w:t xml:space="preserve">CRM-native forms SELECTED. All intake, volunteer signup, and event registration become CRM records automatically.</w:t>
             </w:r>
           </w:p>
         </w:tc>
@@ -1124,7 +1188,7 @@
                 <w:sz w:val="20"/>
                 <w:szCs w:val="20"/>
               </w:rPr>
-              <w:t xml:space="preserve">CodeCommit, GitHub, GitLab</w:t>
+              <w:t xml:space="preserve">AWS CodeCommit, GitHub, GitLab</w:t>
             </w:r>
           </w:p>
         </w:tc>
@@ -1152,7 +1216,7 @@
                 <w:sz w:val="20"/>
                 <w:szCs w:val="20"/>
               </w:rPr>
-              <w:t xml:space="preserve">GitHub SELECTED for planning docs. AWS CodeCommit reserved for website source code.</w:t>
+              <w:t xml:space="preserve">GitHub SELECTED for planning documents. Accessible to board without AWS credentials. AWS CodeCommit reserved for website source code.</w:t>
             </w:r>
           </w:p>
         </w:tc>
@@ -1266,7 +1330,7 @@
                 <w:sz w:val="20"/>
                 <w:szCs w:val="20"/>
               </w:rPr>
-              <w:t xml:space="preserve">EspoCRM SELECTED. FOSS, self-hosted, customizable, email threading, workflow automation, REST API, no per-seat costs. HubSpot not selected. Attio future fallback.</w:t>
+              <w:t xml:space="preserve">EspoCRM SELECTED. FOSS, self-hosted on AWS, fully customizable, native email threading, workflow automation, REST API, no per-seat costs. HubSpot evaluated but not selected. Attio retained as future fallback.</w:t>
             </w:r>
           </w:p>
         </w:tc>
@@ -1324,7 +1388,7 @@
                 <w:sz w:val="20"/>
                 <w:szCs w:val="20"/>
               </w:rPr>
-              <w:t xml:space="preserve">CRM Communication</w:t>
+              <w:t xml:space="preserve">CRM Communication Strategy</w:t>
             </w:r>
           </w:p>
         </w:tc>
@@ -1352,7 +1416,7 @@
                 <w:sz w:val="20"/>
                 <w:szCs w:val="20"/>
               </w:rPr>
-              <w:t xml:space="preserve">Personal email, org email, CRM-native</w:t>
+              <w:t xml:space="preserve">Personal email, organizational email, CRM-native</w:t>
             </w:r>
           </w:p>
         </w:tc>
@@ -1380,7 +1444,7 @@
                 <w:sz w:val="20"/>
                 <w:szCs w:val="20"/>
               </w:rPr>
-              <w:t xml:space="preserve">All mentor-client communication through CRM. Clients use email reply — no CRM login.</w:t>
+              <w:t xml:space="preserve">All mentor-client communication through CRM SELECTED. Enables inactivity tracking, maintains confidentiality. Clients interact via email reply — no CRM login required.</w:t>
             </w:r>
           </w:p>
         </w:tc>
@@ -1466,7 +1530,7 @@
                 <w:sz w:val="20"/>
                 <w:szCs w:val="20"/>
               </w:rPr>
-              <w:t xml:space="preserve">Single role, multiple profiles, multi-role profile</w:t>
+              <w:t xml:space="preserve">Single role per volunteer, multiple profiles, single profile multi-role</w:t>
             </w:r>
           </w:p>
         </w:tc>
@@ -1494,7 +1558,7 @@
                 <w:sz w:val="20"/>
                 <w:szCs w:val="20"/>
               </w:rPr>
-              <w:t xml:space="preserve">Single profile with additive roles. One profile supports mentor, co-mentor, and/or SME concurrently.</w:t>
+              <w:t xml:space="preserve">Single profile with additive roles SELECTED. One profile per volunteer supporting mentor, co-mentor, and/or SME roles concurrently.</w:t>
             </w:r>
           </w:p>
         </w:tc>
@@ -1552,7 +1616,7 @@
                 <w:sz w:val="20"/>
                 <w:szCs w:val="20"/>
               </w:rPr>
-              <w:t xml:space="preserve">Mentor Matching P1</w:t>
+              <w:t xml:space="preserve">Mentor Matching Phase 1</w:t>
             </w:r>
           </w:p>
         </w:tc>
@@ -1580,7 +1644,7 @@
                 <w:sz w:val="20"/>
                 <w:szCs w:val="20"/>
               </w:rPr>
-              <w:t xml:space="preserve">Automated, manual, admin-assisted manual</w:t>
+              <w:t xml:space="preserve">Fully automated, fully manual, admin-assisted manual</w:t>
             </w:r>
           </w:p>
         </w:tc>
@@ -1608,7 +1672,7 @@
                 <w:sz w:val="20"/>
                 <w:szCs w:val="20"/>
               </w:rPr>
-              <w:t xml:space="preserve">Admin-assisted manual for Phase 1. Automated suggestions planned Phase 2 — data model ready.</w:t>
+              <w:t xml:space="preserve">Admin-assisted manual matching SELECTED for Phase 1. Automated suggestion system planned for Phase 2 — data model supports it from day one.</w:t>
             </w:r>
           </w:p>
         </w:tc>
@@ -1722,7 +1786,7 @@
                 <w:sz w:val="20"/>
                 <w:szCs w:val="20"/>
               </w:rPr>
-              <w:t xml:space="preserve">Mentor-initiated. SME accepts or declines. Admin has visibility but not bottleneck.</w:t>
+              <w:t xml:space="preserve">Mentor-initiated request workflow SELECTED. SME accepts or declines. Admin has visibility but is not the bottleneck.</w:t>
             </w:r>
           </w:p>
         </w:tc>
@@ -1808,7 +1872,7 @@
                 <w:sz w:val="20"/>
                 <w:szCs w:val="20"/>
               </w:rPr>
-              <w:t xml:space="preserve">Manual, CRM-native, survey tool</w:t>
+              <w:t xml:space="preserve">Manual surveys, CRM-native, integrated survey tool</w:t>
             </w:r>
           </w:p>
         </w:tc>
@@ -1836,7 +1900,7 @@
                 <w:sz w:val="20"/>
                 <w:szCs w:val="20"/>
               </w:rPr>
-              <w:t xml:space="preserve">CRM-triggered NPS at engagement close. LimeSurvey integration if CRM-native insufficient.</w:t>
+              <w:t xml:space="preserve">CRM-triggered NPS SELECTED. Automated trigger at engagement close. Integrate LimeSurvey if CRM-native insufficient.</w:t>
             </w:r>
           </w:p>
         </w:tc>
@@ -1922,7 +1986,7 @@
                 <w:sz w:val="20"/>
                 <w:szCs w:val="20"/>
               </w:rPr>
-              <w:t xml:space="preserve">CRM-native only, dedicated tool, hybrid</w:t>
+              <w:t xml:space="preserve">CRM-native only, dedicated tool only, hybrid</w:t>
             </w:r>
           </w:p>
         </w:tc>
@@ -1950,7 +2014,7 @@
                 <w:sz w:val="20"/>
                 <w:szCs w:val="20"/>
               </w:rPr>
-              <w:t xml:space="preserve">Hybrid: EspoCRM native (mentor-proposed, default) + Cal.com self-hosted (client self-schedule, optional).</w:t>
+              <w:t xml:space="preserve">Hybrid SELECTED. EspoCRM native for mentor-proposed sessions (default). Cal.com self-hosted for optional client self-scheduling. Both log sessions back to EspoCRM.</w:t>
             </w:r>
           </w:p>
         </w:tc>
@@ -2008,7 +2072,7 @@
                 <w:sz w:val="20"/>
                 <w:szCs w:val="20"/>
               </w:rPr>
-              <w:t xml:space="preserve">Client Video</w:t>
+              <w:t xml:space="preserve">Client-Facing Video</w:t>
             </w:r>
           </w:p>
         </w:tc>
@@ -2036,7 +2100,7 @@
                 <w:sz w:val="20"/>
                 <w:szCs w:val="20"/>
               </w:rPr>
-              <w:t xml:space="preserve">Google Meet, Zoom, Jitsi, Teams</w:t>
+              <w:t xml:space="preserve">Google Meet, Zoom, Jitsi Meet, Microsoft Teams</w:t>
             </w:r>
           </w:p>
         </w:tc>
@@ -2064,7 +2128,7 @@
                 <w:sz w:val="20"/>
                 <w:szCs w:val="20"/>
               </w:rPr>
-              <w:t xml:space="preserve">Google Meet SELECTED. Included in Google Workspace for Nonprofits. No client login, no 1:1 time limit.</w:t>
+              <w:t xml:space="preserve">Google Meet SELECTED for client-facing sessions. Included in Google Workspace for Nonprofits. No client login required. Familiar to senior mentors. No time limit for 1:1 sessions.</w:t>
             </w:r>
           </w:p>
         </w:tc>
@@ -2122,7 +2186,7 @@
                 <w:sz w:val="20"/>
                 <w:szCs w:val="20"/>
               </w:rPr>
-              <w:t xml:space="preserve">Internal Video</w:t>
+              <w:t xml:space="preserve">Internal Meeting Video</w:t>
             </w:r>
           </w:p>
         </w:tc>
@@ -2150,7 +2214,7 @@
                 <w:sz w:val="20"/>
                 <w:szCs w:val="20"/>
               </w:rPr>
-              <w:t xml:space="preserve">Google Meet, Zoom, Jitsi, Teams</w:t>
+              <w:t xml:space="preserve">Google Meet, Zoom, Jitsi Meet, Microsoft Teams</w:t>
             </w:r>
           </w:p>
         </w:tc>
@@ -2178,2287 +2242,7 @@
                 <w:sz w:val="20"/>
                 <w:szCs w:val="20"/>
               </w:rPr>
-              <w:t xml:space="preserve">Jitsi Meet (self-hosted AWS) SELECTED. FOSS, no time limits, no per-seat costs, no participant caps.</w:t>
-            </w:r>
-          </w:p>
-        </w:tc>
-      </w:tr>
-      <w:tr>
-        <w:tc>
-          <w:tcPr>
-            <w:tcW w:type="dxa" w:w="800"/>
-            <w:tcBorders>
-              <w:top w:val="single" w:color="CCCCCC" w:sz="1"/>
-              <w:left w:val="single" w:color="CCCCCC" w:sz="1"/>
-              <w:bottom w:val="single" w:color="CCCCCC" w:sz="1"/>
-              <w:right w:val="single" w:color="CCCCCC" w:sz="1"/>
-            </w:tcBorders>
-            <w:shd w:fill="F2F2F2" w:val="clear"/>
-            <w:tcMar>
-              <w:top w:type="dxa" w:w="80"/>
-              <w:left w:type="dxa" w:w="120"/>
-              <w:bottom w:type="dxa" w:w="80"/>
-              <w:right w:type="dxa" w:w="120"/>
-            </w:tcMar>
-          </w:tcPr>
-          <w:p>
-            <w:r>
-              <w:rPr>
-                <w:rFonts w:ascii="Arial" w:cs="Arial" w:eastAsia="Arial" w:hAnsi="Arial"/>
-                <w:sz w:val="20"/>
-                <w:szCs w:val="20"/>
-              </w:rPr>
-              <w:t xml:space="preserve">D-018</w:t>
-            </w:r>
-          </w:p>
-        </w:tc>
-        <w:tc>
-          <w:tcPr>
-            <w:tcW w:type="dxa" w:w="1600"/>
-            <w:tcBorders>
-              <w:top w:val="single" w:color="CCCCCC" w:sz="1"/>
-              <w:left w:val="single" w:color="CCCCCC" w:sz="1"/>
-              <w:bottom w:val="single" w:color="CCCCCC" w:sz="1"/>
-              <w:right w:val="single" w:color="CCCCCC" w:sz="1"/>
-            </w:tcBorders>
-            <w:shd w:fill="F2F2F2" w:val="clear"/>
-            <w:tcMar>
-              <w:top w:type="dxa" w:w="80"/>
-              <w:left w:type="dxa" w:w="120"/>
-              <w:bottom w:type="dxa" w:w="80"/>
-              <w:right w:type="dxa" w:w="120"/>
-            </w:tcMar>
-          </w:tcPr>
-          <w:p>
-            <w:r>
-              <w:rPr>
-                <w:rFonts w:ascii="Arial" w:cs="Arial" w:eastAsia="Arial" w:hAnsi="Arial"/>
-                <w:sz w:val="20"/>
-                <w:szCs w:val="20"/>
-              </w:rPr>
-              <w:t xml:space="preserve">Community Forums</w:t>
-            </w:r>
-          </w:p>
-        </w:tc>
-        <w:tc>
-          <w:tcPr>
-            <w:tcW w:type="dxa" w:w="2000"/>
-            <w:tcBorders>
-              <w:top w:val="single" w:color="CCCCCC" w:sz="1"/>
-              <w:left w:val="single" w:color="CCCCCC" w:sz="1"/>
-              <w:bottom w:val="single" w:color="CCCCCC" w:sz="1"/>
-              <w:right w:val="single" w:color="CCCCCC" w:sz="1"/>
-            </w:tcBorders>
-            <w:shd w:fill="F2F2F2" w:val="clear"/>
-            <w:tcMar>
-              <w:top w:type="dxa" w:w="80"/>
-              <w:left w:type="dxa" w:w="120"/>
-              <w:bottom w:type="dxa" w:w="80"/>
-              <w:right w:type="dxa" w:w="120"/>
-            </w:tcMar>
-          </w:tcPr>
-          <w:p>
-            <w:r>
-              <w:rPr>
-                <w:rFonts w:ascii="Arial" w:cs="Arial" w:eastAsia="Arial" w:hAnsi="Arial"/>
-                <w:sz w:val="20"/>
-                <w:szCs w:val="20"/>
-              </w:rPr>
-              <w:t xml:space="preserve">Discourse, Mattermost, Flarum, NodeBB</w:t>
-            </w:r>
-          </w:p>
-        </w:tc>
-        <w:tc>
-          <w:tcPr>
-            <w:tcW w:type="dxa" w:w="4960"/>
-            <w:tcBorders>
-              <w:top w:val="single" w:color="CCCCCC" w:sz="1"/>
-              <w:left w:val="single" w:color="CCCCCC" w:sz="1"/>
-              <w:bottom w:val="single" w:color="CCCCCC" w:sz="1"/>
-              <w:right w:val="single" w:color="CCCCCC" w:sz="1"/>
-            </w:tcBorders>
-            <w:shd w:fill="F2F2F2" w:val="clear"/>
-            <w:tcMar>
-              <w:top w:type="dxa" w:w="80"/>
-              <w:left w:type="dxa" w:w="120"/>
-              <w:bottom w:type="dxa" w:w="80"/>
-              <w:right w:type="dxa" w:w="120"/>
-            </w:tcMar>
-          </w:tcPr>
-          <w:p>
-            <w:r>
-              <w:rPr>
-                <w:rFonts w:ascii="Arial" w:cs="Arial" w:eastAsia="Arial" w:hAnsi="Arial"/>
-                <w:sz w:val="20"/>
-                <w:szCs w:val="20"/>
-              </w:rPr>
-              <w:t xml:space="preserve">Flarum SELECTED (two separate self-hosted instances). Discourse ruled out — facial recognition/age verification policy conflicts with CBM privacy values.</w:t>
-            </w:r>
-          </w:p>
-        </w:tc>
-      </w:tr>
-      <w:tr>
-        <w:tc>
-          <w:tcPr>
-            <w:tcW w:type="dxa" w:w="800"/>
-            <w:tcBorders>
-              <w:top w:val="single" w:color="CCCCCC" w:sz="1"/>
-              <w:left w:val="single" w:color="CCCCCC" w:sz="1"/>
-              <w:bottom w:val="single" w:color="CCCCCC" w:sz="1"/>
-              <w:right w:val="single" w:color="CCCCCC" w:sz="1"/>
-            </w:tcBorders>
-            <w:shd w:fill="FFFFFF" w:val="clear"/>
-            <w:tcMar>
-              <w:top w:type="dxa" w:w="80"/>
-              <w:left w:type="dxa" w:w="120"/>
-              <w:bottom w:type="dxa" w:w="80"/>
-              <w:right w:type="dxa" w:w="120"/>
-            </w:tcMar>
-          </w:tcPr>
-          <w:p>
-            <w:r>
-              <w:rPr>
-                <w:rFonts w:ascii="Arial" w:cs="Arial" w:eastAsia="Arial" w:hAnsi="Arial"/>
-                <w:sz w:val="20"/>
-                <w:szCs w:val="20"/>
-              </w:rPr>
-              <w:t xml:space="preserve">D-019</w:t>
-            </w:r>
-          </w:p>
-        </w:tc>
-        <w:tc>
-          <w:tcPr>
-            <w:tcW w:type="dxa" w:w="1600"/>
-            <w:tcBorders>
-              <w:top w:val="single" w:color="CCCCCC" w:sz="1"/>
-              <w:left w:val="single" w:color="CCCCCC" w:sz="1"/>
-              <w:bottom w:val="single" w:color="CCCCCC" w:sz="1"/>
-              <w:right w:val="single" w:color="CCCCCC" w:sz="1"/>
-            </w:tcBorders>
-            <w:shd w:fill="FFFFFF" w:val="clear"/>
-            <w:tcMar>
-              <w:top w:type="dxa" w:w="80"/>
-              <w:left w:type="dxa" w:w="120"/>
-              <w:bottom w:type="dxa" w:w="80"/>
-              <w:right w:type="dxa" w:w="120"/>
-            </w:tcMar>
-          </w:tcPr>
-          <w:p>
-            <w:r>
-              <w:rPr>
-                <w:rFonts w:ascii="Arial" w:cs="Arial" w:eastAsia="Arial" w:hAnsi="Arial"/>
-                <w:sz w:val="20"/>
-                <w:szCs w:val="20"/>
-              </w:rPr>
-              <w:t xml:space="preserve">Forum Architecture</w:t>
-            </w:r>
-          </w:p>
-        </w:tc>
-        <w:tc>
-          <w:tcPr>
-            <w:tcW w:type="dxa" w:w="2000"/>
-            <w:tcBorders>
-              <w:top w:val="single" w:color="CCCCCC" w:sz="1"/>
-              <w:left w:val="single" w:color="CCCCCC" w:sz="1"/>
-              <w:bottom w:val="single" w:color="CCCCCC" w:sz="1"/>
-              <w:right w:val="single" w:color="CCCCCC" w:sz="1"/>
-            </w:tcBorders>
-            <w:shd w:fill="FFFFFF" w:val="clear"/>
-            <w:tcMar>
-              <w:top w:type="dxa" w:w="80"/>
-              <w:left w:type="dxa" w:w="120"/>
-              <w:bottom w:type="dxa" w:w="80"/>
-              <w:right w:type="dxa" w:w="120"/>
-            </w:tcMar>
-          </w:tcPr>
-          <w:p>
-            <w:r>
-              <w:rPr>
-                <w:rFonts w:ascii="Arial" w:cs="Arial" w:eastAsia="Arial" w:hAnsi="Arial"/>
-                <w:sz w:val="20"/>
-                <w:szCs w:val="20"/>
-              </w:rPr>
-              <w:t xml:space="preserve">Single instance with permissions, two instances</w:t>
-            </w:r>
-          </w:p>
-        </w:tc>
-        <w:tc>
-          <w:tcPr>
-            <w:tcW w:type="dxa" w:w="4960"/>
-            <w:tcBorders>
-              <w:top w:val="single" w:color="CCCCCC" w:sz="1"/>
-              <w:left w:val="single" w:color="CCCCCC" w:sz="1"/>
-              <w:bottom w:val="single" w:color="CCCCCC" w:sz="1"/>
-              <w:right w:val="single" w:color="CCCCCC" w:sz="1"/>
-            </w:tcBorders>
-            <w:shd w:fill="FFFFFF" w:val="clear"/>
-            <w:tcMar>
-              <w:top w:type="dxa" w:w="80"/>
-              <w:left w:type="dxa" w:w="120"/>
-              <w:bottom w:type="dxa" w:w="80"/>
-              <w:right w:type="dxa" w:w="120"/>
-            </w:tcMar>
-          </w:tcPr>
-          <w:p>
-            <w:r>
-              <w:rPr>
-                <w:rFonts w:ascii="Arial" w:cs="Arial" w:eastAsia="Arial" w:hAnsi="Arial"/>
-                <w:sz w:val="20"/>
-                <w:szCs w:val="20"/>
-              </w:rPr>
-              <w:t xml:space="preserve">Two separate Flarum instances SELECTED. Complete isolation: Instance 1 mentor community, Instance 2 client community. No public access.</w:t>
-            </w:r>
-          </w:p>
-        </w:tc>
-      </w:tr>
-      <w:tr>
-        <w:tc>
-          <w:tcPr>
-            <w:tcW w:type="dxa" w:w="800"/>
-            <w:tcBorders>
-              <w:top w:val="single" w:color="CCCCCC" w:sz="1"/>
-              <w:left w:val="single" w:color="CCCCCC" w:sz="1"/>
-              <w:bottom w:val="single" w:color="CCCCCC" w:sz="1"/>
-              <w:right w:val="single" w:color="CCCCCC" w:sz="1"/>
-            </w:tcBorders>
-            <w:shd w:fill="F2F2F2" w:val="clear"/>
-            <w:tcMar>
-              <w:top w:type="dxa" w:w="80"/>
-              <w:left w:type="dxa" w:w="120"/>
-              <w:bottom w:type="dxa" w:w="80"/>
-              <w:right w:type="dxa" w:w="120"/>
-            </w:tcMar>
-          </w:tcPr>
-          <w:p>
-            <w:r>
-              <w:rPr>
-                <w:rFonts w:ascii="Arial" w:cs="Arial" w:eastAsia="Arial" w:hAnsi="Arial"/>
-                <w:sz w:val="20"/>
-                <w:szCs w:val="20"/>
-              </w:rPr>
-              <w:t xml:space="preserve">D-020</w:t>
-            </w:r>
-          </w:p>
-        </w:tc>
-        <w:tc>
-          <w:tcPr>
-            <w:tcW w:type="dxa" w:w="1600"/>
-            <w:tcBorders>
-              <w:top w:val="single" w:color="CCCCCC" w:sz="1"/>
-              <w:left w:val="single" w:color="CCCCCC" w:sz="1"/>
-              <w:bottom w:val="single" w:color="CCCCCC" w:sz="1"/>
-              <w:right w:val="single" w:color="CCCCCC" w:sz="1"/>
-            </w:tcBorders>
-            <w:shd w:fill="F2F2F2" w:val="clear"/>
-            <w:tcMar>
-              <w:top w:type="dxa" w:w="80"/>
-              <w:left w:type="dxa" w:w="120"/>
-              <w:bottom w:type="dxa" w:w="80"/>
-              <w:right w:type="dxa" w:w="120"/>
-            </w:tcMar>
-          </w:tcPr>
-          <w:p>
-            <w:r>
-              <w:rPr>
-                <w:rFonts w:ascii="Arial" w:cs="Arial" w:eastAsia="Arial" w:hAnsi="Arial"/>
-                <w:sz w:val="20"/>
-                <w:szCs w:val="20"/>
-              </w:rPr>
-              <w:t xml:space="preserve">Virtual Workshops</w:t>
-            </w:r>
-          </w:p>
-        </w:tc>
-        <w:tc>
-          <w:tcPr>
-            <w:tcW w:type="dxa" w:w="2000"/>
-            <w:tcBorders>
-              <w:top w:val="single" w:color="CCCCCC" w:sz="1"/>
-              <w:left w:val="single" w:color="CCCCCC" w:sz="1"/>
-              <w:bottom w:val="single" w:color="CCCCCC" w:sz="1"/>
-              <w:right w:val="single" w:color="CCCCCC" w:sz="1"/>
-            </w:tcBorders>
-            <w:shd w:fill="F2F2F2" w:val="clear"/>
-            <w:tcMar>
-              <w:top w:type="dxa" w:w="80"/>
-              <w:left w:type="dxa" w:w="120"/>
-              <w:bottom w:type="dxa" w:w="80"/>
-              <w:right w:type="dxa" w:w="120"/>
-            </w:tcMar>
-          </w:tcPr>
-          <w:p>
-            <w:r>
-              <w:rPr>
-                <w:rFonts w:ascii="Arial" w:cs="Arial" w:eastAsia="Arial" w:hAnsi="Arial"/>
-                <w:sz w:val="20"/>
-                <w:szCs w:val="20"/>
-              </w:rPr>
-              <w:t xml:space="preserve">Google Meet, Zoom, BigBlueButton, Teams</w:t>
-            </w:r>
-          </w:p>
-        </w:tc>
-        <w:tc>
-          <w:tcPr>
-            <w:tcW w:type="dxa" w:w="4960"/>
-            <w:tcBorders>
-              <w:top w:val="single" w:color="CCCCCC" w:sz="1"/>
-              <w:left w:val="single" w:color="CCCCCC" w:sz="1"/>
-              <w:bottom w:val="single" w:color="CCCCCC" w:sz="1"/>
-              <w:right w:val="single" w:color="CCCCCC" w:sz="1"/>
-            </w:tcBorders>
-            <w:shd w:fill="F2F2F2" w:val="clear"/>
-            <w:tcMar>
-              <w:top w:type="dxa" w:w="80"/>
-              <w:left w:type="dxa" w:w="120"/>
-              <w:bottom w:type="dxa" w:w="80"/>
-              <w:right w:type="dxa" w:w="120"/>
-            </w:tcMar>
-          </w:tcPr>
-          <w:p>
-            <w:r>
-              <w:rPr>
-                <w:rFonts w:ascii="Arial" w:cs="Arial" w:eastAsia="Arial" w:hAnsi="Arial"/>
-                <w:sz w:val="20"/>
-                <w:szCs w:val="20"/>
-              </w:rPr>
-              <w:t xml:space="preserve">BigBlueButton (self-hosted AWS) SELECTED. Full webinar controls, native recording, native Moodle integration.</w:t>
-            </w:r>
-          </w:p>
-        </w:tc>
-      </w:tr>
-      <w:tr>
-        <w:tc>
-          <w:tcPr>
-            <w:tcW w:type="dxa" w:w="800"/>
-            <w:tcBorders>
-              <w:top w:val="single" w:color="CCCCCC" w:sz="1"/>
-              <w:left w:val="single" w:color="CCCCCC" w:sz="1"/>
-              <w:bottom w:val="single" w:color="CCCCCC" w:sz="1"/>
-              <w:right w:val="single" w:color="CCCCCC" w:sz="1"/>
-            </w:tcBorders>
-            <w:shd w:fill="FFFFFF" w:val="clear"/>
-            <w:tcMar>
-              <w:top w:type="dxa" w:w="80"/>
-              <w:left w:type="dxa" w:w="120"/>
-              <w:bottom w:type="dxa" w:w="80"/>
-              <w:right w:type="dxa" w:w="120"/>
-            </w:tcMar>
-          </w:tcPr>
-          <w:p>
-            <w:r>
-              <w:rPr>
-                <w:rFonts w:ascii="Arial" w:cs="Arial" w:eastAsia="Arial" w:hAnsi="Arial"/>
-                <w:sz w:val="20"/>
-                <w:szCs w:val="20"/>
-              </w:rPr>
-              <w:t xml:space="preserve">D-021</w:t>
-            </w:r>
-          </w:p>
-        </w:tc>
-        <w:tc>
-          <w:tcPr>
-            <w:tcW w:type="dxa" w:w="1600"/>
-            <w:tcBorders>
-              <w:top w:val="single" w:color="CCCCCC" w:sz="1"/>
-              <w:left w:val="single" w:color="CCCCCC" w:sz="1"/>
-              <w:bottom w:val="single" w:color="CCCCCC" w:sz="1"/>
-              <w:right w:val="single" w:color="CCCCCC" w:sz="1"/>
-            </w:tcBorders>
-            <w:shd w:fill="FFFFFF" w:val="clear"/>
-            <w:tcMar>
-              <w:top w:type="dxa" w:w="80"/>
-              <w:left w:type="dxa" w:w="120"/>
-              <w:bottom w:type="dxa" w:w="80"/>
-              <w:right w:type="dxa" w:w="120"/>
-            </w:tcMar>
-          </w:tcPr>
-          <w:p>
-            <w:r>
-              <w:rPr>
-                <w:rFonts w:ascii="Arial" w:cs="Arial" w:eastAsia="Arial" w:hAnsi="Arial"/>
-                <w:sz w:val="20"/>
-                <w:szCs w:val="20"/>
-              </w:rPr>
-              <w:t xml:space="preserve">In-Person Check-in</w:t>
-            </w:r>
-          </w:p>
-        </w:tc>
-        <w:tc>
-          <w:tcPr>
-            <w:tcW w:type="dxa" w:w="2000"/>
-            <w:tcBorders>
-              <w:top w:val="single" w:color="CCCCCC" w:sz="1"/>
-              <w:left w:val="single" w:color="CCCCCC" w:sz="1"/>
-              <w:bottom w:val="single" w:color="CCCCCC" w:sz="1"/>
-              <w:right w:val="single" w:color="CCCCCC" w:sz="1"/>
-            </w:tcBorders>
-            <w:shd w:fill="FFFFFF" w:val="clear"/>
-            <w:tcMar>
-              <w:top w:type="dxa" w:w="80"/>
-              <w:left w:type="dxa" w:w="120"/>
-              <w:bottom w:type="dxa" w:w="80"/>
-              <w:right w:type="dxa" w:w="120"/>
-            </w:tcMar>
-          </w:tcPr>
-          <w:p>
-            <w:r>
-              <w:rPr>
-                <w:rFonts w:ascii="Arial" w:cs="Arial" w:eastAsia="Arial" w:hAnsi="Arial"/>
-                <w:sz w:val="20"/>
-                <w:szCs w:val="20"/>
-              </w:rPr>
-              <w:t xml:space="preserve">Automated QR/tablet, manual EspoCRM entry</w:t>
-            </w:r>
-          </w:p>
-        </w:tc>
-        <w:tc>
-          <w:tcPr>
-            <w:tcW w:type="dxa" w:w="4960"/>
-            <w:tcBorders>
-              <w:top w:val="single" w:color="CCCCCC" w:sz="1"/>
-              <w:left w:val="single" w:color="CCCCCC" w:sz="1"/>
-              <w:bottom w:val="single" w:color="CCCCCC" w:sz="1"/>
-              <w:right w:val="single" w:color="CCCCCC" w:sz="1"/>
-            </w:tcBorders>
-            <w:shd w:fill="FFFFFF" w:val="clear"/>
-            <w:tcMar>
-              <w:top w:type="dxa" w:w="80"/>
-              <w:left w:type="dxa" w:w="120"/>
-              <w:bottom w:type="dxa" w:w="80"/>
-              <w:right w:type="dxa" w:w="120"/>
-            </w:tcMar>
-          </w:tcPr>
-          <w:p>
-            <w:r>
-              <w:rPr>
-                <w:rFonts w:ascii="Arial" w:cs="Arial" w:eastAsia="Arial" w:hAnsi="Arial"/>
-                <w:sz w:val="20"/>
-                <w:szCs w:val="20"/>
-              </w:rPr>
-              <w:t xml:space="preserve">Manual EspoCRM attendance entry for Phase 1. Automated digital check-in deferred to Phase 2.</w:t>
-            </w:r>
-          </w:p>
-        </w:tc>
-      </w:tr>
-      <w:tr>
-        <w:tc>
-          <w:tcPr>
-            <w:tcW w:type="dxa" w:w="800"/>
-            <w:tcBorders>
-              <w:top w:val="single" w:color="CCCCCC" w:sz="1"/>
-              <w:left w:val="single" w:color="CCCCCC" w:sz="1"/>
-              <w:bottom w:val="single" w:color="CCCCCC" w:sz="1"/>
-              <w:right w:val="single" w:color="CCCCCC" w:sz="1"/>
-            </w:tcBorders>
-            <w:shd w:fill="F2F2F2" w:val="clear"/>
-            <w:tcMar>
-              <w:top w:type="dxa" w:w="80"/>
-              <w:left w:type="dxa" w:w="120"/>
-              <w:bottom w:type="dxa" w:w="80"/>
-              <w:right w:type="dxa" w:w="120"/>
-            </w:tcMar>
-          </w:tcPr>
-          <w:p>
-            <w:r>
-              <w:rPr>
-                <w:rFonts w:ascii="Arial" w:cs="Arial" w:eastAsia="Arial" w:hAnsi="Arial"/>
-                <w:sz w:val="20"/>
-                <w:szCs w:val="20"/>
-              </w:rPr>
-              <w:t xml:space="preserve">D-022</w:t>
-            </w:r>
-          </w:p>
-        </w:tc>
-        <w:tc>
-          <w:tcPr>
-            <w:tcW w:type="dxa" w:w="1600"/>
-            <w:tcBorders>
-              <w:top w:val="single" w:color="CCCCCC" w:sz="1"/>
-              <w:left w:val="single" w:color="CCCCCC" w:sz="1"/>
-              <w:bottom w:val="single" w:color="CCCCCC" w:sz="1"/>
-              <w:right w:val="single" w:color="CCCCCC" w:sz="1"/>
-            </w:tcBorders>
-            <w:shd w:fill="F2F2F2" w:val="clear"/>
-            <w:tcMar>
-              <w:top w:type="dxa" w:w="80"/>
-              <w:left w:type="dxa" w:w="120"/>
-              <w:bottom w:type="dxa" w:w="80"/>
-              <w:right w:type="dxa" w:w="120"/>
-            </w:tcMar>
-          </w:tcPr>
-          <w:p>
-            <w:r>
-              <w:rPr>
-                <w:rFonts w:ascii="Arial" w:cs="Arial" w:eastAsia="Arial" w:hAnsi="Arial"/>
-                <w:sz w:val="20"/>
-                <w:szCs w:val="20"/>
-              </w:rPr>
-              <w:t xml:space="preserve">Learning Platform</w:t>
-            </w:r>
-          </w:p>
-        </w:tc>
-        <w:tc>
-          <w:tcPr>
-            <w:tcW w:type="dxa" w:w="2000"/>
-            <w:tcBorders>
-              <w:top w:val="single" w:color="CCCCCC" w:sz="1"/>
-              <w:left w:val="single" w:color="CCCCCC" w:sz="1"/>
-              <w:bottom w:val="single" w:color="CCCCCC" w:sz="1"/>
-              <w:right w:val="single" w:color="CCCCCC" w:sz="1"/>
-            </w:tcBorders>
-            <w:shd w:fill="F2F2F2" w:val="clear"/>
-            <w:tcMar>
-              <w:top w:type="dxa" w:w="80"/>
-              <w:left w:type="dxa" w:w="120"/>
-              <w:bottom w:type="dxa" w:w="80"/>
-              <w:right w:type="dxa" w:w="120"/>
-            </w:tcMar>
-          </w:tcPr>
-          <w:p>
-            <w:r>
-              <w:rPr>
-                <w:rFonts w:ascii="Arial" w:cs="Arial" w:eastAsia="Arial" w:hAnsi="Arial"/>
-                <w:sz w:val="20"/>
-                <w:szCs w:val="20"/>
-              </w:rPr>
-              <w:t xml:space="preserve">Moodle, Chamilo, Canvas OSS, Open edX</w:t>
-            </w:r>
-          </w:p>
-        </w:tc>
-        <w:tc>
-          <w:tcPr>
-            <w:tcW w:type="dxa" w:w="4960"/>
-            <w:tcBorders>
-              <w:top w:val="single" w:color="CCCCCC" w:sz="1"/>
-              <w:left w:val="single" w:color="CCCCCC" w:sz="1"/>
-              <w:bottom w:val="single" w:color="CCCCCC" w:sz="1"/>
-              <w:right w:val="single" w:color="CCCCCC" w:sz="1"/>
-            </w:tcBorders>
-            <w:shd w:fill="F2F2F2" w:val="clear"/>
-            <w:tcMar>
-              <w:top w:type="dxa" w:w="80"/>
-              <w:left w:type="dxa" w:w="120"/>
-              <w:bottom w:type="dxa" w:w="80"/>
-              <w:right w:type="dxa" w:w="120"/>
-            </w:tcMar>
-          </w:tcPr>
-          <w:p>
-            <w:r>
-              <w:rPr>
-                <w:rFonts w:ascii="Arial" w:cs="Arial" w:eastAsia="Arial" w:hAnsi="Arial"/>
-                <w:sz w:val="20"/>
-                <w:szCs w:val="20"/>
-              </w:rPr>
-              <w:t xml:space="preserve">Moodle (self-hosted AWS) SELECTED. Admin has existing Moodle experience. Native BigBlueButton integration in Moodle 4.0+ core.</w:t>
-            </w:r>
-          </w:p>
-        </w:tc>
-      </w:tr>
-      <w:tr>
-        <w:tc>
-          <w:tcPr>
-            <w:tcW w:type="dxa" w:w="800"/>
-            <w:tcBorders>
-              <w:top w:val="single" w:color="CCCCCC" w:sz="1"/>
-              <w:left w:val="single" w:color="CCCCCC" w:sz="1"/>
-              <w:bottom w:val="single" w:color="CCCCCC" w:sz="1"/>
-              <w:right w:val="single" w:color="CCCCCC" w:sz="1"/>
-            </w:tcBorders>
-            <w:shd w:fill="FFFFFF" w:val="clear"/>
-            <w:tcMar>
-              <w:top w:type="dxa" w:w="80"/>
-              <w:left w:type="dxa" w:w="120"/>
-              <w:bottom w:type="dxa" w:w="80"/>
-              <w:right w:type="dxa" w:w="120"/>
-            </w:tcMar>
-          </w:tcPr>
-          <w:p>
-            <w:r>
-              <w:rPr>
-                <w:rFonts w:ascii="Arial" w:cs="Arial" w:eastAsia="Arial" w:hAnsi="Arial"/>
-                <w:sz w:val="20"/>
-                <w:szCs w:val="20"/>
-              </w:rPr>
-              <w:t xml:space="preserve">D-023</w:t>
-            </w:r>
-          </w:p>
-        </w:tc>
-        <w:tc>
-          <w:tcPr>
-            <w:tcW w:type="dxa" w:w="1600"/>
-            <w:tcBorders>
-              <w:top w:val="single" w:color="CCCCCC" w:sz="1"/>
-              <w:left w:val="single" w:color="CCCCCC" w:sz="1"/>
-              <w:bottom w:val="single" w:color="CCCCCC" w:sz="1"/>
-              <w:right w:val="single" w:color="CCCCCC" w:sz="1"/>
-            </w:tcBorders>
-            <w:shd w:fill="FFFFFF" w:val="clear"/>
-            <w:tcMar>
-              <w:top w:type="dxa" w:w="80"/>
-              <w:left w:type="dxa" w:w="120"/>
-              <w:bottom w:type="dxa" w:w="80"/>
-              <w:right w:type="dxa" w:w="120"/>
-            </w:tcMar>
-          </w:tcPr>
-          <w:p>
-            <w:r>
-              <w:rPr>
-                <w:rFonts w:ascii="Arial" w:cs="Arial" w:eastAsia="Arial" w:hAnsi="Arial"/>
-                <w:sz w:val="20"/>
-                <w:szCs w:val="20"/>
-              </w:rPr>
-              <w:t xml:space="preserve">LMS Audience Model</w:t>
-            </w:r>
-          </w:p>
-        </w:tc>
-        <w:tc>
-          <w:tcPr>
-            <w:tcW w:type="dxa" w:w="2000"/>
-            <w:tcBorders>
-              <w:top w:val="single" w:color="CCCCCC" w:sz="1"/>
-              <w:left w:val="single" w:color="CCCCCC" w:sz="1"/>
-              <w:bottom w:val="single" w:color="CCCCCC" w:sz="1"/>
-              <w:right w:val="single" w:color="CCCCCC" w:sz="1"/>
-            </w:tcBorders>
-            <w:shd w:fill="FFFFFF" w:val="clear"/>
-            <w:tcMar>
-              <w:top w:type="dxa" w:w="80"/>
-              <w:left w:type="dxa" w:w="120"/>
-              <w:bottom w:type="dxa" w:w="80"/>
-              <w:right w:type="dxa" w:w="120"/>
-            </w:tcMar>
-          </w:tcPr>
-          <w:p>
-            <w:r>
-              <w:rPr>
-                <w:rFonts w:ascii="Arial" w:cs="Arial" w:eastAsia="Arial" w:hAnsi="Arial"/>
-                <w:sz w:val="20"/>
-                <w:szCs w:val="20"/>
-              </w:rPr>
-              <w:t xml:space="preserve">Client-only, mentor-only, dual-audience</w:t>
-            </w:r>
-          </w:p>
-        </w:tc>
-        <w:tc>
-          <w:tcPr>
-            <w:tcW w:type="dxa" w:w="4960"/>
-            <w:tcBorders>
-              <w:top w:val="single" w:color="CCCCCC" w:sz="1"/>
-              <w:left w:val="single" w:color="CCCCCC" w:sz="1"/>
-              <w:bottom w:val="single" w:color="CCCCCC" w:sz="1"/>
-              <w:right w:val="single" w:color="CCCCCC" w:sz="1"/>
-            </w:tcBorders>
-            <w:shd w:fill="FFFFFF" w:val="clear"/>
-            <w:tcMar>
-              <w:top w:type="dxa" w:w="80"/>
-              <w:left w:type="dxa" w:w="120"/>
-              <w:bottom w:type="dxa" w:w="80"/>
-              <w:right w:type="dxa" w:w="120"/>
-            </w:tcMar>
-          </w:tcPr>
-          <w:p>
-            <w:r>
-              <w:rPr>
-                <w:rFonts w:ascii="Arial" w:cs="Arial" w:eastAsia="Arial" w:hAnsi="Arial"/>
-                <w:sz w:val="20"/>
-                <w:szCs w:val="20"/>
-              </w:rPr>
-              <w:t xml:space="preserve">Dual-audience: separate content areas with distinct access controls — client business education and mentor onboarding/training.</w:t>
-            </w:r>
-          </w:p>
-        </w:tc>
-      </w:tr>
-      <w:tr>
-        <w:tc>
-          <w:tcPr>
-            <w:tcW w:type="dxa" w:w="800"/>
-            <w:tcBorders>
-              <w:top w:val="single" w:color="CCCCCC" w:sz="1"/>
-              <w:left w:val="single" w:color="CCCCCC" w:sz="1"/>
-              <w:bottom w:val="single" w:color="CCCCCC" w:sz="1"/>
-              <w:right w:val="single" w:color="CCCCCC" w:sz="1"/>
-            </w:tcBorders>
-            <w:shd w:fill="F2F2F2" w:val="clear"/>
-            <w:tcMar>
-              <w:top w:type="dxa" w:w="80"/>
-              <w:left w:type="dxa" w:w="120"/>
-              <w:bottom w:type="dxa" w:w="80"/>
-              <w:right w:type="dxa" w:w="120"/>
-            </w:tcMar>
-          </w:tcPr>
-          <w:p>
-            <w:r>
-              <w:rPr>
-                <w:rFonts w:ascii="Arial" w:cs="Arial" w:eastAsia="Arial" w:hAnsi="Arial"/>
-                <w:sz w:val="20"/>
-                <w:szCs w:val="20"/>
-              </w:rPr>
-              <w:t xml:space="preserve">D-024</w:t>
-            </w:r>
-          </w:p>
-        </w:tc>
-        <w:tc>
-          <w:tcPr>
-            <w:tcW w:type="dxa" w:w="1600"/>
-            <w:tcBorders>
-              <w:top w:val="single" w:color="CCCCCC" w:sz="1"/>
-              <w:left w:val="single" w:color="CCCCCC" w:sz="1"/>
-              <w:bottom w:val="single" w:color="CCCCCC" w:sz="1"/>
-              <w:right w:val="single" w:color="CCCCCC" w:sz="1"/>
-            </w:tcBorders>
-            <w:shd w:fill="F2F2F2" w:val="clear"/>
-            <w:tcMar>
-              <w:top w:type="dxa" w:w="80"/>
-              <w:left w:type="dxa" w:w="120"/>
-              <w:bottom w:type="dxa" w:w="80"/>
-              <w:right w:type="dxa" w:w="120"/>
-            </w:tcMar>
-          </w:tcPr>
-          <w:p>
-            <w:r>
-              <w:rPr>
-                <w:rFonts w:ascii="Arial" w:cs="Arial" w:eastAsia="Arial" w:hAnsi="Arial"/>
-                <w:sz w:val="20"/>
-                <w:szCs w:val="20"/>
-              </w:rPr>
-              <w:t xml:space="preserve">Mentor Onboarding</w:t>
-            </w:r>
-          </w:p>
-        </w:tc>
-        <w:tc>
-          <w:tcPr>
-            <w:tcW w:type="dxa" w:w="2000"/>
-            <w:tcBorders>
-              <w:top w:val="single" w:color="CCCCCC" w:sz="1"/>
-              <w:left w:val="single" w:color="CCCCCC" w:sz="1"/>
-              <w:bottom w:val="single" w:color="CCCCCC" w:sz="1"/>
-              <w:right w:val="single" w:color="CCCCCC" w:sz="1"/>
-            </w:tcBorders>
-            <w:shd w:fill="F2F2F2" w:val="clear"/>
-            <w:tcMar>
-              <w:top w:type="dxa" w:w="80"/>
-              <w:left w:type="dxa" w:w="120"/>
-              <w:bottom w:type="dxa" w:w="80"/>
-              <w:right w:type="dxa" w:w="120"/>
-            </w:tcMar>
-          </w:tcPr>
-          <w:p>
-            <w:r>
-              <w:rPr>
-                <w:rFonts w:ascii="Arial" w:cs="Arial" w:eastAsia="Arial" w:hAnsi="Arial"/>
-                <w:sz w:val="20"/>
-                <w:szCs w:val="20"/>
-              </w:rPr>
-              <w:t xml:space="preserve">Informal, Moodle curriculum, external tool</w:t>
-            </w:r>
-          </w:p>
-        </w:tc>
-        <w:tc>
-          <w:tcPr>
-            <w:tcW w:type="dxa" w:w="4960"/>
-            <w:tcBorders>
-              <w:top w:val="single" w:color="CCCCCC" w:sz="1"/>
-              <w:left w:val="single" w:color="CCCCCC" w:sz="1"/>
-              <w:bottom w:val="single" w:color="CCCCCC" w:sz="1"/>
-              <w:right w:val="single" w:color="CCCCCC" w:sz="1"/>
-            </w:tcBorders>
-            <w:shd w:fill="F2F2F2" w:val="clear"/>
-            <w:tcMar>
-              <w:top w:type="dxa" w:w="80"/>
-              <w:left w:type="dxa" w:w="120"/>
-              <w:bottom w:type="dxa" w:w="80"/>
-              <w:right w:type="dxa" w:w="120"/>
-            </w:tcMar>
-          </w:tcPr>
-          <w:p>
-            <w:r>
-              <w:rPr>
-                <w:rFonts w:ascii="Arial" w:cs="Arial" w:eastAsia="Arial" w:hAnsi="Arial"/>
-                <w:sz w:val="20"/>
-                <w:szCs w:val="20"/>
-              </w:rPr>
-              <w:t xml:space="preserve">Structured Moodle curriculum required before EspoCRM activation. Includes ethics checkbox sign-off. Completion triggers admin notification.</w:t>
-            </w:r>
-          </w:p>
-        </w:tc>
-      </w:tr>
-      <w:tr>
-        <w:tc>
-          <w:tcPr>
-            <w:tcW w:type="dxa" w:w="800"/>
-            <w:tcBorders>
-              <w:top w:val="single" w:color="CCCCCC" w:sz="1"/>
-              <w:left w:val="single" w:color="CCCCCC" w:sz="1"/>
-              <w:bottom w:val="single" w:color="CCCCCC" w:sz="1"/>
-              <w:right w:val="single" w:color="CCCCCC" w:sz="1"/>
-            </w:tcBorders>
-            <w:shd w:fill="FFFFFF" w:val="clear"/>
-            <w:tcMar>
-              <w:top w:type="dxa" w:w="80"/>
-              <w:left w:type="dxa" w:w="120"/>
-              <w:bottom w:type="dxa" w:w="80"/>
-              <w:right w:type="dxa" w:w="120"/>
-            </w:tcMar>
-          </w:tcPr>
-          <w:p>
-            <w:r>
-              <w:rPr>
-                <w:rFonts w:ascii="Arial" w:cs="Arial" w:eastAsia="Arial" w:hAnsi="Arial"/>
-                <w:sz w:val="20"/>
-                <w:szCs w:val="20"/>
-              </w:rPr>
-              <w:t xml:space="preserve">D-025</w:t>
-            </w:r>
-          </w:p>
-        </w:tc>
-        <w:tc>
-          <w:tcPr>
-            <w:tcW w:type="dxa" w:w="1600"/>
-            <w:tcBorders>
-              <w:top w:val="single" w:color="CCCCCC" w:sz="1"/>
-              <w:left w:val="single" w:color="CCCCCC" w:sz="1"/>
-              <w:bottom w:val="single" w:color="CCCCCC" w:sz="1"/>
-              <w:right w:val="single" w:color="CCCCCC" w:sz="1"/>
-            </w:tcBorders>
-            <w:shd w:fill="FFFFFF" w:val="clear"/>
-            <w:tcMar>
-              <w:top w:type="dxa" w:w="80"/>
-              <w:left w:type="dxa" w:w="120"/>
-              <w:bottom w:type="dxa" w:w="80"/>
-              <w:right w:type="dxa" w:w="120"/>
-            </w:tcMar>
-          </w:tcPr>
-          <w:p>
-            <w:r>
-              <w:rPr>
-                <w:rFonts w:ascii="Arial" w:cs="Arial" w:eastAsia="Arial" w:hAnsi="Arial"/>
-                <w:sz w:val="20"/>
-                <w:szCs w:val="20"/>
-              </w:rPr>
-              <w:t xml:space="preserve">Ethics Sign-Off</w:t>
-            </w:r>
-          </w:p>
-        </w:tc>
-        <w:tc>
-          <w:tcPr>
-            <w:tcW w:type="dxa" w:w="2000"/>
-            <w:tcBorders>
-              <w:top w:val="single" w:color="CCCCCC" w:sz="1"/>
-              <w:left w:val="single" w:color="CCCCCC" w:sz="1"/>
-              <w:bottom w:val="single" w:color="CCCCCC" w:sz="1"/>
-              <w:right w:val="single" w:color="CCCCCC" w:sz="1"/>
-            </w:tcBorders>
-            <w:shd w:fill="FFFFFF" w:val="clear"/>
-            <w:tcMar>
-              <w:top w:type="dxa" w:w="80"/>
-              <w:left w:type="dxa" w:w="120"/>
-              <w:bottom w:type="dxa" w:w="80"/>
-              <w:right w:type="dxa" w:w="120"/>
-            </w:tcMar>
-          </w:tcPr>
-          <w:p>
-            <w:r>
-              <w:rPr>
-                <w:rFonts w:ascii="Arial" w:cs="Arial" w:eastAsia="Arial" w:hAnsi="Arial"/>
-                <w:sz w:val="20"/>
-                <w:szCs w:val="20"/>
-              </w:rPr>
-              <w:t xml:space="preserve">Checkbox Moodle, digital signature, PDF</w:t>
-            </w:r>
-          </w:p>
-        </w:tc>
-        <w:tc>
-          <w:tcPr>
-            <w:tcW w:type="dxa" w:w="4960"/>
-            <w:tcBorders>
-              <w:top w:val="single" w:color="CCCCCC" w:sz="1"/>
-              <w:left w:val="single" w:color="CCCCCC" w:sz="1"/>
-              <w:bottom w:val="single" w:color="CCCCCC" w:sz="1"/>
-              <w:right w:val="single" w:color="CCCCCC" w:sz="1"/>
-            </w:tcBorders>
-            <w:shd w:fill="FFFFFF" w:val="clear"/>
-            <w:tcMar>
-              <w:top w:type="dxa" w:w="80"/>
-              <w:left w:type="dxa" w:w="120"/>
-              <w:bottom w:type="dxa" w:w="80"/>
-              <w:right w:type="dxa" w:w="120"/>
-            </w:tcMar>
-          </w:tcPr>
-          <w:p>
-            <w:r>
-              <w:rPr>
-                <w:rFonts w:ascii="Arial" w:cs="Arial" w:eastAsia="Arial" w:hAnsi="Arial"/>
-                <w:sz w:val="20"/>
-                <w:szCs w:val="20"/>
-              </w:rPr>
-              <w:t xml:space="preserve">Checkbox acknowledgment in Moodle SELECTED. Timestamped completion record sufficient. No external e-signature tool required.</w:t>
-            </w:r>
-          </w:p>
-        </w:tc>
-      </w:tr>
-      <w:tr>
-        <w:tc>
-          <w:tcPr>
-            <w:tcW w:type="dxa" w:w="800"/>
-            <w:tcBorders>
-              <w:top w:val="single" w:color="CCCCCC" w:sz="1"/>
-              <w:left w:val="single" w:color="CCCCCC" w:sz="1"/>
-              <w:bottom w:val="single" w:color="CCCCCC" w:sz="1"/>
-              <w:right w:val="single" w:color="CCCCCC" w:sz="1"/>
-            </w:tcBorders>
-            <w:shd w:fill="F2F2F2" w:val="clear"/>
-            <w:tcMar>
-              <w:top w:type="dxa" w:w="80"/>
-              <w:left w:type="dxa" w:w="120"/>
-              <w:bottom w:type="dxa" w:w="80"/>
-              <w:right w:type="dxa" w:w="120"/>
-            </w:tcMar>
-          </w:tcPr>
-          <w:p>
-            <w:r>
-              <w:rPr>
-                <w:rFonts w:ascii="Arial" w:cs="Arial" w:eastAsia="Arial" w:hAnsi="Arial"/>
-                <w:sz w:val="20"/>
-                <w:szCs w:val="20"/>
-              </w:rPr>
-              <w:t xml:space="preserve">D-026</w:t>
-            </w:r>
-          </w:p>
-        </w:tc>
-        <w:tc>
-          <w:tcPr>
-            <w:tcW w:type="dxa" w:w="1600"/>
-            <w:tcBorders>
-              <w:top w:val="single" w:color="CCCCCC" w:sz="1"/>
-              <w:left w:val="single" w:color="CCCCCC" w:sz="1"/>
-              <w:bottom w:val="single" w:color="CCCCCC" w:sz="1"/>
-              <w:right w:val="single" w:color="CCCCCC" w:sz="1"/>
-            </w:tcBorders>
-            <w:shd w:fill="F2F2F2" w:val="clear"/>
-            <w:tcMar>
-              <w:top w:type="dxa" w:w="80"/>
-              <w:left w:type="dxa" w:w="120"/>
-              <w:bottom w:type="dxa" w:w="80"/>
-              <w:right w:type="dxa" w:w="120"/>
-            </w:tcMar>
-          </w:tcPr>
-          <w:p>
-            <w:r>
-              <w:rPr>
-                <w:rFonts w:ascii="Arial" w:cs="Arial" w:eastAsia="Arial" w:hAnsi="Arial"/>
-                <w:sz w:val="20"/>
-                <w:szCs w:val="20"/>
-              </w:rPr>
-              <w:t xml:space="preserve">Bulk Email (DEFERRED)</w:t>
-            </w:r>
-          </w:p>
-        </w:tc>
-        <w:tc>
-          <w:tcPr>
-            <w:tcW w:type="dxa" w:w="2000"/>
-            <w:tcBorders>
-              <w:top w:val="single" w:color="CCCCCC" w:sz="1"/>
-              <w:left w:val="single" w:color="CCCCCC" w:sz="1"/>
-              <w:bottom w:val="single" w:color="CCCCCC" w:sz="1"/>
-              <w:right w:val="single" w:color="CCCCCC" w:sz="1"/>
-            </w:tcBorders>
-            <w:shd w:fill="F2F2F2" w:val="clear"/>
-            <w:tcMar>
-              <w:top w:type="dxa" w:w="80"/>
-              <w:left w:type="dxa" w:w="120"/>
-              <w:bottom w:type="dxa" w:w="80"/>
-              <w:right w:type="dxa" w:w="120"/>
-            </w:tcMar>
-          </w:tcPr>
-          <w:p>
-            <w:r>
-              <w:rPr>
-                <w:rFonts w:ascii="Arial" w:cs="Arial" w:eastAsia="Arial" w:hAnsi="Arial"/>
-                <w:sz w:val="20"/>
-                <w:szCs w:val="20"/>
-              </w:rPr>
-              <w:t xml:space="preserve">EspoCRM native, Mautic, Mailchimp</w:t>
-            </w:r>
-          </w:p>
-        </w:tc>
-        <w:tc>
-          <w:tcPr>
-            <w:tcW w:type="dxa" w:w="4960"/>
-            <w:tcBorders>
-              <w:top w:val="single" w:color="CCCCCC" w:sz="1"/>
-              <w:left w:val="single" w:color="CCCCCC" w:sz="1"/>
-              <w:bottom w:val="single" w:color="CCCCCC" w:sz="1"/>
-              <w:right w:val="single" w:color="CCCCCC" w:sz="1"/>
-            </w:tcBorders>
-            <w:shd w:fill="F2F2F2" w:val="clear"/>
-            <w:tcMar>
-              <w:top w:type="dxa" w:w="80"/>
-              <w:left w:type="dxa" w:w="120"/>
-              <w:bottom w:type="dxa" w:w="80"/>
-              <w:right w:type="dxa" w:w="120"/>
-            </w:tcMar>
-          </w:tcPr>
-          <w:p>
-            <w:r>
-              <w:rPr>
-                <w:rFonts w:ascii="Arial" w:cs="Arial" w:eastAsia="Arial" w:hAnsi="Arial"/>
-                <w:sz w:val="20"/>
-                <w:szCs w:val="20"/>
-              </w:rPr>
-              <w:t xml:space="preserve">DEFERRED. Evaluate EspoCRM native mass email first. Mautic (FOSS, self-hosted) designated upgrade path.</w:t>
-            </w:r>
-          </w:p>
-        </w:tc>
-      </w:tr>
-      <w:tr>
-        <w:tc>
-          <w:tcPr>
-            <w:tcW w:type="dxa" w:w="800"/>
-            <w:tcBorders>
-              <w:top w:val="single" w:color="CCCCCC" w:sz="1"/>
-              <w:left w:val="single" w:color="CCCCCC" w:sz="1"/>
-              <w:bottom w:val="single" w:color="CCCCCC" w:sz="1"/>
-              <w:right w:val="single" w:color="CCCCCC" w:sz="1"/>
-            </w:tcBorders>
-            <w:shd w:fill="FFFFFF" w:val="clear"/>
-            <w:tcMar>
-              <w:top w:type="dxa" w:w="80"/>
-              <w:left w:type="dxa" w:w="120"/>
-              <w:bottom w:type="dxa" w:w="80"/>
-              <w:right w:type="dxa" w:w="120"/>
-            </w:tcMar>
-          </w:tcPr>
-          <w:p>
-            <w:r>
-              <w:rPr>
-                <w:rFonts w:ascii="Arial" w:cs="Arial" w:eastAsia="Arial" w:hAnsi="Arial"/>
-                <w:sz w:val="20"/>
-                <w:szCs w:val="20"/>
-              </w:rPr>
-              <w:t xml:space="preserve">D-027</w:t>
-            </w:r>
-          </w:p>
-        </w:tc>
-        <w:tc>
-          <w:tcPr>
-            <w:tcW w:type="dxa" w:w="1600"/>
-            <w:tcBorders>
-              <w:top w:val="single" w:color="CCCCCC" w:sz="1"/>
-              <w:left w:val="single" w:color="CCCCCC" w:sz="1"/>
-              <w:bottom w:val="single" w:color="CCCCCC" w:sz="1"/>
-              <w:right w:val="single" w:color="CCCCCC" w:sz="1"/>
-            </w:tcBorders>
-            <w:shd w:fill="FFFFFF" w:val="clear"/>
-            <w:tcMar>
-              <w:top w:type="dxa" w:w="80"/>
-              <w:left w:type="dxa" w:w="120"/>
-              <w:bottom w:type="dxa" w:w="80"/>
-              <w:right w:type="dxa" w:w="120"/>
-            </w:tcMar>
-          </w:tcPr>
-          <w:p>
-            <w:r>
-              <w:rPr>
-                <w:rFonts w:ascii="Arial" w:cs="Arial" w:eastAsia="Arial" w:hAnsi="Arial"/>
-                <w:sz w:val="20"/>
-                <w:szCs w:val="20"/>
-              </w:rPr>
-              <w:t xml:space="preserve">Dues Collection</w:t>
-            </w:r>
-          </w:p>
-        </w:tc>
-        <w:tc>
-          <w:tcPr>
-            <w:tcW w:type="dxa" w:w="2000"/>
-            <w:tcBorders>
-              <w:top w:val="single" w:color="CCCCCC" w:sz="1"/>
-              <w:left w:val="single" w:color="CCCCCC" w:sz="1"/>
-              <w:bottom w:val="single" w:color="CCCCCC" w:sz="1"/>
-              <w:right w:val="single" w:color="CCCCCC" w:sz="1"/>
-            </w:tcBorders>
-            <w:shd w:fill="FFFFFF" w:val="clear"/>
-            <w:tcMar>
-              <w:top w:type="dxa" w:w="80"/>
-              <w:left w:type="dxa" w:w="120"/>
-              <w:bottom w:type="dxa" w:w="80"/>
-              <w:right w:type="dxa" w:w="120"/>
-            </w:tcMar>
-          </w:tcPr>
-          <w:p>
-            <w:r>
-              <w:rPr>
-                <w:rFonts w:ascii="Arial" w:cs="Arial" w:eastAsia="Arial" w:hAnsi="Arial"/>
-                <w:sz w:val="20"/>
-                <w:szCs w:val="20"/>
-              </w:rPr>
-              <w:t xml:space="preserve">Stripe, PayPal, check only, Square</w:t>
-            </w:r>
-          </w:p>
-        </w:tc>
-        <w:tc>
-          <w:tcPr>
-            <w:tcW w:type="dxa" w:w="4960"/>
-            <w:tcBorders>
-              <w:top w:val="single" w:color="CCCCCC" w:sz="1"/>
-              <w:left w:val="single" w:color="CCCCCC" w:sz="1"/>
-              <w:bottom w:val="single" w:color="CCCCCC" w:sz="1"/>
-              <w:right w:val="single" w:color="CCCCCC" w:sz="1"/>
-            </w:tcBorders>
-            <w:shd w:fill="FFFFFF" w:val="clear"/>
-            <w:tcMar>
-              <w:top w:type="dxa" w:w="80"/>
-              <w:left w:type="dxa" w:w="120"/>
-              <w:bottom w:type="dxa" w:w="80"/>
-              <w:right w:type="dxa" w:w="120"/>
-            </w:tcMar>
-          </w:tcPr>
-          <w:p>
-            <w:r>
-              <w:rPr>
-                <w:rFonts w:ascii="Arial" w:cs="Arial" w:eastAsia="Arial" w:hAnsi="Arial"/>
-                <w:sz w:val="20"/>
-                <w:szCs w:val="20"/>
-              </w:rPr>
-              <w:t xml:space="preserve">Stripe (online) + manual EspoCRM entry (check/cash) SELECTED. Annual payment. Note: dues not eligible for Stripe nonprofit donation rate — standard rate applies.</w:t>
-            </w:r>
-          </w:p>
-        </w:tc>
-      </w:tr>
-      <w:tr>
-        <w:tc>
-          <w:tcPr>
-            <w:tcW w:type="dxa" w:w="800"/>
-            <w:tcBorders>
-              <w:top w:val="single" w:color="CCCCCC" w:sz="1"/>
-              <w:left w:val="single" w:color="CCCCCC" w:sz="1"/>
-              <w:bottom w:val="single" w:color="CCCCCC" w:sz="1"/>
-              <w:right w:val="single" w:color="CCCCCC" w:sz="1"/>
-            </w:tcBorders>
-            <w:shd w:fill="F2F2F2" w:val="clear"/>
-            <w:tcMar>
-              <w:top w:type="dxa" w:w="80"/>
-              <w:left w:type="dxa" w:w="120"/>
-              <w:bottom w:type="dxa" w:w="80"/>
-              <w:right w:type="dxa" w:w="120"/>
-            </w:tcMar>
-          </w:tcPr>
-          <w:p>
-            <w:r>
-              <w:rPr>
-                <w:rFonts w:ascii="Arial" w:cs="Arial" w:eastAsia="Arial" w:hAnsi="Arial"/>
-                <w:sz w:val="20"/>
-                <w:szCs w:val="20"/>
-              </w:rPr>
-              <w:t xml:space="preserve">D-028</w:t>
-            </w:r>
-          </w:p>
-        </w:tc>
-        <w:tc>
-          <w:tcPr>
-            <w:tcW w:type="dxa" w:w="1600"/>
-            <w:tcBorders>
-              <w:top w:val="single" w:color="CCCCCC" w:sz="1"/>
-              <w:left w:val="single" w:color="CCCCCC" w:sz="1"/>
-              <w:bottom w:val="single" w:color="CCCCCC" w:sz="1"/>
-              <w:right w:val="single" w:color="CCCCCC" w:sz="1"/>
-            </w:tcBorders>
-            <w:shd w:fill="F2F2F2" w:val="clear"/>
-            <w:tcMar>
-              <w:top w:type="dxa" w:w="80"/>
-              <w:left w:type="dxa" w:w="120"/>
-              <w:bottom w:type="dxa" w:w="80"/>
-              <w:right w:type="dxa" w:w="120"/>
-            </w:tcMar>
-          </w:tcPr>
-          <w:p>
-            <w:r>
-              <w:rPr>
-                <w:rFonts w:ascii="Arial" w:cs="Arial" w:eastAsia="Arial" w:hAnsi="Arial"/>
-                <w:sz w:val="20"/>
-                <w:szCs w:val="20"/>
-              </w:rPr>
-              <w:t xml:space="preserve">Volunteer KPIs</w:t>
-            </w:r>
-          </w:p>
-        </w:tc>
-        <w:tc>
-          <w:tcPr>
-            <w:tcW w:type="dxa" w:w="2000"/>
-            <w:tcBorders>
-              <w:top w:val="single" w:color="CCCCCC" w:sz="1"/>
-              <w:left w:val="single" w:color="CCCCCC" w:sz="1"/>
-              <w:bottom w:val="single" w:color="CCCCCC" w:sz="1"/>
-              <w:right w:val="single" w:color="CCCCCC" w:sz="1"/>
-            </w:tcBorders>
-            <w:shd w:fill="F2F2F2" w:val="clear"/>
-            <w:tcMar>
-              <w:top w:type="dxa" w:w="80"/>
-              <w:left w:type="dxa" w:w="120"/>
-              <w:bottom w:type="dxa" w:w="80"/>
-              <w:right w:type="dxa" w:w="120"/>
-            </w:tcMar>
-          </w:tcPr>
-          <w:p>
-            <w:r>
-              <w:rPr>
-                <w:rFonts w:ascii="Arial" w:cs="Arial" w:eastAsia="Arial" w:hAnsi="Arial"/>
-                <w:sz w:val="20"/>
-                <w:szCs w:val="20"/>
-              </w:rPr>
-              <w:t xml:space="preserve">Manual tracking, EspoCRM native, external tool</w:t>
-            </w:r>
-          </w:p>
-        </w:tc>
-        <w:tc>
-          <w:tcPr>
-            <w:tcW w:type="dxa" w:w="4960"/>
-            <w:tcBorders>
-              <w:top w:val="single" w:color="CCCCCC" w:sz="1"/>
-              <w:left w:val="single" w:color="CCCCCC" w:sz="1"/>
-              <w:bottom w:val="single" w:color="CCCCCC" w:sz="1"/>
-              <w:right w:val="single" w:color="CCCCCC" w:sz="1"/>
-            </w:tcBorders>
-            <w:shd w:fill="F2F2F2" w:val="clear"/>
-            <w:tcMar>
-              <w:top w:type="dxa" w:w="80"/>
-              <w:left w:type="dxa" w:w="120"/>
-              <w:bottom w:type="dxa" w:w="80"/>
-              <w:right w:type="dxa" w:w="120"/>
-            </w:tcMar>
-          </w:tcPr>
-          <w:p>
-            <w:r>
-              <w:rPr>
-                <w:rFonts w:ascii="Arial" w:cs="Arial" w:eastAsia="Arial" w:hAnsi="Arial"/>
-                <w:sz w:val="20"/>
-                <w:szCs w:val="20"/>
-              </w:rPr>
-              <w:t xml:space="preserve">EspoCRM native tracking SELECTED. Activity, outcome, tenure, and recognition trigger metrics. Dual purpose: internal recognition and funder/grant reporting.</w:t>
-            </w:r>
-          </w:p>
-        </w:tc>
-      </w:tr>
-      <w:tr>
-        <w:tc>
-          <w:tcPr>
-            <w:tcW w:type="dxa" w:w="800"/>
-            <w:tcBorders>
-              <w:top w:val="single" w:color="CCCCCC" w:sz="1"/>
-              <w:left w:val="single" w:color="CCCCCC" w:sz="1"/>
-              <w:bottom w:val="single" w:color="CCCCCC" w:sz="1"/>
-              <w:right w:val="single" w:color="CCCCCC" w:sz="1"/>
-            </w:tcBorders>
-            <w:shd w:fill="FFFFFF" w:val="clear"/>
-            <w:tcMar>
-              <w:top w:type="dxa" w:w="80"/>
-              <w:left w:type="dxa" w:w="120"/>
-              <w:bottom w:type="dxa" w:w="80"/>
-              <w:right w:type="dxa" w:w="120"/>
-            </w:tcMar>
-          </w:tcPr>
-          <w:p>
-            <w:r>
-              <w:rPr>
-                <w:rFonts w:ascii="Arial" w:cs="Arial" w:eastAsia="Arial" w:hAnsi="Arial"/>
-                <w:sz w:val="20"/>
-                <w:szCs w:val="20"/>
-              </w:rPr>
-              <w:t xml:space="preserve">D-029</w:t>
-            </w:r>
-          </w:p>
-        </w:tc>
-        <w:tc>
-          <w:tcPr>
-            <w:tcW w:type="dxa" w:w="1600"/>
-            <w:tcBorders>
-              <w:top w:val="single" w:color="CCCCCC" w:sz="1"/>
-              <w:left w:val="single" w:color="CCCCCC" w:sz="1"/>
-              <w:bottom w:val="single" w:color="CCCCCC" w:sz="1"/>
-              <w:right w:val="single" w:color="CCCCCC" w:sz="1"/>
-            </w:tcBorders>
-            <w:shd w:fill="FFFFFF" w:val="clear"/>
-            <w:tcMar>
-              <w:top w:type="dxa" w:w="80"/>
-              <w:left w:type="dxa" w:w="120"/>
-              <w:bottom w:type="dxa" w:w="80"/>
-              <w:right w:type="dxa" w:w="120"/>
-            </w:tcMar>
-          </w:tcPr>
-          <w:p>
-            <w:r>
-              <w:rPr>
-                <w:rFonts w:ascii="Arial" w:cs="Arial" w:eastAsia="Arial" w:hAnsi="Arial"/>
-                <w:sz w:val="20"/>
-                <w:szCs w:val="20"/>
-              </w:rPr>
-              <w:t xml:space="preserve">Background Checks</w:t>
-            </w:r>
-          </w:p>
-        </w:tc>
-        <w:tc>
-          <w:tcPr>
-            <w:tcW w:type="dxa" w:w="2000"/>
-            <w:tcBorders>
-              <w:top w:val="single" w:color="CCCCCC" w:sz="1"/>
-              <w:left w:val="single" w:color="CCCCCC" w:sz="1"/>
-              <w:bottom w:val="single" w:color="CCCCCC" w:sz="1"/>
-              <w:right w:val="single" w:color="CCCCCC" w:sz="1"/>
-            </w:tcBorders>
-            <w:shd w:fill="FFFFFF" w:val="clear"/>
-            <w:tcMar>
-              <w:top w:type="dxa" w:w="80"/>
-              <w:left w:type="dxa" w:w="120"/>
-              <w:bottom w:type="dxa" w:w="80"/>
-              <w:right w:type="dxa" w:w="120"/>
-            </w:tcMar>
-          </w:tcPr>
-          <w:p>
-            <w:r>
-              <w:rPr>
-                <w:rFonts w:ascii="Arial" w:cs="Arial" w:eastAsia="Arial" w:hAnsi="Arial"/>
-                <w:sz w:val="20"/>
-                <w:szCs w:val="20"/>
-              </w:rPr>
-              <w:t xml:space="preserve">Required, not required</w:t>
-            </w:r>
-          </w:p>
-        </w:tc>
-        <w:tc>
-          <w:tcPr>
-            <w:tcW w:type="dxa" w:w="4960"/>
-            <w:tcBorders>
-              <w:top w:val="single" w:color="CCCCCC" w:sz="1"/>
-              <w:left w:val="single" w:color="CCCCCC" w:sz="1"/>
-              <w:bottom w:val="single" w:color="CCCCCC" w:sz="1"/>
-              <w:right w:val="single" w:color="CCCCCC" w:sz="1"/>
-            </w:tcBorders>
-            <w:shd w:fill="FFFFFF" w:val="clear"/>
-            <w:tcMar>
-              <w:top w:type="dxa" w:w="80"/>
-              <w:left w:type="dxa" w:w="120"/>
-              <w:bottom w:type="dxa" w:w="80"/>
-              <w:right w:type="dxa" w:w="120"/>
-            </w:tcMar>
-          </w:tcPr>
-          <w:p>
-            <w:r>
-              <w:rPr>
-                <w:rFonts w:ascii="Arial" w:cs="Arial" w:eastAsia="Arial" w:hAnsi="Arial"/>
-                <w:sz w:val="20"/>
-                <w:szCs w:val="20"/>
-              </w:rPr>
-              <w:t xml:space="preserve">Not required. No background check process needed.</w:t>
-            </w:r>
-          </w:p>
-        </w:tc>
-      </w:tr>
-      <w:tr>
-        <w:tc>
-          <w:tcPr>
-            <w:tcW w:type="dxa" w:w="800"/>
-            <w:tcBorders>
-              <w:top w:val="single" w:color="CCCCCC" w:sz="1"/>
-              <w:left w:val="single" w:color="CCCCCC" w:sz="1"/>
-              <w:bottom w:val="single" w:color="CCCCCC" w:sz="1"/>
-              <w:right w:val="single" w:color="CCCCCC" w:sz="1"/>
-            </w:tcBorders>
-            <w:shd w:fill="F2F2F2" w:val="clear"/>
-            <w:tcMar>
-              <w:top w:type="dxa" w:w="80"/>
-              <w:left w:type="dxa" w:w="120"/>
-              <w:bottom w:type="dxa" w:w="80"/>
-              <w:right w:type="dxa" w:w="120"/>
-            </w:tcMar>
-          </w:tcPr>
-          <w:p>
-            <w:r>
-              <w:rPr>
-                <w:rFonts w:ascii="Arial" w:cs="Arial" w:eastAsia="Arial" w:hAnsi="Arial"/>
-                <w:sz w:val="20"/>
-                <w:szCs w:val="20"/>
-              </w:rPr>
-              <w:t xml:space="preserve">D-030</w:t>
-            </w:r>
-          </w:p>
-        </w:tc>
-        <w:tc>
-          <w:tcPr>
-            <w:tcW w:type="dxa" w:w="1600"/>
-            <w:tcBorders>
-              <w:top w:val="single" w:color="CCCCCC" w:sz="1"/>
-              <w:left w:val="single" w:color="CCCCCC" w:sz="1"/>
-              <w:bottom w:val="single" w:color="CCCCCC" w:sz="1"/>
-              <w:right w:val="single" w:color="CCCCCC" w:sz="1"/>
-            </w:tcBorders>
-            <w:shd w:fill="F2F2F2" w:val="clear"/>
-            <w:tcMar>
-              <w:top w:type="dxa" w:w="80"/>
-              <w:left w:type="dxa" w:w="120"/>
-              <w:bottom w:type="dxa" w:w="80"/>
-              <w:right w:type="dxa" w:w="120"/>
-            </w:tcMar>
-          </w:tcPr>
-          <w:p>
-            <w:r>
-              <w:rPr>
-                <w:rFonts w:ascii="Arial" w:cs="Arial" w:eastAsia="Arial" w:hAnsi="Arial"/>
-                <w:sz w:val="20"/>
-                <w:szCs w:val="20"/>
-              </w:rPr>
-              <w:t xml:space="preserve">Donor Management</w:t>
-            </w:r>
-          </w:p>
-        </w:tc>
-        <w:tc>
-          <w:tcPr>
-            <w:tcW w:type="dxa" w:w="2000"/>
-            <w:tcBorders>
-              <w:top w:val="single" w:color="CCCCCC" w:sz="1"/>
-              <w:left w:val="single" w:color="CCCCCC" w:sz="1"/>
-              <w:bottom w:val="single" w:color="CCCCCC" w:sz="1"/>
-              <w:right w:val="single" w:color="CCCCCC" w:sz="1"/>
-            </w:tcBorders>
-            <w:shd w:fill="F2F2F2" w:val="clear"/>
-            <w:tcMar>
-              <w:top w:type="dxa" w:w="80"/>
-              <w:left w:type="dxa" w:w="120"/>
-              <w:bottom w:type="dxa" w:w="80"/>
-              <w:right w:type="dxa" w:w="120"/>
-            </w:tcMar>
-          </w:tcPr>
-          <w:p>
-            <w:r>
-              <w:rPr>
-                <w:rFonts w:ascii="Arial" w:cs="Arial" w:eastAsia="Arial" w:hAnsi="Arial"/>
-                <w:sz w:val="20"/>
-                <w:szCs w:val="20"/>
-              </w:rPr>
-              <w:t xml:space="preserve">EspoCRM native, CiviCRM, Salesforce NPSP, Bloomerang</w:t>
-            </w:r>
-          </w:p>
-        </w:tc>
-        <w:tc>
-          <w:tcPr>
-            <w:tcW w:type="dxa" w:w="4960"/>
-            <w:tcBorders>
-              <w:top w:val="single" w:color="CCCCCC" w:sz="1"/>
-              <w:left w:val="single" w:color="CCCCCC" w:sz="1"/>
-              <w:bottom w:val="single" w:color="CCCCCC" w:sz="1"/>
-              <w:right w:val="single" w:color="CCCCCC" w:sz="1"/>
-            </w:tcBorders>
-            <w:shd w:fill="F2F2F2" w:val="clear"/>
-            <w:tcMar>
-              <w:top w:type="dxa" w:w="80"/>
-              <w:left w:type="dxa" w:w="120"/>
-              <w:bottom w:type="dxa" w:w="80"/>
-              <w:right w:type="dxa" w:w="120"/>
-            </w:tcMar>
-          </w:tcPr>
-          <w:p>
-            <w:r>
-              <w:rPr>
-                <w:rFonts w:ascii="Arial" w:cs="Arial" w:eastAsia="Arial" w:hAnsi="Arial"/>
-                <w:sz w:val="20"/>
-                <w:szCs w:val="20"/>
-              </w:rPr>
-              <w:t xml:space="preserve">EspoCRM native SELECTED for Year 1. Simple fundraising needs met natively. Revisit if donor base grows or grant portfolio becomes complex.</w:t>
-            </w:r>
-          </w:p>
-        </w:tc>
-      </w:tr>
-      <w:tr>
-        <w:tc>
-          <w:tcPr>
-            <w:tcW w:type="dxa" w:w="800"/>
-            <w:tcBorders>
-              <w:top w:val="single" w:color="CCCCCC" w:sz="1"/>
-              <w:left w:val="single" w:color="CCCCCC" w:sz="1"/>
-              <w:bottom w:val="single" w:color="CCCCCC" w:sz="1"/>
-              <w:right w:val="single" w:color="CCCCCC" w:sz="1"/>
-            </w:tcBorders>
-            <w:shd w:fill="FFFFFF" w:val="clear"/>
-            <w:tcMar>
-              <w:top w:type="dxa" w:w="80"/>
-              <w:left w:type="dxa" w:w="120"/>
-              <w:bottom w:type="dxa" w:w="80"/>
-              <w:right w:type="dxa" w:w="120"/>
-            </w:tcMar>
-          </w:tcPr>
-          <w:p>
-            <w:r>
-              <w:rPr>
-                <w:rFonts w:ascii="Arial" w:cs="Arial" w:eastAsia="Arial" w:hAnsi="Arial"/>
-                <w:sz w:val="20"/>
-                <w:szCs w:val="20"/>
-              </w:rPr>
-              <w:t xml:space="preserve">D-031</w:t>
-            </w:r>
-          </w:p>
-        </w:tc>
-        <w:tc>
-          <w:tcPr>
-            <w:tcW w:type="dxa" w:w="1600"/>
-            <w:tcBorders>
-              <w:top w:val="single" w:color="CCCCCC" w:sz="1"/>
-              <w:left w:val="single" w:color="CCCCCC" w:sz="1"/>
-              <w:bottom w:val="single" w:color="CCCCCC" w:sz="1"/>
-              <w:right w:val="single" w:color="CCCCCC" w:sz="1"/>
-            </w:tcBorders>
-            <w:shd w:fill="FFFFFF" w:val="clear"/>
-            <w:tcMar>
-              <w:top w:type="dxa" w:w="80"/>
-              <w:left w:type="dxa" w:w="120"/>
-              <w:bottom w:type="dxa" w:w="80"/>
-              <w:right w:type="dxa" w:w="120"/>
-            </w:tcMar>
-          </w:tcPr>
-          <w:p>
-            <w:r>
-              <w:rPr>
-                <w:rFonts w:ascii="Arial" w:cs="Arial" w:eastAsia="Arial" w:hAnsi="Arial"/>
-                <w:sz w:val="20"/>
-                <w:szCs w:val="20"/>
-              </w:rPr>
-              <w:t xml:space="preserve">Online Donations (Phase 2)</w:t>
-            </w:r>
-          </w:p>
-        </w:tc>
-        <w:tc>
-          <w:tcPr>
-            <w:tcW w:type="dxa" w:w="2000"/>
-            <w:tcBorders>
-              <w:top w:val="single" w:color="CCCCCC" w:sz="1"/>
-              <w:left w:val="single" w:color="CCCCCC" w:sz="1"/>
-              <w:bottom w:val="single" w:color="CCCCCC" w:sz="1"/>
-              <w:right w:val="single" w:color="CCCCCC" w:sz="1"/>
-            </w:tcBorders>
-            <w:shd w:fill="FFFFFF" w:val="clear"/>
-            <w:tcMar>
-              <w:top w:type="dxa" w:w="80"/>
-              <w:left w:type="dxa" w:w="120"/>
-              <w:bottom w:type="dxa" w:w="80"/>
-              <w:right w:type="dxa" w:w="120"/>
-            </w:tcMar>
-          </w:tcPr>
-          <w:p>
-            <w:r>
-              <w:rPr>
-                <w:rFonts w:ascii="Arial" w:cs="Arial" w:eastAsia="Arial" w:hAnsi="Arial"/>
-                <w:sz w:val="20"/>
-                <w:szCs w:val="20"/>
-              </w:rPr>
-              <w:t xml:space="preserve">Stripe, PayPal, Zeffy</w:t>
-            </w:r>
-          </w:p>
-        </w:tc>
-        <w:tc>
-          <w:tcPr>
-            <w:tcW w:type="dxa" w:w="4960"/>
-            <w:tcBorders>
-              <w:top w:val="single" w:color="CCCCCC" w:sz="1"/>
-              <w:left w:val="single" w:color="CCCCCC" w:sz="1"/>
-              <w:bottom w:val="single" w:color="CCCCCC" w:sz="1"/>
-              <w:right w:val="single" w:color="CCCCCC" w:sz="1"/>
-            </w:tcBorders>
-            <w:shd w:fill="FFFFFF" w:val="clear"/>
-            <w:tcMar>
-              <w:top w:type="dxa" w:w="80"/>
-              <w:left w:type="dxa" w:w="120"/>
-              <w:bottom w:type="dxa" w:w="80"/>
-              <w:right w:type="dxa" w:w="120"/>
-            </w:tcMar>
-          </w:tcPr>
-          <w:p>
-            <w:r>
-              <w:rPr>
-                <w:rFonts w:ascii="Arial" w:cs="Arial" w:eastAsia="Arial" w:hAnsi="Arial"/>
-                <w:sz w:val="20"/>
-                <w:szCs w:val="20"/>
-              </w:rPr>
-              <w:t xml:space="preserve">DEFERRED to Phase 2. Stripe designated (nonprofit donation rate 2.2% + $0.30 applies to charitable gifts). Simple form on website.</w:t>
-            </w:r>
-          </w:p>
-        </w:tc>
-      </w:tr>
-      <w:tr>
-        <w:tc>
-          <w:tcPr>
-            <w:tcW w:type="dxa" w:w="800"/>
-            <w:tcBorders>
-              <w:top w:val="single" w:color="CCCCCC" w:sz="1"/>
-              <w:left w:val="single" w:color="CCCCCC" w:sz="1"/>
-              <w:bottom w:val="single" w:color="CCCCCC" w:sz="1"/>
-              <w:right w:val="single" w:color="CCCCCC" w:sz="1"/>
-            </w:tcBorders>
-            <w:shd w:fill="F2F2F2" w:val="clear"/>
-            <w:tcMar>
-              <w:top w:type="dxa" w:w="80"/>
-              <w:left w:type="dxa" w:w="120"/>
-              <w:bottom w:type="dxa" w:w="80"/>
-              <w:right w:type="dxa" w:w="120"/>
-            </w:tcMar>
-          </w:tcPr>
-          <w:p>
-            <w:r>
-              <w:rPr>
-                <w:rFonts w:ascii="Arial" w:cs="Arial" w:eastAsia="Arial" w:hAnsi="Arial"/>
-                <w:sz w:val="20"/>
-                <w:szCs w:val="20"/>
-              </w:rPr>
-              <w:t xml:space="preserve">D-032</w:t>
-            </w:r>
-          </w:p>
-        </w:tc>
-        <w:tc>
-          <w:tcPr>
-            <w:tcW w:type="dxa" w:w="1600"/>
-            <w:tcBorders>
-              <w:top w:val="single" w:color="CCCCCC" w:sz="1"/>
-              <w:left w:val="single" w:color="CCCCCC" w:sz="1"/>
-              <w:bottom w:val="single" w:color="CCCCCC" w:sz="1"/>
-              <w:right w:val="single" w:color="CCCCCC" w:sz="1"/>
-            </w:tcBorders>
-            <w:shd w:fill="F2F2F2" w:val="clear"/>
-            <w:tcMar>
-              <w:top w:type="dxa" w:w="80"/>
-              <w:left w:type="dxa" w:w="120"/>
-              <w:bottom w:type="dxa" w:w="80"/>
-              <w:right w:type="dxa" w:w="120"/>
-            </w:tcMar>
-          </w:tcPr>
-          <w:p>
-            <w:r>
-              <w:rPr>
-                <w:rFonts w:ascii="Arial" w:cs="Arial" w:eastAsia="Arial" w:hAnsi="Arial"/>
-                <w:sz w:val="20"/>
-                <w:szCs w:val="20"/>
-              </w:rPr>
-              <w:t xml:space="preserve">Document Sharing</w:t>
-            </w:r>
-          </w:p>
-        </w:tc>
-        <w:tc>
-          <w:tcPr>
-            <w:tcW w:type="dxa" w:w="2000"/>
-            <w:tcBorders>
-              <w:top w:val="single" w:color="CCCCCC" w:sz="1"/>
-              <w:left w:val="single" w:color="CCCCCC" w:sz="1"/>
-              <w:bottom w:val="single" w:color="CCCCCC" w:sz="1"/>
-              <w:right w:val="single" w:color="CCCCCC" w:sz="1"/>
-            </w:tcBorders>
-            <w:shd w:fill="F2F2F2" w:val="clear"/>
-            <w:tcMar>
-              <w:top w:type="dxa" w:w="80"/>
-              <w:left w:type="dxa" w:w="120"/>
-              <w:bottom w:type="dxa" w:w="80"/>
-              <w:right w:type="dxa" w:w="120"/>
-            </w:tcMar>
-          </w:tcPr>
-          <w:p>
-            <w:r>
-              <w:rPr>
-                <w:rFonts w:ascii="Arial" w:cs="Arial" w:eastAsia="Arial" w:hAnsi="Arial"/>
-                <w:sz w:val="20"/>
-                <w:szCs w:val="20"/>
-              </w:rPr>
-              <w:t xml:space="preserve">Google Drive, Nextcloud, SharePoint, OneDrive</w:t>
-            </w:r>
-          </w:p>
-        </w:tc>
-        <w:tc>
-          <w:tcPr>
-            <w:tcW w:type="dxa" w:w="4960"/>
-            <w:tcBorders>
-              <w:top w:val="single" w:color="CCCCCC" w:sz="1"/>
-              <w:left w:val="single" w:color="CCCCCC" w:sz="1"/>
-              <w:bottom w:val="single" w:color="CCCCCC" w:sz="1"/>
-              <w:right w:val="single" w:color="CCCCCC" w:sz="1"/>
-            </w:tcBorders>
-            <w:shd w:fill="F2F2F2" w:val="clear"/>
-            <w:tcMar>
-              <w:top w:type="dxa" w:w="80"/>
-              <w:left w:type="dxa" w:w="120"/>
-              <w:bottom w:type="dxa" w:w="80"/>
-              <w:right w:type="dxa" w:w="120"/>
-            </w:tcMar>
-          </w:tcPr>
-          <w:p>
-            <w:r>
-              <w:rPr>
-                <w:rFonts w:ascii="Arial" w:cs="Arial" w:eastAsia="Arial" w:hAnsi="Arial"/>
-                <w:sz w:val="20"/>
-                <w:szCs w:val="20"/>
-              </w:rPr>
-              <w:t xml:space="preserve">Google Drive (Google Workspace for Nonprofits) SELECTED. Already in stack, 100TB shared storage, role-based shared drives, zero additional cost.</w:t>
-            </w:r>
-          </w:p>
-        </w:tc>
-      </w:tr>
-      <w:tr>
-        <w:tc>
-          <w:tcPr>
-            <w:tcW w:type="dxa" w:w="800"/>
-            <w:tcBorders>
-              <w:top w:val="single" w:color="CCCCCC" w:sz="1"/>
-              <w:left w:val="single" w:color="CCCCCC" w:sz="1"/>
-              <w:bottom w:val="single" w:color="CCCCCC" w:sz="1"/>
-              <w:right w:val="single" w:color="CCCCCC" w:sz="1"/>
-            </w:tcBorders>
-            <w:shd w:fill="FFFFFF" w:val="clear"/>
-            <w:tcMar>
-              <w:top w:type="dxa" w:w="80"/>
-              <w:left w:type="dxa" w:w="120"/>
-              <w:bottom w:type="dxa" w:w="80"/>
-              <w:right w:type="dxa" w:w="120"/>
-            </w:tcMar>
-          </w:tcPr>
-          <w:p>
-            <w:r>
-              <w:rPr>
-                <w:rFonts w:ascii="Arial" w:cs="Arial" w:eastAsia="Arial" w:hAnsi="Arial"/>
-                <w:sz w:val="20"/>
-                <w:szCs w:val="20"/>
-              </w:rPr>
-              <w:t xml:space="preserve">D-033</w:t>
-            </w:r>
-          </w:p>
-        </w:tc>
-        <w:tc>
-          <w:tcPr>
-            <w:tcW w:type="dxa" w:w="1600"/>
-            <w:tcBorders>
-              <w:top w:val="single" w:color="CCCCCC" w:sz="1"/>
-              <w:left w:val="single" w:color="CCCCCC" w:sz="1"/>
-              <w:bottom w:val="single" w:color="CCCCCC" w:sz="1"/>
-              <w:right w:val="single" w:color="CCCCCC" w:sz="1"/>
-            </w:tcBorders>
-            <w:shd w:fill="FFFFFF" w:val="clear"/>
-            <w:tcMar>
-              <w:top w:type="dxa" w:w="80"/>
-              <w:left w:type="dxa" w:w="120"/>
-              <w:bottom w:type="dxa" w:w="80"/>
-              <w:right w:type="dxa" w:w="120"/>
-            </w:tcMar>
-          </w:tcPr>
-          <w:p>
-            <w:r>
-              <w:rPr>
-                <w:rFonts w:ascii="Arial" w:cs="Arial" w:eastAsia="Arial" w:hAnsi="Arial"/>
-                <w:sz w:val="20"/>
-                <w:szCs w:val="20"/>
-              </w:rPr>
-              <w:t xml:space="preserve">Reporting Tools</w:t>
-            </w:r>
-          </w:p>
-        </w:tc>
-        <w:tc>
-          <w:tcPr>
-            <w:tcW w:type="dxa" w:w="2000"/>
-            <w:tcBorders>
-              <w:top w:val="single" w:color="CCCCCC" w:sz="1"/>
-              <w:left w:val="single" w:color="CCCCCC" w:sz="1"/>
-              <w:bottom w:val="single" w:color="CCCCCC" w:sz="1"/>
-              <w:right w:val="single" w:color="CCCCCC" w:sz="1"/>
-            </w:tcBorders>
-            <w:shd w:fill="FFFFFF" w:val="clear"/>
-            <w:tcMar>
-              <w:top w:type="dxa" w:w="80"/>
-              <w:left w:type="dxa" w:w="120"/>
-              <w:bottom w:type="dxa" w:w="80"/>
-              <w:right w:type="dxa" w:w="120"/>
-            </w:tcMar>
-          </w:tcPr>
-          <w:p>
-            <w:r>
-              <w:rPr>
-                <w:rFonts w:ascii="Arial" w:cs="Arial" w:eastAsia="Arial" w:hAnsi="Arial"/>
-                <w:sz w:val="20"/>
-                <w:szCs w:val="20"/>
-              </w:rPr>
-              <w:t xml:space="preserve">EspoCRM native, Metabase, Google Looker Studio, Tableau</w:t>
-            </w:r>
-          </w:p>
-        </w:tc>
-        <w:tc>
-          <w:tcPr>
-            <w:tcW w:type="dxa" w:w="4960"/>
-            <w:tcBorders>
-              <w:top w:val="single" w:color="CCCCCC" w:sz="1"/>
-              <w:left w:val="single" w:color="CCCCCC" w:sz="1"/>
-              <w:bottom w:val="single" w:color="CCCCCC" w:sz="1"/>
-              <w:right w:val="single" w:color="CCCCCC" w:sz="1"/>
-            </w:tcBorders>
-            <w:shd w:fill="FFFFFF" w:val="clear"/>
-            <w:tcMar>
-              <w:top w:type="dxa" w:w="80"/>
-              <w:left w:type="dxa" w:w="120"/>
-              <w:bottom w:type="dxa" w:w="80"/>
-              <w:right w:type="dxa" w:w="120"/>
-            </w:tcMar>
-          </w:tcPr>
-          <w:p>
-            <w:r>
-              <w:rPr>
-                <w:rFonts w:ascii="Arial" w:cs="Arial" w:eastAsia="Arial" w:hAnsi="Arial"/>
-                <w:sz w:val="20"/>
-                <w:szCs w:val="20"/>
-              </w:rPr>
-              <w:t xml:space="preserve">EspoCRM native dashboards + Google Workspace (Slides, Docs, Sheets) for Year 1. Metabase (FOSS) designated upgrade path if needed.</w:t>
-            </w:r>
-          </w:p>
-        </w:tc>
-      </w:tr>
-      <w:tr>
-        <w:tc>
-          <w:tcPr>
-            <w:tcW w:type="dxa" w:w="800"/>
-            <w:tcBorders>
-              <w:top w:val="single" w:color="CCCCCC" w:sz="1"/>
-              <w:left w:val="single" w:color="CCCCCC" w:sz="1"/>
-              <w:bottom w:val="single" w:color="CCCCCC" w:sz="1"/>
-              <w:right w:val="single" w:color="CCCCCC" w:sz="1"/>
-            </w:tcBorders>
-            <w:shd w:fill="F2F2F2" w:val="clear"/>
-            <w:tcMar>
-              <w:top w:type="dxa" w:w="80"/>
-              <w:left w:type="dxa" w:w="120"/>
-              <w:bottom w:type="dxa" w:w="80"/>
-              <w:right w:type="dxa" w:w="120"/>
-            </w:tcMar>
-          </w:tcPr>
-          <w:p>
-            <w:r>
-              <w:rPr>
-                <w:rFonts w:ascii="Arial" w:cs="Arial" w:eastAsia="Arial" w:hAnsi="Arial"/>
-                <w:sz w:val="20"/>
-                <w:szCs w:val="20"/>
-              </w:rPr>
-              <w:t xml:space="preserve">D-034</w:t>
-            </w:r>
-          </w:p>
-        </w:tc>
-        <w:tc>
-          <w:tcPr>
-            <w:tcW w:type="dxa" w:w="1600"/>
-            <w:tcBorders>
-              <w:top w:val="single" w:color="CCCCCC" w:sz="1"/>
-              <w:left w:val="single" w:color="CCCCCC" w:sz="1"/>
-              <w:bottom w:val="single" w:color="CCCCCC" w:sz="1"/>
-              <w:right w:val="single" w:color="CCCCCC" w:sz="1"/>
-            </w:tcBorders>
-            <w:shd w:fill="F2F2F2" w:val="clear"/>
-            <w:tcMar>
-              <w:top w:type="dxa" w:w="80"/>
-              <w:left w:type="dxa" w:w="120"/>
-              <w:bottom w:type="dxa" w:w="80"/>
-              <w:right w:type="dxa" w:w="120"/>
-            </w:tcMar>
-          </w:tcPr>
-          <w:p>
-            <w:r>
-              <w:rPr>
-                <w:rFonts w:ascii="Arial" w:cs="Arial" w:eastAsia="Arial" w:hAnsi="Arial"/>
-                <w:sz w:val="20"/>
-                <w:szCs w:val="20"/>
-              </w:rPr>
-              <w:t xml:space="preserve">Data Retention Policy</w:t>
-            </w:r>
-          </w:p>
-        </w:tc>
-        <w:tc>
-          <w:tcPr>
-            <w:tcW w:type="dxa" w:w="2000"/>
-            <w:tcBorders>
-              <w:top w:val="single" w:color="CCCCCC" w:sz="1"/>
-              <w:left w:val="single" w:color="CCCCCC" w:sz="1"/>
-              <w:bottom w:val="single" w:color="CCCCCC" w:sz="1"/>
-              <w:right w:val="single" w:color="CCCCCC" w:sz="1"/>
-            </w:tcBorders>
-            <w:shd w:fill="F2F2F2" w:val="clear"/>
-            <w:tcMar>
-              <w:top w:type="dxa" w:w="80"/>
-              <w:left w:type="dxa" w:w="120"/>
-              <w:bottom w:type="dxa" w:w="80"/>
-              <w:right w:type="dxa" w:w="120"/>
-            </w:tcMar>
-          </w:tcPr>
-          <w:p>
-            <w:r>
-              <w:rPr>
-                <w:rFonts w:ascii="Arial" w:cs="Arial" w:eastAsia="Arial" w:hAnsi="Arial"/>
-                <w:sz w:val="20"/>
-                <w:szCs w:val="20"/>
-              </w:rPr>
-              <w:t xml:space="preserve">Custom periods, standard nonprofit practice</w:t>
-            </w:r>
-          </w:p>
-        </w:tc>
-        <w:tc>
-          <w:tcPr>
-            <w:tcW w:type="dxa" w:w="4960"/>
-            <w:tcBorders>
-              <w:top w:val="single" w:color="CCCCCC" w:sz="1"/>
-              <w:left w:val="single" w:color="CCCCCC" w:sz="1"/>
-              <w:bottom w:val="single" w:color="CCCCCC" w:sz="1"/>
-              <w:right w:val="single" w:color="CCCCCC" w:sz="1"/>
-            </w:tcBorders>
-            <w:shd w:fill="F2F2F2" w:val="clear"/>
-            <w:tcMar>
-              <w:top w:type="dxa" w:w="80"/>
-              <w:left w:type="dxa" w:w="120"/>
-              <w:bottom w:type="dxa" w:w="80"/>
-              <w:right w:type="dxa" w:w="120"/>
-            </w:tcMar>
-          </w:tcPr>
-          <w:p>
-            <w:r>
-              <w:rPr>
-                <w:rFonts w:ascii="Arial" w:cs="Arial" w:eastAsia="Arial" w:hAnsi="Arial"/>
-                <w:sz w:val="20"/>
-                <w:szCs w:val="20"/>
-              </w:rPr>
-              <w:t xml:space="preserve">Standard nonprofit practice SELECTED. Permanent: governance docs, 990s, board minutes. 7 years: financial, grant, donor, client, volunteer records. 3 years: workshop attendance. 2 years: general correspondence. Ohio legal review required before board adoption.</w:t>
-            </w:r>
-          </w:p>
-        </w:tc>
-      </w:tr>
-      <w:tr>
-        <w:tc>
-          <w:tcPr>
-            <w:tcW w:type="dxa" w:w="800"/>
-            <w:tcBorders>
-              <w:top w:val="single" w:color="CCCCCC" w:sz="1"/>
-              <w:left w:val="single" w:color="CCCCCC" w:sz="1"/>
-              <w:bottom w:val="single" w:color="CCCCCC" w:sz="1"/>
-              <w:right w:val="single" w:color="CCCCCC" w:sz="1"/>
-            </w:tcBorders>
-            <w:shd w:fill="FFFFFF" w:val="clear"/>
-            <w:tcMar>
-              <w:top w:type="dxa" w:w="80"/>
-              <w:left w:type="dxa" w:w="120"/>
-              <w:bottom w:type="dxa" w:w="80"/>
-              <w:right w:type="dxa" w:w="120"/>
-            </w:tcMar>
-          </w:tcPr>
-          <w:p>
-            <w:r>
-              <w:rPr>
-                <w:rFonts w:ascii="Arial" w:cs="Arial" w:eastAsia="Arial" w:hAnsi="Arial"/>
-                <w:sz w:val="20"/>
-                <w:szCs w:val="20"/>
-              </w:rPr>
-              <w:t xml:space="preserve">D-035</w:t>
-            </w:r>
-          </w:p>
-        </w:tc>
-        <w:tc>
-          <w:tcPr>
-            <w:tcW w:type="dxa" w:w="1600"/>
-            <w:tcBorders>
-              <w:top w:val="single" w:color="CCCCCC" w:sz="1"/>
-              <w:left w:val="single" w:color="CCCCCC" w:sz="1"/>
-              <w:bottom w:val="single" w:color="CCCCCC" w:sz="1"/>
-              <w:right w:val="single" w:color="CCCCCC" w:sz="1"/>
-            </w:tcBorders>
-            <w:shd w:fill="FFFFFF" w:val="clear"/>
-            <w:tcMar>
-              <w:top w:type="dxa" w:w="80"/>
-              <w:left w:type="dxa" w:w="120"/>
-              <w:bottom w:type="dxa" w:w="80"/>
-              <w:right w:type="dxa" w:w="120"/>
-            </w:tcMar>
-          </w:tcPr>
-          <w:p>
-            <w:r>
-              <w:rPr>
-                <w:rFonts w:ascii="Arial" w:cs="Arial" w:eastAsia="Arial" w:hAnsi="Arial"/>
-                <w:sz w:val="20"/>
-                <w:szCs w:val="20"/>
-              </w:rPr>
-              <w:t xml:space="preserve">Backup Strategy</w:t>
-            </w:r>
-          </w:p>
-        </w:tc>
-        <w:tc>
-          <w:tcPr>
-            <w:tcW w:type="dxa" w:w="2000"/>
-            <w:tcBorders>
-              <w:top w:val="single" w:color="CCCCCC" w:sz="1"/>
-              <w:left w:val="single" w:color="CCCCCC" w:sz="1"/>
-              <w:bottom w:val="single" w:color="CCCCCC" w:sz="1"/>
-              <w:right w:val="single" w:color="CCCCCC" w:sz="1"/>
-            </w:tcBorders>
-            <w:shd w:fill="FFFFFF" w:val="clear"/>
-            <w:tcMar>
-              <w:top w:type="dxa" w:w="80"/>
-              <w:left w:type="dxa" w:w="120"/>
-              <w:bottom w:type="dxa" w:w="80"/>
-              <w:right w:type="dxa" w:w="120"/>
-            </w:tcMar>
-          </w:tcPr>
-          <w:p>
-            <w:r>
-              <w:rPr>
-                <w:rFonts w:ascii="Arial" w:cs="Arial" w:eastAsia="Arial" w:hAnsi="Arial"/>
-                <w:sz w:val="20"/>
-                <w:szCs w:val="20"/>
-              </w:rPr>
-              <w:t xml:space="preserve">AWS snapshots only, offsite backup, third-party backup</w:t>
-            </w:r>
-          </w:p>
-        </w:tc>
-        <w:tc>
-          <w:tcPr>
-            <w:tcW w:type="dxa" w:w="4960"/>
-            <w:tcBorders>
-              <w:top w:val="single" w:color="CCCCCC" w:sz="1"/>
-              <w:left w:val="single" w:color="CCCCCC" w:sz="1"/>
-              <w:bottom w:val="single" w:color="CCCCCC" w:sz="1"/>
-              <w:right w:val="single" w:color="CCCCCC" w:sz="1"/>
-            </w:tcBorders>
-            <w:shd w:fill="FFFFFF" w:val="clear"/>
-            <w:tcMar>
-              <w:top w:type="dxa" w:w="80"/>
-              <w:left w:type="dxa" w:w="120"/>
-              <w:bottom w:type="dxa" w:w="80"/>
-              <w:right w:type="dxa" w:w="120"/>
-            </w:tcMar>
-          </w:tcPr>
-          <w:p>
-            <w:r>
-              <w:rPr>
-                <w:rFonts w:ascii="Arial" w:cs="Arial" w:eastAsia="Arial" w:hAnsi="Arial"/>
-                <w:sz w:val="20"/>
-                <w:szCs w:val="20"/>
-              </w:rPr>
-              <w:t xml:space="preserve">AWS daily snapshots (30-day retention) + monthly offsite export to separate AWS region + S3 versioning. RTO: 24 hours. RPO: 24 hours. Annual restoration test.</w:t>
-            </w:r>
-          </w:p>
-        </w:tc>
-      </w:tr>
-      <w:tr>
-        <w:tc>
-          <w:tcPr>
-            <w:tcW w:type="dxa" w:w="800"/>
-            <w:tcBorders>
-              <w:top w:val="single" w:color="CCCCCC" w:sz="1"/>
-              <w:left w:val="single" w:color="CCCCCC" w:sz="1"/>
-              <w:bottom w:val="single" w:color="CCCCCC" w:sz="1"/>
-              <w:right w:val="single" w:color="CCCCCC" w:sz="1"/>
-            </w:tcBorders>
-            <w:shd w:fill="F2F2F2" w:val="clear"/>
-            <w:tcMar>
-              <w:top w:type="dxa" w:w="80"/>
-              <w:left w:type="dxa" w:w="120"/>
-              <w:bottom w:type="dxa" w:w="80"/>
-              <w:right w:type="dxa" w:w="120"/>
-            </w:tcMar>
-          </w:tcPr>
-          <w:p>
-            <w:r>
-              <w:rPr>
-                <w:rFonts w:ascii="Arial" w:cs="Arial" w:eastAsia="Arial" w:hAnsi="Arial"/>
-                <w:sz w:val="20"/>
-                <w:szCs w:val="20"/>
-              </w:rPr>
-              <w:t xml:space="preserve">D-036</w:t>
-            </w:r>
-          </w:p>
-        </w:tc>
-        <w:tc>
-          <w:tcPr>
-            <w:tcW w:type="dxa" w:w="1600"/>
-            <w:tcBorders>
-              <w:top w:val="single" w:color="CCCCCC" w:sz="1"/>
-              <w:left w:val="single" w:color="CCCCCC" w:sz="1"/>
-              <w:bottom w:val="single" w:color="CCCCCC" w:sz="1"/>
-              <w:right w:val="single" w:color="CCCCCC" w:sz="1"/>
-            </w:tcBorders>
-            <w:shd w:fill="F2F2F2" w:val="clear"/>
-            <w:tcMar>
-              <w:top w:type="dxa" w:w="80"/>
-              <w:left w:type="dxa" w:w="120"/>
-              <w:bottom w:type="dxa" w:w="80"/>
-              <w:right w:type="dxa" w:w="120"/>
-            </w:tcMar>
-          </w:tcPr>
-          <w:p>
-            <w:r>
-              <w:rPr>
-                <w:rFonts w:ascii="Arial" w:cs="Arial" w:eastAsia="Arial" w:hAnsi="Arial"/>
-                <w:sz w:val="20"/>
-                <w:szCs w:val="20"/>
-              </w:rPr>
-              <w:t xml:space="preserve">Offboarding Process</w:t>
-            </w:r>
-          </w:p>
-        </w:tc>
-        <w:tc>
-          <w:tcPr>
-            <w:tcW w:type="dxa" w:w="2000"/>
-            <w:tcBorders>
-              <w:top w:val="single" w:color="CCCCCC" w:sz="1"/>
-              <w:left w:val="single" w:color="CCCCCC" w:sz="1"/>
-              <w:bottom w:val="single" w:color="CCCCCC" w:sz="1"/>
-              <w:right w:val="single" w:color="CCCCCC" w:sz="1"/>
-            </w:tcBorders>
-            <w:shd w:fill="F2F2F2" w:val="clear"/>
-            <w:tcMar>
-              <w:top w:type="dxa" w:w="80"/>
-              <w:left w:type="dxa" w:w="120"/>
-              <w:bottom w:type="dxa" w:w="80"/>
-              <w:right w:type="dxa" w:w="120"/>
-            </w:tcMar>
-          </w:tcPr>
-          <w:p>
-            <w:r>
-              <w:rPr>
-                <w:rFonts w:ascii="Arial" w:cs="Arial" w:eastAsia="Arial" w:hAnsi="Arial"/>
-                <w:sz w:val="20"/>
-                <w:szCs w:val="20"/>
-              </w:rPr>
-              <w:t xml:space="preserve">Manual ad hoc, formal checklist, automated</w:t>
-            </w:r>
-          </w:p>
-        </w:tc>
-        <w:tc>
-          <w:tcPr>
-            <w:tcW w:type="dxa" w:w="4960"/>
-            <w:tcBorders>
-              <w:top w:val="single" w:color="CCCCCC" w:sz="1"/>
-              <w:left w:val="single" w:color="CCCCCC" w:sz="1"/>
-              <w:bottom w:val="single" w:color="CCCCCC" w:sz="1"/>
-              <w:right w:val="single" w:color="CCCCCC" w:sz="1"/>
-            </w:tcBorders>
-            <w:shd w:fill="F2F2F2" w:val="clear"/>
-            <w:tcMar>
-              <w:top w:type="dxa" w:w="80"/>
-              <w:left w:type="dxa" w:w="120"/>
-              <w:bottom w:type="dxa" w:w="80"/>
-              <w:right w:type="dxa" w:w="120"/>
-            </w:tcMar>
-          </w:tcPr>
-          <w:p>
-            <w:r>
-              <w:rPr>
-                <w:rFonts w:ascii="Arial" w:cs="Arial" w:eastAsia="Arial" w:hAnsi="Arial"/>
-                <w:sz w:val="20"/>
-                <w:szCs w:val="20"/>
-              </w:rPr>
-              <w:t xml:space="preserve">Mandatory 24-hour offboarding checklist covering all systems. Stored in Google Drive. Board president notified for involuntary departures.</w:t>
-            </w:r>
-          </w:p>
-        </w:tc>
-      </w:tr>
-      <w:tr>
-        <w:tc>
-          <w:tcPr>
-            <w:tcW w:type="dxa" w:w="800"/>
-            <w:tcBorders>
-              <w:top w:val="single" w:color="CCCCCC" w:sz="1"/>
-              <w:left w:val="single" w:color="CCCCCC" w:sz="1"/>
-              <w:bottom w:val="single" w:color="CCCCCC" w:sz="1"/>
-              <w:right w:val="single" w:color="CCCCCC" w:sz="1"/>
-            </w:tcBorders>
-            <w:shd w:fill="FFFFFF" w:val="clear"/>
-            <w:tcMar>
-              <w:top w:type="dxa" w:w="80"/>
-              <w:left w:type="dxa" w:w="120"/>
-              <w:bottom w:type="dxa" w:w="80"/>
-              <w:right w:type="dxa" w:w="120"/>
-            </w:tcMar>
-          </w:tcPr>
-          <w:p>
-            <w:r>
-              <w:rPr>
-                <w:rFonts w:ascii="Arial" w:cs="Arial" w:eastAsia="Arial" w:hAnsi="Arial"/>
-                <w:sz w:val="20"/>
-                <w:szCs w:val="20"/>
-              </w:rPr>
-              <w:t xml:space="preserve">D-037</w:t>
-            </w:r>
-          </w:p>
-        </w:tc>
-        <w:tc>
-          <w:tcPr>
-            <w:tcW w:type="dxa" w:w="1600"/>
-            <w:tcBorders>
-              <w:top w:val="single" w:color="CCCCCC" w:sz="1"/>
-              <w:left w:val="single" w:color="CCCCCC" w:sz="1"/>
-              <w:bottom w:val="single" w:color="CCCCCC" w:sz="1"/>
-              <w:right w:val="single" w:color="CCCCCC" w:sz="1"/>
-            </w:tcBorders>
-            <w:shd w:fill="FFFFFF" w:val="clear"/>
-            <w:tcMar>
-              <w:top w:type="dxa" w:w="80"/>
-              <w:left w:type="dxa" w:w="120"/>
-              <w:bottom w:type="dxa" w:w="80"/>
-              <w:right w:type="dxa" w:w="120"/>
-            </w:tcMar>
-          </w:tcPr>
-          <w:p>
-            <w:r>
-              <w:rPr>
-                <w:rFonts w:ascii="Arial" w:cs="Arial" w:eastAsia="Arial" w:hAnsi="Arial"/>
-                <w:sz w:val="20"/>
-                <w:szCs w:val="20"/>
-              </w:rPr>
-              <w:t xml:space="preserve">Incident Response</w:t>
-            </w:r>
-          </w:p>
-        </w:tc>
-        <w:tc>
-          <w:tcPr>
-            <w:tcW w:type="dxa" w:w="2000"/>
-            <w:tcBorders>
-              <w:top w:val="single" w:color="CCCCCC" w:sz="1"/>
-              <w:left w:val="single" w:color="CCCCCC" w:sz="1"/>
-              <w:bottom w:val="single" w:color="CCCCCC" w:sz="1"/>
-              <w:right w:val="single" w:color="CCCCCC" w:sz="1"/>
-            </w:tcBorders>
-            <w:shd w:fill="FFFFFF" w:val="clear"/>
-            <w:tcMar>
-              <w:top w:type="dxa" w:w="80"/>
-              <w:left w:type="dxa" w:w="120"/>
-              <w:bottom w:type="dxa" w:w="80"/>
-              <w:right w:type="dxa" w:w="120"/>
-            </w:tcMar>
-          </w:tcPr>
-          <w:p>
-            <w:r>
-              <w:rPr>
-                <w:rFonts w:ascii="Arial" w:cs="Arial" w:eastAsia="Arial" w:hAnsi="Arial"/>
-                <w:sz w:val="20"/>
-                <w:szCs w:val="20"/>
-              </w:rPr>
-              <w:t xml:space="preserve">Ad hoc, formal documented process</w:t>
-            </w:r>
-          </w:p>
-        </w:tc>
-        <w:tc>
-          <w:tcPr>
-            <w:tcW w:type="dxa" w:w="4960"/>
-            <w:tcBorders>
-              <w:top w:val="single" w:color="CCCCCC" w:sz="1"/>
-              <w:left w:val="single" w:color="CCCCCC" w:sz="1"/>
-              <w:bottom w:val="single" w:color="CCCCCC" w:sz="1"/>
-              <w:right w:val="single" w:color="CCCCCC" w:sz="1"/>
-            </w:tcBorders>
-            <w:shd w:fill="FFFFFF" w:val="clear"/>
-            <w:tcMar>
-              <w:top w:type="dxa" w:w="80"/>
-              <w:left w:type="dxa" w:w="120"/>
-              <w:bottom w:type="dxa" w:w="80"/>
-              <w:right w:type="dxa" w:w="120"/>
-            </w:tcMar>
-          </w:tcPr>
-          <w:p>
-            <w:r>
-              <w:rPr>
-                <w:rFonts w:ascii="Arial" w:cs="Arial" w:eastAsia="Arial" w:hAnsi="Arial"/>
-                <w:sz w:val="20"/>
-                <w:szCs w:val="20"/>
-              </w:rPr>
-              <w:t xml:space="preserve">6-step process: Detect → Contain → Assess → Notify → Remediate → Review. Ohio 45-day breach notification law applies. Legal counsel engaged for client data breaches.</w:t>
+              <w:t xml:space="preserve">Jitsi Meet (self-hosted on AWS) SELECTED for internal meetings. Fully FOSS. No time limits. No per-seat costs. No participant caps. Internal audience can be coached to use it. Solves group meeting duration concern without cost.</w:t>
             </w:r>
           </w:p>
         </w:tc>
@@ -4585,7 +2369,7 @@
                 <w:sz w:val="20"/>
                 <w:szCs w:val="20"/>
               </w:rPr>
-              <w:t xml:space="preserve">Bulk Email Tool</w:t>
+              <w:t xml:space="preserve">Online Learning Platform</w:t>
             </w:r>
           </w:p>
         </w:tc>
@@ -4613,7 +2397,7 @@
                 <w:sz w:val="20"/>
                 <w:szCs w:val="20"/>
               </w:rPr>
-              <w:t xml:space="preserve">Deferred — evaluate EspoCRM native capability first; Mautic as upgrade path</w:t>
+              <w:t xml:space="preserve">Pending — Section 8 conversation pending</w:t>
             </w:r>
           </w:p>
         </w:tc>
@@ -4643,7 +2427,7 @@
                 <w:sz w:val="20"/>
                 <w:szCs w:val="20"/>
               </w:rPr>
-              <w:t xml:space="preserve">Email Platform (Final)</w:t>
+              <w:t xml:space="preserve">Volunteer Coordination Tools</w:t>
             </w:r>
           </w:p>
         </w:tc>
@@ -4671,7 +2455,7 @@
                 <w:sz w:val="20"/>
                 <w:szCs w:val="20"/>
               </w:rPr>
-              <w:t xml:space="preserve">Provisional Google Workspace — pending CRM communication capability assessment</w:t>
+              <w:t xml:space="preserve">Largely resolved by EspoCRM — confirm in section conversation</w:t>
             </w:r>
           </w:p>
         </w:tc>
@@ -4701,7 +2485,7 @@
                 <w:sz w:val="20"/>
                 <w:szCs w:val="20"/>
               </w:rPr>
-              <w:t xml:space="preserve">Google Meet Group Time Limit</w:t>
+              <w:t xml:space="preserve">Donor Management</w:t>
             </w:r>
           </w:p>
         </w:tc>
@@ -4729,7 +2513,7 @@
                 <w:sz w:val="20"/>
                 <w:szCs w:val="20"/>
               </w:rPr>
-              <w:t xml:space="preserve">Action required — verify free nonprofit tier removes 60-min group meeting limit</w:t>
+              <w:t xml:space="preserve">Evaluate EspoCRM native capability first</w:t>
             </w:r>
           </w:p>
         </w:tc>
@@ -4759,7 +2543,7 @@
                 <w:sz w:val="20"/>
                 <w:szCs w:val="20"/>
               </w:rPr>
-              <w:t xml:space="preserve">Dues Amount</w:t>
+              <w:t xml:space="preserve">Document &amp; Resource Sharing</w:t>
             </w:r>
           </w:p>
         </w:tc>
@@ -4787,7 +2571,7 @@
                 <w:sz w:val="20"/>
                 <w:szCs w:val="20"/>
               </w:rPr>
-              <w:t xml:space="preserve">Open — board to determine annual dues level before system configuration</w:t>
+              <w:t xml:space="preserve">Pending — evaluate Google Drive vs FOSS alternatives</w:t>
             </w:r>
           </w:p>
         </w:tc>
@@ -4817,7 +2601,7 @@
                 <w:sz w:val="20"/>
                 <w:szCs w:val="20"/>
               </w:rPr>
-              <w:t xml:space="preserve">Ohio Legal Review — Retention Policy</w:t>
+              <w:t xml:space="preserve">Reporting &amp; Analytics</w:t>
             </w:r>
           </w:p>
         </w:tc>
@@ -4845,7 +2629,7 @@
                 <w:sz w:val="20"/>
                 <w:szCs w:val="20"/>
               </w:rPr>
-              <w:t xml:space="preserve">Action required — verify retention schedule against Ohio state law before board adoption</w:t>
+              <w:t xml:space="preserve">Largely resolved by EspoCRM — confirm dashboards adequate</w:t>
             </w:r>
           </w:p>
         </w:tc>
@@ -4875,7 +2659,7 @@
                 <w:sz w:val="20"/>
                 <w:szCs w:val="20"/>
               </w:rPr>
-              <w:t xml:space="preserve">Privacy Policy (Public)</w:t>
+              <w:t xml:space="preserve">Email Platform (Final)</w:t>
             </w:r>
           </w:p>
         </w:tc>
@@ -4903,7 +2687,7 @@
                 <w:sz w:val="20"/>
                 <w:szCs w:val="20"/>
               </w:rPr>
-              <w:t xml:space="preserve">Open — draft required before website launch</w:t>
+              <w:t xml:space="preserve">Provisional — pending CRM communication capability assessment</w:t>
             </w:r>
           </w:p>
         </w:tc>
@@ -4933,7 +2717,7 @@
                 <w:sz w:val="20"/>
                 <w:szCs w:val="20"/>
               </w:rPr>
-              <w:t xml:space="preserve">Online Donations</w:t>
+              <w:t xml:space="preserve">Google Meet Group Limit Verification</w:t>
             </w:r>
           </w:p>
         </w:tc>
@@ -4961,7 +2745,7 @@
                 <w:sz w:val="20"/>
                 <w:szCs w:val="20"/>
               </w:rPr>
-              <w:t xml:space="preserve">Deferred to Phase 2 — Stripe designated</w:t>
+              <w:t xml:space="preserve">Action required — verify free nonprofit tier removes 60-min group limit</w:t>
             </w:r>
           </w:p>
         </w:tc>
@@ -4991,7 +2775,7 @@
                 <w:sz w:val="20"/>
                 <w:szCs w:val="20"/>
               </w:rPr>
-              <w:t xml:space="preserve">Phase 2: Automated Mentor Matching</w:t>
+              <w:t xml:space="preserve">Dues Payment Processing</w:t>
             </w:r>
           </w:p>
         </w:tc>
@@ -5019,7 +2803,7 @@
                 <w:sz w:val="20"/>
                 <w:szCs w:val="20"/>
               </w:rPr>
-              <w:t xml:space="preserve">Planned — data model designed from day one</w:t>
+              <w:t xml:space="preserve">Open — PCI-compliant payment integration needed</w:t>
             </w:r>
           </w:p>
         </w:tc>
@@ -5049,7 +2833,7 @@
                 <w:sz w:val="20"/>
                 <w:szCs w:val="20"/>
               </w:rPr>
-              <w:t xml:space="preserve">Phase 2: Digital Event Check-in</w:t>
+              <w:t xml:space="preserve">Backup &amp; Recovery Strategy</w:t>
             </w:r>
           </w:p>
         </w:tc>
@@ -5077,123 +2861,7 @@
                 <w:sz w:val="20"/>
                 <w:szCs w:val="20"/>
               </w:rPr>
-              <w:t xml:space="preserve">Planned — QR/tablet check-in for in-person workshops</w:t>
-            </w:r>
-          </w:p>
-        </w:tc>
-      </w:tr>
-      <w:tr>
-        <w:tc>
-          <w:tcPr>
-            <w:tcW w:type="dxa" w:w="3500"/>
-            <w:tcBorders>
-              <w:top w:val="single" w:color="CCCCCC" w:sz="1"/>
-              <w:left w:val="single" w:color="CCCCCC" w:sz="1"/>
-              <w:bottom w:val="single" w:color="CCCCCC" w:sz="1"/>
-              <w:right w:val="single" w:color="CCCCCC" w:sz="1"/>
-            </w:tcBorders>
-            <w:shd w:fill="F2F2F2" w:val="clear"/>
-            <w:tcMar>
-              <w:top w:type="dxa" w:w="80"/>
-              <w:left w:type="dxa" w:w="120"/>
-              <w:bottom w:type="dxa" w:w="80"/>
-              <w:right w:type="dxa" w:w="120"/>
-            </w:tcMar>
-          </w:tcPr>
-          <w:p>
-            <w:r>
-              <w:rPr>
-                <w:rFonts w:ascii="Arial" w:cs="Arial" w:eastAsia="Arial" w:hAnsi="Arial"/>
-                <w:sz w:val="20"/>
-                <w:szCs w:val="20"/>
-              </w:rPr>
-              <w:t xml:space="preserve">Phase 2: Metabase Reporting</w:t>
-            </w:r>
-          </w:p>
-        </w:tc>
-        <w:tc>
-          <w:tcPr>
-            <w:tcW w:type="dxa" w:w="5860"/>
-            <w:tcBorders>
-              <w:top w:val="single" w:color="CCCCCC" w:sz="1"/>
-              <w:left w:val="single" w:color="CCCCCC" w:sz="1"/>
-              <w:bottom w:val="single" w:color="CCCCCC" w:sz="1"/>
-              <w:right w:val="single" w:color="CCCCCC" w:sz="1"/>
-            </w:tcBorders>
-            <w:shd w:fill="F2F2F2" w:val="clear"/>
-            <w:tcMar>
-              <w:top w:type="dxa" w:w="80"/>
-              <w:left w:type="dxa" w:w="120"/>
-              <w:bottom w:type="dxa" w:w="80"/>
-              <w:right w:type="dxa" w:w="120"/>
-            </w:tcMar>
-          </w:tcPr>
-          <w:p>
-            <w:r>
-              <w:rPr>
-                <w:rFonts w:ascii="Arial" w:cs="Arial" w:eastAsia="Arial" w:hAnsi="Arial"/>
-                <w:sz w:val="20"/>
-                <w:szCs w:val="20"/>
-              </w:rPr>
-              <w:t xml:space="preserve">Revisit trigger — if funder reporting exceeds EspoCRM native capability</w:t>
-            </w:r>
-          </w:p>
-        </w:tc>
-      </w:tr>
-      <w:tr>
-        <w:tc>
-          <w:tcPr>
-            <w:tcW w:type="dxa" w:w="3500"/>
-            <w:tcBorders>
-              <w:top w:val="single" w:color="CCCCCC" w:sz="1"/>
-              <w:left w:val="single" w:color="CCCCCC" w:sz="1"/>
-              <w:bottom w:val="single" w:color="CCCCCC" w:sz="1"/>
-              <w:right w:val="single" w:color="CCCCCC" w:sz="1"/>
-            </w:tcBorders>
-            <w:shd w:fill="FFFFFF" w:val="clear"/>
-            <w:tcMar>
-              <w:top w:type="dxa" w:w="80"/>
-              <w:left w:type="dxa" w:w="120"/>
-              <w:bottom w:type="dxa" w:w="80"/>
-              <w:right w:type="dxa" w:w="120"/>
-            </w:tcMar>
-          </w:tcPr>
-          <w:p>
-            <w:r>
-              <w:rPr>
-                <w:rFonts w:ascii="Arial" w:cs="Arial" w:eastAsia="Arial" w:hAnsi="Arial"/>
-                <w:sz w:val="20"/>
-                <w:szCs w:val="20"/>
-              </w:rPr>
-              <w:t xml:space="preserve">Section 14: Implementation Roadmap</w:t>
-            </w:r>
-          </w:p>
-        </w:tc>
-        <w:tc>
-          <w:tcPr>
-            <w:tcW w:type="dxa" w:w="5860"/>
-            <w:tcBorders>
-              <w:top w:val="single" w:color="CCCCCC" w:sz="1"/>
-              <w:left w:val="single" w:color="CCCCCC" w:sz="1"/>
-              <w:bottom w:val="single" w:color="CCCCCC" w:sz="1"/>
-              <w:right w:val="single" w:color="CCCCCC" w:sz="1"/>
-            </w:tcBorders>
-            <w:shd w:fill="FFFFFF" w:val="clear"/>
-            <w:tcMar>
-              <w:top w:type="dxa" w:w="80"/>
-              <w:left w:type="dxa" w:w="120"/>
-              <w:bottom w:type="dxa" w:w="80"/>
-              <w:right w:type="dxa" w:w="120"/>
-            </w:tcMar>
-          </w:tcPr>
-          <w:p>
-            <w:r>
-              <w:rPr>
-                <w:rFonts w:ascii="Arial" w:cs="Arial" w:eastAsia="Arial" w:hAnsi="Arial"/>
-                <w:sz w:val="20"/>
-                <w:szCs w:val="20"/>
-              </w:rPr>
-              <w:t xml:space="preserve">Pending — next planning session</w:t>
+              <w:t xml:space="preserve">Open — self-hosted EspoCRM and Jitsi on AWS</w:t>
             </w:r>
           </w:p>
         </w:tc>
@@ -5482,6 +3150,12 @@
       <w:startOverride w:val="1"/>
     </w:lvlOverride>
   </w:num>
+  <w:num w:numId="2">
+    <w:abstractNumId w:val="2"/>
+    <w:lvlOverride w:ilvl="0">
+      <w:startOverride w:val="1"/>
+    </w:lvlOverride>
+  </w:num>
 </w:numbering>
 </file>
 

</xml_diff>